<commit_message>
Revisão editorial estilo tabloide: manchetes, carimbos e letreiro de TV
Manchetes com número concreto, carimbos, citações-destaque, tarjas de TV
e letreiro ÚLTIMAS no rodapé (só fatos com fonte). Tipografia maior e
páginas sem espaço vazio no pé.

Co-Authored-By: Claude Opus 5.5 <noreply@anthropic.com>
Claude-Session: https://claude.ai/code/session_01GJhkYfDrHd3AkmDKDTo71F
</commit_message>
<xml_diff>
--- a/curso/dist/LULA-GANHOU-Curso-Completo.docx
+++ b/curso/dist/LULA-GANHOU-Curso-Completo.docx
@@ -58,6 +58,17 @@
       </w:r>
       <w:r>
         <w:t xml:space="preserve">PRA ONDE IR?</w:t>
+      </w:r>
+    </w:p>
+    <w:p>
+      <w:pPr>
+        <w:pStyle w:val="BodyText"/>
+      </w:pPr>
+      <w:r>
+        <w:t xml:space="preserve">AO VIVO</w:t>
+      </w:r>
+      <w:r>
+        <w:t xml:space="preserve">O plano B de quem trabalha e produz</w:t>
       </w:r>
     </w:p>
     <w:p>
@@ -261,18 +272,26 @@
         <w:t xml:space="preserve">O Brasil que foi às ruas</w:t>
       </w:r>
     </w:p>
-    <w:bookmarkStart w:id="20" w:name="você-fez-a-sua-parte.-muita-gente-fez."/>
+    <w:bookmarkStart w:id="20" w:name="mil-na-paulista.-e-agora"/>
     <w:p>
       <w:pPr>
         <w:pStyle w:val="Heading2"/>
       </w:pPr>
       <w:r>
-        <w:t xml:space="preserve">Você fez a sua parte. Muita gente fez.</w:t>
+        <w:t xml:space="preserve">185 mil na Paulista. E agora?</w:t>
       </w:r>
     </w:p>
     <w:p>
       <w:pPr>
         <w:pStyle w:val="FirstParagraph"/>
+      </w:pPr>
+      <w:r>
+        <w:t xml:space="preserve">Você fez a sua parte. Milhões fizeram.</w:t>
+      </w:r>
+    </w:p>
+    <w:p>
+      <w:pPr>
+        <w:pStyle w:val="BodyText"/>
       </w:pPr>
       <w:r>
         <w:t xml:space="preserve">De verde e amarelo, com a bandeira nas costas, a direita brasileira lotou avenidas como nenhum outro movimento.</w:t>
@@ -511,7 +530,7 @@
           <w:bCs/>
           <w:b/>
         </w:rPr>
-        <w:t xml:space="preserve">A direita é maioria nas ruas.</w:t>
+        <w:t xml:space="preserve">A direita enche as ruas.</w:t>
       </w:r>
       <w:r>
         <w:t xml:space="preserve"> </w:t>
@@ -557,21 +576,37 @@
         <w:pStyle w:val="FirstParagraph"/>
       </w:pPr>
       <w:r>
+        <w:t xml:space="preserve">ALERTA</w:t>
+      </w:r>
+    </w:p>
+    <w:p>
+      <w:pPr>
+        <w:pStyle w:val="BodyText"/>
+      </w:pPr>
+      <w:r>
         <w:t xml:space="preserve">O perigo vermelho</w:t>
       </w:r>
     </w:p>
-    <w:bookmarkStart w:id="23" w:name="Xfabb5dedf87ee8f2472707c5008b5219b985240"/>
+    <w:bookmarkStart w:id="23" w:name="de-inflação-o-recibo-do-socialismo"/>
     <w:p>
       <w:pPr>
         <w:pStyle w:val="Heading2"/>
       </w:pPr>
       <w:r>
-        <w:t xml:space="preserve">O que o socialismo fez com os nossos vizinhos</w:t>
+        <w:t xml:space="preserve">130.060% de inflação: o recibo do socialismo</w:t>
       </w:r>
     </w:p>
     <w:p>
       <w:pPr>
         <w:pStyle w:val="FirstParagraph"/>
+      </w:pPr>
+      <w:r>
+        <w:t xml:space="preserve">O que aconteceu com os vizinhos que confiaram na esquerda radical.</w:t>
+      </w:r>
+    </w:p>
+    <w:p>
+      <w:pPr>
+        <w:pStyle w:val="BodyText"/>
       </w:pPr>
       <w:r>
         <w:t xml:space="preserve">Não é teoria. Está a poucas horas de voo. Onde a esquerda radical mandou por anos, quem pagou foi quem trabalha:</w:t>
@@ -705,13 +740,13 @@
         <w:t xml:space="preserve">A virada da direita</w:t>
       </w:r>
     </w:p>
-    <w:bookmarkStart w:id="24" w:name="onde-a-direita-assumiu-a-coisa-mudou"/>
+    <w:bookmarkStart w:id="24" w:name="inflação-de-211-para-31-o-efeito-milei"/>
     <w:p>
       <w:pPr>
         <w:pStyle w:val="Heading2"/>
       </w:pPr>
       <w:r>
-        <w:t xml:space="preserve">Onde a direita assumiu, a coisa mudou</w:t>
+        <w:t xml:space="preserve">Inflação de 211% para 31%: o efeito Milei</w:t>
       </w:r>
     </w:p>
     <w:p>
@@ -864,6 +899,26 @@
         <w:pStyle w:val="BodyText"/>
       </w:pPr>
       <w:r>
+        <w:t xml:space="preserve">MAPA</w:t>
+      </w:r>
+      <w:r>
+        <w:t xml:space="preserve">Bolívia, Argentina e Paraguai:</w:t>
+      </w:r>
+      <w:r>
+        <w:t xml:space="preserve"> </w:t>
+      </w:r>
+      <w:r>
+        <w:rPr>
+          <w:highlight w:val="yellow"/>
+        </w:rPr>
+        <w:t xml:space="preserve">a direita cercando o Brasil</w:t>
+      </w:r>
+    </w:p>
+    <w:p>
+      <w:pPr>
+        <w:pStyle w:val="BodyText"/>
+      </w:pPr>
+      <w:r>
         <w:t xml:space="preserve">INDEC Argentina (IPC 2023, 2024 e 2025); MercoPress (10/11/2025); posses oficiais.</w:t>
       </w:r>
     </w:p>
@@ -883,13 +938,13 @@
         <w:t xml:space="preserve">A decisão</w:t>
       </w:r>
     </w:p>
-    <w:bookmarkStart w:id="28" w:name="os-3-caminhos-depois-do-resultado"/>
+    <w:bookmarkStart w:id="28" w:name="caminhos.-só-1-deixa-você-mais-rico."/>
     <w:p>
       <w:pPr>
         <w:pStyle w:val="Heading2"/>
       </w:pPr>
       <w:r>
-        <w:t xml:space="preserve">Os 3 caminhos depois do resultado</w:t>
+        <w:t xml:space="preserve">3 caminhos. Só 1 deixa você mais rico.</w:t>
       </w:r>
     </w:p>
     <w:bookmarkStart w:id="25" w:name="ficar-e-reclamar"/>
@@ -1053,18 +1108,34 @@
         <w:t xml:space="preserve">O sonho caro</w:t>
       </w:r>
     </w:p>
-    <w:bookmarkStart w:id="30" w:name="por-que-não-portugal-ou-eua"/>
+    <w:p>
+      <w:pPr>
+        <w:pStyle w:val="BodyText"/>
+      </w:pPr>
+      <w:r>
+        <w:t xml:space="preserve">CHOCANTE</w:t>
+      </w:r>
+    </w:p>
+    <w:bookmarkStart w:id="30" w:name="r-13-mil-por-1-quarto-em-miami"/>
     <w:p>
       <w:pPr>
         <w:pStyle w:val="Heading1"/>
       </w:pPr>
       <w:r>
-        <w:t xml:space="preserve">Por que não Portugal ou EUA?</w:t>
+        <w:t xml:space="preserve">R$ 13 mil por 1 quarto em Miami</w:t>
       </w:r>
     </w:p>
     <w:p>
       <w:pPr>
         <w:pStyle w:val="FirstParagraph"/>
+      </w:pPr>
+      <w:r>
+        <w:t xml:space="preserve">Por que Portugal e EUA são o sonho que deixa você mais pobre.</w:t>
+      </w:r>
+    </w:p>
+    <w:p>
+      <w:pPr>
+        <w:pStyle w:val="BodyText"/>
       </w:pPr>
       <w:r>
         <w:t xml:space="preserve">Todo brasileiro já pensou em Lisboa ou na Flórida. O problema é a conversão: lá,</w:t>
@@ -1164,13 +1235,13 @@
         </w:pict>
       </w:r>
     </w:p>
-    <w:bookmarkStart w:id="33" w:name="não-é-só-o-aluguel"/>
+    <w:bookmarkStart w:id="33" w:name="Xc73fc7754499a3ee531bdf2e3c089533358b4d1"/>
     <w:p>
       <w:pPr>
         <w:pStyle w:val="Heading2"/>
       </w:pPr>
       <w:r>
-        <w:t xml:space="preserve">Não é só o aluguel</w:t>
+        <w:t xml:space="preserve">Visto, moeda, distância: a conta que ninguém mostra</w:t>
       </w:r>
     </w:p>
     <w:tbl>
@@ -1632,13 +1703,13 @@
         <w:t xml:space="preserve">Conta de bolso</w:t>
       </w:r>
     </w:p>
-    <w:bookmarkStart w:id="34" w:name="com-r-200-mil-quanto-tempo-você-vive"/>
+    <w:bookmarkStart w:id="34" w:name="Xa1b4d9a65c695da716573075b303934a164bcf4"/>
     <w:p>
       <w:pPr>
         <w:pStyle w:val="Heading2"/>
       </w:pPr>
       <w:r>
-        <w:t xml:space="preserve">Com R$ 200 mil, quanto tempo você vive?</w:t>
+        <w:t xml:space="preserve">R$ 200 mil: 15 meses em Miami ou 70 na Bolívia</w:t>
       </w:r>
     </w:p>
     <w:p>
@@ -1900,6 +1971,32 @@
         <w:pStyle w:val="BodyText"/>
       </w:pPr>
       <w:r>
+        <w:t xml:space="preserve">CONTA</w:t>
+      </w:r>
+      <w:r>
+        <w:t xml:space="preserve">Mesmo dinheiro.</w:t>
+      </w:r>
+      <w:r>
+        <w:t xml:space="preserve"> </w:t>
+      </w:r>
+      <w:r>
+        <w:rPr>
+          <w:highlight w:val="yellow"/>
+        </w:rPr>
+        <w:t xml:space="preserve">4,7× mais tempo</w:t>
+      </w:r>
+      <w:r>
+        <w:t xml:space="preserve"> </w:t>
+      </w:r>
+      <w:r>
+        <w:t xml:space="preserve">de vida.</w:t>
+      </w:r>
+    </w:p>
+    <w:p>
+      <w:pPr>
+        <w:pStyle w:val="BodyText"/>
+      </w:pPr>
+      <w:r>
         <w:t xml:space="preserve">Mesmas fontes e câmbios da página anterior. Cálculo do autor do curso.</w:t>
       </w:r>
     </w:p>
@@ -1919,13 +2016,21 @@
         <w:t xml:space="preserve">O destino</w:t>
       </w:r>
     </w:p>
-    <w:bookmarkStart w:id="35" w:name="por-que-a-bolívia"/>
+    <w:bookmarkStart w:id="35" w:name="o-vizinho-que-virou-à-direita"/>
     <w:p>
       <w:pPr>
         <w:pStyle w:val="Heading1"/>
       </w:pPr>
       <w:r>
-        <w:t xml:space="preserve">Por que a Bolívia</w:t>
+        <w:t xml:space="preserve">O vizinho que virou à direita</w:t>
+      </w:r>
+    </w:p>
+    <w:p>
+      <w:pPr>
+        <w:pStyle w:val="FirstParagraph"/>
+      </w:pPr>
+      <w:r>
+        <w:t xml:space="preserve">Por que a Bolívia é o destino número 1 deste curso.</w:t>
       </w:r>
     </w:p>
     <w:tbl>
@@ -2102,6 +2207,14 @@
         <w:t xml:space="preserve">A virada</w:t>
       </w:r>
     </w:p>
+    <w:p>
+      <w:pPr>
+        <w:pStyle w:val="BodyText"/>
+      </w:pPr>
+      <w:r>
+        <w:t xml:space="preserve">HISTÓRICO</w:t>
+      </w:r>
+    </w:p>
     <w:bookmarkStart w:id="38" w:name="a-bolívia-expulsou-o-socialismo-do-poder"/>
     <w:p>
       <w:pPr>
@@ -2233,6 +2346,14 @@
       </w:r>
       <w:r>
         <w:t xml:space="preserve">Os bolivianos já vivem isso.</w:t>
+      </w:r>
+    </w:p>
+    <w:p>
+      <w:pPr>
+        <w:pStyle w:val="BodyText"/>
+      </w:pPr>
+      <w:r>
+        <w:t xml:space="preserve">Eles não mudaram a direção. Os bolivianos mudaram.</w:t>
       </w:r>
     </w:p>
     <w:p>
@@ -2365,6 +2486,32 @@
         <w:pStyle w:val="BodyText"/>
       </w:pPr>
       <w:r>
+        <w:t xml:space="preserve">MUSTANG</w:t>
+      </w:r>
+      <w:r>
+        <w:t xml:space="preserve">R$ 279.990 no Brasil.</w:t>
+      </w:r>
+      <w:r>
+        <w:t xml:space="preserve"> </w:t>
+      </w:r>
+      <w:r>
+        <w:rPr>
+          <w:highlight w:val="yellow"/>
+        </w:rPr>
+        <w:t xml:space="preserve">~R$ 69 mil</w:t>
+      </w:r>
+      <w:r>
+        <w:t xml:space="preserve"> </w:t>
+      </w:r>
+      <w:r>
+        <w:t xml:space="preserve">na Bolívia.</w:t>
+      </w:r>
+    </w:p>
+    <w:p>
+      <w:pPr>
+        <w:pStyle w:val="BodyText"/>
+      </w:pPr>
+      <w:r>
         <w:t xml:space="preserve">Infobae; The Rio Times (Bs 6,96); BCB via usdtbol.com, 28/10/2026 (Bs 12,02); Facebook Marketplace, levantado pelo autor, out/2026 (preço pedido).</w:t>
       </w:r>
     </w:p>
@@ -2376,13 +2523,21 @@
         </w:pict>
       </w:r>
     </w:p>
-    <w:bookmarkStart w:id="40" w:name="bolívia-brasil-em-4-números"/>
+    <w:bookmarkStart w:id="40" w:name="números-que-vão-fazer-você-rever-tudo"/>
     <w:p>
       <w:pPr>
         <w:pStyle w:val="Heading2"/>
       </w:pPr>
       <w:r>
-        <w:t xml:space="preserve">Bolívia × Brasil em 4 números</w:t>
+        <w:t xml:space="preserve">4 números que vão fazer você rever tudo</w:t>
+      </w:r>
+    </w:p>
+    <w:p>
+      <w:pPr>
+        <w:pStyle w:val="FirstParagraph"/>
+      </w:pPr>
+      <w:r>
+        <w:t xml:space="preserve">Bolívia × Brasil, preço por preço.</w:t>
       </w:r>
     </w:p>
     <w:tbl>
@@ -2710,6 +2865,14 @@
         <w:t xml:space="preserve">A ponte</w:t>
       </w:r>
     </w:p>
+    <w:p>
+      <w:pPr>
+        <w:pStyle w:val="BodyText"/>
+      </w:pPr>
+      <w:r>
+        <w:t xml:space="preserve">ATENÇÃO</w:t>
+      </w:r>
+    </w:p>
     <w:bookmarkStart w:id="41" w:name="o-dinheiro-primeiro-o-avião-depois"/>
     <w:p>
       <w:pPr>
@@ -2856,6 +3019,14 @@
         <w:pStyle w:val="BodyText"/>
       </w:pPr>
       <w:r>
+        <w:t xml:space="preserve">Seu dinheiro. Suas regras. Sua liberdade.</w:t>
+      </w:r>
+    </w:p>
+    <w:p>
+      <w:pPr>
+        <w:pStyle w:val="BodyText"/>
+      </w:pPr>
+      <w:r>
         <w:t xml:space="preserve">Decretos 12.466 e 12.499/2025 (IOF 3,5%); dolarparalelobolivia.net, 28/10/2026 (P2P Bs 12,13).</w:t>
       </w:r>
     </w:p>
@@ -2867,13 +3038,21 @@
         </w:pict>
       </w:r>
     </w:p>
-    <w:bookmarkStart w:id="42" w:name="a-prova-r-50-mil-por-3-caminhos"/>
+    <w:bookmarkStart w:id="42" w:name="X182ab342f3b6feef0f26119dc64d09d42133f83"/>
     <w:p>
       <w:pPr>
         <w:pStyle w:val="Heading2"/>
       </w:pPr>
       <w:r>
-        <w:t xml:space="preserve">A prova: R$ 50 mil por 3 caminhos</w:t>
+        <w:t xml:space="preserve">R$ 200 mil pelo caminho certo: R$ 11 mil a mais</w:t>
+      </w:r>
+    </w:p>
+    <w:p>
+      <w:pPr>
+        <w:pStyle w:val="FirstParagraph"/>
+      </w:pPr>
+      <w:r>
+        <w:t xml:space="preserve">A mesma quantia, 3 caminhos, 3 resultados.</w:t>
       </w:r>
     </w:p>
     <w:tbl>
@@ -3176,13 +3355,21 @@
         <w:t xml:space="preserve">Teste rápido</w:t>
       </w:r>
     </w:p>
-    <w:bookmarkStart w:id="43" w:name="você-está-pronto"/>
+    <w:p>
+      <w:pPr>
+        <w:pStyle w:val="BodyText"/>
+      </w:pPr>
+      <w:r>
+        <w:t xml:space="preserve">TESTE</w:t>
+      </w:r>
+    </w:p>
+    <w:bookmarkStart w:id="43" w:name="você-está-pronto-para-sair"/>
     <w:p>
       <w:pPr>
         <w:pStyle w:val="Heading1"/>
       </w:pPr>
       <w:r>
-        <w:t xml:space="preserve">Você está pronto?</w:t>
+        <w:t xml:space="preserve">Você está pronto para sair?</w:t>
       </w:r>
     </w:p>
     <w:p>
@@ -3353,13 +3540,13 @@
         </w:pict>
       </w:r>
     </w:p>
-    <w:bookmarkStart w:id="47" w:name="o-seu-diagnóstico"/>
+    <w:bookmarkStart w:id="47" w:name="seu-resultado-onde-você-está-agora"/>
     <w:p>
       <w:pPr>
         <w:pStyle w:val="Heading2"/>
       </w:pPr>
       <w:r>
-        <w:t xml:space="preserve">O seu diagnóstico</w:t>
+        <w:t xml:space="preserve">Seu resultado: onde você está agora</w:t>
       </w:r>
     </w:p>
     <w:bookmarkStart w:id="44" w:name="a-20-pontos-pronto-para-agir"/>

</xml_diff>

<commit_message>
Parte 2: custo real do autor em Cochabamba (Queru Queru)
Aluguel de 3 quartos por Bs 2.800 com condomínio, dividido por 3, e
R$ 700/mês de despesas: nova página de resultado do autor (R$ 1.106/mês)
e o dado entra em aluguel, medicina e simulador.

Co-Authored-By: Claude Opus 5.5 <noreply@anthropic.com>
Claude-Session: https://claude.ai/code/session_01GJhkYfDrHd3AkmDKDTo71F
</commit_message>
<xml_diff>
--- a/curso/dist/LULA-GANHOU-Curso-Completo.docx
+++ b/curso/dist/LULA-GANHOU-Curso-Completo.docx
@@ -434,14 +434,6 @@
         <w:pStyle w:val="BodyText"/>
       </w:pPr>
       <w:r>
-        <w:t xml:space="preserve">FipeZAP Locação set/2026 (TNH1); InfoCasas out/2026; The Rio Times, set/2026 (Equipetrol e diferença de 1,5–2×). Câmbios: US$ 1 = R$ 5,35; R$ 1 = Bs 2,30.</w:t>
-      </w:r>
-    </w:p>
-    <w:p>
-      <w:pPr>
-        <w:pStyle w:val="BodyText"/>
-      </w:pPr>
-      <w:r>
         <w:t xml:space="preserve">InfoNegocios (como funciona); boliviaimpuestos.com (gravame ~0,5%, RC-IVA 10% a.a., Formulário 610; confirmar no SIN). Valores do exemplo: ilustrativos.</w:t>
       </w:r>
     </w:p>
@@ -512,6 +504,20 @@
         <w:pStyle w:val="BodyText"/>
       </w:pPr>
       <w:r>
+        <w:t xml:space="preserve">Autor, out/2026 (aluguel e despesas reais). R$ 1 = Bs 2,30 (autor, 28/10/2026). SP: FipeZAP Locação set/2026.</w:t>
+      </w:r>
+      <w:r>
+        <w:t xml:space="preserve"> </w:t>
+      </w:r>
+      <w:r>
+        <w:t xml:space="preserve">[PEDIR AO AUTOR: foto do contrato ou recibo com dados pessoais borrados]</w:t>
+      </w:r>
+    </w:p>
+    <w:p>
+      <w:pPr>
+        <w:pStyle w:val="BodyText"/>
+      </w:pPr>
+      <w:r>
         <w:t xml:space="preserve">The Rio Times, set/2026 (aluguel em dólar; câmbio); expat.com (filas em escolas internacionais); France 24 (combustível, 2025).</w:t>
       </w:r>
     </w:p>
@@ -553,14 +559,6 @@
       </w:pPr>
       <w:r>
         <w:t xml:space="preserve">Gran Faculdade (média nacional ~R$ 9.500, 2026); Sanarmed (Bolívia R$ 700–1.200); Universidade do Intercâmbio (média ~R$ 750 em Cochabamba e Santa Cruz). Valores variam; confirmar com cada instituição.</w:t>
-      </w:r>
-    </w:p>
-    <w:p>
-      <w:pPr>
-        <w:pStyle w:val="BodyText"/>
-      </w:pPr>
-      <w:r>
-        <w:t xml:space="preserve">Universidade do Intercâmbio; Estratégia Vestibulares; Correio do Estado; Querobolsa (lista de universidades). Exemplos, não indicação paga.</w:t>
       </w:r>
     </w:p>
     <w:p>

</xml_diff>

<commit_message>
Capa patriota e fontes movidas para anexo
Faixa "E-book patriota · contra a censura da esquerda" na capa e no título.
As linhas de fonte saem das páginas e vão para um anexo automático
"Fontes de todos os números", com o número da página de cada dado.

Co-Authored-By: Claude Opus 5.5 <noreply@anthropic.com>
Claude-Session: https://claude.ai/code/session_01GJhkYfDrHd3AkmDKDTo71F
</commit_message>
<xml_diff>
--- a/curso/dist/LULA-GANHOU-Curso-Completo.docx
+++ b/curso/dist/LULA-GANHOU-Curso-Completo.docx
@@ -33,6 +33,54 @@
       <w:r>
         <w:t xml:space="preserve">IR?</w:t>
       </w:r>
+      <w:r>
+        <w:t xml:space="preserve"> </w:t>
+      </w:r>
+      <w:r>
+        <w:t xml:space="preserve">·</w:t>
+      </w:r>
+      <w:r>
+        <w:t xml:space="preserve"> </w:t>
+      </w:r>
+      <w:r>
+        <w:t xml:space="preserve">E-book</w:t>
+      </w:r>
+      <w:r>
+        <w:t xml:space="preserve"> </w:t>
+      </w:r>
+      <w:r>
+        <w:t xml:space="preserve">patriota,</w:t>
+      </w:r>
+      <w:r>
+        <w:t xml:space="preserve"> </w:t>
+      </w:r>
+      <w:r>
+        <w:t xml:space="preserve">contra</w:t>
+      </w:r>
+      <w:r>
+        <w:t xml:space="preserve"> </w:t>
+      </w:r>
+      <w:r>
+        <w:t xml:space="preserve">a</w:t>
+      </w:r>
+      <w:r>
+        <w:t xml:space="preserve"> </w:t>
+      </w:r>
+      <w:r>
+        <w:t xml:space="preserve">censura</w:t>
+      </w:r>
+      <w:r>
+        <w:t xml:space="preserve"> </w:t>
+      </w:r>
+      <w:r>
+        <w:t xml:space="preserve">da</w:t>
+      </w:r>
+      <w:r>
+        <w:t xml:space="preserve"> </w:t>
+      </w:r>
+      <w:r>
+        <w:t xml:space="preserve">esquerda</w:t>
+      </w:r>
     </w:p>
     <w:p>
       <w:r>
@@ -58,6 +106,20 @@
       </w:r>
       <w:r>
         <w:t xml:space="preserve">PRA ONDE IR?</w:t>
+      </w:r>
+    </w:p>
+    <w:p>
+      <w:pPr>
+        <w:pStyle w:val="BodyText"/>
+      </w:pPr>
+      <w:r>
+        <w:t xml:space="preserve">E-BOOK PATRIOTA</w:t>
+      </w:r>
+      <w:r>
+        <w:t xml:space="preserve"> </w:t>
+      </w:r>
+      <w:r>
+        <w:t xml:space="preserve">· CONTRA A CENSURA DA ESQUERDA</w:t>
       </w:r>
     </w:p>
     <w:p>
@@ -309,14 +371,6 @@
         <w:t xml:space="preserve">A pergunta que 58 milhões de brasileiros estão se fazendo agora.</w:t>
       </w:r>
     </w:p>
-    <w:p>
-      <w:pPr>
-        <w:pStyle w:val="BodyText"/>
-      </w:pPr>
-      <w:r>
-        <w:t xml:space="preserve">TSE, resultado do 2º turno de 2022 (58.206.354 votos, 49,1% dos válidos).</w:t>
-      </w:r>
-    </w:p>
     <w:bookmarkEnd w:id="20"/>
     <w:p>
       <w:r>
@@ -490,14 +544,6 @@
         <w:t xml:space="preserve">Leia a página “Como usar o curso” e escolha a sua trilha hoje. Não amanhã.</w:t>
       </w:r>
     </w:p>
-    <w:p>
-      <w:pPr>
-        <w:pStyle w:val="BodyText"/>
-      </w:pPr>
-      <w:r>
-        <w:t xml:space="preserve">Tribunal Supremo Electoral da Bolívia via Agência Brasil (19/10/2025); MercoPress (10/11/2025).</w:t>
-      </w:r>
-    </w:p>
     <w:bookmarkEnd w:id="21"/>
     <w:bookmarkEnd w:id="22"/>
     <w:p>
@@ -1157,6 +1203,21 @@
       </w:r>
       <w:r>
         <w:t xml:space="preserve">90</w:t>
+      </w:r>
+    </w:p>
+    <w:p>
+      <w:pPr>
+        <w:numPr>
+          <w:ilvl w:val="0"/>
+          <w:numId w:val="1003"/>
+        </w:numPr>
+        <w:pStyle w:val="Compact"/>
+      </w:pPr>
+      <w:r>
+        <w:t xml:space="preserve">Anexo · Fontes de todos os números</w:t>
+      </w:r>
+      <w:r>
+        <w:t xml:space="preserve">93</w:t>
       </w:r>
     </w:p>
     <w:p>
@@ -1546,14 +1607,6 @@
       </w:pPr>
       <w:r>
         <w:t xml:space="preserve">Ficar parado também é uma decisão. É decidir pagar a conta.</w:t>
-      </w:r>
-    </w:p>
-    <w:p>
-      <w:pPr>
-        <w:pStyle w:val="BodyText"/>
-      </w:pPr>
-      <w:r>
-        <w:t xml:space="preserve">Gazeta do Povo, 2026 (arrecadação de R$ 2,887 tri; carga de 32,4% do PIB) e mar/2026 (43 medidas); Banco Central via Forbes, 27/10/2026 (dívida, ago/2026); reações de lideranças, Gazeta do Povo, 25/10/2026.</w:t>
       </w:r>
     </w:p>
     <w:p>
@@ -1851,14 +1904,6 @@
         <w:t xml:space="preserve">liberdade financeira.</w:t>
       </w:r>
     </w:p>
-    <w:p>
-      <w:pPr>
-        <w:pStyle w:val="BodyText"/>
-      </w:pPr>
-      <w:r>
-        <w:t xml:space="preserve">TSE (2º turno 2018: 57.797.847 votos; 2022: 58.206.354); Monitor do Debate Político/USP via CartaCapital e O Povo (2024); SSP-SP via SBT News (25/02/2024).</w:t>
-      </w:r>
-    </w:p>
     <w:bookmarkEnd w:id="28"/>
     <w:p>
       <w:r>
@@ -2001,14 +2046,6 @@
       </w:r>
       <w:r>
         <w:t xml:space="preserve">socialismo promete tudo e entrega fila, inflação e êxodo. Seu patrimônio não precisa esperar para ver.</w:t>
-      </w:r>
-    </w:p>
-    <w:p>
-      <w:pPr>
-        <w:pStyle w:val="BodyText"/>
-      </w:pPr>
-      <w:r>
-        <w:t xml:space="preserve">Banco Central de Venezuela via Poder360/DW (29/05/2019); R4V via Bloomberg Línea (2025: 6,70 mi na América Latina + 1,19 mi no resto do mundo); France 24 (08/11/2025); Infobae; The Rio Times.</w:t>
       </w:r>
     </w:p>
     <w:bookmarkEnd w:id="30"/>
@@ -2199,14 +2236,6 @@
         <w:t xml:space="preserve">a direita cercando o Brasil</w:t>
       </w:r>
     </w:p>
-    <w:p>
-      <w:pPr>
-        <w:pStyle w:val="BodyText"/>
-      </w:pPr>
-      <w:r>
-        <w:t xml:space="preserve">INDEC Argentina (IPC 2023, 2024 e 2025); MercoPress (10/11/2025); posses oficiais.</w:t>
-      </w:r>
-    </w:p>
     <w:bookmarkEnd w:id="32"/>
     <w:p>
       <w:r>
@@ -2367,14 +2396,6 @@
       </w:pPr>
       <w:r>
         <w:t xml:space="preserve">Escreva num papel quanto você tem de reserva hoje. Esse número vai ser usado em todo o curso.</w:t>
-      </w:r>
-    </w:p>
-    <w:p>
-      <w:pPr>
-        <w:pStyle w:val="BodyText"/>
-      </w:pPr>
-      <w:r>
-        <w:t xml:space="preserve">IFI via Forbes, 27/10/2026 (ajuste fiscal); Decretos 12.466 e 12.499/2025 (IOF).</w:t>
       </w:r>
     </w:p>
     <w:bookmarkEnd w:id="36"/>
@@ -2493,14 +2514,6 @@
       </w:r>
       <w:r>
         <w:t xml:space="preserve">em Cochabamba.</w:t>
-      </w:r>
-    </w:p>
-    <w:p>
-      <w:pPr>
-        <w:pStyle w:val="BodyText"/>
-      </w:pPr>
-      <w:r>
-        <w:t xml:space="preserve">Zumper via WLRN (set/2026, Miami US$ 2.500); Zumper via WFLA (Orlando US$ 1.690, data a confirmar); Numbeo mai/2026 via Cidadania e Visto (Lisboa €1.280); FipeZAP Locação set/2026; InfoCasas out/2026. Câmbio: US$ 1 = R$ 5,35 (Investidor10, 28/10/2026); €1 = R$ 5,62 (Meelion, 09/10/2026); R$ 1 = Bs 2,30 (autor).</w:t>
       </w:r>
     </w:p>
     <w:bookmarkEnd w:id="37"/>
@@ -3001,14 +3014,6 @@
       </w:r>
     </w:p>
     <w:bookmarkEnd w:id="40"/>
-    <w:p>
-      <w:pPr>
-        <w:pStyle w:val="FirstParagraph"/>
-      </w:pPr>
-      <w:r>
-        <w:t xml:space="preserve">Mochileiros (entrada com RG/CIN, 90 dias); The Rio Times (residência Mercosul); FlightConnections, abr/2026 (voo direto GRU–VVI, média 3h05); aluguéis: mesmas fontes da página anterior.</w:t>
-      </w:r>
-    </w:p>
     <w:bookmarkEnd w:id="41"/>
     <w:p>
       <w:r>
@@ -3311,14 +3316,6 @@
         <w:t xml:space="preserve">de vida.</w:t>
       </w:r>
     </w:p>
-    <w:p>
-      <w:pPr>
-        <w:pStyle w:val="BodyText"/>
-      </w:pPr>
-      <w:r>
-        <w:t xml:space="preserve">Mesmas fontes e câmbios da página anterior. Cálculo do autor do curso.</w:t>
-      </w:r>
-    </w:p>
     <w:bookmarkEnd w:id="42"/>
     <w:p>
       <w:r>
@@ -3502,14 +3499,6 @@
         <w:t xml:space="preserve">desde novembro de 2025</w:t>
       </w:r>
     </w:p>
-    <w:p>
-      <w:pPr>
-        <w:pStyle w:val="FirstParagraph"/>
-      </w:pPr>
-      <w:r>
-        <w:t xml:space="preserve">Mochileiros (entrada); The Rio Times (residência Mercosul, taxa ~450 UFV); FlightConnections, abr/2026 (voo direto São Paulo–Santa Cruz, média 3h05); autor, 28/10/2026 (câmbio de referência).</w:t>
-      </w:r>
-    </w:p>
     <w:bookmarkEnd w:id="43"/>
     <w:p>
       <w:r>
@@ -3665,14 +3654,6 @@
       </w:pPr>
       <w:r>
         <w:t xml:space="preserve">Eles não mudaram a direção. Os bolivianos mudaram.</w:t>
-      </w:r>
-    </w:p>
-    <w:p>
-      <w:pPr>
-        <w:pStyle w:val="BodyText"/>
-      </w:pPr>
-      <w:r>
-        <w:t xml:space="preserve">Agência Brasil e Poder360 (19/10/2025); MercoPress (10/11/2025); France 24 via Acento (08/11/2025); usdthoy.com (flutuação desde 29/06/2026).</w:t>
       </w:r>
     </w:p>
     <w:bookmarkEnd w:id="46"/>
@@ -3816,14 +3797,6 @@
       </w:r>
       <w:r>
         <w:t xml:space="preserve">na Bolívia.</w:t>
-      </w:r>
-    </w:p>
-    <w:p>
-      <w:pPr>
-        <w:pStyle w:val="BodyText"/>
-      </w:pPr>
-      <w:r>
-        <w:t xml:space="preserve">Infobae; The Rio Times (Bs 6,96); BCB via usdtbol.com, 28/10/2026 (Bs 12,02); Facebook Marketplace, levantado pelo autor, out/2026 (preço pedido).</w:t>
       </w:r>
     </w:p>
     <w:bookmarkEnd w:id="47"/>
@@ -4149,14 +4122,6 @@
         <w:t xml:space="preserve">Escolha 1 item que você quer (carro, casa, escola) e pesquise o preço dele no Brasil. Guarde para comparar na Parte 2.</w:t>
       </w:r>
     </w:p>
-    <w:p>
-      <w:pPr>
-        <w:pStyle w:val="BodyText"/>
-      </w:pPr>
-      <w:r>
-        <w:t xml:space="preserve">FipeZAP set/2026 via MySide; InfoCasas out/2026; Facebook Marketplace (autor, out/2026); Correo del Sur ago/2026; ANP set/2026. Câmbios: US$ 1 = R$ 5,35; R$ 1 = Bs 2,30.</w:t>
-      </w:r>
-    </w:p>
     <w:bookmarkEnd w:id="48"/>
     <w:p>
       <w:r>
@@ -4320,14 +4285,6 @@
       </w:pPr>
       <w:r>
         <w:t xml:space="preserve">Seu dinheiro. Suas regras. Sua liberdade.</w:t>
-      </w:r>
-    </w:p>
-    <w:p>
-      <w:pPr>
-        <w:pStyle w:val="BodyText"/>
-      </w:pPr>
-      <w:r>
-        <w:t xml:space="preserve">Decretos 12.466 e 12.499/2025 (IOF 3,5%); dolarparalelobolivia.net, 28/10/2026 (P2P Bs 12,13).</w:t>
       </w:r>
     </w:p>
     <w:bookmarkEnd w:id="49"/>
@@ -4628,14 +4585,6 @@
         <w:t xml:space="preserve">Multiplique a sua reserva por 2,25. Esse é, em bolivianos, quanto ela vira pelo Método USDT.</w:t>
       </w:r>
     </w:p>
-    <w:p>
-      <w:pPr>
-        <w:pStyle w:val="BodyText"/>
-      </w:pPr>
-      <w:r>
-        <w:t xml:space="preserve">CoinMarketCap e Investidor10, 28/10/2026; dolarparalelobolivia.net, 28/10/2026; BCB via usdtbol.com, 28/10/2026. Cálculo do curso.</w:t>
-      </w:r>
-    </w:p>
     <w:bookmarkEnd w:id="50"/>
     <w:p>
       <w:r>
@@ -5187,14 +5136,6 @@
         <w:t xml:space="preserve">O socialismo travou o câmbio. A conta chegou. E abriu uma janela para quem tem dólar.</w:t>
       </w:r>
     </w:p>
-    <w:p>
-      <w:pPr>
-        <w:pStyle w:val="BodyText"/>
-      </w:pPr>
-      <w:r>
-        <w:t xml:space="preserve">Infobae; The Rio Times (Bs 6,96 até jun/2026; queda de ~45%, set/2026); usdthoy.com (flutuação desde 29/06/2026); BCB via usdtbol.com, 28/10/2026 (Bs 12,02).</w:t>
-      </w:r>
-    </w:p>
     <w:bookmarkEnd w:id="58"/>
     <w:p>
       <w:r>
@@ -5240,14 +5181,6 @@
           <w:highlight w:val="yellow"/>
         </w:rPr>
         <w:t xml:space="preserve">Bs 12,13</w:t>
-      </w:r>
-    </w:p>
-    <w:p>
-      <w:pPr>
-        <w:pStyle w:val="BodyText"/>
-      </w:pPr>
-      <w:r>
-        <w:t xml:space="preserve">Infobae; The Rio Times; France 24 via Acento (08/11/2025); Agência Brasil (19/10/2025); usdthoy.com; BCB via usdtbol.com e dolarparalelobolivia.net, 28/10/2026.</w:t>
       </w:r>
     </w:p>
     <w:bookmarkEnd w:id="59"/>
@@ -5538,14 +5471,6 @@
       </w:pPr>
       <w:r>
         <w:t xml:space="preserve">Pegue o número da sua reserva e multiplique por 2,25. Anote: esse é o seu poder de compra em bolivianos.</w:t>
-      </w:r>
-    </w:p>
-    <w:p>
-      <w:pPr>
-        <w:pStyle w:val="BodyText"/>
-      </w:pPr>
-      <w:r>
-        <w:t xml:space="preserve">Seção 2.1 do escopo (exemplo-padrão); almoço local US$ 1,50–3 (Food Travel Explore, 2026); aluguel InfoCasas out/2026; Mustang: Facebook Marketplace, autor, out/2026.</w:t>
       </w:r>
     </w:p>
     <w:bookmarkEnd w:id="60"/>
@@ -5707,14 +5632,6 @@
         </w:tc>
       </w:tr>
     </w:tbl>
-    <w:p>
-      <w:pPr>
-        <w:pStyle w:val="BodyText"/>
-      </w:pPr>
-      <w:r>
-        <w:t xml:space="preserve">FipeZAP set/2026 via MySide (Leblon); autor e InfoCasas out/2026 (Cochabamba, faixa US$ 70–170 mil). US$ 1 = R$ 5,35 (Investidor10, 28/10/2026). Preço de anúncio é preço pedido.</w:t>
-      </w:r>
-    </w:p>
     <w:bookmarkEnd w:id="61"/>
     <w:p>
       <w:r>
@@ -5760,14 +5677,6 @@
           <w:highlight w:val="yellow"/>
         </w:rPr>
         <w:t xml:space="preserve">menos que o da Barra</w:t>
-      </w:r>
-    </w:p>
-    <w:p>
-      <w:pPr>
-        <w:pStyle w:val="BodyText"/>
-      </w:pPr>
-      <w:r>
-        <w:t xml:space="preserve">FipeZAP set/2026 via MySide e Daniel Carvalho Imobiliário; Equipetrol: anúncios Century 21, out/2026 (US$ 1.310–1.950/m²); Cochabamba: InfoCasas out/2026 (média ~US$ 940/m²); Calacoto: anúncios Century 21 (~US$ 620–670/m²).</w:t>
       </w:r>
     </w:p>
     <w:bookmarkEnd w:id="62"/>
@@ -6176,14 +6085,6 @@
         <w:t xml:space="preserve">Encontre o seu bairro (ou o mais parecido) e anote quantos apês você teria na Bolívia.</w:t>
       </w:r>
     </w:p>
-    <w:p>
-      <w:pPr>
-        <w:pStyle w:val="BodyText"/>
-      </w:pPr>
-      <w:r>
-        <w:t xml:space="preserve">FipeZAP set/2026 (m² por bairro) × 110 m²; Cochabamba: autor e InfoCasas out/2026. Cálculo do curso.</w:t>
-      </w:r>
-    </w:p>
     <w:bookmarkEnd w:id="63"/>
     <w:p>
       <w:r>
@@ -6323,14 +6224,6 @@
         <w:t xml:space="preserve">Uma casa de 400 m² em condomínio pelo preço de um apê de 140 m² em Pinheiros.</w:t>
       </w:r>
     </w:p>
-    <w:p>
-      <w:pPr>
-        <w:pStyle w:val="BodyText"/>
-      </w:pPr>
-      <w:r>
-        <w:t xml:space="preserve">Century 21 (anúncios em Equipetrol e Urubó, consultados em out/2026; preço pedido); eju.tv (lotes Urubó Golf, US$ 110–170/m²). Pinheiros: FipeZAP set/2026, R$ 18.260/m² × 140 m² ≈ R$ 2,56 mi ≈ US$ 480 mil.</w:t>
-      </w:r>
-    </w:p>
     <w:bookmarkEnd w:id="66"/>
     <w:p>
       <w:r>
@@ -6437,14 +6330,6 @@
       </w:pPr>
       <w:r>
         <w:t xml:space="preserve">[PEDIR AO AUTOR: 3 anúncios reais de venda que você viu, com cidade, bairro, m² e preço]</w:t>
-      </w:r>
-    </w:p>
-    <w:p>
-      <w:pPr>
-        <w:pStyle w:val="BodyText"/>
-      </w:pPr>
-      <w:r>
-        <w:t xml:space="preserve">Century 21 (anúncios Alto Calacoto e Urb. Cordes, preço pedido, out/2026). Guinness World Records (altitude de La Paz).</w:t>
       </w:r>
     </w:p>
     <w:bookmarkEnd w:id="67"/>
@@ -6609,14 +6494,6 @@
       </w:pPr>
       <w:r>
         <w:t xml:space="preserve">Abra um portal de imóveis boliviano hoje e salve 3 anúncios no bairro que você gostou.</w:t>
-      </w:r>
-    </w:p>
-    <w:p>
-      <w:pPr>
-        <w:pStyle w:val="BodyText"/>
-      </w:pPr>
-      <w:r>
-        <w:t xml:space="preserve">Century 21 (anúncio com 60% em dólar e 40% em Bs, out/2026); boliviaimpuestos.com (folio real e Derechos Reales).</w:t>
       </w:r>
     </w:p>
     <w:bookmarkEnd w:id="68"/>
@@ -6863,14 +6740,6 @@
         <w:t xml:space="preserve">Pelo aluguel de 1 mês em São Paulo, você paga até 7 meses em Cochabamba.</w:t>
       </w:r>
     </w:p>
-    <w:p>
-      <w:pPr>
-        <w:pStyle w:val="BodyText"/>
-      </w:pPr>
-      <w:r>
-        <w:t xml:space="preserve">FipeZAP Locação set/2026 (TNH1); InfoCasas out/2026; The Rio Times, set/2026 (Equipetrol e diferença de 1,5–2×). Câmbios: US$ 1 = R$ 5,35; R$ 1 = Bs 2,30.</w:t>
-      </w:r>
-    </w:p>
     <w:bookmarkEnd w:id="69"/>
     <w:p>
       <w:r>
@@ -7110,14 +6979,6 @@
         <w:t xml:space="preserve">Custos: inscrição em Derechos Reales (~0,5% do valor cadastral) e RC-IVA de 10% ao ano sobre o valor do contrato, pago por trimestre.</w:t>
       </w:r>
     </w:p>
-    <w:p>
-      <w:pPr>
-        <w:pStyle w:val="BodyText"/>
-      </w:pPr>
-      <w:r>
-        <w:t xml:space="preserve">InfoNegocios (como funciona); boliviaimpuestos.com (gravame ~0,5%, RC-IVA 10% a.a., Formulário 610; confirmar no SIN). Valores do exemplo: ilustrativos.</w:t>
-      </w:r>
-    </w:p>
     <w:bookmarkEnd w:id="70"/>
     <w:bookmarkEnd w:id="71"/>
     <w:p>
@@ -7293,14 +7154,6 @@
       </w:pPr>
       <w:r>
         <w:t xml:space="preserve">Se o anticrético te interessou, anote: “folio real + Derechos Reales + moeda da devolução”. São as 3 palavras que salvam você.</w:t>
-      </w:r>
-    </w:p>
-    <w:p>
-      <w:pPr>
-        <w:pStyle w:val="BodyText"/>
-      </w:pPr>
-      <w:r>
-        <w:t xml:space="preserve">boliviaimpuestos.com; Red Uno via Bolivian Thoughts (19/11/2025, moeda da devolução); eju.tv (alta de anticréticos e aluguéis; data a confirmar).</w:t>
       </w:r>
     </w:p>
     <w:bookmarkEnd w:id="72"/>
@@ -7855,14 +7708,6 @@
         </w:tc>
       </w:tr>
     </w:tbl>
-    <w:p>
-      <w:pPr>
-        <w:pStyle w:val="BodyText"/>
-      </w:pPr>
-      <w:r>
-        <w:t xml:space="preserve">Facebook Marketplace, levantado pelo autor, out/2026 (preço pedido; anúncios sem dados de terceiros). R$ 1 = Bs 2,30 (autor, 28/10/2026).</w:t>
-      </w:r>
-    </w:p>
     <w:bookmarkEnd w:id="74"/>
     <w:p>
       <w:r>
@@ -7975,14 +7820,6 @@
       </w:pPr>
       <w:r>
         <w:t xml:space="preserve">Enquanto aqui você paga IPVA de carro velho, lá você troca de carro com o troco do apê.</w:t>
-      </w:r>
-    </w:p>
-    <w:p>
-      <w:pPr>
-        <w:pStyle w:val="BodyText"/>
-      </w:pPr>
-      <w:r>
-        <w:t xml:space="preserve">Câmbio de referência do autor (28/10/2026).</w:t>
       </w:r>
     </w:p>
     <w:bookmarkEnd w:id="76"/>
@@ -8440,14 +8277,6 @@
         <w:t xml:space="preserve">.</w:t>
       </w:r>
     </w:p>
-    <w:p>
-      <w:pPr>
-        <w:pStyle w:val="BodyText"/>
-      </w:pPr>
-      <w:r>
-        <w:t xml:space="preserve">ANP set/2026; Correo del Sur ago/2026; France 24 via Acento (crise de combustíveis, 08/11/2025). R$ 1 = Bs 2,30.</w:t>
-      </w:r>
-    </w:p>
     <w:bookmarkEnd w:id="78"/>
     <w:p>
       <w:r>
@@ -8636,14 +8465,6 @@
       </w:pPr>
       <w:r>
         <w:t xml:space="preserve">Um mês inteiro de almoço na Bolívia custa menos que 12 pratos feitos aqui.</w:t>
-      </w:r>
-    </w:p>
-    <w:p>
-      <w:pPr>
-        <w:pStyle w:val="BodyText"/>
-      </w:pPr>
-      <w:r>
-        <w:t xml:space="preserve">FAC-SP, Índice Prato Feito, jun/2026 (via SBT News); Food Travel Explore (2026); Living Cost Index 2026; The Rio Times, set/2026 (casal em Santa Cruz). US$ 1 = R$ 5,35.</w:t>
       </w:r>
     </w:p>
     <w:bookmarkEnd w:id="79"/>
@@ -9024,20 +8845,6 @@
         <w:t xml:space="preserve">Preencha a tabela a lápis. Se o seu multiplicador passar de 2, este curso já se pagou centenas de vezes.</w:t>
       </w:r>
     </w:p>
-    <w:p>
-      <w:pPr>
-        <w:pStyle w:val="BodyText"/>
-      </w:pPr>
-      <w:r>
-        <w:t xml:space="preserve">Referências das páginas anteriores.</w:t>
-      </w:r>
-      <w:r>
-        <w:t xml:space="preserve"> </w:t>
-      </w:r>
-      <w:r>
-        <w:t xml:space="preserve">[PEDIR AO AUTOR: preço real de mercado do mês, contas e academia na sua cidade]</w:t>
-      </w:r>
-    </w:p>
     <w:bookmarkEnd w:id="80"/>
     <w:p>
       <w:r>
@@ -9169,14 +8976,6 @@
       </w:pPr>
       <w:r>
         <w:t xml:space="preserve">O aluguel de 100 m² em SP paga o mês de um casal em Santa Cruz.</w:t>
-      </w:r>
-    </w:p>
-    <w:p>
-      <w:pPr>
-        <w:pStyle w:val="BodyText"/>
-      </w:pPr>
-      <w:r>
-        <w:t xml:space="preserve">Living Cost Index 2026 (solteiro); The Rio Times, set/2026 (casal); FipeZAP Locação set/2026 (SP). US$ 1 = R$ 5,35.</w:t>
       </w:r>
     </w:p>
     <w:bookmarkEnd w:id="84"/>
@@ -9411,20 +9210,6 @@
       </w:r>
       <w:r>
         <w:t xml:space="preserve">Depende do bairro, de dividir o apê e do seu padrão de consumo. Morando sozinho no mesmo apê, o custo seria cerca de R$ 1.917 por mês (aluguel inteiro + as mesmas despesas).</w:t>
-      </w:r>
-    </w:p>
-    <w:p>
-      <w:pPr>
-        <w:pStyle w:val="BodyText"/>
-      </w:pPr>
-      <w:r>
-        <w:t xml:space="preserve">Autor, out/2026 (aluguel e despesas reais). R$ 1 = Bs 2,30 (autor, 28/10/2026). SP: FipeZAP Locação set/2026.</w:t>
-      </w:r>
-      <w:r>
-        <w:t xml:space="preserve"> </w:t>
-      </w:r>
-      <w:r>
-        <w:t xml:space="preserve">[PEDIR AO AUTOR: foto do contrato ou recibo com dados pessoais borrados]</w:t>
       </w:r>
     </w:p>
     <w:bookmarkEnd w:id="85"/>
@@ -9757,14 +9542,6 @@
         <w:t xml:space="preserve">quase 3 vezes mais barato</w:t>
       </w:r>
     </w:p>
-    <w:p>
-      <w:pPr>
-        <w:pStyle w:val="BodyText"/>
-      </w:pPr>
-      <w:r>
-        <w:t xml:space="preserve">Autor, out/2026 (fotos e valores reais). Brasil: FAC-SP, Índice Prato Feito, jun/2026. R$ 1 = Bs 2,30 (autor). Resultado do autor, não é promessa.</w:t>
-      </w:r>
-    </w:p>
     <w:bookmarkEnd w:id="92"/>
     <w:p>
       <w:r>
@@ -10035,14 +9812,6 @@
         <w:t xml:space="preserve">Aqui, R$ 60 paga um almoço com sobremesa. Lá, um jantar premiado com vinho.</w:t>
       </w:r>
     </w:p>
-    <w:p>
-      <w:pPr>
-        <w:pStyle w:val="BodyText"/>
-      </w:pPr>
-      <w:r>
-        <w:t xml:space="preserve">Autor, out/2026 (fotos, cardápio e conta). Placas visíveis na foto do restaurante. SP: ABBT, 2024 (prato, bebida, sobremesa e café). R$ 1 = Bs 2,30.</w:t>
-      </w:r>
-    </w:p>
     <w:bookmarkEnd w:id="99"/>
     <w:p>
       <w:r>
@@ -10198,14 +9967,6 @@
       </w:pPr>
       <w:r>
         <w:t xml:space="preserve">Liste 3 coisas importadas que você usa muito (ex.: iPhone, whey, peças de carro). Planeje comprar no Brasil antes de ir ou pesquise o preço lá.</w:t>
-      </w:r>
-    </w:p>
-    <w:p>
-      <w:pPr>
-        <w:pStyle w:val="BodyText"/>
-      </w:pPr>
-      <w:r>
-        <w:t xml:space="preserve">The Rio Times, set/2026 (aluguel em dólar; câmbio); expat.com (filas em escolas internacionais); France 24 (combustível, 2025).</w:t>
       </w:r>
     </w:p>
     <w:bookmarkEnd w:id="100"/>
@@ -10478,14 +10239,6 @@
         <w:t xml:space="preserve">.</w:t>
       </w:r>
     </w:p>
-    <w:p>
-      <w:pPr>
-        <w:pStyle w:val="BodyText"/>
-      </w:pPr>
-      <w:r>
-        <w:t xml:space="preserve">Orçamentos da página anterior (teto de cada faixa). Cálculo do curso; não considera inflação nem rendimento.</w:t>
-      </w:r>
-    </w:p>
     <w:bookmarkEnd w:id="101"/>
     <w:p>
       <w:r>
@@ -10682,14 +10435,6 @@
       </w:r>
     </w:p>
     <w:bookmarkEnd w:id="103"/>
-    <w:p>
-      <w:pPr>
-        <w:pStyle w:val="BodyText"/>
-      </w:pPr>
-      <w:r>
-        <w:t xml:space="preserve">The Rio Times (Healthcare in Bolivia 2026); GOV.UK (lista de clínicas na Bolívia); Holafly (saúde pública para estrangeiros).</w:t>
-      </w:r>
-    </w:p>
     <w:bookmarkEnd w:id="104"/>
     <w:p>
       <w:r>
@@ -10834,14 +10579,6 @@
       </w:pPr>
       <w:r>
         <w:t xml:space="preserve">Tire hoje uma foto das suas receitas e marque a vacina de febre amarela se ainda não tiver o CIVP.</w:t>
-      </w:r>
-    </w:p>
-    <w:p>
-      <w:pPr>
-        <w:pStyle w:val="BodyText"/>
-      </w:pPr>
-      <w:r>
-        <w:t xml:space="preserve">Mochileiros (CIVP febre amarela para entrada).</w:t>
       </w:r>
     </w:p>
     <w:bookmarkEnd w:id="105"/>
@@ -10985,14 +10722,6 @@
       </w:pPr>
       <w:r>
         <w:t xml:space="preserve">[PEDIR AO AUTOR: preços reais de consulta, exames e seguro que você pagou]</w:t>
-      </w:r>
-    </w:p>
-    <w:p>
-      <w:pPr>
-        <w:pStyle w:val="BodyText"/>
-      </w:pPr>
-      <w:r>
-        <w:t xml:space="preserve">International Medical Relief (pacote Clínica Alemana). US$ 1 = R$ 5,35.</w:t>
       </w:r>
     </w:p>
     <w:bookmarkEnd w:id="106"/>
@@ -11161,14 +10890,6 @@
         </w:tc>
       </w:tr>
     </w:tbl>
-    <w:p>
-      <w:pPr>
-        <w:pStyle w:val="BodyText"/>
-      </w:pPr>
-      <w:r>
-        <w:t xml:space="preserve">Gran Faculdade (média nacional ~R$ 9.500, 2026); Sanarmed (Bolívia R$ 700–1.200); Universidade do Intercâmbio (média ~R$ 750 em Cochabamba e Santa Cruz). Valores variam; confirmar com cada instituição.</w:t>
-      </w:r>
-    </w:p>
     <w:bookmarkEnd w:id="107"/>
     <w:p>
       <w:r>
@@ -11430,14 +11151,6 @@
         <w:t xml:space="preserve">Seu filho médico, sem você vender a casa para pagar a faculdade.</w:t>
       </w:r>
     </w:p>
-    <w:p>
-      <w:pPr>
-        <w:pStyle w:val="BodyText"/>
-      </w:pPr>
-      <w:r>
-        <w:t xml:space="preserve">Universidade do Intercâmbio; Estratégia Vestibulares; Correio do Estado; Querobolsa (lista de universidades). Exemplos, não indicação paga.</w:t>
-      </w:r>
-    </w:p>
     <w:bookmarkEnd w:id="110"/>
     <w:p>
       <w:r>
@@ -11630,14 +11343,6 @@
         <w:t xml:space="preserve">.</w:t>
       </w:r>
     </w:p>
-    <w:p>
-      <w:pPr>
-        <w:pStyle w:val="BodyText"/>
-      </w:pPr>
-      <w:r>
-        <w:t xml:space="preserve">expat.com (guia de Santa Cruz); IBO (Colegio Alemán); CBDE, monitoramento de imprensa, jan/2026 (congelamento e denúncias).</w:t>
-      </w:r>
-    </w:p>
     <w:bookmarkEnd w:id="111"/>
     <w:p>
       <w:r>
@@ -11767,14 +11472,6 @@
       </w:pPr>
       <w:r>
         <w:t xml:space="preserve">Liste as 3 coisas que mais importam para você numa escola. Leve a lista na visita.</w:t>
-      </w:r>
-    </w:p>
-    <w:p>
-      <w:pPr>
-        <w:pStyle w:val="BodyText"/>
-      </w:pPr>
-      <w:r>
-        <w:t xml:space="preserve">expat.com (perfil das escolas internacionais e fila de espera).</w:t>
       </w:r>
     </w:p>
     <w:bookmarkEnd w:id="112"/>
@@ -11977,14 +11674,6 @@
         </w:tc>
       </w:tr>
     </w:tbl>
-    <w:p>
-      <w:pPr>
-        <w:pStyle w:val="BodyText"/>
-      </w:pPr>
-      <w:r>
-        <w:t xml:space="preserve">Guias de viagem 2026 (US$ 140–200); Nomades (US$ 229 até 31/12/2026; semiprivado US$ 710/pessoa para 2). Extras: guia de viagem. Preços de agência, variam por temporada.</w:t>
-      </w:r>
-    </w:p>
     <w:bookmarkEnd w:id="113"/>
     <w:p>
       <w:r>
@@ -12168,20 +11857,6 @@
       </w:pPr>
       <w:r>
         <w:t xml:space="preserve">Aqui você trabalha para pagar boleto. Lá sobra para viver.</w:t>
-      </w:r>
-    </w:p>
-    <w:p>
-      <w:pPr>
-        <w:pStyle w:val="BodyText"/>
-      </w:pPr>
-      <w:r>
-        <w:t xml:space="preserve">Autor, out/2026. R$ 1 = Bs 2,30.</w:t>
-      </w:r>
-      <w:r>
-        <w:t xml:space="preserve"> </w:t>
-      </w:r>
-      <w:r>
-        <w:t xml:space="preserve">[PEDIR AO AUTOR: preço de academia e cinema]</w:t>
       </w:r>
     </w:p>
     <w:bookmarkEnd w:id="114"/>
@@ -12720,14 +12395,6 @@
         <w:t xml:space="preserve">Meses de vida sem renda. Econômico: US$ 820 (solteiro sem aluguel, morando em imóvel próprio ou de família). Confortável: US$ 1.120. Casal alto: US$ 1.300.</w:t>
       </w:r>
     </w:p>
-    <w:p>
-      <w:pPr>
-        <w:pStyle w:val="BodyText"/>
-      </w:pPr>
-      <w:r>
-        <w:t xml:space="preserve">Living Cost Index 2026; The Rio Times, set/2026. US$ 1 = R$ 5,35. Cálculo do curso; sem inflação nem rendimento.</w:t>
-      </w:r>
-    </w:p>
     <w:bookmarkEnd w:id="118"/>
     <w:p>
       <w:r>
@@ -12995,14 +12662,6 @@
         <w:t xml:space="preserve">Some todas as suas rendas que continuam se você se mudar. Coloque na fórmula e descubra quantos meses (ou anos) você tem.</w:t>
       </w:r>
     </w:p>
-    <w:p>
-      <w:pPr>
-        <w:pStyle w:val="BodyText"/>
-      </w:pPr>
-      <w:r>
-        <w:t xml:space="preserve">Orçamento: The Rio Times, set/2026 (teto da faixa do casal). Aluguel SP: FipeZAP Locação set/2026.</w:t>
-      </w:r>
-    </w:p>
     <w:bookmarkEnd w:id="119"/>
     <w:p>
       <w:r>
@@ -13441,14 +13100,6 @@
         <w:t xml:space="preserve">Seu dinheiro. Suas regras. 24 horas por dia.</w:t>
       </w:r>
     </w:p>
-    <w:p>
-      <w:pPr>
-        <w:pStyle w:val="BodyText"/>
-      </w:pPr>
-      <w:r>
-        <w:t xml:space="preserve">Decretos 12.466 e 12.499/2025 (IOF 3,5%); eco.com, guias de 2026 (taxas de rede e tempo de envio; envio errado em geral não tem volta).</w:t>
-      </w:r>
-    </w:p>
     <w:bookmarkEnd w:id="124"/>
     <w:p>
       <w:r>
@@ -13565,14 +13216,6 @@
       </w:pPr>
       <w:r>
         <w:t xml:space="preserve">Instale nada ainda. Só leia até o fim da Parte 3. A pressa aqui é inimiga.</w:t>
-      </w:r>
-    </w:p>
-    <w:p>
-      <w:pPr>
-        <w:pStyle w:val="BodyText"/>
-      </w:pPr>
-      <w:r>
-        <w:t xml:space="preserve">Chainalysis via Investalk/BB (jul/2024–jun/2025: US$ 319 bi; 90% em stablecoins); diretor do BC Renato Dias Gomes, mai/2025 (~90%); Receita Federal via COAD (R$ 1,13 tri declarados em stablecoins, ago/2019–dez/2025, ~80% do volume declarado); InfoMoney e Fizen (Res. BCB 519–521).</w:t>
       </w:r>
     </w:p>
     <w:bookmarkEnd w:id="125"/>
@@ -13806,14 +13449,6 @@
         </w:tc>
       </w:tr>
     </w:tbl>
-    <w:p>
-      <w:pPr>
-        <w:pStyle w:val="BodyText"/>
-      </w:pPr>
-      <w:r>
-        <w:t xml:space="preserve">usdthoy.com (flutuação do boliviano desde 29/06/2026).</w:t>
-      </w:r>
-    </w:p>
     <w:bookmarkEnd w:id="126"/>
     <w:p>
       <w:r>
@@ -13909,14 +13544,6 @@
       </w:pPr>
       <w:r>
         <w:t xml:space="preserve">Use o USDT como ponte, não como cofre eterno.</w:t>
-      </w:r>
-    </w:p>
-    <w:p>
-      <w:pPr>
-        <w:pStyle w:val="BodyText"/>
-      </w:pPr>
-      <w:r>
-        <w:t xml:space="preserve">CoinMarketCap e DefiLlama via Admiral Markets (~12/10/2026: US$ 184 bi; ~60% de US$ 306 bi); atestação BDO do 2º tri/2026 (31/07/2026), via Stablecoin Insider; Crowdfund Insider via Admiral Markets (auditoria em andamento, ago/2026).</w:t>
       </w:r>
     </w:p>
     <w:bookmarkEnd w:id="127"/>
@@ -14185,14 +13812,6 @@
         <w:t xml:space="preserve">Grave esta frase: “USDT para transportar, bolivianos para gastar”.</w:t>
       </w:r>
     </w:p>
-    <w:p>
-      <w:pPr>
-        <w:pStyle w:val="BodyText"/>
-      </w:pPr>
-      <w:r>
-        <w:t xml:space="preserve">DefiLlama via Admiral Markets (~12/10/2026); dolarparalelobolivia.net, 28/10/2026 (P2P Bs 12,13); CriptoNoticias, Criptoinforme e usdthoy (bancos bolivianos).</w:t>
-      </w:r>
-    </w:p>
     <w:bookmarkEnd w:id="128"/>
     <w:p>
       <w:r>
@@ -14403,14 +14022,6 @@
         <w:t xml:space="preserve">Quem entende o risco controla o risco.</w:t>
       </w:r>
     </w:p>
-    <w:p>
-      <w:pPr>
-        <w:pStyle w:val="BodyText"/>
-      </w:pPr>
-      <w:r>
-        <w:t xml:space="preserve">Atestação BDO do 2º tri/2026; Res. BCB 519–521 (operações com stablecoin).</w:t>
-      </w:r>
-    </w:p>
     <w:bookmarkEnd w:id="129"/>
     <w:p>
       <w:r>
@@ -14487,14 +14098,6 @@
         <w:t xml:space="preserve">o USDT, todo dia</w:t>
       </w:r>
     </w:p>
-    <w:p>
-      <w:pPr>
-        <w:pStyle w:val="BodyText"/>
-      </w:pPr>
-      <w:r>
-        <w:t xml:space="preserve">Capital Aberto, mar/2026 (topo de US$ 126 mil em out/2025; retração de 52,4%); AUVP (queda de 13% em 06/02/2026).</w:t>
-      </w:r>
-    </w:p>
     <w:bookmarkEnd w:id="130"/>
     <w:p>
       <w:r>
@@ -14678,14 +14281,6 @@
       </w:pPr>
       <w:r>
         <w:t xml:space="preserve">Quem trabalha e produz não precisa apostar o patrimônio.</w:t>
-      </w:r>
-    </w:p>
-    <w:p>
-      <w:pPr>
-        <w:pStyle w:val="BodyText"/>
-      </w:pPr>
-      <w:r>
-        <w:t xml:space="preserve">AUVP (queda de 13% em um dia, 06/02/2026).</w:t>
       </w:r>
     </w:p>
     <w:bookmarkEnd w:id="133"/>
@@ -15139,14 +14734,6 @@
         <w:t xml:space="preserve">deixe o mínimo possível parado na exchange. Comprou, mandou, vendeu.</w:t>
       </w:r>
     </w:p>
-    <w:p>
-      <w:pPr>
-        <w:pStyle w:val="BodyText"/>
-      </w:pPr>
-      <w:r>
-        <w:t xml:space="preserve">InfoMoney e Fizen (Res. BCB 519–521: identificação de carteira autocustodiada, vigência 02/02/2026).</w:t>
-      </w:r>
-    </w:p>
     <w:bookmarkEnd w:id="137"/>
     <w:p>
       <w:r>
@@ -15687,14 +15274,6 @@
       </w:r>
       <w:r>
         <w:t xml:space="preserve">. Mandou USDT-TRC20 para um endereço de outra rede? Em geral, não tem volta.</w:t>
-      </w:r>
-    </w:p>
-    <w:p>
-      <w:pPr>
-        <w:pStyle w:val="BodyText"/>
-      </w:pPr>
-      <w:r>
-        <w:t xml:space="preserve">eco.com, guias de 2026 (redes do USDT; envio para rede errada em geral não é recuperável).</w:t>
       </w:r>
     </w:p>
     <w:bookmarkEnd w:id="144"/>
@@ -16020,14 +15599,6 @@
         <w:t xml:space="preserve">. A mais barata não serve se o outro lado não recebe</w:t>
       </w:r>
     </w:p>
-    <w:p>
-      <w:pPr>
-        <w:pStyle w:val="BodyText"/>
-      </w:pPr>
-      <w:r>
-        <w:t xml:space="preserve">eco.com, comparativo de taxas de rede, mai/2026 (Binance: TRC20 1, BEP20 0,29, ERC20 1,6, SOL 1 USDT; velocidade TRC20/BEP20 ~1 min, ERC20 ~2 min); comparativo de 2026 (Polygon ~1 USDT). Escopo do curso, Seção 2.1 (taxa de 1 USDT no exemplo-padrão).</w:t>
-      </w:r>
-    </w:p>
     <w:bookmarkEnd w:id="145"/>
     <w:p>
       <w:r>
@@ -16400,14 +15971,6 @@
         <w:t xml:space="preserve">Abra a tela de depósito de qualquer exchange (sem depositar nada) e veja como o endereço muda quando você troca a rede.</w:t>
       </w:r>
     </w:p>
-    <w:p>
-      <w:pPr>
-        <w:pStyle w:val="BodyText"/>
-      </w:pPr>
-      <w:r>
-        <w:t xml:space="preserve">Endereços de exemplo, fictícios e encurtados.</w:t>
-      </w:r>
-    </w:p>
     <w:bookmarkEnd w:id="147"/>
     <w:p>
       <w:r>
@@ -16529,14 +16092,6 @@
       </w:r>
       <w:r>
         <w:t xml:space="preserve">Copie e cole, ou leia o QR. Um caractere errado manda o dinheiro para o lugar errado.</w:t>
-      </w:r>
-    </w:p>
-    <w:p>
-      <w:pPr>
-        <w:pStyle w:val="BodyText"/>
-      </w:pPr>
-      <w:r>
-        <w:t xml:space="preserve">eco.com, guias de 2026 (memo não necessário em TRC20, BEP20 e ERC20, salvo quando o lado que recebe informa um).</w:t>
       </w:r>
     </w:p>
     <w:bookmarkEnd w:id="148"/>
@@ -18806,6 +18361,1264 @@
       </w:r>
       <w:r>
         <w:t xml:space="preserve">, passo a passo, tela a tela</w:t>
+      </w:r>
+    </w:p>
+    <w:p>
+      <w:r>
+        <w:pict>
+          <v:rect style="width:0;height:1.5pt" o:hralign="center" o:hrstd="t" o:hr="t"/>
+        </w:pict>
+      </w:r>
+    </w:p>
+    <w:p>
+      <w:pPr>
+        <w:pStyle w:val="FirstParagraph"/>
+      </w:pPr>
+      <w:r>
+        <w:t xml:space="preserve">Anexo</w:t>
+      </w:r>
+    </w:p>
+    <w:bookmarkStart w:id="158" w:name="fontes-de-todos-os-números"/>
+    <w:p>
+      <w:pPr>
+        <w:pStyle w:val="Heading2"/>
+      </w:pPr>
+      <w:r>
+        <w:t xml:space="preserve">Fontes de todos os números</w:t>
+      </w:r>
+    </w:p>
+    <w:p>
+      <w:pPr>
+        <w:pStyle w:val="FirstParagraph"/>
+      </w:pPr>
+      <w:r>
+        <w:t xml:space="preserve">Cada número do curso tem origem. Aqui estão, página por página.</w:t>
+      </w:r>
+    </w:p>
+    <w:p>
+      <w:pPr>
+        <w:numPr>
+          <w:ilvl w:val="0"/>
+          <w:numId w:val="1036"/>
+        </w:numPr>
+        <w:pStyle w:val="Compact"/>
+      </w:pPr>
+      <w:r>
+        <w:rPr>
+          <w:bCs/>
+          <w:b/>
+        </w:rPr>
+        <w:t xml:space="preserve">p. 2</w:t>
+      </w:r>
+      <w:r>
+        <w:t xml:space="preserve">TSE, resultado do 2º turno de 2022 (58.206.354 votos, 49,1% dos válidos).</w:t>
+      </w:r>
+    </w:p>
+    <w:p>
+      <w:pPr>
+        <w:numPr>
+          <w:ilvl w:val="0"/>
+          <w:numId w:val="1036"/>
+        </w:numPr>
+        <w:pStyle w:val="Compact"/>
+      </w:pPr>
+      <w:r>
+        <w:rPr>
+          <w:bCs/>
+          <w:b/>
+        </w:rPr>
+        <w:t xml:space="preserve">p. 3</w:t>
+      </w:r>
+      <w:r>
+        <w:t xml:space="preserve">Tribunal Supremo Electoral da Bolívia via Agência Brasil (19/10/2025); MercoPress (10/11/2025).</w:t>
+      </w:r>
+    </w:p>
+    <w:p>
+      <w:pPr>
+        <w:numPr>
+          <w:ilvl w:val="0"/>
+          <w:numId w:val="1036"/>
+        </w:numPr>
+        <w:pStyle w:val="Compact"/>
+      </w:pPr>
+      <w:r>
+        <w:rPr>
+          <w:bCs/>
+          <w:b/>
+        </w:rPr>
+        <w:t xml:space="preserve">p. 9</w:t>
+      </w:r>
+      <w:r>
+        <w:t xml:space="preserve">Gazeta do Povo, 2026 (arrecadação de R$ 2,887 tri; carga de 32,4% do PIB) e mar/2026 (43 medidas); Banco Central via Forbes, 27/10/2026 (dívida, ago/2026); reações de lideranças, Gazeta do Povo, 25/10/2026.</w:t>
+      </w:r>
+    </w:p>
+    <w:p>
+      <w:pPr>
+        <w:numPr>
+          <w:ilvl w:val="0"/>
+          <w:numId w:val="1036"/>
+        </w:numPr>
+        <w:pStyle w:val="Compact"/>
+      </w:pPr>
+      <w:r>
+        <w:rPr>
+          <w:bCs/>
+          <w:b/>
+        </w:rPr>
+        <w:t xml:space="preserve">p. 10</w:t>
+      </w:r>
+      <w:r>
+        <w:t xml:space="preserve">TSE (2º turno 2018: 57.797.847 votos; 2022: 58.206.354); Monitor do Debate Político/USP via CartaCapital e O Povo (2024); SSP-SP via SBT News (25/02/2024).</w:t>
+      </w:r>
+    </w:p>
+    <w:p>
+      <w:pPr>
+        <w:numPr>
+          <w:ilvl w:val="0"/>
+          <w:numId w:val="1036"/>
+        </w:numPr>
+        <w:pStyle w:val="Compact"/>
+      </w:pPr>
+      <w:r>
+        <w:rPr>
+          <w:bCs/>
+          <w:b/>
+        </w:rPr>
+        <w:t xml:space="preserve">p. 11</w:t>
+      </w:r>
+      <w:r>
+        <w:t xml:space="preserve">Banco Central de Venezuela via Poder360/DW (29/05/2019); R4V via Bloomberg Línea (2025: 6,70 mi na América Latina + 1,19 mi no resto do mundo); France 24 (08/11/2025); Infobae; The Rio Times.</w:t>
+      </w:r>
+    </w:p>
+    <w:p>
+      <w:pPr>
+        <w:numPr>
+          <w:ilvl w:val="0"/>
+          <w:numId w:val="1036"/>
+        </w:numPr>
+        <w:pStyle w:val="Compact"/>
+      </w:pPr>
+      <w:r>
+        <w:rPr>
+          <w:bCs/>
+          <w:b/>
+        </w:rPr>
+        <w:t xml:space="preserve">p. 12</w:t>
+      </w:r>
+      <w:r>
+        <w:t xml:space="preserve">INDEC Argentina (IPC 2023, 2024 e 2025); MercoPress (10/11/2025); posses oficiais.</w:t>
+      </w:r>
+    </w:p>
+    <w:p>
+      <w:pPr>
+        <w:numPr>
+          <w:ilvl w:val="0"/>
+          <w:numId w:val="1036"/>
+        </w:numPr>
+        <w:pStyle w:val="Compact"/>
+      </w:pPr>
+      <w:r>
+        <w:rPr>
+          <w:bCs/>
+          <w:b/>
+        </w:rPr>
+        <w:t xml:space="preserve">p. 13</w:t>
+      </w:r>
+      <w:r>
+        <w:t xml:space="preserve">IFI via Forbes, 27/10/2026 (ajuste fiscal); Decretos 12.466 e 12.499/2025 (IOF).</w:t>
+      </w:r>
+    </w:p>
+    <w:p>
+      <w:pPr>
+        <w:numPr>
+          <w:ilvl w:val="0"/>
+          <w:numId w:val="1036"/>
+        </w:numPr>
+        <w:pStyle w:val="Compact"/>
+      </w:pPr>
+      <w:r>
+        <w:rPr>
+          <w:bCs/>
+          <w:b/>
+        </w:rPr>
+        <w:t xml:space="preserve">p. 14</w:t>
+      </w:r>
+      <w:r>
+        <w:t xml:space="preserve">Zumper via WLRN (set/2026, Miami US$ 2.500); Zumper via WFLA (Orlando US$ 1.690, data a confirmar); Numbeo mai/2026 via Cidadania e Visto (Lisboa €1.280); FipeZAP Locação set/2026; InfoCasas out/2026. Câmbio: US$ 1 = R$ 5,35 (Investidor10, 28/10/2026); €1 = R$ 5,62 (Meelion, 09/10/2026); R$ 1 = Bs 2,30 (autor).</w:t>
+      </w:r>
+    </w:p>
+    <w:p>
+      <w:pPr>
+        <w:numPr>
+          <w:ilvl w:val="0"/>
+          <w:numId w:val="1036"/>
+        </w:numPr>
+        <w:pStyle w:val="Compact"/>
+      </w:pPr>
+      <w:r>
+        <w:rPr>
+          <w:bCs/>
+          <w:b/>
+        </w:rPr>
+        <w:t xml:space="preserve">p. 15</w:t>
+      </w:r>
+      <w:r>
+        <w:t xml:space="preserve">Mochileiros (entrada com RG/CIN, 90 dias); The Rio Times (residência Mercosul); FlightConnections, abr/2026 (voo direto GRU–VVI, média 3h05); aluguéis: mesmas fontes da página anterior.</w:t>
+      </w:r>
+    </w:p>
+    <w:p>
+      <w:pPr>
+        <w:numPr>
+          <w:ilvl w:val="0"/>
+          <w:numId w:val="1036"/>
+        </w:numPr>
+        <w:pStyle w:val="Compact"/>
+      </w:pPr>
+      <w:r>
+        <w:rPr>
+          <w:bCs/>
+          <w:b/>
+        </w:rPr>
+        <w:t xml:space="preserve">p. 16</w:t>
+      </w:r>
+      <w:r>
+        <w:t xml:space="preserve">Mesmas fontes e câmbios da página anterior. Cálculo do autor do curso.</w:t>
+      </w:r>
+    </w:p>
+    <w:p>
+      <w:pPr>
+        <w:numPr>
+          <w:ilvl w:val="0"/>
+          <w:numId w:val="1036"/>
+        </w:numPr>
+        <w:pStyle w:val="Compact"/>
+      </w:pPr>
+      <w:r>
+        <w:rPr>
+          <w:bCs/>
+          <w:b/>
+        </w:rPr>
+        <w:t xml:space="preserve">p. 17</w:t>
+      </w:r>
+      <w:r>
+        <w:t xml:space="preserve">Mochileiros (entrada); The Rio Times (residência Mercosul, taxa ~450 UFV); FlightConnections, abr/2026 (voo direto São Paulo–Santa Cruz, média 3h05); autor, 28/10/2026 (câmbio de referência).</w:t>
+      </w:r>
+    </w:p>
+    <w:p>
+      <w:pPr>
+        <w:numPr>
+          <w:ilvl w:val="0"/>
+          <w:numId w:val="1036"/>
+        </w:numPr>
+        <w:pStyle w:val="Compact"/>
+      </w:pPr>
+      <w:r>
+        <w:rPr>
+          <w:bCs/>
+          <w:b/>
+        </w:rPr>
+        <w:t xml:space="preserve">p. 18</w:t>
+      </w:r>
+      <w:r>
+        <w:t xml:space="preserve">Agência Brasil e Poder360 (19/10/2025); MercoPress (10/11/2025); France 24 via Acento (08/11/2025); usdthoy.com (flutuação desde 29/06/2026).</w:t>
+      </w:r>
+    </w:p>
+    <w:bookmarkEnd w:id="158"/>
+    <w:p>
+      <w:r>
+        <w:pict>
+          <v:rect style="width:0;height:1.5pt" o:hralign="center" o:hrstd="t" o:hr="t"/>
+        </w:pict>
+      </w:r>
+    </w:p>
+    <w:p>
+      <w:pPr>
+        <w:numPr>
+          <w:ilvl w:val="0"/>
+          <w:numId w:val="1037"/>
+        </w:numPr>
+        <w:pStyle w:val="Compact"/>
+      </w:pPr>
+      <w:r>
+        <w:rPr>
+          <w:bCs/>
+          <w:b/>
+        </w:rPr>
+        <w:t xml:space="preserve">p. 19</w:t>
+      </w:r>
+      <w:r>
+        <w:t xml:space="preserve">Infobae; The Rio Times (Bs 6,96); BCB via usdtbol.com, 28/10/2026 (Bs 12,02); Facebook Marketplace, levantado pelo autor, out/2026 (preço pedido).</w:t>
+      </w:r>
+    </w:p>
+    <w:p>
+      <w:pPr>
+        <w:numPr>
+          <w:ilvl w:val="0"/>
+          <w:numId w:val="1037"/>
+        </w:numPr>
+        <w:pStyle w:val="Compact"/>
+      </w:pPr>
+      <w:r>
+        <w:rPr>
+          <w:bCs/>
+          <w:b/>
+        </w:rPr>
+        <w:t xml:space="preserve">p. 20</w:t>
+      </w:r>
+      <w:r>
+        <w:t xml:space="preserve">FipeZAP set/2026 via MySide; InfoCasas out/2026; Facebook Marketplace (autor, out/2026); Correo del Sur ago/2026; ANP set/2026. Câmbios: US$ 1 = R$ 5,35; R$ 1 = Bs 2,30.</w:t>
+      </w:r>
+    </w:p>
+    <w:p>
+      <w:pPr>
+        <w:numPr>
+          <w:ilvl w:val="0"/>
+          <w:numId w:val="1037"/>
+        </w:numPr>
+        <w:pStyle w:val="Compact"/>
+      </w:pPr>
+      <w:r>
+        <w:rPr>
+          <w:bCs/>
+          <w:b/>
+        </w:rPr>
+        <w:t xml:space="preserve">p. 21</w:t>
+      </w:r>
+      <w:r>
+        <w:t xml:space="preserve">Decretos 12.466 e 12.499/2025 (IOF 3,5%); dolarparalelobolivia.net, 28/10/2026 (P2P Bs 12,13).</w:t>
+      </w:r>
+    </w:p>
+    <w:p>
+      <w:pPr>
+        <w:numPr>
+          <w:ilvl w:val="0"/>
+          <w:numId w:val="1037"/>
+        </w:numPr>
+        <w:pStyle w:val="Compact"/>
+      </w:pPr>
+      <w:r>
+        <w:rPr>
+          <w:bCs/>
+          <w:b/>
+        </w:rPr>
+        <w:t xml:space="preserve">p. 22</w:t>
+      </w:r>
+      <w:r>
+        <w:t xml:space="preserve">CoinMarketCap e Investidor10, 28/10/2026; dolarparalelobolivia.net, 28/10/2026; BCB via usdtbol.com, 28/10/2026. Cálculo do curso.</w:t>
+      </w:r>
+    </w:p>
+    <w:p>
+      <w:pPr>
+        <w:numPr>
+          <w:ilvl w:val="0"/>
+          <w:numId w:val="1037"/>
+        </w:numPr>
+        <w:pStyle w:val="Compact"/>
+      </w:pPr>
+      <w:r>
+        <w:rPr>
+          <w:bCs/>
+          <w:b/>
+        </w:rPr>
+        <w:t xml:space="preserve">p. 27</w:t>
+      </w:r>
+      <w:r>
+        <w:t xml:space="preserve">Infobae; The Rio Times (Bs 6,96 até jun/2026; queda de ~45%, set/2026); usdthoy.com (flutuação desde 29/06/2026); BCB via usdtbol.com, 28/10/2026 (Bs 12,02).</w:t>
+      </w:r>
+    </w:p>
+    <w:p>
+      <w:pPr>
+        <w:numPr>
+          <w:ilvl w:val="0"/>
+          <w:numId w:val="1037"/>
+        </w:numPr>
+        <w:pStyle w:val="Compact"/>
+      </w:pPr>
+      <w:r>
+        <w:rPr>
+          <w:bCs/>
+          <w:b/>
+        </w:rPr>
+        <w:t xml:space="preserve">p. 28</w:t>
+      </w:r>
+      <w:r>
+        <w:t xml:space="preserve">Infobae; The Rio Times; France 24 via Acento (08/11/2025); Agência Brasil (19/10/2025); usdthoy.com; BCB via usdtbol.com e dolarparalelobolivia.net, 28/10/2026.</w:t>
+      </w:r>
+    </w:p>
+    <w:p>
+      <w:pPr>
+        <w:numPr>
+          <w:ilvl w:val="0"/>
+          <w:numId w:val="1037"/>
+        </w:numPr>
+        <w:pStyle w:val="Compact"/>
+      </w:pPr>
+      <w:r>
+        <w:rPr>
+          <w:bCs/>
+          <w:b/>
+        </w:rPr>
+        <w:t xml:space="preserve">p. 29</w:t>
+      </w:r>
+      <w:r>
+        <w:t xml:space="preserve">Seção 2.1 do escopo (exemplo-padrão); almoço local US$ 1,50–3 (Food Travel Explore, 2026); aluguel InfoCasas out/2026; Mustang: Facebook Marketplace, autor, out/2026.</w:t>
+      </w:r>
+    </w:p>
+    <w:p>
+      <w:pPr>
+        <w:numPr>
+          <w:ilvl w:val="0"/>
+          <w:numId w:val="1037"/>
+        </w:numPr>
+        <w:pStyle w:val="Compact"/>
+      </w:pPr>
+      <w:r>
+        <w:rPr>
+          <w:bCs/>
+          <w:b/>
+        </w:rPr>
+        <w:t xml:space="preserve">p. 30</w:t>
+      </w:r>
+      <w:r>
+        <w:t xml:space="preserve">FipeZAP set/2026 via MySide (Leblon); autor e InfoCasas out/2026 (Cochabamba, faixa US$ 70–170 mil). US$ 1 = R$ 5,35 (Investidor10, 28/10/2026). Preço de anúncio é preço pedido.</w:t>
+      </w:r>
+    </w:p>
+    <w:p>
+      <w:pPr>
+        <w:numPr>
+          <w:ilvl w:val="0"/>
+          <w:numId w:val="1037"/>
+        </w:numPr>
+        <w:pStyle w:val="Compact"/>
+      </w:pPr>
+      <w:r>
+        <w:rPr>
+          <w:bCs/>
+          <w:b/>
+        </w:rPr>
+        <w:t xml:space="preserve">p. 31</w:t>
+      </w:r>
+      <w:r>
+        <w:t xml:space="preserve">FipeZAP set/2026 via MySide e Daniel Carvalho Imobiliário; Equipetrol: anúncios Century 21, out/2026 (US$ 1.310–1.950/m²); Cochabamba: InfoCasas out/2026 (média ~US$ 940/m²); Calacoto: anúncios Century 21 (~US$ 620–670/m²).</w:t>
+      </w:r>
+    </w:p>
+    <w:p>
+      <w:pPr>
+        <w:numPr>
+          <w:ilvl w:val="0"/>
+          <w:numId w:val="1037"/>
+        </w:numPr>
+        <w:pStyle w:val="Compact"/>
+      </w:pPr>
+      <w:r>
+        <w:rPr>
+          <w:bCs/>
+          <w:b/>
+        </w:rPr>
+        <w:t xml:space="preserve">p. 32</w:t>
+      </w:r>
+      <w:r>
+        <w:t xml:space="preserve">FipeZAP set/2026 (m² por bairro) × 110 m²; Cochabamba: autor e InfoCasas out/2026. Cálculo do curso.</w:t>
+      </w:r>
+    </w:p>
+    <w:p>
+      <w:pPr>
+        <w:numPr>
+          <w:ilvl w:val="0"/>
+          <w:numId w:val="1037"/>
+        </w:numPr>
+        <w:pStyle w:val="Compact"/>
+      </w:pPr>
+      <w:r>
+        <w:rPr>
+          <w:bCs/>
+          <w:b/>
+        </w:rPr>
+        <w:t xml:space="preserve">p. 33</w:t>
+      </w:r>
+      <w:r>
+        <w:t xml:space="preserve">Century 21 (anúncios em Equipetrol e Urubó, consultados em out/2026; preço pedido); eju.tv (lotes Urubó Golf, US$ 110–170/m²). Pinheiros: FipeZAP set/2026, R$ 18.260/m² × 140 m² ≈ R$ 2,56 mi ≈ US$ 480 mil.</w:t>
+      </w:r>
+    </w:p>
+    <w:p>
+      <w:r>
+        <w:pict>
+          <v:rect style="width:0;height:1.5pt" o:hralign="center" o:hrstd="t" o:hr="t"/>
+        </w:pict>
+      </w:r>
+    </w:p>
+    <w:p>
+      <w:pPr>
+        <w:numPr>
+          <w:ilvl w:val="0"/>
+          <w:numId w:val="1038"/>
+        </w:numPr>
+        <w:pStyle w:val="Compact"/>
+      </w:pPr>
+      <w:r>
+        <w:rPr>
+          <w:bCs/>
+          <w:b/>
+        </w:rPr>
+        <w:t xml:space="preserve">p. 34</w:t>
+      </w:r>
+      <w:r>
+        <w:t xml:space="preserve">Century 21 (anúncios Alto Calacoto e Urb. Cordes, preço pedido, out/2026). Guinness World Records (altitude de La Paz).</w:t>
+      </w:r>
+    </w:p>
+    <w:p>
+      <w:pPr>
+        <w:numPr>
+          <w:ilvl w:val="0"/>
+          <w:numId w:val="1038"/>
+        </w:numPr>
+        <w:pStyle w:val="Compact"/>
+      </w:pPr>
+      <w:r>
+        <w:rPr>
+          <w:bCs/>
+          <w:b/>
+        </w:rPr>
+        <w:t xml:space="preserve">p. 35</w:t>
+      </w:r>
+      <w:r>
+        <w:t xml:space="preserve">Century 21 (anúncio com 60% em dólar e 40% em Bs, out/2026); boliviaimpuestos.com (folio real e Derechos Reales).</w:t>
+      </w:r>
+    </w:p>
+    <w:p>
+      <w:pPr>
+        <w:numPr>
+          <w:ilvl w:val="0"/>
+          <w:numId w:val="1038"/>
+        </w:numPr>
+        <w:pStyle w:val="Compact"/>
+      </w:pPr>
+      <w:r>
+        <w:rPr>
+          <w:bCs/>
+          <w:b/>
+        </w:rPr>
+        <w:t xml:space="preserve">p. 36</w:t>
+      </w:r>
+      <w:r>
+        <w:t xml:space="preserve">FipeZAP Locação set/2026 (TNH1); InfoCasas out/2026; The Rio Times, set/2026 (Equipetrol e diferença de 1,5–2×). Câmbios: US$ 1 = R$ 5,35; R$ 1 = Bs 2,30.</w:t>
+      </w:r>
+    </w:p>
+    <w:p>
+      <w:pPr>
+        <w:numPr>
+          <w:ilvl w:val="0"/>
+          <w:numId w:val="1038"/>
+        </w:numPr>
+        <w:pStyle w:val="Compact"/>
+      </w:pPr>
+      <w:r>
+        <w:rPr>
+          <w:bCs/>
+          <w:b/>
+        </w:rPr>
+        <w:t xml:space="preserve">p. 37</w:t>
+      </w:r>
+      <w:r>
+        <w:t xml:space="preserve">InfoNegocios (como funciona); boliviaimpuestos.com (gravame ~0,5%, RC-IVA 10% a.a., Formulário 610; confirmar no SIN). Valores do exemplo: ilustrativos.</w:t>
+      </w:r>
+    </w:p>
+    <w:p>
+      <w:pPr>
+        <w:numPr>
+          <w:ilvl w:val="0"/>
+          <w:numId w:val="1038"/>
+        </w:numPr>
+        <w:pStyle w:val="Compact"/>
+      </w:pPr>
+      <w:r>
+        <w:rPr>
+          <w:bCs/>
+          <w:b/>
+        </w:rPr>
+        <w:t xml:space="preserve">p. 38</w:t>
+      </w:r>
+      <w:r>
+        <w:t xml:space="preserve">boliviaimpuestos.com; Red Uno via Bolivian Thoughts (19/11/2025, moeda da devolução); eju.tv (alta de anticréticos e aluguéis; data a confirmar).</w:t>
+      </w:r>
+    </w:p>
+    <w:p>
+      <w:pPr>
+        <w:numPr>
+          <w:ilvl w:val="0"/>
+          <w:numId w:val="1038"/>
+        </w:numPr>
+        <w:pStyle w:val="Compact"/>
+      </w:pPr>
+      <w:r>
+        <w:rPr>
+          <w:bCs/>
+          <w:b/>
+        </w:rPr>
+        <w:t xml:space="preserve">p. 40</w:t>
+      </w:r>
+      <w:r>
+        <w:t xml:space="preserve">Facebook Marketplace, levantado pelo autor, out/2026 (preço pedido; anúncios sem dados de terceiros). R$ 1 = Bs 2,30 (autor, 28/10/2026).</w:t>
+      </w:r>
+    </w:p>
+    <w:p>
+      <w:pPr>
+        <w:numPr>
+          <w:ilvl w:val="0"/>
+          <w:numId w:val="1038"/>
+        </w:numPr>
+        <w:pStyle w:val="Compact"/>
+      </w:pPr>
+      <w:r>
+        <w:rPr>
+          <w:bCs/>
+          <w:b/>
+        </w:rPr>
+        <w:t xml:space="preserve">p. 41</w:t>
+      </w:r>
+      <w:r>
+        <w:t xml:space="preserve">Câmbio de referência do autor (28/10/2026).</w:t>
+      </w:r>
+    </w:p>
+    <w:p>
+      <w:pPr>
+        <w:numPr>
+          <w:ilvl w:val="0"/>
+          <w:numId w:val="1038"/>
+        </w:numPr>
+        <w:pStyle w:val="Compact"/>
+      </w:pPr>
+      <w:r>
+        <w:rPr>
+          <w:bCs/>
+          <w:b/>
+        </w:rPr>
+        <w:t xml:space="preserve">p. 43</w:t>
+      </w:r>
+      <w:r>
+        <w:t xml:space="preserve">ANP set/2026; Correo del Sur ago/2026; France 24 via Acento (crise de combustíveis, 08/11/2025). R$ 1 = Bs 2,30.</w:t>
+      </w:r>
+    </w:p>
+    <w:p>
+      <w:pPr>
+        <w:numPr>
+          <w:ilvl w:val="0"/>
+          <w:numId w:val="1038"/>
+        </w:numPr>
+        <w:pStyle w:val="Compact"/>
+      </w:pPr>
+      <w:r>
+        <w:rPr>
+          <w:bCs/>
+          <w:b/>
+        </w:rPr>
+        <w:t xml:space="preserve">p. 44</w:t>
+      </w:r>
+      <w:r>
+        <w:t xml:space="preserve">FAC-SP, Índice Prato Feito, jun/2026 (via SBT News); Food Travel Explore (2026); Living Cost Index 2026; The Rio Times, set/2026 (casal em Santa Cruz). US$ 1 = R$ 5,35.</w:t>
+      </w:r>
+    </w:p>
+    <w:p>
+      <w:pPr>
+        <w:numPr>
+          <w:ilvl w:val="0"/>
+          <w:numId w:val="1038"/>
+        </w:numPr>
+        <w:pStyle w:val="Compact"/>
+      </w:pPr>
+      <w:r>
+        <w:rPr>
+          <w:bCs/>
+          <w:b/>
+        </w:rPr>
+        <w:t xml:space="preserve">p. 45</w:t>
+      </w:r>
+      <w:r>
+        <w:t xml:space="preserve">Referências das páginas anteriores.</w:t>
+      </w:r>
+    </w:p>
+    <w:p>
+      <w:pPr>
+        <w:numPr>
+          <w:ilvl w:val="0"/>
+          <w:numId w:val="1038"/>
+        </w:numPr>
+        <w:pStyle w:val="Compact"/>
+      </w:pPr>
+      <w:r>
+        <w:rPr>
+          <w:bCs/>
+          <w:b/>
+        </w:rPr>
+        <w:t xml:space="preserve">p. 46</w:t>
+      </w:r>
+      <w:r>
+        <w:t xml:space="preserve">Living Cost Index 2026 (solteiro); The Rio Times, set/2026 (casal); FipeZAP Locação set/2026 (SP). US$ 1 = R$ 5,35.</w:t>
+      </w:r>
+    </w:p>
+    <w:p>
+      <w:pPr>
+        <w:numPr>
+          <w:ilvl w:val="0"/>
+          <w:numId w:val="1038"/>
+        </w:numPr>
+        <w:pStyle w:val="Compact"/>
+      </w:pPr>
+      <w:r>
+        <w:rPr>
+          <w:bCs/>
+          <w:b/>
+        </w:rPr>
+        <w:t xml:space="preserve">p. 47</w:t>
+      </w:r>
+      <w:r>
+        <w:t xml:space="preserve">Autor, out/2026 (aluguel e despesas reais). R$ 1 = Bs 2,30 (autor, 28/10/2026). SP: FipeZAP Locação set/2026.</w:t>
+      </w:r>
+    </w:p>
+    <w:p>
+      <w:pPr>
+        <w:numPr>
+          <w:ilvl w:val="0"/>
+          <w:numId w:val="1038"/>
+        </w:numPr>
+        <w:pStyle w:val="Compact"/>
+      </w:pPr>
+      <w:r>
+        <w:rPr>
+          <w:bCs/>
+          <w:b/>
+        </w:rPr>
+        <w:t xml:space="preserve">p. 48</w:t>
+      </w:r>
+      <w:r>
+        <w:t xml:space="preserve">Autor, out/2026 (fotos e valores reais). Brasil: FAC-SP, Índice Prato Feito, jun/2026. R$ 1 = Bs 2,30 (autor). Resultado do autor, não é promessa.</w:t>
+      </w:r>
+    </w:p>
+    <w:p>
+      <w:pPr>
+        <w:numPr>
+          <w:ilvl w:val="0"/>
+          <w:numId w:val="1038"/>
+        </w:numPr>
+        <w:pStyle w:val="Compact"/>
+      </w:pPr>
+      <w:r>
+        <w:rPr>
+          <w:bCs/>
+          <w:b/>
+        </w:rPr>
+        <w:t xml:space="preserve">p. 49</w:t>
+      </w:r>
+      <w:r>
+        <w:t xml:space="preserve">Autor, out/2026 (fotos, cardápio e conta). Placas visíveis na foto do restaurante. SP: ABBT, 2024 (prato, bebida, sobremesa e café). R$ 1 = Bs 2,30.</w:t>
+      </w:r>
+    </w:p>
+    <w:p>
+      <w:r>
+        <w:pict>
+          <v:rect style="width:0;height:1.5pt" o:hralign="center" o:hrstd="t" o:hr="t"/>
+        </w:pict>
+      </w:r>
+    </w:p>
+    <w:p>
+      <w:pPr>
+        <w:numPr>
+          <w:ilvl w:val="0"/>
+          <w:numId w:val="1039"/>
+        </w:numPr>
+        <w:pStyle w:val="Compact"/>
+      </w:pPr>
+      <w:r>
+        <w:rPr>
+          <w:bCs/>
+          <w:b/>
+        </w:rPr>
+        <w:t xml:space="preserve">p. 50</w:t>
+      </w:r>
+      <w:r>
+        <w:t xml:space="preserve">The Rio Times, set/2026 (aluguel em dólar; câmbio); expat.com (filas em escolas internacionais); France 24 (combustível, 2025).</w:t>
+      </w:r>
+    </w:p>
+    <w:p>
+      <w:pPr>
+        <w:numPr>
+          <w:ilvl w:val="0"/>
+          <w:numId w:val="1039"/>
+        </w:numPr>
+        <w:pStyle w:val="Compact"/>
+      </w:pPr>
+      <w:r>
+        <w:rPr>
+          <w:bCs/>
+          <w:b/>
+        </w:rPr>
+        <w:t xml:space="preserve">p. 51</w:t>
+      </w:r>
+      <w:r>
+        <w:t xml:space="preserve">Orçamentos da página anterior (teto de cada faixa). Cálculo do curso; não considera inflação nem rendimento.</w:t>
+      </w:r>
+    </w:p>
+    <w:p>
+      <w:pPr>
+        <w:numPr>
+          <w:ilvl w:val="0"/>
+          <w:numId w:val="1039"/>
+        </w:numPr>
+        <w:pStyle w:val="Compact"/>
+      </w:pPr>
+      <w:r>
+        <w:rPr>
+          <w:bCs/>
+          <w:b/>
+        </w:rPr>
+        <w:t xml:space="preserve">p. 52</w:t>
+      </w:r>
+      <w:r>
+        <w:t xml:space="preserve">The Rio Times (Healthcare in Bolivia 2026); GOV.UK (lista de clínicas na Bolívia); Holafly (saúde pública para estrangeiros).</w:t>
+      </w:r>
+    </w:p>
+    <w:p>
+      <w:pPr>
+        <w:numPr>
+          <w:ilvl w:val="0"/>
+          <w:numId w:val="1039"/>
+        </w:numPr>
+        <w:pStyle w:val="Compact"/>
+      </w:pPr>
+      <w:r>
+        <w:rPr>
+          <w:bCs/>
+          <w:b/>
+        </w:rPr>
+        <w:t xml:space="preserve">p. 53</w:t>
+      </w:r>
+      <w:r>
+        <w:t xml:space="preserve">Mochileiros (CIVP febre amarela para entrada).</w:t>
+      </w:r>
+    </w:p>
+    <w:p>
+      <w:pPr>
+        <w:numPr>
+          <w:ilvl w:val="0"/>
+          <w:numId w:val="1039"/>
+        </w:numPr>
+        <w:pStyle w:val="Compact"/>
+      </w:pPr>
+      <w:r>
+        <w:rPr>
+          <w:bCs/>
+          <w:b/>
+        </w:rPr>
+        <w:t xml:space="preserve">p. 54</w:t>
+      </w:r>
+      <w:r>
+        <w:t xml:space="preserve">International Medical Relief (pacote Clínica Alemana). US$ 1 = R$ 5,35.</w:t>
+      </w:r>
+    </w:p>
+    <w:p>
+      <w:pPr>
+        <w:numPr>
+          <w:ilvl w:val="0"/>
+          <w:numId w:val="1039"/>
+        </w:numPr>
+        <w:pStyle w:val="Compact"/>
+      </w:pPr>
+      <w:r>
+        <w:rPr>
+          <w:bCs/>
+          <w:b/>
+        </w:rPr>
+        <w:t xml:space="preserve">p. 55</w:t>
+      </w:r>
+      <w:r>
+        <w:t xml:space="preserve">Gran Faculdade (média nacional ~R$ 9.500, 2026); Sanarmed (Bolívia R$ 700–1.200); Universidade do Intercâmbio (média ~R$ 750 em Cochabamba e Santa Cruz). Valores variam; confirmar com cada instituição.</w:t>
+      </w:r>
+    </w:p>
+    <w:p>
+      <w:pPr>
+        <w:numPr>
+          <w:ilvl w:val="0"/>
+          <w:numId w:val="1039"/>
+        </w:numPr>
+        <w:pStyle w:val="Compact"/>
+      </w:pPr>
+      <w:r>
+        <w:rPr>
+          <w:bCs/>
+          <w:b/>
+        </w:rPr>
+        <w:t xml:space="preserve">p. 56</w:t>
+      </w:r>
+      <w:r>
+        <w:t xml:space="preserve">Universidade do Intercâmbio; Estratégia Vestibulares; Correio do Estado; Querobolsa (lista de universidades). Exemplos, não indicação paga.</w:t>
+      </w:r>
+    </w:p>
+    <w:p>
+      <w:pPr>
+        <w:numPr>
+          <w:ilvl w:val="0"/>
+          <w:numId w:val="1039"/>
+        </w:numPr>
+        <w:pStyle w:val="Compact"/>
+      </w:pPr>
+      <w:r>
+        <w:rPr>
+          <w:bCs/>
+          <w:b/>
+        </w:rPr>
+        <w:t xml:space="preserve">p. 57</w:t>
+      </w:r>
+      <w:r>
+        <w:t xml:space="preserve">expat.com (guia de Santa Cruz); IBO (Colegio Alemán); CBDE, monitoramento de imprensa, jan/2026 (congelamento e denúncias).</w:t>
+      </w:r>
+    </w:p>
+    <w:p>
+      <w:pPr>
+        <w:numPr>
+          <w:ilvl w:val="0"/>
+          <w:numId w:val="1039"/>
+        </w:numPr>
+        <w:pStyle w:val="Compact"/>
+      </w:pPr>
+      <w:r>
+        <w:rPr>
+          <w:bCs/>
+          <w:b/>
+        </w:rPr>
+        <w:t xml:space="preserve">p. 58</w:t>
+      </w:r>
+      <w:r>
+        <w:t xml:space="preserve">expat.com (perfil das escolas internacionais e fila de espera).</w:t>
+      </w:r>
+    </w:p>
+    <w:p>
+      <w:pPr>
+        <w:numPr>
+          <w:ilvl w:val="0"/>
+          <w:numId w:val="1039"/>
+        </w:numPr>
+        <w:pStyle w:val="Compact"/>
+      </w:pPr>
+      <w:r>
+        <w:rPr>
+          <w:bCs/>
+          <w:b/>
+        </w:rPr>
+        <w:t xml:space="preserve">p. 59</w:t>
+      </w:r>
+      <w:r>
+        <w:t xml:space="preserve">Guias de viagem 2026 (US$ 140–200); Nomades (US$ 229 até 31/12/2026; semiprivado US$ 710/pessoa para 2). Extras: guia de viagem. Preços de agência, variam por temporada.</w:t>
+      </w:r>
+    </w:p>
+    <w:p>
+      <w:pPr>
+        <w:numPr>
+          <w:ilvl w:val="0"/>
+          <w:numId w:val="1039"/>
+        </w:numPr>
+        <w:pStyle w:val="Compact"/>
+      </w:pPr>
+      <w:r>
+        <w:rPr>
+          <w:bCs/>
+          <w:b/>
+        </w:rPr>
+        <w:t xml:space="preserve">p. 60</w:t>
+      </w:r>
+      <w:r>
+        <w:t xml:space="preserve">Autor, out/2026. R$ 1 = Bs 2,30.</w:t>
+      </w:r>
+    </w:p>
+    <w:p>
+      <w:pPr>
+        <w:numPr>
+          <w:ilvl w:val="0"/>
+          <w:numId w:val="1039"/>
+        </w:numPr>
+        <w:pStyle w:val="Compact"/>
+      </w:pPr>
+      <w:r>
+        <w:rPr>
+          <w:bCs/>
+          <w:b/>
+        </w:rPr>
+        <w:t xml:space="preserve">p. 62</w:t>
+      </w:r>
+      <w:r>
+        <w:t xml:space="preserve">Living Cost Index 2026; The Rio Times, set/2026. US$ 1 = R$ 5,35. Cálculo do curso; sem inflação nem rendimento.</w:t>
+      </w:r>
+    </w:p>
+    <w:p>
+      <w:pPr>
+        <w:numPr>
+          <w:ilvl w:val="0"/>
+          <w:numId w:val="1039"/>
+        </w:numPr>
+        <w:pStyle w:val="Compact"/>
+      </w:pPr>
+      <w:r>
+        <w:rPr>
+          <w:bCs/>
+          <w:b/>
+        </w:rPr>
+        <w:t xml:space="preserve">p. 63</w:t>
+      </w:r>
+      <w:r>
+        <w:t xml:space="preserve">Orçamento: The Rio Times, set/2026 (teto da faixa do casal). Aluguel SP: FipeZAP Locação set/2026.</w:t>
+      </w:r>
+    </w:p>
+    <w:p>
+      <w:pPr>
+        <w:numPr>
+          <w:ilvl w:val="0"/>
+          <w:numId w:val="1039"/>
+        </w:numPr>
+        <w:pStyle w:val="Compact"/>
+      </w:pPr>
+      <w:r>
+        <w:rPr>
+          <w:bCs/>
+          <w:b/>
+        </w:rPr>
+        <w:t xml:space="preserve">p. 67</w:t>
+      </w:r>
+      <w:r>
+        <w:t xml:space="preserve">Decretos 12.466 e 12.499/2025 (IOF 3,5%); eco.com, guias de 2026 (taxas de rede e tempo de envio; envio errado em geral não tem volta).</w:t>
+      </w:r>
+    </w:p>
+    <w:p>
+      <w:r>
+        <w:pict>
+          <v:rect style="width:0;height:1.5pt" o:hralign="center" o:hrstd="t" o:hr="t"/>
+        </w:pict>
+      </w:r>
+    </w:p>
+    <w:p>
+      <w:pPr>
+        <w:numPr>
+          <w:ilvl w:val="0"/>
+          <w:numId w:val="1040"/>
+        </w:numPr>
+        <w:pStyle w:val="Compact"/>
+      </w:pPr>
+      <w:r>
+        <w:rPr>
+          <w:bCs/>
+          <w:b/>
+        </w:rPr>
+        <w:t xml:space="preserve">p. 68</w:t>
+      </w:r>
+      <w:r>
+        <w:t xml:space="preserve">Chainalysis via Investalk/BB (jul/2024–jun/2025: US$ 319 bi; 90% em stablecoins); diretor do BC Renato Dias Gomes, mai/2025 (~90%); Receita Federal via COAD (R$ 1,13 tri declarados em stablecoins, ago/2019–dez/2025, ~80% do volume declarado); InfoMoney e Fizen (Res. BCB 519–521).</w:t>
+      </w:r>
+    </w:p>
+    <w:p>
+      <w:pPr>
+        <w:numPr>
+          <w:ilvl w:val="0"/>
+          <w:numId w:val="1040"/>
+        </w:numPr>
+        <w:pStyle w:val="Compact"/>
+      </w:pPr>
+      <w:r>
+        <w:rPr>
+          <w:bCs/>
+          <w:b/>
+        </w:rPr>
+        <w:t xml:space="preserve">p. 69</w:t>
+      </w:r>
+      <w:r>
+        <w:t xml:space="preserve">usdthoy.com (flutuação do boliviano desde 29/06/2026).</w:t>
+      </w:r>
+    </w:p>
+    <w:p>
+      <w:pPr>
+        <w:numPr>
+          <w:ilvl w:val="0"/>
+          <w:numId w:val="1040"/>
+        </w:numPr>
+        <w:pStyle w:val="Compact"/>
+      </w:pPr>
+      <w:r>
+        <w:rPr>
+          <w:bCs/>
+          <w:b/>
+        </w:rPr>
+        <w:t xml:space="preserve">p. 70</w:t>
+      </w:r>
+      <w:r>
+        <w:t xml:space="preserve">CoinMarketCap e DefiLlama via Admiral Markets (~12/10/2026: US$ 184 bi; ~60% de US$ 306 bi); atestação BDO do 2º tri/2026 (31/07/2026), via Stablecoin Insider; Crowdfund Insider via Admiral Markets (auditoria em andamento, ago/2026).</w:t>
+      </w:r>
+    </w:p>
+    <w:p>
+      <w:pPr>
+        <w:numPr>
+          <w:ilvl w:val="0"/>
+          <w:numId w:val="1040"/>
+        </w:numPr>
+        <w:pStyle w:val="Compact"/>
+      </w:pPr>
+      <w:r>
+        <w:rPr>
+          <w:bCs/>
+          <w:b/>
+        </w:rPr>
+        <w:t xml:space="preserve">p. 71</w:t>
+      </w:r>
+      <w:r>
+        <w:t xml:space="preserve">DefiLlama via Admiral Markets (~12/10/2026); dolarparalelobolivia.net, 28/10/2026 (P2P Bs 12,13); CriptoNoticias, Criptoinforme e usdthoy (bancos bolivianos).</w:t>
+      </w:r>
+    </w:p>
+    <w:p>
+      <w:pPr>
+        <w:numPr>
+          <w:ilvl w:val="0"/>
+          <w:numId w:val="1040"/>
+        </w:numPr>
+        <w:pStyle w:val="Compact"/>
+      </w:pPr>
+      <w:r>
+        <w:rPr>
+          <w:bCs/>
+          <w:b/>
+        </w:rPr>
+        <w:t xml:space="preserve">p. 72</w:t>
+      </w:r>
+      <w:r>
+        <w:t xml:space="preserve">Atestação BDO do 2º tri/2026; Res. BCB 519–521 (operações com stablecoin).</w:t>
+      </w:r>
+    </w:p>
+    <w:p>
+      <w:pPr>
+        <w:numPr>
+          <w:ilvl w:val="0"/>
+          <w:numId w:val="1040"/>
+        </w:numPr>
+        <w:pStyle w:val="Compact"/>
+      </w:pPr>
+      <w:r>
+        <w:rPr>
+          <w:bCs/>
+          <w:b/>
+        </w:rPr>
+        <w:t xml:space="preserve">p. 73</w:t>
+      </w:r>
+      <w:r>
+        <w:t xml:space="preserve">Capital Aberto, mar/2026 (topo de US$ 126 mil em out/2025; retração de 52,4%); AUVP (queda de 13% em 06/02/2026).</w:t>
+      </w:r>
+    </w:p>
+    <w:p>
+      <w:pPr>
+        <w:numPr>
+          <w:ilvl w:val="0"/>
+          <w:numId w:val="1040"/>
+        </w:numPr>
+        <w:pStyle w:val="Compact"/>
+      </w:pPr>
+      <w:r>
+        <w:rPr>
+          <w:bCs/>
+          <w:b/>
+        </w:rPr>
+        <w:t xml:space="preserve">p. 74</w:t>
+      </w:r>
+      <w:r>
+        <w:t xml:space="preserve">AUVP (queda de 13% em um dia, 06/02/2026).</w:t>
+      </w:r>
+    </w:p>
+    <w:p>
+      <w:pPr>
+        <w:numPr>
+          <w:ilvl w:val="0"/>
+          <w:numId w:val="1040"/>
+        </w:numPr>
+        <w:pStyle w:val="Compact"/>
+      </w:pPr>
+      <w:r>
+        <w:rPr>
+          <w:bCs/>
+          <w:b/>
+        </w:rPr>
+        <w:t xml:space="preserve">p. 76</w:t>
+      </w:r>
+      <w:r>
+        <w:t xml:space="preserve">InfoMoney e Fizen (Res. BCB 519–521: identificação de carteira autocustodiada, vigência 02/02/2026).</w:t>
+      </w:r>
+    </w:p>
+    <w:p>
+      <w:pPr>
+        <w:numPr>
+          <w:ilvl w:val="0"/>
+          <w:numId w:val="1040"/>
+        </w:numPr>
+        <w:pStyle w:val="Compact"/>
+      </w:pPr>
+      <w:r>
+        <w:rPr>
+          <w:bCs/>
+          <w:b/>
+        </w:rPr>
+        <w:t xml:space="preserve">p. 80</w:t>
+      </w:r>
+      <w:r>
+        <w:t xml:space="preserve">eco.com, guias de 2026 (redes do USDT; envio para rede errada em geral não é recuperável).</w:t>
+      </w:r>
+    </w:p>
+    <w:p>
+      <w:pPr>
+        <w:numPr>
+          <w:ilvl w:val="0"/>
+          <w:numId w:val="1040"/>
+        </w:numPr>
+        <w:pStyle w:val="Compact"/>
+      </w:pPr>
+      <w:r>
+        <w:rPr>
+          <w:bCs/>
+          <w:b/>
+        </w:rPr>
+        <w:t xml:space="preserve">p. 81</w:t>
+      </w:r>
+      <w:r>
+        <w:t xml:space="preserve">eco.com, comparativo de taxas de rede, mai/2026 (Binance: TRC20 1, BEP20 0,29, ERC20 1,6, SOL 1 USDT; velocidade TRC20/BEP20 ~1 min, ERC20 ~2 min); comparativo de 2026 (Polygon ~1 USDT). Escopo do curso, Seção 2.1 (taxa de 1 USDT no exemplo-padrão).</w:t>
+      </w:r>
+    </w:p>
+    <w:p>
+      <w:pPr>
+        <w:numPr>
+          <w:ilvl w:val="0"/>
+          <w:numId w:val="1040"/>
+        </w:numPr>
+        <w:pStyle w:val="Compact"/>
+      </w:pPr>
+      <w:r>
+        <w:rPr>
+          <w:bCs/>
+          <w:b/>
+        </w:rPr>
+        <w:t xml:space="preserve">p. 83</w:t>
+      </w:r>
+      <w:r>
+        <w:t xml:space="preserve">Endereços de exemplo, fictícios e encurtados.</w:t>
+      </w:r>
+    </w:p>
+    <w:p>
+      <w:pPr>
+        <w:numPr>
+          <w:ilvl w:val="0"/>
+          <w:numId w:val="1040"/>
+        </w:numPr>
+        <w:pStyle w:val="Compact"/>
+      </w:pPr>
+      <w:r>
+        <w:rPr>
+          <w:bCs/>
+          <w:b/>
+        </w:rPr>
+        <w:t xml:space="preserve">p. 84</w:t>
+      </w:r>
+      <w:r>
+        <w:t xml:space="preserve">eco.com, guias de 2026 (memo não necessário em TRC20, BEP20 e ERC20, salvo quando o lado que recebe informa um).</w:t>
       </w:r>
     </w:p>
     <w:sectPr/>
@@ -19371,6 +20184,21 @@
     <w:lvlOverride w:ilvl="8">
       <w:startOverride w:val="1"/>
     </w:lvlOverride>
+  </w:num>
+  <w:num w:numId="1036">
+    <w:abstractNumId w:val="991"/>
+  </w:num>
+  <w:num w:numId="1037">
+    <w:abstractNumId w:val="991"/>
+  </w:num>
+  <w:num w:numId="1038">
+    <w:abstractNumId w:val="991"/>
+  </w:num>
+  <w:num w:numId="1039">
+    <w:abstractNumId w:val="991"/>
+  </w:num>
+  <w:num w:numId="1040">
+    <w:abstractNumId w:val="991"/>
   </w:num>
 </w:numbering>
 </file>

</xml_diff>

<commit_message>
Capa: fundo ilustrado da Esplanada e selo "Eu vivo isso"
Fundo próprio em SVG com o Congresso Nacional, a Esplanada e a multidão
verde-amarela sob céu de alerta. Selo de autoridade com o caso real do
autor em Cochabamba.

Co-Authored-By: Claude Opus 5.5 <noreply@anthropic.com>
Claude-Session: https://claude.ai/code/session_01GJhkYfDrHd3AkmDKDTo71F
</commit_message>
<xml_diff>
--- a/curso/dist/LULA-GANHOU-Curso-Completo.docx
+++ b/curso/dist/LULA-GANHOU-Curso-Completo.docx
@@ -92,6 +92,23 @@
     <w:p>
       <w:pPr>
         <w:pStyle w:val="FirstParagraph"/>
+      </w:pPr>
+      <w:r>
+        <w:t xml:space="preserve">EU VIVO</w:t>
+      </w:r>
+      <w:r>
+        <w:br/>
+      </w:r>
+      <w:r>
+        <w:t xml:space="preserve">ISSO</w:t>
+      </w:r>
+      <w:r>
+        <w:t xml:space="preserve">Escrito por um brasileiro que mora em Cochabamba e usa o método na prática</w:t>
+      </w:r>
+    </w:p>
+    <w:p>
+      <w:pPr>
+        <w:pStyle w:val="BodyText"/>
       </w:pPr>
       <w:r>
         <w:t xml:space="preserve">URGENTE</w:t>

</xml_diff>

<commit_message>
Bônus B7: Dossiê "mais 4 anos em manchetes" com QR codes
19 manchetes de Gazeta do Povo, Poder360, Revista Oeste, Jovem Pan e
Blocktrends, separadas entre fatos publicados e projeções, cada uma com
QR code gerado no build (<!--QR:url-->), e versão de 1 página para
WhatsApp.

Co-Authored-By: Claude Opus 5.5 <noreply@anthropic.com>
Claude-Session: https://claude.ai/code/session_01GJhkYfDrHd3AkmDKDTo71F
</commit_message>
<xml_diff>
--- a/curso/dist/LULA-GANHOU-Curso-Completo.docx
+++ b/curso/dist/LULA-GANHOU-Curso-Completo.docx
@@ -1851,10 +1851,40 @@
         <w:pStyle w:val="Compact"/>
       </w:pPr>
       <w:r>
+        <w:t xml:space="preserve">Bônus B7 · Dossiê: mais 4 anos em manchetes</w:t>
+      </w:r>
+      <w:r>
+        <w:t xml:space="preserve">156</w:t>
+      </w:r>
+    </w:p>
+    <w:p>
+      <w:pPr>
+        <w:numPr>
+          <w:ilvl w:val="0"/>
+          <w:numId w:val="1005"/>
+        </w:numPr>
+        <w:pStyle w:val="Compact"/>
+      </w:pPr>
+      <w:r>
+        <w:t xml:space="preserve">B7 · Versão de 1 página para WhatsApp</w:t>
+      </w:r>
+      <w:r>
+        <w:t xml:space="preserve">165</w:t>
+      </w:r>
+    </w:p>
+    <w:p>
+      <w:pPr>
+        <w:numPr>
+          <w:ilvl w:val="0"/>
+          <w:numId w:val="1005"/>
+        </w:numPr>
+        <w:pStyle w:val="Compact"/>
+      </w:pPr>
+      <w:r>
         <w:t xml:space="preserve">Anexo · Fontes de todos os números</w:t>
       </w:r>
       <w:r>
-        <w:t xml:space="preserve">156</w:t>
+        <w:t xml:space="preserve">166</w:t>
       </w:r>
     </w:p>
     <w:p>
@@ -30972,255 +31002,25 @@
         <w:pStyle w:val="FirstParagraph"/>
       </w:pPr>
       <w:r>
-        <w:t xml:space="preserve">Anexo</w:t>
-      </w:r>
-    </w:p>
-    <w:bookmarkStart w:id="238" w:name="fontes-de-todos-os-números"/>
-    <w:p>
-      <w:pPr>
-        <w:pStyle w:val="Heading2"/>
-      </w:pPr>
-      <w:r>
-        <w:t xml:space="preserve">Fontes de todos os números</w:t>
-      </w:r>
-    </w:p>
-    <w:p>
-      <w:pPr>
-        <w:pStyle w:val="FirstParagraph"/>
-      </w:pPr>
-      <w:r>
-        <w:t xml:space="preserve">Cada número do curso tem origem. Aqui estão, página por página.</w:t>
-      </w:r>
-    </w:p>
-    <w:p>
-      <w:pPr>
-        <w:numPr>
-          <w:ilvl w:val="0"/>
-          <w:numId w:val="1081"/>
-        </w:numPr>
-        <w:pStyle w:val="Compact"/>
-      </w:pPr>
-      <w:r>
-        <w:rPr>
-          <w:bCs/>
-          <w:b/>
-        </w:rPr>
-        <w:t xml:space="preserve">p. 2</w:t>
-      </w:r>
-      <w:r>
-        <w:t xml:space="preserve">TSE, resultado do 2º turno de 2022 (58.206.354 votos, 49,1% dos válidos).</w:t>
-      </w:r>
-    </w:p>
-    <w:p>
-      <w:pPr>
-        <w:numPr>
-          <w:ilvl w:val="0"/>
-          <w:numId w:val="1081"/>
-        </w:numPr>
-        <w:pStyle w:val="Compact"/>
-      </w:pPr>
-      <w:r>
-        <w:rPr>
-          <w:bCs/>
-          <w:b/>
-        </w:rPr>
-        <w:t xml:space="preserve">p. 3</w:t>
-      </w:r>
-      <w:r>
-        <w:t xml:space="preserve">Tribunal Supremo Electoral da Bolívia via Agência Brasil (19/10/2025); MercoPress (10/11/2025).</w:t>
-      </w:r>
-    </w:p>
-    <w:p>
-      <w:pPr>
-        <w:numPr>
-          <w:ilvl w:val="0"/>
-          <w:numId w:val="1081"/>
-        </w:numPr>
-        <w:pStyle w:val="Compact"/>
-      </w:pPr>
-      <w:r>
-        <w:rPr>
-          <w:bCs/>
-          <w:b/>
-        </w:rPr>
-        <w:t xml:space="preserve">p. 11</w:t>
-      </w:r>
-      <w:r>
-        <w:t xml:space="preserve">Gazeta do Povo, 2026 (arrecadação de R$ 2,887 tri; carga de 32,4% do PIB) e mar/2026 (43 medidas); Banco Central via Forbes, 27/10/2026 (dívida, ago/2026); reações de lideranças, Gazeta do Povo, 25/10/2026.</w:t>
-      </w:r>
-    </w:p>
-    <w:p>
-      <w:pPr>
-        <w:numPr>
-          <w:ilvl w:val="0"/>
-          <w:numId w:val="1081"/>
-        </w:numPr>
-        <w:pStyle w:val="Compact"/>
-      </w:pPr>
-      <w:r>
-        <w:rPr>
-          <w:bCs/>
-          <w:b/>
-        </w:rPr>
-        <w:t xml:space="preserve">p. 12</w:t>
-      </w:r>
-      <w:r>
-        <w:t xml:space="preserve">TSE (2º turno 2018: 57.797.847 votos; 2022: 58.206.354); Monitor do Debate Político/USP via CartaCapital e O Povo (2024); SSP-SP via SBT News (25/02/2024).</w:t>
-      </w:r>
-    </w:p>
-    <w:p>
-      <w:pPr>
-        <w:numPr>
-          <w:ilvl w:val="0"/>
-          <w:numId w:val="1081"/>
-        </w:numPr>
-        <w:pStyle w:val="Compact"/>
-      </w:pPr>
-      <w:r>
-        <w:rPr>
-          <w:bCs/>
-          <w:b/>
-        </w:rPr>
-        <w:t xml:space="preserve">p. 13</w:t>
-      </w:r>
-      <w:r>
-        <w:t xml:space="preserve">Banco Central de Venezuela via Poder360/DW (29/05/2019); R4V via Bloomberg Línea (2025: 6,70 mi na América Latina + 1,19 mi no resto do mundo); France 24 (08/11/2025); Infobae; The Rio Times.</w:t>
-      </w:r>
-    </w:p>
-    <w:p>
-      <w:pPr>
-        <w:numPr>
-          <w:ilvl w:val="0"/>
-          <w:numId w:val="1081"/>
-        </w:numPr>
-        <w:pStyle w:val="Compact"/>
-      </w:pPr>
-      <w:r>
-        <w:rPr>
-          <w:bCs/>
-          <w:b/>
-        </w:rPr>
-        <w:t xml:space="preserve">p. 14</w:t>
-      </w:r>
-      <w:r>
-        <w:t xml:space="preserve">INDEC Argentina (IPC 2023, 2024 e 2025); MercoPress (10/11/2025); posses oficiais.</w:t>
-      </w:r>
-    </w:p>
-    <w:p>
-      <w:pPr>
-        <w:numPr>
-          <w:ilvl w:val="0"/>
-          <w:numId w:val="1081"/>
-        </w:numPr>
-        <w:pStyle w:val="Compact"/>
-      </w:pPr>
-      <w:r>
-        <w:rPr>
-          <w:bCs/>
-          <w:b/>
-        </w:rPr>
-        <w:t xml:space="preserve">p. 15</w:t>
-      </w:r>
-      <w:r>
-        <w:t xml:space="preserve">IFI via Forbes, 27/10/2026 (ajuste fiscal); Decretos 12.466 e 12.499/2025 (IOF).</w:t>
-      </w:r>
-    </w:p>
-    <w:p>
-      <w:pPr>
-        <w:numPr>
-          <w:ilvl w:val="0"/>
-          <w:numId w:val="1081"/>
-        </w:numPr>
-        <w:pStyle w:val="Compact"/>
-      </w:pPr>
-      <w:r>
-        <w:rPr>
-          <w:bCs/>
-          <w:b/>
-        </w:rPr>
-        <w:t xml:space="preserve">p. 16</w:t>
-      </w:r>
-      <w:r>
-        <w:t xml:space="preserve">Zumper via WLRN (set/2026, Miami US$ 2.500); Zumper via WFLA (Orlando US$ 1.690, data a confirmar); Numbeo mai/2026 via Cidadania e Visto (Lisboa €1.280); FipeZAP Locação set/2026; InfoCasas out/2026. Câmbio: US$ 1 = R$ 5,35 (Investidor10, 28/10/2026); €1 = R$ 5,62 (Meelion, 09/10/2026); R$ 1 = Bs 2,30 (autor).</w:t>
-      </w:r>
-    </w:p>
-    <w:p>
-      <w:pPr>
-        <w:numPr>
-          <w:ilvl w:val="0"/>
-          <w:numId w:val="1081"/>
-        </w:numPr>
-        <w:pStyle w:val="Compact"/>
-      </w:pPr>
-      <w:r>
-        <w:rPr>
-          <w:bCs/>
-          <w:b/>
-        </w:rPr>
-        <w:t xml:space="preserve">p. 17</w:t>
-      </w:r>
-      <w:r>
-        <w:t xml:space="preserve">Mochileiros (entrada com RG/CIN, 90 dias); The Rio Times (residência Mercosul); FlightConnections, abr/2026 (voo direto GRU–VVI, média 3h05); aluguéis: mesmas fontes da página anterior.</w:t>
-      </w:r>
-    </w:p>
-    <w:p>
-      <w:pPr>
-        <w:numPr>
-          <w:ilvl w:val="0"/>
-          <w:numId w:val="1081"/>
-        </w:numPr>
-        <w:pStyle w:val="Compact"/>
-      </w:pPr>
-      <w:r>
-        <w:rPr>
-          <w:bCs/>
-          <w:b/>
-        </w:rPr>
-        <w:t xml:space="preserve">p. 18</w:t>
-      </w:r>
-      <w:r>
-        <w:t xml:space="preserve">Mesmas fontes e câmbios da página anterior. Cálculo do autor do curso.</w:t>
-      </w:r>
-    </w:p>
-    <w:p>
-      <w:pPr>
-        <w:numPr>
-          <w:ilvl w:val="0"/>
-          <w:numId w:val="1081"/>
-        </w:numPr>
-        <w:pStyle w:val="Compact"/>
-      </w:pPr>
-      <w:r>
-        <w:rPr>
-          <w:bCs/>
-          <w:b/>
-        </w:rPr>
-        <w:t xml:space="preserve">p. 19</w:t>
-      </w:r>
-      <w:r>
-        <w:t xml:space="preserve">Mochileiros (entrada); The Rio Times (residência Mercosul, taxa ~450 UFV); FlightConnections, abr/2026 (voo direto São Paulo–Santa Cruz, média 3h05); autor, 28/10/2026 (câmbio de referência).</w:t>
-      </w:r>
-    </w:p>
-    <w:p>
-      <w:pPr>
-        <w:numPr>
-          <w:ilvl w:val="0"/>
-          <w:numId w:val="1081"/>
-        </w:numPr>
-        <w:pStyle w:val="Compact"/>
-      </w:pPr>
-      <w:r>
-        <w:rPr>
-          <w:bCs/>
-          <w:b/>
-        </w:rPr>
-        <w:t xml:space="preserve">p. 20</w:t>
-      </w:r>
-      <w:r>
-        <w:t xml:space="preserve">Agência Brasil e Poder360 (19/10/2025); MercoPress (10/11/2025); France 24 via Acento (08/11/2025); usdthoy.com (flutuação desde 29/06/2026).</w:t>
-      </w:r>
-    </w:p>
-    <w:bookmarkEnd w:id="238"/>
+        <w:t xml:space="preserve">B7</w:t>
+      </w:r>
+    </w:p>
+    <w:p>
+      <w:pPr>
+        <w:pStyle w:val="BodyText"/>
+      </w:pPr>
+      <w:r>
+        <w:t xml:space="preserve">Dossiê: mais 4 anos em manchetes</w:t>
+      </w:r>
+    </w:p>
+    <w:p>
+      <w:pPr>
+        <w:pStyle w:val="BodyText"/>
+      </w:pPr>
+      <w:r>
+        <w:t xml:space="preserve">Links para mandar ao seu conhecido de esquerda. Não é opinião: é manchete, com veículo e QR code para ele mesmo conferir.</w:t>
+      </w:r>
+    </w:p>
     <w:p>
       <w:r>
         <w:pict>
@@ -31230,213 +31030,148 @@
     </w:p>
     <w:p>
       <w:pPr>
-        <w:numPr>
-          <w:ilvl w:val="0"/>
-          <w:numId w:val="1082"/>
-        </w:numPr>
-        <w:pStyle w:val="Compact"/>
-      </w:pPr>
-      <w:r>
-        <w:rPr>
-          <w:bCs/>
-          <w:b/>
-        </w:rPr>
-        <w:t xml:space="preserve">p. 21</w:t>
-      </w:r>
-      <w:r>
-        <w:t xml:space="preserve">Infobae; The Rio Times (Bs 6,96); BCB via usdtbol.com, 28/10/2026 (Bs 12,02); Facebook Marketplace, levantado pelo autor, out/2026 (preço pedido).</w:t>
-      </w:r>
-    </w:p>
-    <w:p>
-      <w:pPr>
-        <w:numPr>
-          <w:ilvl w:val="0"/>
-          <w:numId w:val="1082"/>
-        </w:numPr>
-        <w:pStyle w:val="Compact"/>
-      </w:pPr>
-      <w:r>
-        <w:rPr>
-          <w:bCs/>
-          <w:b/>
-        </w:rPr>
-        <w:t xml:space="preserve">p. 22</w:t>
-      </w:r>
-      <w:r>
-        <w:t xml:space="preserve">FipeZAP set/2026 via MySide; InfoCasas out/2026; Facebook Marketplace (autor, out/2026); Correo del Sur ago/2026; ANP set/2026. Câmbios: US$ 1 = R$ 5,35; R$ 1 = Bs 2,30.</w:t>
-      </w:r>
-    </w:p>
-    <w:p>
-      <w:pPr>
-        <w:numPr>
-          <w:ilvl w:val="0"/>
-          <w:numId w:val="1082"/>
-        </w:numPr>
-        <w:pStyle w:val="Compact"/>
-      </w:pPr>
-      <w:r>
-        <w:rPr>
-          <w:bCs/>
-          <w:b/>
-        </w:rPr>
-        <w:t xml:space="preserve">p. 23</w:t>
-      </w:r>
-      <w:r>
-        <w:t xml:space="preserve">Decretos 12.466 e 12.499/2025 (IOF 3,5%); dolarparalelobolivia.net, 28/10/2026 (P2P Bs 12,13).</w:t>
-      </w:r>
-    </w:p>
-    <w:p>
-      <w:pPr>
-        <w:numPr>
-          <w:ilvl w:val="0"/>
-          <w:numId w:val="1082"/>
-        </w:numPr>
-        <w:pStyle w:val="Compact"/>
-      </w:pPr>
-      <w:r>
-        <w:rPr>
-          <w:bCs/>
-          <w:b/>
-        </w:rPr>
-        <w:t xml:space="preserve">p. 24</w:t>
-      </w:r>
-      <w:r>
-        <w:t xml:space="preserve">CoinMarketCap e Investidor10, 28/10/2026; dolarparalelobolivia.net, 28/10/2026; BCB via usdtbol.com, 28/10/2026. Cálculo do curso.</w:t>
-      </w:r>
-    </w:p>
-    <w:p>
-      <w:pPr>
-        <w:numPr>
-          <w:ilvl w:val="0"/>
-          <w:numId w:val="1082"/>
-        </w:numPr>
-        <w:pStyle w:val="Compact"/>
-      </w:pPr>
-      <w:r>
-        <w:rPr>
-          <w:bCs/>
-          <w:b/>
-        </w:rPr>
-        <w:t xml:space="preserve">p. 29</w:t>
-      </w:r>
-      <w:r>
-        <w:t xml:space="preserve">Infobae; The Rio Times (Bs 6,96 até jun/2026; queda de ~45%, set/2026); usdthoy.com (flutuação desde 29/06/2026); BCB via usdtbol.com, 28/10/2026 (Bs 12,02).</w:t>
-      </w:r>
-    </w:p>
-    <w:p>
-      <w:pPr>
-        <w:numPr>
-          <w:ilvl w:val="0"/>
-          <w:numId w:val="1082"/>
-        </w:numPr>
-        <w:pStyle w:val="Compact"/>
-      </w:pPr>
-      <w:r>
-        <w:rPr>
-          <w:bCs/>
-          <w:b/>
-        </w:rPr>
-        <w:t xml:space="preserve">p. 30</w:t>
-      </w:r>
-      <w:r>
-        <w:t xml:space="preserve">Infobae; The Rio Times; France 24 via Acento (08/11/2025); Agência Brasil (19/10/2025); usdthoy.com; BCB via usdtbol.com e dolarparalelobolivia.net, 28/10/2026.</w:t>
-      </w:r>
-    </w:p>
-    <w:p>
-      <w:pPr>
-        <w:numPr>
-          <w:ilvl w:val="0"/>
-          <w:numId w:val="1082"/>
-        </w:numPr>
-        <w:pStyle w:val="Compact"/>
-      </w:pPr>
-      <w:r>
-        <w:rPr>
-          <w:bCs/>
-          <w:b/>
-        </w:rPr>
-        <w:t xml:space="preserve">p. 31</w:t>
-      </w:r>
-      <w:r>
-        <w:t xml:space="preserve">Seção 2.1 do escopo (exemplo-padrão); almoço local US$ 1,50–3 (Food Travel Explore, 2026); aluguel InfoCasas out/2026; Mustang: Facebook Marketplace, autor, out/2026.</w:t>
-      </w:r>
-    </w:p>
-    <w:p>
-      <w:pPr>
-        <w:numPr>
-          <w:ilvl w:val="0"/>
-          <w:numId w:val="1082"/>
-        </w:numPr>
-        <w:pStyle w:val="Compact"/>
-      </w:pPr>
-      <w:r>
-        <w:rPr>
-          <w:bCs/>
-          <w:b/>
-        </w:rPr>
-        <w:t xml:space="preserve">p. 32</w:t>
-      </w:r>
-      <w:r>
-        <w:t xml:space="preserve">FipeZAP set/2026 via MySide (Leblon); autor e InfoCasas out/2026 (Cochabamba, faixa US$ 70–170 mil). US$ 1 = R$ 5,35 (Investidor10, 28/10/2026). Preço de anúncio é preço pedido.</w:t>
-      </w:r>
-    </w:p>
-    <w:p>
-      <w:pPr>
-        <w:numPr>
-          <w:ilvl w:val="0"/>
-          <w:numId w:val="1082"/>
-        </w:numPr>
-        <w:pStyle w:val="Compact"/>
-      </w:pPr>
-      <w:r>
-        <w:rPr>
-          <w:bCs/>
-          <w:b/>
-        </w:rPr>
-        <w:t xml:space="preserve">p. 33</w:t>
-      </w:r>
-      <w:r>
-        <w:t xml:space="preserve">FipeZAP set/2026 via MySide e Daniel Carvalho Imobiliário; Equipetrol: anúncios Century 21, out/2026 (US$ 1.310–1.950/m²); Cochabamba: InfoCasas out/2026 (média ~US$ 940/m²); Calacoto: anúncios Century 21 (~US$ 620–670/m²).</w:t>
-      </w:r>
-    </w:p>
-    <w:p>
-      <w:pPr>
-        <w:numPr>
-          <w:ilvl w:val="0"/>
-          <w:numId w:val="1082"/>
-        </w:numPr>
-        <w:pStyle w:val="Compact"/>
-      </w:pPr>
-      <w:r>
-        <w:rPr>
-          <w:bCs/>
-          <w:b/>
-        </w:rPr>
-        <w:t xml:space="preserve">p. 34</w:t>
-      </w:r>
-      <w:r>
-        <w:t xml:space="preserve">FipeZAP set/2026 (m² por bairro) × 110 m²; Cochabamba: autor e InfoCasas out/2026. Cálculo do curso.</w:t>
-      </w:r>
-    </w:p>
-    <w:p>
-      <w:pPr>
-        <w:numPr>
-          <w:ilvl w:val="0"/>
-          <w:numId w:val="1082"/>
-        </w:numPr>
-        <w:pStyle w:val="Compact"/>
-      </w:pPr>
-      <w:r>
-        <w:rPr>
-          <w:bCs/>
-          <w:b/>
-        </w:rPr>
-        <w:t xml:space="preserve">p. 35</w:t>
-      </w:r>
-      <w:r>
-        <w:t xml:space="preserve">Century 21 (anúncios em Equipetrol e Urubó, consultados em out/2026; preço pedido); eju.tv (lotes Urubó Golf, US$ 110–170/m²). Pinheiros: FipeZAP set/2026, R$ 18.260/m² × 140 m² ≈ R$ 2,56 mi ≈ US$ 480 mil.</w:t>
-      </w:r>
-    </w:p>
+        <w:pStyle w:val="FirstParagraph"/>
+      </w:pPr>
+      <w:r>
+        <w:t xml:space="preserve">Como usar o dossiê</w:t>
+      </w:r>
+    </w:p>
+    <w:bookmarkStart w:id="240" w:name="não-discuta.-mande-o-link."/>
+    <w:p>
+      <w:pPr>
+        <w:pStyle w:val="Heading1"/>
+      </w:pPr>
+      <w:r>
+        <w:t xml:space="preserve">Não discuta. Mande o link.</w:t>
+      </w:r>
+    </w:p>
+    <w:p>
+      <w:pPr>
+        <w:pStyle w:val="FirstParagraph"/>
+      </w:pPr>
+      <w:r>
+        <w:t xml:space="preserve">Discussão de grupo de família não convence ninguém.</w:t>
+      </w:r>
+      <w:r>
+        <w:t xml:space="preserve"> </w:t>
+      </w:r>
+      <w:r>
+        <w:rPr>
+          <w:bCs/>
+          <w:b/>
+        </w:rPr>
+        <w:t xml:space="preserve">Manchete com data e veículo</w:t>
+      </w:r>
+      <w:r>
+        <w:t xml:space="preserve"> </w:t>
+      </w:r>
+      <w:r>
+        <w:t xml:space="preserve">convence mais. Este dossiê é para isso.</w:t>
+      </w:r>
+    </w:p>
+    <w:p>
+      <w:pPr>
+        <w:numPr>
+          <w:ilvl w:val="0"/>
+          <w:numId w:val="1081"/>
+        </w:numPr>
+        <w:pStyle w:val="Compact"/>
+      </w:pPr>
+      <w:r>
+        <w:t xml:space="preserve">Escolha 1 ou 2 manchetes sobre o assunto da conversa</w:t>
+      </w:r>
+    </w:p>
+    <w:p>
+      <w:pPr>
+        <w:numPr>
+          <w:ilvl w:val="0"/>
+          <w:numId w:val="1081"/>
+        </w:numPr>
+        <w:pStyle w:val="Compact"/>
+      </w:pPr>
+      <w:r>
+        <w:t xml:space="preserve">Aponte a câmera do celular para o QR code e copie o link</w:t>
+      </w:r>
+    </w:p>
+    <w:p>
+      <w:pPr>
+        <w:numPr>
+          <w:ilvl w:val="0"/>
+          <w:numId w:val="1081"/>
+        </w:numPr>
+        <w:pStyle w:val="Compact"/>
+      </w:pPr>
+      <w:r>
+        <w:t xml:space="preserve">Mande o link, sem textão. Deixe a notícia falar</w:t>
+      </w:r>
+    </w:p>
+    <w:p>
+      <w:pPr>
+        <w:numPr>
+          <w:ilvl w:val="0"/>
+          <w:numId w:val="1081"/>
+        </w:numPr>
+        <w:pStyle w:val="Compact"/>
+      </w:pPr>
+      <w:r>
+        <w:t xml:space="preserve">Se ele disser “site de direita”, mande o dado oficial que está na mesma linha (Banco Central, Senado, Receita)</w:t>
+      </w:r>
+    </w:p>
+    <w:bookmarkStart w:id="238" w:name="já-aconteceu"/>
+    <w:p>
+      <w:pPr>
+        <w:pStyle w:val="Heading3"/>
+      </w:pPr>
+      <w:r>
+        <w:t xml:space="preserve">Já aconteceu</w:t>
+      </w:r>
+    </w:p>
+    <w:p>
+      <w:pPr>
+        <w:pStyle w:val="FirstParagraph"/>
+      </w:pPr>
+      <w:r>
+        <w:t xml:space="preserve">Fatos publicados: impostos, IOF, dívida, juros, déficit, golpes.</w:t>
+      </w:r>
+    </w:p>
+    <w:bookmarkEnd w:id="238"/>
+    <w:bookmarkStart w:id="239" w:name="o-que-vem-por-aí"/>
+    <w:p>
+      <w:pPr>
+        <w:pStyle w:val="Heading3"/>
+      </w:pPr>
+      <w:r>
+        <w:t xml:space="preserve">O que vem por aí</w:t>
+      </w:r>
+    </w:p>
+    <w:p>
+      <w:pPr>
+        <w:pStyle w:val="FirstParagraph"/>
+      </w:pPr>
+      <w:r>
+        <w:t xml:space="preserve">Projeções de instituições e propostas do governo, marcadas como projeção.</w:t>
+      </w:r>
+    </w:p>
+    <w:bookmarkEnd w:id="239"/>
+    <w:p>
+      <w:pPr>
+        <w:pStyle w:val="BodyText"/>
+      </w:pPr>
+      <w:r>
+        <w:rPr>
+          <w:bCs/>
+          <w:b/>
+        </w:rPr>
+        <w:t xml:space="preserve">Links mudam.</w:t>
+      </w:r>
+      <w:r>
+        <w:t xml:space="preserve"> </w:t>
+      </w:r>
+      <w:r>
+        <w:t xml:space="preserve">Todos foram consultados em 28/10/2026. Se algum sair do ar, busque o título entre aspas.</w:t>
+      </w:r>
+    </w:p>
+    <w:bookmarkEnd w:id="240"/>
     <w:p>
       <w:r>
         <w:pict>
@@ -31446,270 +31181,157 @@
     </w:p>
     <w:p>
       <w:pPr>
-        <w:numPr>
-          <w:ilvl w:val="0"/>
-          <w:numId w:val="1083"/>
-        </w:numPr>
-        <w:pStyle w:val="Compact"/>
-      </w:pPr>
-      <w:r>
-        <w:rPr>
-          <w:bCs/>
-          <w:b/>
-        </w:rPr>
-        <w:t xml:space="preserve">p. 36</w:t>
-      </w:r>
-      <w:r>
-        <w:t xml:space="preserve">Century 21 (anúncios Alto Calacoto e Urb. Cordes, preço pedido, out/2026). Guinness World Records (altitude de La Paz).</w:t>
-      </w:r>
-    </w:p>
-    <w:p>
-      <w:pPr>
-        <w:numPr>
-          <w:ilvl w:val="0"/>
-          <w:numId w:val="1083"/>
-        </w:numPr>
-        <w:pStyle w:val="Compact"/>
-      </w:pPr>
-      <w:r>
-        <w:rPr>
-          <w:bCs/>
-          <w:b/>
-        </w:rPr>
-        <w:t xml:space="preserve">p. 37</w:t>
-      </w:r>
-      <w:r>
-        <w:t xml:space="preserve">Century 21 (anúncio com 60% em dólar e 40% em Bs, out/2026); boliviaimpuestos.com (folio real e Derechos Reales).</w:t>
-      </w:r>
-    </w:p>
-    <w:p>
-      <w:pPr>
-        <w:numPr>
-          <w:ilvl w:val="0"/>
-          <w:numId w:val="1083"/>
-        </w:numPr>
-        <w:pStyle w:val="Compact"/>
-      </w:pPr>
-      <w:r>
-        <w:rPr>
-          <w:bCs/>
-          <w:b/>
-        </w:rPr>
-        <w:t xml:space="preserve">p. 38</w:t>
-      </w:r>
-      <w:r>
-        <w:t xml:space="preserve">FipeZAP Locação set/2026 (TNH1); InfoCasas out/2026; The Rio Times, set/2026 (Equipetrol e diferença de 1,5–2×). Câmbios: US$ 1 = R$ 5,35; R$ 1 = Bs 2,30.</w:t>
-      </w:r>
-    </w:p>
-    <w:p>
-      <w:pPr>
-        <w:numPr>
-          <w:ilvl w:val="0"/>
-          <w:numId w:val="1083"/>
-        </w:numPr>
-        <w:pStyle w:val="Compact"/>
-      </w:pPr>
-      <w:r>
-        <w:rPr>
-          <w:bCs/>
-          <w:b/>
-        </w:rPr>
-        <w:t xml:space="preserve">p. 39</w:t>
-      </w:r>
-      <w:r>
-        <w:t xml:space="preserve">InfoNegocios (como funciona); boliviaimpuestos.com (gravame ~0,5%, RC-IVA 10% a.a., Formulário 610; confirmar no SIN). Valores do exemplo: ilustrativos.</w:t>
-      </w:r>
-    </w:p>
-    <w:p>
-      <w:pPr>
-        <w:numPr>
-          <w:ilvl w:val="0"/>
-          <w:numId w:val="1083"/>
-        </w:numPr>
-        <w:pStyle w:val="Compact"/>
-      </w:pPr>
-      <w:r>
-        <w:rPr>
-          <w:bCs/>
-          <w:b/>
-        </w:rPr>
-        <w:t xml:space="preserve">p. 40</w:t>
-      </w:r>
-      <w:r>
-        <w:t xml:space="preserve">boliviaimpuestos.com; Red Uno via Bolivian Thoughts (19/11/2025, moeda da devolução); eju.tv (alta de anticréticos e aluguéis; data a confirmar).</w:t>
-      </w:r>
-    </w:p>
-    <w:p>
-      <w:pPr>
-        <w:numPr>
-          <w:ilvl w:val="0"/>
-          <w:numId w:val="1083"/>
-        </w:numPr>
-        <w:pStyle w:val="Compact"/>
-      </w:pPr>
-      <w:r>
-        <w:rPr>
-          <w:bCs/>
-          <w:b/>
-        </w:rPr>
-        <w:t xml:space="preserve">p. 42</w:t>
-      </w:r>
-      <w:r>
-        <w:t xml:space="preserve">Facebook Marketplace, levantado pelo autor, out/2026 (preço pedido; anúncios sem dados de terceiros). R$ 1 = Bs 2,30 (autor, 28/10/2026).</w:t>
-      </w:r>
-    </w:p>
-    <w:p>
-      <w:pPr>
-        <w:numPr>
-          <w:ilvl w:val="0"/>
-          <w:numId w:val="1083"/>
-        </w:numPr>
-        <w:pStyle w:val="Compact"/>
-      </w:pPr>
-      <w:r>
-        <w:rPr>
-          <w:bCs/>
-          <w:b/>
-        </w:rPr>
-        <w:t xml:space="preserve">p. 43</w:t>
-      </w:r>
-      <w:r>
-        <w:t xml:space="preserve">Câmbio de referência do autor (28/10/2026).</w:t>
-      </w:r>
-    </w:p>
-    <w:p>
-      <w:pPr>
-        <w:numPr>
-          <w:ilvl w:val="0"/>
-          <w:numId w:val="1083"/>
-        </w:numPr>
-        <w:pStyle w:val="Compact"/>
-      </w:pPr>
-      <w:r>
-        <w:rPr>
-          <w:bCs/>
-          <w:b/>
-        </w:rPr>
-        <w:t xml:space="preserve">p. 45</w:t>
-      </w:r>
-      <w:r>
-        <w:t xml:space="preserve">ANP set/2026; Correo del Sur ago/2026; France 24 via Acento (crise de combustíveis, 08/11/2025). R$ 1 = Bs 2,30.</w:t>
-      </w:r>
-    </w:p>
-    <w:p>
-      <w:pPr>
-        <w:numPr>
-          <w:ilvl w:val="0"/>
-          <w:numId w:val="1083"/>
-        </w:numPr>
-        <w:pStyle w:val="Compact"/>
-      </w:pPr>
-      <w:r>
-        <w:rPr>
-          <w:bCs/>
-          <w:b/>
-        </w:rPr>
-        <w:t xml:space="preserve">p. 46</w:t>
-      </w:r>
-      <w:r>
-        <w:t xml:space="preserve">FAC-SP, Índice Prato Feito, jun/2026 (via SBT News); Food Travel Explore (2026); Living Cost Index 2026; The Rio Times, set/2026 (casal em Santa Cruz). US$ 1 = R$ 5,35.</w:t>
-      </w:r>
-    </w:p>
-    <w:p>
-      <w:pPr>
-        <w:numPr>
-          <w:ilvl w:val="0"/>
-          <w:numId w:val="1083"/>
-        </w:numPr>
-        <w:pStyle w:val="Compact"/>
-      </w:pPr>
-      <w:r>
-        <w:rPr>
-          <w:bCs/>
-          <w:b/>
-        </w:rPr>
-        <w:t xml:space="preserve">p. 47</w:t>
-      </w:r>
-      <w:r>
-        <w:t xml:space="preserve">Referências das páginas anteriores.</w:t>
-      </w:r>
-    </w:p>
-    <w:p>
-      <w:pPr>
-        <w:numPr>
-          <w:ilvl w:val="0"/>
-          <w:numId w:val="1083"/>
-        </w:numPr>
-        <w:pStyle w:val="Compact"/>
-      </w:pPr>
-      <w:r>
-        <w:rPr>
-          <w:bCs/>
-          <w:b/>
-        </w:rPr>
-        <w:t xml:space="preserve">p. 48</w:t>
-      </w:r>
-      <w:r>
-        <w:t xml:space="preserve">Living Cost Index 2026 (solteiro); The Rio Times, set/2026 (casal); FipeZAP Locação set/2026 (SP). US$ 1 = R$ 5,35.</w:t>
-      </w:r>
-    </w:p>
-    <w:p>
-      <w:pPr>
-        <w:numPr>
-          <w:ilvl w:val="0"/>
-          <w:numId w:val="1083"/>
-        </w:numPr>
-        <w:pStyle w:val="Compact"/>
-      </w:pPr>
-      <w:r>
-        <w:rPr>
-          <w:bCs/>
-          <w:b/>
-        </w:rPr>
-        <w:t xml:space="preserve">p. 49</w:t>
-      </w:r>
-      <w:r>
-        <w:t xml:space="preserve">Autor, out/2026 (aluguel e despesas reais). R$ 1 = Bs 2,30 (autor, 28/10/2026). SP: FipeZAP Locação set/2026.</w:t>
-      </w:r>
-    </w:p>
-    <w:p>
-      <w:pPr>
-        <w:numPr>
-          <w:ilvl w:val="0"/>
-          <w:numId w:val="1083"/>
-        </w:numPr>
-        <w:pStyle w:val="Compact"/>
-      </w:pPr>
-      <w:r>
-        <w:rPr>
-          <w:bCs/>
-          <w:b/>
-        </w:rPr>
-        <w:t xml:space="preserve">p. 50</w:t>
-      </w:r>
-      <w:r>
-        <w:t xml:space="preserve">Autor, out/2026 (fotos e valores reais). Brasil: FAC-SP, Índice Prato Feito, jun/2026. R$ 1 = Bs 2,30 (autor). Resultado do autor, não é promessa.</w:t>
-      </w:r>
-    </w:p>
-    <w:p>
-      <w:pPr>
-        <w:numPr>
-          <w:ilvl w:val="0"/>
-          <w:numId w:val="1083"/>
-        </w:numPr>
-        <w:pStyle w:val="Compact"/>
-      </w:pPr>
-      <w:r>
-        <w:rPr>
-          <w:bCs/>
-          <w:b/>
-        </w:rPr>
-        <w:t xml:space="preserve">p. 51</w:t>
-      </w:r>
-      <w:r>
-        <w:t xml:space="preserve">Autor, out/2026 (fotos, cardápio e conta). Placas visíveis na foto do restaurante. SP: ABBT, 2024 (prato, bebida, sobremesa e café). R$ 1 = Bs 2,30.</w:t>
-      </w:r>
-    </w:p>
+        <w:pStyle w:val="FirstParagraph"/>
+      </w:pPr>
+      <w:r>
+        <w:t xml:space="preserve">Fatos publicados</w:t>
+      </w:r>
+    </w:p>
+    <w:bookmarkStart w:id="241" w:name="já-aconteceu-1"/>
+    <w:p>
+      <w:pPr>
+        <w:pStyle w:val="Heading2"/>
+      </w:pPr>
+      <w:r>
+        <w:t xml:space="preserve">Já aconteceu</w:t>
+      </w:r>
+    </w:p>
+    <w:p>
+      <w:pPr>
+        <w:pStyle w:val="FirstParagraph"/>
+      </w:pPr>
+      <w:r>
+        <w:t xml:space="preserve">IMPOSTOS</w:t>
+      </w:r>
+      <w:r>
+        <w:t xml:space="preserve">R$ 2,89 tri</w:t>
+      </w:r>
+    </w:p>
+    <w:p>
+      <w:pPr>
+        <w:pStyle w:val="BodyText"/>
+      </w:pPr>
+      <w:r>
+        <w:t xml:space="preserve">“Arrecadação de impostos bate recorde em 2025 e atinge R$ 2,89 trilhões”</w:t>
+      </w:r>
+    </w:p>
+    <w:p>
+      <w:pPr>
+        <w:pStyle w:val="BodyText"/>
+      </w:pPr>
+      <w:r>
+        <w:t xml:space="preserve">Maior arrecadação da história, com alta real de 3,75% sobre 2024.</w:t>
+      </w:r>
+    </w:p>
+    <w:p>
+      <w:pPr>
+        <w:pStyle w:val="BodyText"/>
+      </w:pPr>
+      <w:r>
+        <w:rPr>
+          <w:bCs/>
+          <w:b/>
+        </w:rPr>
+        <w:t xml:space="preserve">Gazeta do Povo</w:t>
+      </w:r>
+      <w:r>
+        <w:t xml:space="preserve"> </w:t>
+      </w:r>
+      <w:r>
+        <w:t xml:space="preserve">· link consultado em 28/10/2026</w:t>
+      </w:r>
+    </w:p>
+    <w:p>
+      <w:pPr>
+        <w:pStyle w:val="BodyText"/>
+      </w:pPr>
+      <w:r>
+        <w:t xml:space="preserve">IMPOSTOS</w:t>
+      </w:r>
+      <w:r>
+        <w:t xml:space="preserve">1 a cada 27 dias</w:t>
+      </w:r>
+    </w:p>
+    <w:p>
+      <w:pPr>
+        <w:pStyle w:val="BodyText"/>
+      </w:pPr>
+      <w:r>
+        <w:t xml:space="preserve">“Governo Lula: novo imposto a cada 27 dias e carga recorde”</w:t>
+      </w:r>
+    </w:p>
+    <w:p>
+      <w:pPr>
+        <w:pStyle w:val="BodyText"/>
+      </w:pPr>
+      <w:r>
+        <w:t xml:space="preserve">43 medidas para elevar impostos em pouco mais de 3 anos.</w:t>
+      </w:r>
+    </w:p>
+    <w:p>
+      <w:pPr>
+        <w:pStyle w:val="BodyText"/>
+      </w:pPr>
+      <w:r>
+        <w:rPr>
+          <w:bCs/>
+          <w:b/>
+        </w:rPr>
+        <w:t xml:space="preserve">Gazeta do Povo</w:t>
+      </w:r>
+      <w:r>
+        <w:t xml:space="preserve"> </w:t>
+      </w:r>
+      <w:r>
+        <w:t xml:space="preserve">· link consultado em 28/10/2026</w:t>
+      </w:r>
+    </w:p>
+    <w:p>
+      <w:pPr>
+        <w:pStyle w:val="BodyText"/>
+      </w:pPr>
+      <w:r>
+        <w:t xml:space="preserve">IMPOSTOS</w:t>
+      </w:r>
+      <w:r>
+        <w:t xml:space="preserve">27 aumentos</w:t>
+      </w:r>
+    </w:p>
+    <w:p>
+      <w:pPr>
+        <w:pStyle w:val="BodyText"/>
+      </w:pPr>
+      <w:r>
+        <w:t xml:space="preserve">“Lula aumentou impostos 27 vezes em 3 anos no Planalto”</w:t>
+      </w:r>
+    </w:p>
+    <w:p>
+      <w:pPr>
+        <w:pStyle w:val="BodyText"/>
+      </w:pPr>
+      <w:r>
+        <w:t xml:space="preserve">Contagem do Poder360: ao menos 27 aumentos desde 2023.</w:t>
+      </w:r>
+    </w:p>
+    <w:p>
+      <w:pPr>
+        <w:pStyle w:val="BodyText"/>
+      </w:pPr>
+      <w:r>
+        <w:rPr>
+          <w:bCs/>
+          <w:b/>
+        </w:rPr>
+        <w:t xml:space="preserve">Poder360</w:t>
+      </w:r>
+      <w:r>
+        <w:t xml:space="preserve"> </w:t>
+      </w:r>
+      <w:r>
+        <w:t xml:space="preserve">· link consultado em 28/10/2026</w:t>
+      </w:r>
+    </w:p>
+    <w:bookmarkEnd w:id="241"/>
     <w:p>
       <w:r>
         <w:pict>
@@ -31717,272 +31339,151 @@
         </w:pict>
       </w:r>
     </w:p>
-    <w:p>
-      <w:pPr>
-        <w:numPr>
-          <w:ilvl w:val="0"/>
-          <w:numId w:val="1084"/>
-        </w:numPr>
-        <w:pStyle w:val="Compact"/>
-      </w:pPr>
-      <w:r>
-        <w:rPr>
-          <w:bCs/>
-          <w:b/>
-        </w:rPr>
-        <w:t xml:space="preserve">p. 52</w:t>
-      </w:r>
-      <w:r>
-        <w:t xml:space="preserve">The Rio Times, set/2026 (aluguel em dólar; câmbio); expat.com (filas em escolas internacionais); France 24 (combustível, 2025).</w:t>
-      </w:r>
-    </w:p>
-    <w:p>
-      <w:pPr>
-        <w:numPr>
-          <w:ilvl w:val="0"/>
-          <w:numId w:val="1084"/>
-        </w:numPr>
-        <w:pStyle w:val="Compact"/>
-      </w:pPr>
-      <w:r>
-        <w:rPr>
-          <w:bCs/>
-          <w:b/>
-        </w:rPr>
-        <w:t xml:space="preserve">p. 53</w:t>
-      </w:r>
-      <w:r>
-        <w:t xml:space="preserve">Orçamentos da página anterior (teto de cada faixa). Cálculo do curso; não considera inflação nem rendimento.</w:t>
-      </w:r>
-    </w:p>
-    <w:p>
-      <w:pPr>
-        <w:numPr>
-          <w:ilvl w:val="0"/>
-          <w:numId w:val="1084"/>
-        </w:numPr>
-        <w:pStyle w:val="Compact"/>
-      </w:pPr>
-      <w:r>
-        <w:rPr>
-          <w:bCs/>
-          <w:b/>
-        </w:rPr>
-        <w:t xml:space="preserve">p. 54</w:t>
-      </w:r>
-      <w:r>
-        <w:t xml:space="preserve">The Rio Times (Healthcare in Bolivia 2026); GOV.UK (lista de clínicas na Bolívia); Holafly (saúde pública para estrangeiros).</w:t>
-      </w:r>
-    </w:p>
-    <w:p>
-      <w:pPr>
-        <w:numPr>
-          <w:ilvl w:val="0"/>
-          <w:numId w:val="1084"/>
-        </w:numPr>
-        <w:pStyle w:val="Compact"/>
-      </w:pPr>
-      <w:r>
-        <w:rPr>
-          <w:bCs/>
-          <w:b/>
-        </w:rPr>
-        <w:t xml:space="preserve">p. 55</w:t>
-      </w:r>
-      <w:r>
-        <w:t xml:space="preserve">Mochileiros (CIVP febre amarela para entrada).</w:t>
-      </w:r>
-    </w:p>
-    <w:p>
-      <w:pPr>
-        <w:numPr>
-          <w:ilvl w:val="0"/>
-          <w:numId w:val="1084"/>
-        </w:numPr>
-        <w:pStyle w:val="Compact"/>
-      </w:pPr>
-      <w:r>
-        <w:rPr>
-          <w:bCs/>
-          <w:b/>
-        </w:rPr>
-        <w:t xml:space="preserve">p. 56</w:t>
-      </w:r>
-      <w:r>
-        <w:t xml:space="preserve">International Medical Relief (pacote Clínica Alemana). US$ 1 = R$ 5,35.</w:t>
-      </w:r>
-    </w:p>
-    <w:p>
-      <w:pPr>
-        <w:numPr>
-          <w:ilvl w:val="0"/>
-          <w:numId w:val="1084"/>
-        </w:numPr>
-        <w:pStyle w:val="Compact"/>
-      </w:pPr>
-      <w:r>
-        <w:rPr>
-          <w:bCs/>
-          <w:b/>
-        </w:rPr>
-        <w:t xml:space="preserve">p. 57</w:t>
-      </w:r>
-      <w:r>
-        <w:t xml:space="preserve">Gran Faculdade (média nacional ~R$ 9.500, 2026); Sanarmed (Bolívia R$ 700–1.200); Universidade do Intercâmbio (média ~R$ 750 em Cochabamba e Santa Cruz). Valores variam; confirmar com cada instituição.</w:t>
-      </w:r>
-    </w:p>
-    <w:p>
-      <w:pPr>
-        <w:numPr>
-          <w:ilvl w:val="0"/>
-          <w:numId w:val="1084"/>
-        </w:numPr>
-        <w:pStyle w:val="Compact"/>
-      </w:pPr>
-      <w:r>
-        <w:rPr>
-          <w:bCs/>
-          <w:b/>
-        </w:rPr>
-        <w:t xml:space="preserve">p. 58</w:t>
-      </w:r>
-      <w:r>
-        <w:t xml:space="preserve">Universidade do Intercâmbio; Estratégia Vestibulares; Correio do Estado; Querobolsa (lista de universidades). Exemplos, não indicação paga.</w:t>
-      </w:r>
-    </w:p>
-    <w:p>
-      <w:pPr>
-        <w:numPr>
-          <w:ilvl w:val="0"/>
-          <w:numId w:val="1084"/>
-        </w:numPr>
-        <w:pStyle w:val="Compact"/>
-      </w:pPr>
-      <w:r>
-        <w:rPr>
-          <w:bCs/>
-          <w:b/>
-        </w:rPr>
-        <w:t xml:space="preserve">p. 59</w:t>
-      </w:r>
-      <w:r>
-        <w:t xml:space="preserve">expat.com (guia de Santa Cruz); IBO (Colegio Alemán); CBDE, monitoramento de imprensa, jan/2026 (congelamento e denúncias).</w:t>
-      </w:r>
-    </w:p>
-    <w:p>
-      <w:pPr>
-        <w:numPr>
-          <w:ilvl w:val="0"/>
-          <w:numId w:val="1084"/>
-        </w:numPr>
-        <w:pStyle w:val="Compact"/>
-      </w:pPr>
-      <w:r>
-        <w:rPr>
-          <w:bCs/>
-          <w:b/>
-        </w:rPr>
-        <w:t xml:space="preserve">p. 60</w:t>
-      </w:r>
-      <w:r>
-        <w:t xml:space="preserve">expat.com (perfil das escolas internacionais e fila de espera).</w:t>
-      </w:r>
-    </w:p>
-    <w:p>
-      <w:pPr>
-        <w:numPr>
-          <w:ilvl w:val="0"/>
-          <w:numId w:val="1084"/>
-        </w:numPr>
-        <w:pStyle w:val="Compact"/>
-      </w:pPr>
-      <w:r>
-        <w:rPr>
-          <w:bCs/>
-          <w:b/>
-        </w:rPr>
-        <w:t xml:space="preserve">p. 61</w:t>
-      </w:r>
-      <w:r>
-        <w:t xml:space="preserve">Guias de viagem 2026 (US$ 140–200); Nomades (US$ 229 até 31/12/2026; semiprivado US$ 710/pessoa para 2). Extras: guia de viagem. Preços de agência, variam por temporada.</w:t>
-      </w:r>
-    </w:p>
-    <w:p>
-      <w:pPr>
-        <w:numPr>
-          <w:ilvl w:val="0"/>
-          <w:numId w:val="1084"/>
-        </w:numPr>
-        <w:pStyle w:val="Compact"/>
-      </w:pPr>
-      <w:r>
-        <w:rPr>
-          <w:bCs/>
-          <w:b/>
-        </w:rPr>
-        <w:t xml:space="preserve">p. 62</w:t>
-      </w:r>
-      <w:r>
-        <w:t xml:space="preserve">Autor, out/2026. R$ 1 = Bs 2,30.</w:t>
-      </w:r>
-    </w:p>
-    <w:p>
-      <w:pPr>
-        <w:numPr>
-          <w:ilvl w:val="0"/>
-          <w:numId w:val="1084"/>
-        </w:numPr>
-        <w:pStyle w:val="Compact"/>
-      </w:pPr>
-      <w:r>
-        <w:rPr>
-          <w:bCs/>
-          <w:b/>
-        </w:rPr>
-        <w:t xml:space="preserve">p. 64</w:t>
-      </w:r>
-      <w:r>
-        <w:t xml:space="preserve">Living Cost Index 2026; The Rio Times, set/2026. US$ 1 = R$ 5,35. Cálculo do curso; sem inflação nem rendimento.</w:t>
-      </w:r>
-    </w:p>
-    <w:p>
-      <w:pPr>
-        <w:numPr>
-          <w:ilvl w:val="0"/>
-          <w:numId w:val="1084"/>
-        </w:numPr>
-        <w:pStyle w:val="Compact"/>
-      </w:pPr>
-      <w:r>
-        <w:rPr>
-          <w:bCs/>
-          <w:b/>
-        </w:rPr>
-        <w:t xml:space="preserve">p. 65</w:t>
-      </w:r>
-      <w:r>
-        <w:t xml:space="preserve">Orçamento: The Rio Times, set/2026 (teto da faixa do casal). Aluguel SP: FipeZAP Locação set/2026.</w:t>
-      </w:r>
-    </w:p>
-    <w:p>
-      <w:pPr>
-        <w:numPr>
-          <w:ilvl w:val="0"/>
-          <w:numId w:val="1084"/>
-        </w:numPr>
-        <w:pStyle w:val="Compact"/>
-      </w:pPr>
-      <w:r>
-        <w:rPr>
-          <w:bCs/>
-          <w:b/>
-        </w:rPr>
-        <w:t xml:space="preserve">p. 69</w:t>
-      </w:r>
-      <w:r>
-        <w:t xml:space="preserve">Decretos 12.466 e 12.499/2025 (IOF 3,5%); eco.com, guias de 2026 (taxas de rede e tempo de envio; envio errado em geral não tem volta).</w:t>
-      </w:r>
-    </w:p>
+    <w:bookmarkStart w:id="242" w:name="já-aconteceu-cont."/>
+    <w:p>
+      <w:pPr>
+        <w:pStyle w:val="Heading2"/>
+      </w:pPr>
+      <w:r>
+        <w:t xml:space="preserve">Já aconteceu (cont.)</w:t>
+      </w:r>
+    </w:p>
+    <w:p>
+      <w:pPr>
+        <w:pStyle w:val="FirstParagraph"/>
+      </w:pPr>
+      <w:r>
+        <w:t xml:space="preserve">IMPOSTOS</w:t>
+      </w:r>
+      <w:r>
+        <w:t xml:space="preserve">A lista</w:t>
+      </w:r>
+    </w:p>
+    <w:p>
+      <w:pPr>
+        <w:pStyle w:val="BodyText"/>
+      </w:pPr>
+      <w:r>
+        <w:t xml:space="preserve">“Lista dos impostos que o governo Lula criou ou elevou”</w:t>
+      </w:r>
+    </w:p>
+    <w:p>
+      <w:pPr>
+        <w:pStyle w:val="BodyText"/>
+      </w:pPr>
+      <w:r>
+        <w:t xml:space="preserve">Taxa das blusinhas, IOF, fundos exclusivos, bets, combustíveis e mais.</w:t>
+      </w:r>
+    </w:p>
+    <w:p>
+      <w:pPr>
+        <w:pStyle w:val="BodyText"/>
+      </w:pPr>
+      <w:r>
+        <w:rPr>
+          <w:bCs/>
+          <w:b/>
+        </w:rPr>
+        <w:t xml:space="preserve">Gazeta do Povo</w:t>
+      </w:r>
+      <w:r>
+        <w:t xml:space="preserve"> </w:t>
+      </w:r>
+      <w:r>
+        <w:t xml:space="preserve">· link consultado em 28/10/2026</w:t>
+      </w:r>
+    </w:p>
+    <w:p>
+      <w:pPr>
+        <w:pStyle w:val="BodyText"/>
+      </w:pPr>
+      <w:r>
+        <w:t xml:space="preserve">CÂMBIO</w:t>
+      </w:r>
+      <w:r>
+        <w:t xml:space="preserve">IOF 3,5%</w:t>
+      </w:r>
+    </w:p>
+    <w:p>
+      <w:pPr>
+        <w:pStyle w:val="BodyText"/>
+      </w:pPr>
+      <w:r>
+        <w:t xml:space="preserve">“Haddad desiste de zerar IOF do cartão internacional e sobe para 3,5%”</w:t>
+      </w:r>
+    </w:p>
+    <w:p>
+      <w:pPr>
+        <w:pStyle w:val="BodyText"/>
+      </w:pPr>
+      <w:r>
+        <w:t xml:space="preserve">Cartão, dinheiro em espécie e remessa para conta própria: 3,5%.</w:t>
+      </w:r>
+    </w:p>
+    <w:p>
+      <w:pPr>
+        <w:pStyle w:val="BodyText"/>
+      </w:pPr>
+      <w:r>
+        <w:rPr>
+          <w:bCs/>
+          <w:b/>
+        </w:rPr>
+        <w:t xml:space="preserve">Poder360</w:t>
+      </w:r>
+      <w:r>
+        <w:t xml:space="preserve"> </w:t>
+      </w:r>
+      <w:r>
+        <w:t xml:space="preserve">· link consultado em 28/10/2026</w:t>
+      </w:r>
+    </w:p>
+    <w:p>
+      <w:pPr>
+        <w:pStyle w:val="BodyText"/>
+      </w:pPr>
+      <w:r>
+        <w:t xml:space="preserve">CÂMBIO</w:t>
+      </w:r>
+      <w:r>
+        <w:t xml:space="preserve">Congresso × STF</w:t>
+      </w:r>
+    </w:p>
+    <w:p>
+      <w:pPr>
+        <w:pStyle w:val="BodyText"/>
+      </w:pPr>
+      <w:r>
+        <w:t xml:space="preserve">“Saiba como fica o IOF após decisão de Moraes”</w:t>
+      </w:r>
+    </w:p>
+    <w:p>
+      <w:pPr>
+        <w:pStyle w:val="BodyText"/>
+      </w:pPr>
+      <w:r>
+        <w:t xml:space="preserve">O Congresso derrubou o aumento do IOF. Uma decisão de Moraes restabeleceu as taxas.</w:t>
+      </w:r>
+    </w:p>
+    <w:p>
+      <w:pPr>
+        <w:pStyle w:val="BodyText"/>
+      </w:pPr>
+      <w:r>
+        <w:rPr>
+          <w:bCs/>
+          <w:b/>
+        </w:rPr>
+        <w:t xml:space="preserve">Jovem Pan</w:t>
+      </w:r>
+      <w:r>
+        <w:t xml:space="preserve"> </w:t>
+      </w:r>
+      <w:r>
+        <w:t xml:space="preserve">· link consultado em 28/10/2026</w:t>
+      </w:r>
+    </w:p>
+    <w:bookmarkEnd w:id="242"/>
     <w:p>
       <w:r>
         <w:pict>
@@ -31990,253 +31491,151 @@
         </w:pict>
       </w:r>
     </w:p>
-    <w:p>
-      <w:pPr>
-        <w:numPr>
-          <w:ilvl w:val="0"/>
-          <w:numId w:val="1085"/>
-        </w:numPr>
-        <w:pStyle w:val="Compact"/>
-      </w:pPr>
-      <w:r>
-        <w:rPr>
-          <w:bCs/>
-          <w:b/>
-        </w:rPr>
-        <w:t xml:space="preserve">p. 70</w:t>
-      </w:r>
-      <w:r>
-        <w:t xml:space="preserve">Chainalysis via Investalk/BB (jul/2024–jun/2025: US$ 319 bi; 90% em stablecoins); diretor do BC Renato Dias Gomes, mai/2025 (~90%); Receita Federal via COAD (R$ 1,13 tri declarados em stablecoins, ago/2019–dez/2025, ~80% do volume declarado); InfoMoney e Fizen (Res. BCB 519–521).</w:t>
-      </w:r>
-    </w:p>
-    <w:p>
-      <w:pPr>
-        <w:numPr>
-          <w:ilvl w:val="0"/>
-          <w:numId w:val="1085"/>
-        </w:numPr>
-        <w:pStyle w:val="Compact"/>
-      </w:pPr>
-      <w:r>
-        <w:rPr>
-          <w:bCs/>
-          <w:b/>
-        </w:rPr>
-        <w:t xml:space="preserve">p. 71</w:t>
-      </w:r>
-      <w:r>
-        <w:t xml:space="preserve">usdthoy.com (flutuação do boliviano desde 29/06/2026).</w:t>
-      </w:r>
-    </w:p>
-    <w:p>
-      <w:pPr>
-        <w:numPr>
-          <w:ilvl w:val="0"/>
-          <w:numId w:val="1085"/>
-        </w:numPr>
-        <w:pStyle w:val="Compact"/>
-      </w:pPr>
-      <w:r>
-        <w:rPr>
-          <w:bCs/>
-          <w:b/>
-        </w:rPr>
-        <w:t xml:space="preserve">p. 72</w:t>
-      </w:r>
-      <w:r>
-        <w:t xml:space="preserve">CoinMarketCap e DefiLlama via Admiral Markets (~12/10/2026: US$ 184 bi; ~60% de US$ 306 bi); atestação BDO do 2º tri/2026 (31/07/2026), via Stablecoin Insider; Crowdfund Insider via Admiral Markets (auditoria em andamento, ago/2026).</w:t>
-      </w:r>
-    </w:p>
-    <w:p>
-      <w:pPr>
-        <w:numPr>
-          <w:ilvl w:val="0"/>
-          <w:numId w:val="1085"/>
-        </w:numPr>
-        <w:pStyle w:val="Compact"/>
-      </w:pPr>
-      <w:r>
-        <w:rPr>
-          <w:bCs/>
-          <w:b/>
-        </w:rPr>
-        <w:t xml:space="preserve">p. 73</w:t>
-      </w:r>
-      <w:r>
-        <w:t xml:space="preserve">DefiLlama via Admiral Markets (~12/10/2026); dolarparalelobolivia.net, 28/10/2026 (P2P Bs 12,13); CriptoNoticias, Criptoinforme e usdthoy (bancos bolivianos).</w:t>
-      </w:r>
-    </w:p>
-    <w:p>
-      <w:pPr>
-        <w:numPr>
-          <w:ilvl w:val="0"/>
-          <w:numId w:val="1085"/>
-        </w:numPr>
-        <w:pStyle w:val="Compact"/>
-      </w:pPr>
-      <w:r>
-        <w:rPr>
-          <w:bCs/>
-          <w:b/>
-        </w:rPr>
-        <w:t xml:space="preserve">p. 74</w:t>
-      </w:r>
-      <w:r>
-        <w:t xml:space="preserve">Atestação BDO do 2º tri/2026; Res. BCB 519–521 (operações com stablecoin).</w:t>
-      </w:r>
-    </w:p>
-    <w:p>
-      <w:pPr>
-        <w:numPr>
-          <w:ilvl w:val="0"/>
-          <w:numId w:val="1085"/>
-        </w:numPr>
-        <w:pStyle w:val="Compact"/>
-      </w:pPr>
-      <w:r>
-        <w:rPr>
-          <w:bCs/>
-          <w:b/>
-        </w:rPr>
-        <w:t xml:space="preserve">p. 75</w:t>
-      </w:r>
-      <w:r>
-        <w:t xml:space="preserve">Capital Aberto, mar/2026 (topo de US$ 126 mil em out/2025; retração de 52,4%); AUVP (queda de 13% em 06/02/2026).</w:t>
-      </w:r>
-    </w:p>
-    <w:p>
-      <w:pPr>
-        <w:numPr>
-          <w:ilvl w:val="0"/>
-          <w:numId w:val="1085"/>
-        </w:numPr>
-        <w:pStyle w:val="Compact"/>
-      </w:pPr>
-      <w:r>
-        <w:rPr>
-          <w:bCs/>
-          <w:b/>
-        </w:rPr>
-        <w:t xml:space="preserve">p. 76</w:t>
-      </w:r>
-      <w:r>
-        <w:t xml:space="preserve">AUVP (queda de 13% em um dia, 06/02/2026).</w:t>
-      </w:r>
-    </w:p>
-    <w:p>
-      <w:pPr>
-        <w:numPr>
-          <w:ilvl w:val="0"/>
-          <w:numId w:val="1085"/>
-        </w:numPr>
-        <w:pStyle w:val="Compact"/>
-      </w:pPr>
-      <w:r>
-        <w:rPr>
-          <w:bCs/>
-          <w:b/>
-        </w:rPr>
-        <w:t xml:space="preserve">p. 78</w:t>
-      </w:r>
-      <w:r>
-        <w:t xml:space="preserve">InfoMoney e Fizen (Res. BCB 519–521: identificação de carteira autocustodiada, vigência 02/02/2026).</w:t>
-      </w:r>
-    </w:p>
-    <w:p>
-      <w:pPr>
-        <w:numPr>
-          <w:ilvl w:val="0"/>
-          <w:numId w:val="1085"/>
-        </w:numPr>
-        <w:pStyle w:val="Compact"/>
-      </w:pPr>
-      <w:r>
-        <w:rPr>
-          <w:bCs/>
-          <w:b/>
-        </w:rPr>
-        <w:t xml:space="preserve">p. 82</w:t>
-      </w:r>
-      <w:r>
-        <w:t xml:space="preserve">eco.com, guias de 2026 (redes do USDT; envio para rede errada em geral não é recuperável).</w:t>
-      </w:r>
-    </w:p>
-    <w:p>
-      <w:pPr>
-        <w:numPr>
-          <w:ilvl w:val="0"/>
-          <w:numId w:val="1085"/>
-        </w:numPr>
-        <w:pStyle w:val="Compact"/>
-      </w:pPr>
-      <w:r>
-        <w:rPr>
-          <w:bCs/>
-          <w:b/>
-        </w:rPr>
-        <w:t xml:space="preserve">p. 83</w:t>
-      </w:r>
-      <w:r>
-        <w:t xml:space="preserve">eco.com, comparativo de taxas de rede, mai/2026 (Binance: TRC20 1, BEP20 0,29, ERC20 1,6, SOL 1 USDT; velocidade TRC20/BEP20 ~1 min, ERC20 ~2 min); comparativo de 2026 (Polygon ~1 USDT). Escopo do curso, Seção 2.1 (taxa de 1 USDT no exemplo-padrão).</w:t>
-      </w:r>
-    </w:p>
-    <w:p>
-      <w:pPr>
-        <w:numPr>
-          <w:ilvl w:val="0"/>
-          <w:numId w:val="1085"/>
-        </w:numPr>
-        <w:pStyle w:val="Compact"/>
-      </w:pPr>
-      <w:r>
-        <w:rPr>
-          <w:bCs/>
-          <w:b/>
-        </w:rPr>
-        <w:t xml:space="preserve">p. 85</w:t>
-      </w:r>
-      <w:r>
-        <w:t xml:space="preserve">Endereços de exemplo, fictícios e encurtados.</w:t>
-      </w:r>
-    </w:p>
-    <w:p>
-      <w:pPr>
-        <w:numPr>
-          <w:ilvl w:val="0"/>
-          <w:numId w:val="1085"/>
-        </w:numPr>
-        <w:pStyle w:val="Compact"/>
-      </w:pPr>
-      <w:r>
-        <w:rPr>
-          <w:bCs/>
-          <w:b/>
-        </w:rPr>
-        <w:t xml:space="preserve">p. 86</w:t>
-      </w:r>
-      <w:r>
-        <w:t xml:space="preserve">eco.com, guias de 2026 (memo não necessário em TRC20, BEP20 e ERC20, salvo quando o lado que recebe informa um).</w:t>
-      </w:r>
-    </w:p>
-    <w:p>
-      <w:pPr>
-        <w:numPr>
-          <w:ilvl w:val="0"/>
-          <w:numId w:val="1085"/>
-        </w:numPr>
-        <w:pStyle w:val="Compact"/>
-      </w:pPr>
-      <w:r>
-        <w:rPr>
-          <w:bCs/>
-          <w:b/>
-        </w:rPr>
-        <w:t xml:space="preserve">p. 96</w:t>
-      </w:r>
-      <w:r>
-        <w:t xml:space="preserve">Escopo do curso, Seção 2.1 (exemplo-padrão: USDT a R$ 5,38, rede de 1 USDT, P2P a Bs 12,13; remessa e espécie com percentuais ilustrativos).</w:t>
-      </w:r>
-    </w:p>
+    <w:bookmarkStart w:id="243" w:name="já-aconteceu-cont.-1"/>
+    <w:p>
+      <w:pPr>
+        <w:pStyle w:val="Heading2"/>
+      </w:pPr>
+      <w:r>
+        <w:t xml:space="preserve">Já aconteceu (cont.)</w:t>
+      </w:r>
+    </w:p>
+    <w:p>
+      <w:pPr>
+        <w:pStyle w:val="FirstParagraph"/>
+      </w:pPr>
+      <w:r>
+        <w:t xml:space="preserve">DÍVIDA</w:t>
+      </w:r>
+      <w:r>
+        <w:t xml:space="preserve">R$ 11,1 tri</w:t>
+      </w:r>
+    </w:p>
+    <w:p>
+      <w:pPr>
+        <w:pStyle w:val="BodyText"/>
+      </w:pPr>
+      <w:r>
+        <w:t xml:space="preserve">“Dívida pública avança a 82,9% do PIB e bate R$ 11 trilhões sob Lula”</w:t>
+      </w:r>
+    </w:p>
+    <w:p>
+      <w:pPr>
+        <w:pStyle w:val="BodyText"/>
+      </w:pPr>
+      <w:r>
+        <w:t xml:space="preserve">Confirmado pelo Banco Central (Poder360): maior nível desde 2020.</w:t>
+      </w:r>
+    </w:p>
+    <w:p>
+      <w:pPr>
+        <w:pStyle w:val="BodyText"/>
+      </w:pPr>
+      <w:r>
+        <w:rPr>
+          <w:bCs/>
+          <w:b/>
+        </w:rPr>
+        <w:t xml:space="preserve">Revista Oeste</w:t>
+      </w:r>
+      <w:r>
+        <w:t xml:space="preserve"> </w:t>
+      </w:r>
+      <w:r>
+        <w:t xml:space="preserve">· link consultado em 28/10/2026</w:t>
+      </w:r>
+    </w:p>
+    <w:p>
+      <w:pPr>
+        <w:pStyle w:val="BodyText"/>
+      </w:pPr>
+      <w:r>
+        <w:t xml:space="preserve">DÍVIDA</w:t>
+      </w:r>
+      <w:r>
+        <w:t xml:space="preserve">R$ 1,18 tri</w:t>
+      </w:r>
+    </w:p>
+    <w:p>
+      <w:pPr>
+        <w:pStyle w:val="BodyText"/>
+      </w:pPr>
+      <w:r>
+        <w:t xml:space="preserve">“Dívida pública brasileira alcança R$ 11 trilhões e chega a 82,9% do PIB”</w:t>
+      </w:r>
+    </w:p>
+    <w:p>
+      <w:pPr>
+        <w:pStyle w:val="BodyText"/>
+      </w:pPr>
+      <w:r>
+        <w:t xml:space="preserve">Só de juros: R$ 1,18 trilhão em 12 meses (até ago/2026).</w:t>
+      </w:r>
+    </w:p>
+    <w:p>
+      <w:pPr>
+        <w:pStyle w:val="BodyText"/>
+      </w:pPr>
+      <w:r>
+        <w:rPr>
+          <w:bCs/>
+          <w:b/>
+        </w:rPr>
+        <w:t xml:space="preserve">Gazeta do Povo</w:t>
+      </w:r>
+      <w:r>
+        <w:t xml:space="preserve"> </w:t>
+      </w:r>
+      <w:r>
+        <w:t xml:space="preserve">· link consultado em 28/10/2026</w:t>
+      </w:r>
+    </w:p>
+    <w:p>
+      <w:pPr>
+        <w:pStyle w:val="BodyText"/>
+      </w:pPr>
+      <w:r>
+        <w:t xml:space="preserve">DÉFICIT</w:t>
+      </w:r>
+      <w:r>
+        <w:t xml:space="preserve">+ R$ 1 tri</w:t>
+      </w:r>
+    </w:p>
+    <w:p>
+      <w:pPr>
+        <w:pStyle w:val="BodyText"/>
+      </w:pPr>
+      <w:r>
+        <w:t xml:space="preserve">“Sob Lula, arrecadação bate recorde, mas déficit permanece acima de R$ 1 tri pelo 3º ano seguido”</w:t>
+      </w:r>
+    </w:p>
+    <w:p>
+      <w:pPr>
+        <w:pStyle w:val="BodyText"/>
+      </w:pPr>
+      <w:r>
+        <w:t xml:space="preserve">Arrecada mais do que nunca e ainda fecha no vermelho.</w:t>
+      </w:r>
+    </w:p>
+    <w:p>
+      <w:pPr>
+        <w:pStyle w:val="BodyText"/>
+      </w:pPr>
+      <w:r>
+        <w:rPr>
+          <w:bCs/>
+          <w:b/>
+        </w:rPr>
+        <w:t xml:space="preserve">Revista Oeste</w:t>
+      </w:r>
+      <w:r>
+        <w:t xml:space="preserve"> </w:t>
+      </w:r>
+      <w:r>
+        <w:t xml:space="preserve">· link consultado em 28/10/2026</w:t>
+      </w:r>
+    </w:p>
+    <w:bookmarkEnd w:id="243"/>
     <w:p>
       <w:r>
         <w:pict>
@@ -32244,215 +31643,151 @@
         </w:pict>
       </w:r>
     </w:p>
-    <w:p>
-      <w:pPr>
-        <w:numPr>
-          <w:ilvl w:val="0"/>
-          <w:numId w:val="1086"/>
-        </w:numPr>
-        <w:pStyle w:val="Compact"/>
-      </w:pPr>
-      <w:r>
-        <w:rPr>
-          <w:bCs/>
-          <w:b/>
-        </w:rPr>
-        <w:t xml:space="preserve">p. 98</w:t>
-      </w:r>
-      <w:r>
-        <w:t xml:space="preserve">Escopo do curso, Seção 2.1 (câmbio efetivo; spreads de remessa e espécie são exemplos); Decretos 12.466 e 12.499/2025 (IOF 3,5%).</w:t>
-      </w:r>
-    </w:p>
-    <w:p>
-      <w:pPr>
-        <w:numPr>
-          <w:ilvl w:val="0"/>
-          <w:numId w:val="1086"/>
-        </w:numPr>
-        <w:pStyle w:val="Compact"/>
-      </w:pPr>
-      <w:r>
-        <w:rPr>
-          <w:bCs/>
-          <w:b/>
-        </w:rPr>
-        <w:t xml:space="preserve">p. 99</w:t>
-      </w:r>
-      <w:r>
-        <w:t xml:space="preserve">Escopo do curso, Seção 2.1; InfoMoney (nov/2025) e Blue Consult (25/07/2026): IOF não cobrado automaticamente na compra de stablecoin.</w:t>
-      </w:r>
-    </w:p>
-    <w:p>
-      <w:pPr>
-        <w:numPr>
-          <w:ilvl w:val="0"/>
-          <w:numId w:val="1086"/>
-        </w:numPr>
-        <w:pStyle w:val="Compact"/>
-      </w:pPr>
-      <w:r>
-        <w:rPr>
-          <w:bCs/>
-          <w:b/>
-        </w:rPr>
-        <w:t xml:space="preserve">p. 100</w:t>
-      </w:r>
-      <w:r>
-        <w:t xml:space="preserve">Escopo do curso, Seção 2.1; Investidor10 e CoinMarketCap, 28/10/2026 (R$ 5,35); dolarparalelobolivia.net, 28/10/2026 (P2P Bs 12,13).</w:t>
-      </w:r>
-    </w:p>
-    <w:p>
-      <w:pPr>
-        <w:numPr>
-          <w:ilvl w:val="0"/>
-          <w:numId w:val="1086"/>
-        </w:numPr>
-        <w:pStyle w:val="Compact"/>
-      </w:pPr>
-      <w:r>
-        <w:rPr>
-          <w:bCs/>
-          <w:b/>
-        </w:rPr>
-        <w:t xml:space="preserve">p. 101</w:t>
-      </w:r>
-      <w:r>
-        <w:t xml:space="preserve">Lei 14.478/2022; Poder360 (textos das Res. BCB 519, 520 e 521, 10/11/2025); InfoMoney (vigência 02/02/2026); BlockEden (Res. 561); Let's Money (prazo de autorização até 30/10/2026; reporte adiado para 03/11/2026 pela Res. 574); Blocktrends e Judit (Res. 584).</w:t>
-      </w:r>
-    </w:p>
-    <w:p>
-      <w:pPr>
-        <w:numPr>
-          <w:ilvl w:val="0"/>
-          <w:numId w:val="1086"/>
-        </w:numPr>
-        <w:pStyle w:val="Compact"/>
-      </w:pPr>
-      <w:r>
-        <w:rPr>
-          <w:bCs/>
-          <w:b/>
-        </w:rPr>
-        <w:t xml:space="preserve">p. 102</w:t>
-      </w:r>
-      <w:r>
-        <w:t xml:space="preserve">Poder360 (íntegra das Res. BCB 519, 520 e 521); InfoMoney (“BC define regras para o mercado de criptomoedas”). Conferir os textos oficiais em bcb.gov.br.</w:t>
-      </w:r>
-    </w:p>
-    <w:p>
-      <w:pPr>
-        <w:numPr>
-          <w:ilvl w:val="0"/>
-          <w:numId w:val="1086"/>
-        </w:numPr>
-        <w:pStyle w:val="Compact"/>
-      </w:pPr>
-      <w:r>
-        <w:rPr>
-          <w:bCs/>
-          <w:b/>
-        </w:rPr>
-        <w:t xml:space="preserve">p. 103</w:t>
-      </w:r>
-      <w:r>
-        <w:t xml:space="preserve">Blocktrends e SpaceMoney (Res. BCB 584, publicada em 07/08/2026, vigência 01/01/2027); Judit (liberação antecipada); Investalk/BB; Judit (PDL 926/2026, 10/08/2026).</w:t>
-      </w:r>
-    </w:p>
-    <w:p>
-      <w:pPr>
-        <w:numPr>
-          <w:ilvl w:val="0"/>
-          <w:numId w:val="1086"/>
-        </w:numPr>
-        <w:pStyle w:val="Compact"/>
-      </w:pPr>
-      <w:r>
-        <w:rPr>
-          <w:bCs/>
-          <w:b/>
-        </w:rPr>
-        <w:t xml:space="preserve">p. 104</w:t>
-      </w:r>
-      <w:r>
-        <w:t xml:space="preserve">Gazeta do Povo e Revista Oeste (minuta da Receita, fev/2026: 3,5% com isenção até R$ 10 mil/mês para PF); InfoMoney (“Secretário de Haddad confirma plano de taxar criptomoedas”); Blocknews, out/2026 (consulta adiada; incerteza após a reeleição).</w:t>
-      </w:r>
-    </w:p>
-    <w:p>
-      <w:pPr>
-        <w:numPr>
-          <w:ilvl w:val="0"/>
-          <w:numId w:val="1086"/>
-        </w:numPr>
-        <w:pStyle w:val="Compact"/>
-      </w:pPr>
-      <w:r>
-        <w:rPr>
-          <w:bCs/>
-          <w:b/>
-        </w:rPr>
-        <w:t xml:space="preserve">p. 105</w:t>
-      </w:r>
-      <w:r>
-        <w:t xml:space="preserve">Lei 7.492/1986; Lei 14.478/2022 (escopo do curso, Seção 3.2).</w:t>
-      </w:r>
-    </w:p>
-    <w:p>
-      <w:pPr>
-        <w:numPr>
-          <w:ilvl w:val="0"/>
-          <w:numId w:val="1086"/>
-        </w:numPr>
-        <w:pStyle w:val="Compact"/>
-      </w:pPr>
-      <w:r>
-        <w:rPr>
-          <w:bCs/>
-          <w:b/>
-        </w:rPr>
-        <w:t xml:space="preserve">p. 106</w:t>
-      </w:r>
-      <w:r>
-        <w:t xml:space="preserve">CriptoNoticias (bancos bolivianos com USDT; FIE Cuenta Cripto desde 09/04/2026; Unión/Yasta abr/2026; BISA); KuCoin News (fim da proibição em jun/2024); Cointelegraph e CriptoNoticias (declaração do ministro José Gabriel Espinoza).</w:t>
-      </w:r>
-    </w:p>
-    <w:p>
-      <w:pPr>
-        <w:numPr>
-          <w:ilvl w:val="0"/>
-          <w:numId w:val="1086"/>
-        </w:numPr>
-        <w:pStyle w:val="Compact"/>
-      </w:pPr>
-      <w:r>
-        <w:rPr>
-          <w:bCs/>
-          <w:b/>
-        </w:rPr>
-        <w:t xml:space="preserve">p. 107</w:t>
-      </w:r>
-      <w:r>
-        <w:t xml:space="preserve">CriptoNoticias (FIE: cidadãos bolivianos maiores de 18 residentes; Unión/Yasta; BISA).</w:t>
-      </w:r>
-    </w:p>
-    <w:p>
-      <w:pPr>
-        <w:numPr>
-          <w:ilvl w:val="0"/>
-          <w:numId w:val="1086"/>
-        </w:numPr>
-        <w:pStyle w:val="Compact"/>
-      </w:pPr>
-      <w:r>
-        <w:rPr>
-          <w:bCs/>
-          <w:b/>
-        </w:rPr>
-        <w:t xml:space="preserve">p. 109</w:t>
-      </w:r>
-      <w:r>
-        <w:t xml:space="preserve">InfoMoney (vigência das Res. 519–521); Let's Money (prazo de 270 dias, até 30/10/2026); IstoÉ Dinheiro (prazo de 2 e 3 anos para o BC decidir, 19/02/2026).</w:t>
-      </w:r>
-    </w:p>
+    <w:bookmarkStart w:id="244" w:name="já-aconteceu-cont.-2"/>
+    <w:p>
+      <w:pPr>
+        <w:pStyle w:val="Heading2"/>
+      </w:pPr>
+      <w:r>
+        <w:t xml:space="preserve">Já aconteceu (cont.)</w:t>
+      </w:r>
+    </w:p>
+    <w:p>
+      <w:pPr>
+        <w:pStyle w:val="FirstParagraph"/>
+      </w:pPr>
+      <w:r>
+        <w:t xml:space="preserve">GOLPES</w:t>
+      </w:r>
+      <w:r>
+        <w:t xml:space="preserve">R$ 6,5 bi</w:t>
+      </w:r>
+    </w:p>
+    <w:p>
+      <w:pPr>
+        <w:pStyle w:val="BodyText"/>
+      </w:pPr>
+      <w:r>
+        <w:t xml:space="preserve">“Pix: Golpes crescem 80% e somam R$ 6,5 bi em 2024”</w:t>
+      </w:r>
+    </w:p>
+    <w:p>
+      <w:pPr>
+        <w:pStyle w:val="BodyText"/>
+      </w:pPr>
+      <w:r>
+        <w:t xml:space="preserve">4,7 milhões de fraudes. Só cerca de 7% voltou às vítimas.</w:t>
+      </w:r>
+    </w:p>
+    <w:p>
+      <w:pPr>
+        <w:pStyle w:val="BodyText"/>
+      </w:pPr>
+      <w:r>
+        <w:rPr>
+          <w:bCs/>
+          <w:b/>
+        </w:rPr>
+        <w:t xml:space="preserve">Poder360</w:t>
+      </w:r>
+      <w:r>
+        <w:t xml:space="preserve"> </w:t>
+      </w:r>
+      <w:r>
+        <w:t xml:space="preserve">· link consultado em 28/10/2026</w:t>
+      </w:r>
+    </w:p>
+    <w:p>
+      <w:pPr>
+        <w:pStyle w:val="BodyText"/>
+      </w:pPr>
+      <w:r>
+        <w:t xml:space="preserve">IMPOSTOS</w:t>
+      </w:r>
+      <w:r>
+        <w:t xml:space="preserve">+ R$ 14 bi</w:t>
+      </w:r>
+    </w:p>
+    <w:p>
+      <w:pPr>
+        <w:pStyle w:val="BodyText"/>
+      </w:pPr>
+      <w:r>
+        <w:t xml:space="preserve">“Governo Lula eleva Imposto de Importação e trava investimentos”</w:t>
+      </w:r>
+    </w:p>
+    <w:p>
+      <w:pPr>
+        <w:pStyle w:val="BodyText"/>
+      </w:pPr>
+      <w:r>
+        <w:t xml:space="preserve">Alta sobre bens de capital e informática: pelo menos R$ 14 bilhões.</w:t>
+      </w:r>
+    </w:p>
+    <w:p>
+      <w:pPr>
+        <w:pStyle w:val="BodyText"/>
+      </w:pPr>
+      <w:r>
+        <w:rPr>
+          <w:bCs/>
+          <w:b/>
+        </w:rPr>
+        <w:t xml:space="preserve">Gazeta do Povo</w:t>
+      </w:r>
+      <w:r>
+        <w:t xml:space="preserve"> </w:t>
+      </w:r>
+      <w:r>
+        <w:t xml:space="preserve">· link consultado em 28/10/2026</w:t>
+      </w:r>
+    </w:p>
+    <w:p>
+      <w:pPr>
+        <w:pStyle w:val="BodyText"/>
+      </w:pPr>
+      <w:r>
+        <w:t xml:space="preserve">CRIPTO</w:t>
+      </w:r>
+      <w:r>
+        <w:t xml:space="preserve">IOF 3,5%</w:t>
+      </w:r>
+    </w:p>
+    <w:p>
+      <w:pPr>
+        <w:pStyle w:val="BodyText"/>
+      </w:pPr>
+      <w:r>
+        <w:t xml:space="preserve">“Governo pretende cobrar IOF sobre operações com criptomoedas”</w:t>
+      </w:r>
+    </w:p>
+    <w:p>
+      <w:pPr>
+        <w:pStyle w:val="BodyText"/>
+      </w:pPr>
+      <w:r>
+        <w:t xml:space="preserve">Minuta: 3,5% sobre compras de cripto acima de R$ 10 mil por mês.</w:t>
+      </w:r>
+    </w:p>
+    <w:p>
+      <w:pPr>
+        <w:pStyle w:val="BodyText"/>
+      </w:pPr>
+      <w:r>
+        <w:rPr>
+          <w:bCs/>
+          <w:b/>
+        </w:rPr>
+        <w:t xml:space="preserve">Gazeta do Povo</w:t>
+      </w:r>
+      <w:r>
+        <w:t xml:space="preserve"> </w:t>
+      </w:r>
+      <w:r>
+        <w:t xml:space="preserve">· link consultado em 28/10/2026</w:t>
+      </w:r>
+    </w:p>
+    <w:bookmarkEnd w:id="244"/>
     <w:p>
       <w:r>
         <w:pict>
@@ -32462,270 +31797,157 @@
     </w:p>
     <w:p>
       <w:pPr>
-        <w:numPr>
-          <w:ilvl w:val="0"/>
-          <w:numId w:val="1087"/>
-        </w:numPr>
-        <w:pStyle w:val="Compact"/>
-      </w:pPr>
-      <w:r>
-        <w:rPr>
-          <w:bCs/>
-          <w:b/>
-        </w:rPr>
-        <w:t xml:space="preserve">p. 112</w:t>
-      </w:r>
-      <w:r>
-        <w:t xml:space="preserve">Jovem Pan e Revista Oeste (regras do Pix: limite noturno de R$ 1.000 entre pessoas físicas, 20h–6h); Tecnoblog (aumento em 24 a 48 h); Diário do Comércio, jun/2026 (limite mantido em 2026).</w:t>
-      </w:r>
-    </w:p>
-    <w:p>
-      <w:pPr>
-        <w:numPr>
-          <w:ilvl w:val="0"/>
-          <w:numId w:val="1087"/>
-        </w:numPr>
-        <w:pStyle w:val="Compact"/>
-      </w:pPr>
-      <w:r>
-        <w:rPr>
-          <w:bCs/>
-          <w:b/>
-        </w:rPr>
-        <w:t xml:space="preserve">p. 116</w:t>
-      </w:r>
-      <w:r>
-        <w:t xml:space="preserve">Investidor10 e CoinMarketCap, 28/10/2026.</w:t>
-      </w:r>
-    </w:p>
-    <w:p>
-      <w:pPr>
-        <w:numPr>
-          <w:ilvl w:val="0"/>
-          <w:numId w:val="1087"/>
-        </w:numPr>
-        <w:pStyle w:val="Compact"/>
-      </w:pPr>
-      <w:r>
-        <w:rPr>
-          <w:bCs/>
-          <w:b/>
-        </w:rPr>
-        <w:t xml:space="preserve">p. 117</w:t>
-      </w:r>
-      <w:r>
-        <w:t xml:space="preserve">eco.com, comparativo de taxas de rede, mai/2026.</w:t>
-      </w:r>
-    </w:p>
-    <w:p>
-      <w:pPr>
-        <w:numPr>
-          <w:ilvl w:val="0"/>
-          <w:numId w:val="1087"/>
-        </w:numPr>
-        <w:pStyle w:val="Compact"/>
-      </w:pPr>
-      <w:r>
-        <w:rPr>
-          <w:bCs/>
-          <w:b/>
-        </w:rPr>
-        <w:t xml:space="preserve">p. 120</w:t>
-      </w:r>
-      <w:r>
-        <w:t xml:space="preserve">Poder360 (texto da Res. BCB 521: identificação de carteira autocustodiada); Blocktrends (Res. 584).</w:t>
-      </w:r>
-    </w:p>
-    <w:p>
-      <w:pPr>
-        <w:numPr>
-          <w:ilvl w:val="0"/>
-          <w:numId w:val="1087"/>
-        </w:numPr>
-        <w:pStyle w:val="Compact"/>
-      </w:pPr>
-      <w:r>
-        <w:rPr>
-          <w:bCs/>
-          <w:b/>
-        </w:rPr>
-        <w:t xml:space="preserve">p. 121</w:t>
-      </w:r>
-      <w:r>
-        <w:t xml:space="preserve">dolarparalelobolivia.net, 28/10/2026 (P2P Binance: compra Bs 12,17, venda Bs 12,13); BCB via usdtbol.com, 28/10/2026 (Bs 12,02).</w:t>
-      </w:r>
-    </w:p>
-    <w:p>
-      <w:pPr>
-        <w:numPr>
-          <w:ilvl w:val="0"/>
-          <w:numId w:val="1087"/>
-        </w:numPr>
-        <w:pStyle w:val="Compact"/>
-      </w:pPr>
-      <w:r>
-        <w:rPr>
-          <w:bCs/>
-          <w:b/>
-        </w:rPr>
-        <w:t xml:space="preserve">p. 126</w:t>
-      </w:r>
-      <w:r>
-        <w:t xml:space="preserve">CriptoNoticias; Criptoinforme; usdthoy (escopo do curso, Seção 2: limites de BISA, FIE e Unión/Yasta); CriptoNoticias (FIE para cidadãos bolivianos residentes; Unión/EFY com respaldo da ASFI).</w:t>
-      </w:r>
-    </w:p>
-    <w:p>
-      <w:pPr>
-        <w:numPr>
-          <w:ilvl w:val="0"/>
-          <w:numId w:val="1087"/>
-        </w:numPr>
-        <w:pStyle w:val="Compact"/>
-      </w:pPr>
-      <w:r>
-        <w:rPr>
-          <w:bCs/>
-          <w:b/>
-        </w:rPr>
-        <w:t xml:space="preserve">p. 127</w:t>
-      </w:r>
-      <w:r>
-        <w:t xml:space="preserve">CriptoNoticias, CoinMarketCap Academy e Bitcoin.com News (Toyosa: Toyota, BYD e Yamaha aceitam USDT; anúncio de Paolo Ardoino em 21/09/2025).</w:t>
-      </w:r>
-    </w:p>
-    <w:p>
-      <w:pPr>
-        <w:numPr>
-          <w:ilvl w:val="0"/>
-          <w:numId w:val="1087"/>
-        </w:numPr>
-        <w:pStyle w:val="Compact"/>
-      </w:pPr>
-      <w:r>
-        <w:rPr>
-          <w:bCs/>
-          <w:b/>
-        </w:rPr>
-        <w:t xml:space="preserve">p. 129</w:t>
-      </w:r>
-      <w:r>
-        <w:t xml:space="preserve">Escopo do curso, Seção 2.1 (exemplo-padrão).</w:t>
-      </w:r>
-    </w:p>
-    <w:p>
-      <w:pPr>
-        <w:numPr>
-          <w:ilvl w:val="0"/>
-          <w:numId w:val="1087"/>
-        </w:numPr>
-        <w:pStyle w:val="Compact"/>
-      </w:pPr>
-      <w:r>
-        <w:rPr>
-          <w:bCs/>
-          <w:b/>
-        </w:rPr>
-        <w:t xml:space="preserve">p. 131</w:t>
-      </w:r>
-      <w:r>
-        <w:t xml:space="preserve">Escopo do curso, Seção 3.2 (proibição de fracionar para escapar de limites); Blocktrends e Judit (Res. 584).</w:t>
-      </w:r>
-    </w:p>
-    <w:p>
-      <w:pPr>
-        <w:numPr>
-          <w:ilvl w:val="0"/>
-          <w:numId w:val="1087"/>
-        </w:numPr>
-        <w:pStyle w:val="Compact"/>
-      </w:pPr>
-      <w:r>
-        <w:rPr>
-          <w:bCs/>
-          <w:b/>
-        </w:rPr>
-        <w:t xml:space="preserve">p. 132</w:t>
-      </w:r>
-      <w:r>
-        <w:t xml:space="preserve">Poder360 (Res. BCB 521: limite de US$ 100 mil); Blocktrends (Res. 584).</w:t>
-      </w:r>
-    </w:p>
-    <w:p>
-      <w:pPr>
-        <w:numPr>
-          <w:ilvl w:val="0"/>
-          <w:numId w:val="1087"/>
-        </w:numPr>
-        <w:pStyle w:val="Compact"/>
-      </w:pPr>
-      <w:r>
-        <w:rPr>
-          <w:bCs/>
-          <w:b/>
-        </w:rPr>
-        <w:t xml:space="preserve">p. 133</w:t>
-      </w:r>
-      <w:r>
-        <w:t xml:space="preserve">Receita Federal (e-DBV); Aduana Nacional da Bolívia, RD 01-013-24 (Formulário 250, ASFI e retenção de 30%).</w:t>
-      </w:r>
-    </w:p>
-    <w:p>
-      <w:pPr>
-        <w:numPr>
-          <w:ilvl w:val="0"/>
-          <w:numId w:val="1087"/>
-        </w:numPr>
-        <w:pStyle w:val="Compact"/>
-      </w:pPr>
-      <w:r>
-        <w:rPr>
-          <w:bCs/>
-          <w:b/>
-        </w:rPr>
-        <w:t xml:space="preserve">p. 136</w:t>
-      </w:r>
-      <w:r>
-        <w:t xml:space="preserve">Escopo do curso, Seção 3.5; Lei 14.478/2022; Res. BCB 519 e 520.</w:t>
-      </w:r>
-    </w:p>
-    <w:p>
-      <w:pPr>
-        <w:numPr>
-          <w:ilvl w:val="0"/>
-          <w:numId w:val="1087"/>
-        </w:numPr>
-        <w:pStyle w:val="Compact"/>
-      </w:pPr>
-      <w:r>
-        <w:rPr>
-          <w:bCs/>
-          <w:b/>
-        </w:rPr>
-        <w:t xml:space="preserve">p. 138</w:t>
-      </w:r>
-      <w:r>
-        <w:t xml:space="preserve">Exame, via Global Anti-Scam Alliance (mar/2025–fev/2026: R$ 21,2 bi, 16,5 mi de vítimas); Poder360 e Exame, via Banco Central (2024: 4,7 mi de fraudes no Pix, R$ 6,5 bi, R$ 459 mi devolvidos); InfoMoney (golpes com cripto: ~R$ 40 bi e quase 4 mi de vítimas em 5 anos).</w:t>
-      </w:r>
-    </w:p>
-    <w:p>
-      <w:pPr>
-        <w:numPr>
-          <w:ilvl w:val="0"/>
-          <w:numId w:val="1087"/>
-        </w:numPr>
-        <w:pStyle w:val="Compact"/>
-      </w:pPr>
-      <w:r>
-        <w:rPr>
-          <w:bCs/>
-          <w:b/>
-        </w:rPr>
-        <w:t xml:space="preserve">p. 142</w:t>
-      </w:r>
-      <w:r>
-        <w:t xml:space="preserve">Revista Oeste e InfoMoney (Operação Criptoabate, Polícia Civil do RS: perda de R$ 37 mi e cobrança de “taxas” para liberar saque); InfoMoney (Operação Profeta, PF: promessa de até 9% ao mês, ~R$ 260 mi).</w:t>
-      </w:r>
-    </w:p>
+        <w:pStyle w:val="FirstParagraph"/>
+      </w:pPr>
+      <w:r>
+        <w:t xml:space="preserve">Projeções e propostas</w:t>
+      </w:r>
+    </w:p>
+    <w:bookmarkStart w:id="245" w:name="o-que-vem-por-aí-1"/>
+    <w:p>
+      <w:pPr>
+        <w:pStyle w:val="Heading2"/>
+      </w:pPr>
+      <w:r>
+        <w:t xml:space="preserve">O que vem por aí</w:t>
+      </w:r>
+    </w:p>
+    <w:p>
+      <w:pPr>
+        <w:pStyle w:val="FirstParagraph"/>
+      </w:pPr>
+      <w:r>
+        <w:t xml:space="preserve">DÍVIDA</w:t>
+      </w:r>
+      <w:r>
+        <w:t xml:space="preserve">90% do PIB</w:t>
+      </w:r>
+    </w:p>
+    <w:p>
+      <w:pPr>
+        <w:pStyle w:val="BodyText"/>
+      </w:pPr>
+      <w:r>
+        <w:t xml:space="preserve">“Governo admite deixar “herança” de dívida pública em 90% do PIB”</w:t>
+      </w:r>
+    </w:p>
+    <w:p>
+      <w:pPr>
+        <w:pStyle w:val="BodyText"/>
+      </w:pPr>
+      <w:r>
+        <w:t xml:space="preserve">Projeção: o boletim Focus também aponta 90% do PIB já em 2027.</w:t>
+      </w:r>
+    </w:p>
+    <w:p>
+      <w:pPr>
+        <w:pStyle w:val="BodyText"/>
+      </w:pPr>
+      <w:r>
+        <w:rPr>
+          <w:bCs/>
+          <w:b/>
+        </w:rPr>
+        <w:t xml:space="preserve">Gazeta do Povo</w:t>
+      </w:r>
+      <w:r>
+        <w:t xml:space="preserve"> </w:t>
+      </w:r>
+      <w:r>
+        <w:t xml:space="preserve">· link consultado em 28/10/2026</w:t>
+      </w:r>
+    </w:p>
+    <w:p>
+      <w:pPr>
+        <w:pStyle w:val="BodyText"/>
+      </w:pPr>
+      <w:r>
+        <w:t xml:space="preserve">DÍVIDA</w:t>
+      </w:r>
+      <w:r>
+        <w:t xml:space="preserve">Rumo a 100%</w:t>
+      </w:r>
+    </w:p>
+    <w:p>
+      <w:pPr>
+        <w:pStyle w:val="BodyText"/>
+      </w:pPr>
+      <w:r>
+        <w:t xml:space="preserve">“Brasil crescerá 2,4% em 2026 e dívida se aproxima de 100% do PIB”</w:t>
+      </w:r>
+    </w:p>
+    <w:p>
+      <w:pPr>
+        <w:pStyle w:val="BodyText"/>
+      </w:pPr>
+      <w:r>
+        <w:t xml:space="preserve">Projeção publicada pelo Poder360.</w:t>
+      </w:r>
+    </w:p>
+    <w:p>
+      <w:pPr>
+        <w:pStyle w:val="BodyText"/>
+      </w:pPr>
+      <w:r>
+        <w:rPr>
+          <w:bCs/>
+          <w:b/>
+        </w:rPr>
+        <w:t xml:space="preserve">Poder360</w:t>
+      </w:r>
+      <w:r>
+        <w:t xml:space="preserve"> </w:t>
+      </w:r>
+      <w:r>
+        <w:t xml:space="preserve">· link consultado em 28/10/2026</w:t>
+      </w:r>
+    </w:p>
+    <w:p>
+      <w:pPr>
+        <w:pStyle w:val="BodyText"/>
+      </w:pPr>
+      <w:r>
+        <w:t xml:space="preserve">AJUSTE</w:t>
+      </w:r>
+      <w:r>
+        <w:t xml:space="preserve">Inevitável</w:t>
+      </w:r>
+    </w:p>
+    <w:p>
+      <w:pPr>
+        <w:pStyle w:val="BodyText"/>
+      </w:pPr>
+      <w:r>
+        <w:t xml:space="preserve">“Instituição do Senado diz que ajuste fiscal será inevitável”</w:t>
+      </w:r>
+    </w:p>
+    <w:p>
+      <w:pPr>
+        <w:pStyle w:val="BodyText"/>
+      </w:pPr>
+      <w:r>
+        <w:t xml:space="preserve">A IFI projeta déficit de R$ 86,1 bi em 2027; o governo promete superávit de R$ 18,6 bi.</w:t>
+      </w:r>
+    </w:p>
+    <w:p>
+      <w:pPr>
+        <w:pStyle w:val="BodyText"/>
+      </w:pPr>
+      <w:r>
+        <w:rPr>
+          <w:bCs/>
+          <w:b/>
+        </w:rPr>
+        <w:t xml:space="preserve">Poder360</w:t>
+      </w:r>
+      <w:r>
+        <w:t xml:space="preserve"> </w:t>
+      </w:r>
+      <w:r>
+        <w:t xml:space="preserve">· link consultado em 28/10/2026</w:t>
+      </w:r>
+    </w:p>
+    <w:bookmarkEnd w:id="245"/>
     <w:p>
       <w:r>
         <w:pict>
@@ -32733,6 +31955,1830 @@
         </w:pict>
       </w:r>
     </w:p>
+    <w:bookmarkStart w:id="246" w:name="o-que-vem-por-aí-cont."/>
+    <w:p>
+      <w:pPr>
+        <w:pStyle w:val="Heading2"/>
+      </w:pPr>
+      <w:r>
+        <w:t xml:space="preserve">O que vem por aí (cont.)</w:t>
+      </w:r>
+    </w:p>
+    <w:p>
+      <w:pPr>
+        <w:pStyle w:val="FirstParagraph"/>
+      </w:pPr>
+      <w:r>
+        <w:t xml:space="preserve">INVESTIMENTOS</w:t>
+      </w:r>
+      <w:r>
+        <w:t xml:space="preserve">LCI e LCA</w:t>
+      </w:r>
+    </w:p>
+    <w:p>
+      <w:pPr>
+        <w:pStyle w:val="BodyText"/>
+      </w:pPr>
+      <w:r>
+        <w:t xml:space="preserve">“Governo Lula prepara cobrança do IOF sobre investimentos isentos sem passar pelo Congresso”</w:t>
+      </w:r>
+    </w:p>
+    <w:p>
+      <w:pPr>
+        <w:pStyle w:val="BodyText"/>
+      </w:pPr>
+      <w:r>
+        <w:t xml:space="preserve">Proposta em estudo: IOF sobre LCI e LCA, hoje isentas (~R$ 2,6 bi).</w:t>
+      </w:r>
+    </w:p>
+    <w:p>
+      <w:pPr>
+        <w:pStyle w:val="BodyText"/>
+      </w:pPr>
+      <w:r>
+        <w:rPr>
+          <w:bCs/>
+          <w:b/>
+        </w:rPr>
+        <w:t xml:space="preserve">Revista Oeste</w:t>
+      </w:r>
+      <w:r>
+        <w:t xml:space="preserve"> </w:t>
+      </w:r>
+      <w:r>
+        <w:t xml:space="preserve">· link consultado em 28/10/2026</w:t>
+      </w:r>
+    </w:p>
+    <w:p>
+      <w:pPr>
+        <w:pStyle w:val="BodyText"/>
+      </w:pPr>
+      <w:r>
+        <w:t xml:space="preserve">IMPOSTOS</w:t>
+      </w:r>
+      <w:r>
+        <w:t xml:space="preserve">Mais em 2026</w:t>
+      </w:r>
+    </w:p>
+    <w:p>
+      <w:pPr>
+        <w:pStyle w:val="BodyText"/>
+      </w:pPr>
+      <w:r>
+        <w:t xml:space="preserve">“O Leão insaciável: arrecadação é recorde em 2025, mas governo quer mais impostos em 2026”</w:t>
+      </w:r>
+    </w:p>
+    <w:p>
+      <w:pPr>
+        <w:pStyle w:val="BodyText"/>
+      </w:pPr>
+      <w:r>
+        <w:t xml:space="preserve">Recorde de arrecadação e ainda mais impostos na fila.</w:t>
+      </w:r>
+    </w:p>
+    <w:p>
+      <w:pPr>
+        <w:pStyle w:val="BodyText"/>
+      </w:pPr>
+      <w:r>
+        <w:rPr>
+          <w:bCs/>
+          <w:b/>
+        </w:rPr>
+        <w:t xml:space="preserve">Revista Oeste</w:t>
+      </w:r>
+      <w:r>
+        <w:t xml:space="preserve"> </w:t>
+      </w:r>
+      <w:r>
+        <w:t xml:space="preserve">· link consultado em 28/10/2026</w:t>
+      </w:r>
+    </w:p>
+    <w:p>
+      <w:pPr>
+        <w:pStyle w:val="BodyText"/>
+      </w:pPr>
+      <w:r>
+        <w:t xml:space="preserve">GOLPES</w:t>
+      </w:r>
+      <w:r>
+        <w:t xml:space="preserve">R$ 11 bi/ano</w:t>
+      </w:r>
+    </w:p>
+    <w:p>
+      <w:pPr>
+        <w:pStyle w:val="BodyText"/>
+      </w:pPr>
+      <w:r>
+        <w:t xml:space="preserve">“Golpes via Pix podem custar R$ 11 bi a brasileiros até 2028”</w:t>
+      </w:r>
+    </w:p>
+    <w:p>
+      <w:pPr>
+        <w:pStyle w:val="BodyText"/>
+      </w:pPr>
+      <w:r>
+        <w:t xml:space="preserve">Projeção de estudo citado pelo Poder360.</w:t>
+      </w:r>
+    </w:p>
+    <w:p>
+      <w:pPr>
+        <w:pStyle w:val="BodyText"/>
+      </w:pPr>
+      <w:r>
+        <w:rPr>
+          <w:bCs/>
+          <w:b/>
+        </w:rPr>
+        <w:t xml:space="preserve">Poder360</w:t>
+      </w:r>
+      <w:r>
+        <w:t xml:space="preserve"> </w:t>
+      </w:r>
+      <w:r>
+        <w:t xml:space="preserve">· link consultado em 28/10/2026</w:t>
+      </w:r>
+    </w:p>
+    <w:bookmarkEnd w:id="246"/>
+    <w:p>
+      <w:r>
+        <w:pict>
+          <v:rect style="width:0;height:1.5pt" o:hralign="center" o:hrstd="t" o:hr="t"/>
+        </w:pict>
+      </w:r>
+    </w:p>
+    <w:bookmarkStart w:id="247" w:name="o-que-vem-por-aí-cont.-1"/>
+    <w:p>
+      <w:pPr>
+        <w:pStyle w:val="Heading2"/>
+      </w:pPr>
+      <w:r>
+        <w:t xml:space="preserve">O que vem por aí (cont.)</w:t>
+      </w:r>
+    </w:p>
+    <w:p>
+      <w:pPr>
+        <w:pStyle w:val="FirstParagraph"/>
+      </w:pPr>
+      <w:r>
+        <w:t xml:space="preserve">CRIPTO</w:t>
+      </w:r>
+      <w:r>
+        <w:t xml:space="preserve">Trava de 24 h</w:t>
+      </w:r>
+    </w:p>
+    <w:p>
+      <w:pPr>
+        <w:pStyle w:val="BodyText"/>
+      </w:pPr>
+      <w:r>
+        <w:t xml:space="preserve">“BC exige retenção de até 24 horas em envios de cripto ao exterior a partir de 2027”</w:t>
+      </w:r>
+    </w:p>
+    <w:p>
+      <w:pPr>
+        <w:pStyle w:val="BodyText"/>
+      </w:pPr>
+      <w:r>
+        <w:t xml:space="preserve">Res. BCB 584: vale a partir de 01/01/2027, acima de US$ 10 mil.</w:t>
+      </w:r>
+    </w:p>
+    <w:p>
+      <w:pPr>
+        <w:pStyle w:val="BodyText"/>
+      </w:pPr>
+      <w:r>
+        <w:rPr>
+          <w:bCs/>
+          <w:b/>
+        </w:rPr>
+        <w:t xml:space="preserve">Blocktrends</w:t>
+      </w:r>
+      <w:r>
+        <w:t xml:space="preserve"> </w:t>
+      </w:r>
+      <w:r>
+        <w:t xml:space="preserve">· link consultado em 28/10/2026</w:t>
+      </w:r>
+    </w:p>
+    <w:bookmarkEnd w:id="247"/>
+    <w:p>
+      <w:r>
+        <w:pict>
+          <v:rect style="width:0;height:1.5pt" o:hralign="center" o:hrstd="t" o:hr="t"/>
+        </w:pict>
+      </w:r>
+    </w:p>
+    <w:p>
+      <w:pPr>
+        <w:pStyle w:val="FirstParagraph"/>
+      </w:pPr>
+      <w:r>
+        <w:t xml:space="preserve">Para o WhatsApp</w:t>
+      </w:r>
+    </w:p>
+    <w:bookmarkStart w:id="248" w:name="mais-4-anos-em-6-números"/>
+    <w:p>
+      <w:pPr>
+        <w:pStyle w:val="Heading1"/>
+      </w:pPr>
+      <w:r>
+        <w:t xml:space="preserve">Mais 4 anos em 6 números</w:t>
+      </w:r>
+    </w:p>
+    <w:p>
+      <w:pPr>
+        <w:pStyle w:val="FirstParagraph"/>
+      </w:pPr>
+      <w:r>
+        <w:t xml:space="preserve">R$ 2,89 tri</w:t>
+      </w:r>
+      <w:r>
+        <w:t xml:space="preserve">arrecadação recorde em 2025</w:t>
+      </w:r>
+    </w:p>
+    <w:p>
+      <w:pPr>
+        <w:pStyle w:val="BodyText"/>
+      </w:pPr>
+      <w:r>
+        <w:t xml:space="preserve">1 a cada 27 dias</w:t>
+      </w:r>
+      <w:r>
+        <w:t xml:space="preserve">um imposto novo ou maior</w:t>
+      </w:r>
+    </w:p>
+    <w:p>
+      <w:pPr>
+        <w:pStyle w:val="BodyText"/>
+      </w:pPr>
+      <w:r>
+        <w:t xml:space="preserve">3,5%</w:t>
+      </w:r>
+      <w:r>
+        <w:t xml:space="preserve">de IOF no cartão, na remessa e no dólar em espécie</w:t>
+      </w:r>
+    </w:p>
+    <w:p>
+      <w:pPr>
+        <w:pStyle w:val="BodyText"/>
+      </w:pPr>
+      <w:r>
+        <w:t xml:space="preserve">R$ 11,1 tri</w:t>
+      </w:r>
+      <w:r>
+        <w:t xml:space="preserve">de dívida pública (82,9% do PIB)</w:t>
+      </w:r>
+    </w:p>
+    <w:p>
+      <w:pPr>
+        <w:pStyle w:val="BodyText"/>
+      </w:pPr>
+      <w:r>
+        <w:t xml:space="preserve">R$ 1,18 tri</w:t>
+      </w:r>
+      <w:r>
+        <w:t xml:space="preserve">só de juros em 12 meses</w:t>
+      </w:r>
+    </w:p>
+    <w:p>
+      <w:pPr>
+        <w:pStyle w:val="BodyText"/>
+      </w:pPr>
+      <w:r>
+        <w:t xml:space="preserve">90%</w:t>
+      </w:r>
+      <w:r>
+        <w:t xml:space="preserve">do PIB: a dívida projetada para 2027</w:t>
+      </w:r>
+    </w:p>
+    <w:p>
+      <w:pPr>
+        <w:pStyle w:val="BodyText"/>
+      </w:pPr>
+      <w:r>
+        <w:rPr>
+          <w:bCs/>
+          <w:b/>
+        </w:rPr>
+        <w:t xml:space="preserve">Eles não mudaram a direção. Mude você.</w:t>
+      </w:r>
+      <w:r>
+        <w:t xml:space="preserve"> </w:t>
+      </w:r>
+      <w:r>
+        <w:t xml:space="preserve">Conheça o método para levar seu dinheiro, dentro da lei, para um país com governo de direita.</w:t>
+      </w:r>
+    </w:p>
+    <w:p>
+      <w:pPr>
+        <w:pStyle w:val="BodyText"/>
+      </w:pPr>
+      <w:r>
+        <w:t xml:space="preserve">[LINK DO CURSO]</w:t>
+      </w:r>
+    </w:p>
+    <w:bookmarkEnd w:id="248"/>
+    <w:p>
+      <w:r>
+        <w:pict>
+          <v:rect style="width:0;height:1.5pt" o:hralign="center" o:hrstd="t" o:hr="t"/>
+        </w:pict>
+      </w:r>
+    </w:p>
+    <w:p>
+      <w:pPr>
+        <w:pStyle w:val="FirstParagraph"/>
+      </w:pPr>
+      <w:r>
+        <w:t xml:space="preserve">Anexo</w:t>
+      </w:r>
+    </w:p>
+    <w:bookmarkStart w:id="249" w:name="fontes-de-todos-os-números"/>
+    <w:p>
+      <w:pPr>
+        <w:pStyle w:val="Heading2"/>
+      </w:pPr>
+      <w:r>
+        <w:t xml:space="preserve">Fontes de todos os números</w:t>
+      </w:r>
+    </w:p>
+    <w:p>
+      <w:pPr>
+        <w:pStyle w:val="FirstParagraph"/>
+      </w:pPr>
+      <w:r>
+        <w:t xml:space="preserve">Cada número do curso tem origem. Aqui estão, página por página.</w:t>
+      </w:r>
+    </w:p>
+    <w:p>
+      <w:pPr>
+        <w:numPr>
+          <w:ilvl w:val="0"/>
+          <w:numId w:val="1082"/>
+        </w:numPr>
+        <w:pStyle w:val="Compact"/>
+      </w:pPr>
+      <w:r>
+        <w:rPr>
+          <w:bCs/>
+          <w:b/>
+        </w:rPr>
+        <w:t xml:space="preserve">p. 2</w:t>
+      </w:r>
+      <w:r>
+        <w:t xml:space="preserve">TSE, resultado do 2º turno de 2022 (58.206.354 votos, 49,1% dos válidos).</w:t>
+      </w:r>
+    </w:p>
+    <w:p>
+      <w:pPr>
+        <w:numPr>
+          <w:ilvl w:val="0"/>
+          <w:numId w:val="1082"/>
+        </w:numPr>
+        <w:pStyle w:val="Compact"/>
+      </w:pPr>
+      <w:r>
+        <w:rPr>
+          <w:bCs/>
+          <w:b/>
+        </w:rPr>
+        <w:t xml:space="preserve">p. 3</w:t>
+      </w:r>
+      <w:r>
+        <w:t xml:space="preserve">Tribunal Supremo Electoral da Bolívia via Agência Brasil (19/10/2025); MercoPress (10/11/2025).</w:t>
+      </w:r>
+    </w:p>
+    <w:p>
+      <w:pPr>
+        <w:numPr>
+          <w:ilvl w:val="0"/>
+          <w:numId w:val="1082"/>
+        </w:numPr>
+        <w:pStyle w:val="Compact"/>
+      </w:pPr>
+      <w:r>
+        <w:rPr>
+          <w:bCs/>
+          <w:b/>
+        </w:rPr>
+        <w:t xml:space="preserve">p. 11</w:t>
+      </w:r>
+      <w:r>
+        <w:t xml:space="preserve">Gazeta do Povo, 2026 (arrecadação de R$ 2,887 tri; carga de 32,4% do PIB) e mar/2026 (43 medidas); Banco Central via Forbes, 27/10/2026 (dívida, ago/2026); reações de lideranças, Gazeta do Povo, 25/10/2026.</w:t>
+      </w:r>
+    </w:p>
+    <w:p>
+      <w:pPr>
+        <w:numPr>
+          <w:ilvl w:val="0"/>
+          <w:numId w:val="1082"/>
+        </w:numPr>
+        <w:pStyle w:val="Compact"/>
+      </w:pPr>
+      <w:r>
+        <w:rPr>
+          <w:bCs/>
+          <w:b/>
+        </w:rPr>
+        <w:t xml:space="preserve">p. 12</w:t>
+      </w:r>
+      <w:r>
+        <w:t xml:space="preserve">TSE (2º turno 2018: 57.797.847 votos; 2022: 58.206.354); Monitor do Debate Político/USP via CartaCapital e O Povo (2024); SSP-SP via SBT News (25/02/2024).</w:t>
+      </w:r>
+    </w:p>
+    <w:p>
+      <w:pPr>
+        <w:numPr>
+          <w:ilvl w:val="0"/>
+          <w:numId w:val="1082"/>
+        </w:numPr>
+        <w:pStyle w:val="Compact"/>
+      </w:pPr>
+      <w:r>
+        <w:rPr>
+          <w:bCs/>
+          <w:b/>
+        </w:rPr>
+        <w:t xml:space="preserve">p. 13</w:t>
+      </w:r>
+      <w:r>
+        <w:t xml:space="preserve">Banco Central de Venezuela via Poder360/DW (29/05/2019); R4V via Bloomberg Línea (2025: 6,70 mi na América Latina + 1,19 mi no resto do mundo); France 24 (08/11/2025); Infobae; The Rio Times.</w:t>
+      </w:r>
+    </w:p>
+    <w:p>
+      <w:pPr>
+        <w:numPr>
+          <w:ilvl w:val="0"/>
+          <w:numId w:val="1082"/>
+        </w:numPr>
+        <w:pStyle w:val="Compact"/>
+      </w:pPr>
+      <w:r>
+        <w:rPr>
+          <w:bCs/>
+          <w:b/>
+        </w:rPr>
+        <w:t xml:space="preserve">p. 14</w:t>
+      </w:r>
+      <w:r>
+        <w:t xml:space="preserve">INDEC Argentina (IPC 2023, 2024 e 2025); MercoPress (10/11/2025); posses oficiais.</w:t>
+      </w:r>
+    </w:p>
+    <w:p>
+      <w:pPr>
+        <w:numPr>
+          <w:ilvl w:val="0"/>
+          <w:numId w:val="1082"/>
+        </w:numPr>
+        <w:pStyle w:val="Compact"/>
+      </w:pPr>
+      <w:r>
+        <w:rPr>
+          <w:bCs/>
+          <w:b/>
+        </w:rPr>
+        <w:t xml:space="preserve">p. 15</w:t>
+      </w:r>
+      <w:r>
+        <w:t xml:space="preserve">IFI via Forbes, 27/10/2026 (ajuste fiscal); Decretos 12.466 e 12.499/2025 (IOF).</w:t>
+      </w:r>
+    </w:p>
+    <w:p>
+      <w:pPr>
+        <w:numPr>
+          <w:ilvl w:val="0"/>
+          <w:numId w:val="1082"/>
+        </w:numPr>
+        <w:pStyle w:val="Compact"/>
+      </w:pPr>
+      <w:r>
+        <w:rPr>
+          <w:bCs/>
+          <w:b/>
+        </w:rPr>
+        <w:t xml:space="preserve">p. 16</w:t>
+      </w:r>
+      <w:r>
+        <w:t xml:space="preserve">Zumper via WLRN (set/2026, Miami US$ 2.500); Zumper via WFLA (Orlando US$ 1.690, data a confirmar); Numbeo mai/2026 via Cidadania e Visto (Lisboa €1.280); FipeZAP Locação set/2026; InfoCasas out/2026. Câmbio: US$ 1 = R$ 5,35 (Investidor10, 28/10/2026); €1 = R$ 5,62 (Meelion, 09/10/2026); R$ 1 = Bs 2,30 (autor).</w:t>
+      </w:r>
+    </w:p>
+    <w:p>
+      <w:pPr>
+        <w:numPr>
+          <w:ilvl w:val="0"/>
+          <w:numId w:val="1082"/>
+        </w:numPr>
+        <w:pStyle w:val="Compact"/>
+      </w:pPr>
+      <w:r>
+        <w:rPr>
+          <w:bCs/>
+          <w:b/>
+        </w:rPr>
+        <w:t xml:space="preserve">p. 17</w:t>
+      </w:r>
+      <w:r>
+        <w:t xml:space="preserve">Mochileiros (entrada com RG/CIN, 90 dias); The Rio Times (residência Mercosul); FlightConnections, abr/2026 (voo direto GRU–VVI, média 3h05); aluguéis: mesmas fontes da página anterior.</w:t>
+      </w:r>
+    </w:p>
+    <w:p>
+      <w:pPr>
+        <w:numPr>
+          <w:ilvl w:val="0"/>
+          <w:numId w:val="1082"/>
+        </w:numPr>
+        <w:pStyle w:val="Compact"/>
+      </w:pPr>
+      <w:r>
+        <w:rPr>
+          <w:bCs/>
+          <w:b/>
+        </w:rPr>
+        <w:t xml:space="preserve">p. 18</w:t>
+      </w:r>
+      <w:r>
+        <w:t xml:space="preserve">Mesmas fontes e câmbios da página anterior. Cálculo do autor do curso.</w:t>
+      </w:r>
+    </w:p>
+    <w:p>
+      <w:pPr>
+        <w:numPr>
+          <w:ilvl w:val="0"/>
+          <w:numId w:val="1082"/>
+        </w:numPr>
+        <w:pStyle w:val="Compact"/>
+      </w:pPr>
+      <w:r>
+        <w:rPr>
+          <w:bCs/>
+          <w:b/>
+        </w:rPr>
+        <w:t xml:space="preserve">p. 19</w:t>
+      </w:r>
+      <w:r>
+        <w:t xml:space="preserve">Mochileiros (entrada); The Rio Times (residência Mercosul, taxa ~450 UFV); FlightConnections, abr/2026 (voo direto São Paulo–Santa Cruz, média 3h05); autor, 28/10/2026 (câmbio de referência).</w:t>
+      </w:r>
+    </w:p>
+    <w:p>
+      <w:pPr>
+        <w:numPr>
+          <w:ilvl w:val="0"/>
+          <w:numId w:val="1082"/>
+        </w:numPr>
+        <w:pStyle w:val="Compact"/>
+      </w:pPr>
+      <w:r>
+        <w:rPr>
+          <w:bCs/>
+          <w:b/>
+        </w:rPr>
+        <w:t xml:space="preserve">p. 20</w:t>
+      </w:r>
+      <w:r>
+        <w:t xml:space="preserve">Agência Brasil e Poder360 (19/10/2025); MercoPress (10/11/2025); France 24 via Acento (08/11/2025); usdthoy.com (flutuação desde 29/06/2026).</w:t>
+      </w:r>
+    </w:p>
+    <w:bookmarkEnd w:id="249"/>
+    <w:p>
+      <w:r>
+        <w:pict>
+          <v:rect style="width:0;height:1.5pt" o:hralign="center" o:hrstd="t" o:hr="t"/>
+        </w:pict>
+      </w:r>
+    </w:p>
+    <w:p>
+      <w:pPr>
+        <w:numPr>
+          <w:ilvl w:val="0"/>
+          <w:numId w:val="1083"/>
+        </w:numPr>
+        <w:pStyle w:val="Compact"/>
+      </w:pPr>
+      <w:r>
+        <w:rPr>
+          <w:bCs/>
+          <w:b/>
+        </w:rPr>
+        <w:t xml:space="preserve">p. 21</w:t>
+      </w:r>
+      <w:r>
+        <w:t xml:space="preserve">Infobae; The Rio Times (Bs 6,96); BCB via usdtbol.com, 28/10/2026 (Bs 12,02); Facebook Marketplace, levantado pelo autor, out/2026 (preço pedido).</w:t>
+      </w:r>
+    </w:p>
+    <w:p>
+      <w:pPr>
+        <w:numPr>
+          <w:ilvl w:val="0"/>
+          <w:numId w:val="1083"/>
+        </w:numPr>
+        <w:pStyle w:val="Compact"/>
+      </w:pPr>
+      <w:r>
+        <w:rPr>
+          <w:bCs/>
+          <w:b/>
+        </w:rPr>
+        <w:t xml:space="preserve">p. 22</w:t>
+      </w:r>
+      <w:r>
+        <w:t xml:space="preserve">FipeZAP set/2026 via MySide; InfoCasas out/2026; Facebook Marketplace (autor, out/2026); Correo del Sur ago/2026; ANP set/2026. Câmbios: US$ 1 = R$ 5,35; R$ 1 = Bs 2,30.</w:t>
+      </w:r>
+    </w:p>
+    <w:p>
+      <w:pPr>
+        <w:numPr>
+          <w:ilvl w:val="0"/>
+          <w:numId w:val="1083"/>
+        </w:numPr>
+        <w:pStyle w:val="Compact"/>
+      </w:pPr>
+      <w:r>
+        <w:rPr>
+          <w:bCs/>
+          <w:b/>
+        </w:rPr>
+        <w:t xml:space="preserve">p. 23</w:t>
+      </w:r>
+      <w:r>
+        <w:t xml:space="preserve">Decretos 12.466 e 12.499/2025 (IOF 3,5%); dolarparalelobolivia.net, 28/10/2026 (P2P Bs 12,13).</w:t>
+      </w:r>
+    </w:p>
+    <w:p>
+      <w:pPr>
+        <w:numPr>
+          <w:ilvl w:val="0"/>
+          <w:numId w:val="1083"/>
+        </w:numPr>
+        <w:pStyle w:val="Compact"/>
+      </w:pPr>
+      <w:r>
+        <w:rPr>
+          <w:bCs/>
+          <w:b/>
+        </w:rPr>
+        <w:t xml:space="preserve">p. 24</w:t>
+      </w:r>
+      <w:r>
+        <w:t xml:space="preserve">CoinMarketCap e Investidor10, 28/10/2026; dolarparalelobolivia.net, 28/10/2026; BCB via usdtbol.com, 28/10/2026. Cálculo do curso.</w:t>
+      </w:r>
+    </w:p>
+    <w:p>
+      <w:pPr>
+        <w:numPr>
+          <w:ilvl w:val="0"/>
+          <w:numId w:val="1083"/>
+        </w:numPr>
+        <w:pStyle w:val="Compact"/>
+      </w:pPr>
+      <w:r>
+        <w:rPr>
+          <w:bCs/>
+          <w:b/>
+        </w:rPr>
+        <w:t xml:space="preserve">p. 29</w:t>
+      </w:r>
+      <w:r>
+        <w:t xml:space="preserve">Infobae; The Rio Times (Bs 6,96 até jun/2026; queda de ~45%, set/2026); usdthoy.com (flutuação desde 29/06/2026); BCB via usdtbol.com, 28/10/2026 (Bs 12,02).</w:t>
+      </w:r>
+    </w:p>
+    <w:p>
+      <w:pPr>
+        <w:numPr>
+          <w:ilvl w:val="0"/>
+          <w:numId w:val="1083"/>
+        </w:numPr>
+        <w:pStyle w:val="Compact"/>
+      </w:pPr>
+      <w:r>
+        <w:rPr>
+          <w:bCs/>
+          <w:b/>
+        </w:rPr>
+        <w:t xml:space="preserve">p. 30</w:t>
+      </w:r>
+      <w:r>
+        <w:t xml:space="preserve">Infobae; The Rio Times; France 24 via Acento (08/11/2025); Agência Brasil (19/10/2025); usdthoy.com; BCB via usdtbol.com e dolarparalelobolivia.net, 28/10/2026.</w:t>
+      </w:r>
+    </w:p>
+    <w:p>
+      <w:pPr>
+        <w:numPr>
+          <w:ilvl w:val="0"/>
+          <w:numId w:val="1083"/>
+        </w:numPr>
+        <w:pStyle w:val="Compact"/>
+      </w:pPr>
+      <w:r>
+        <w:rPr>
+          <w:bCs/>
+          <w:b/>
+        </w:rPr>
+        <w:t xml:space="preserve">p. 31</w:t>
+      </w:r>
+      <w:r>
+        <w:t xml:space="preserve">Seção 2.1 do escopo (exemplo-padrão); almoço local US$ 1,50–3 (Food Travel Explore, 2026); aluguel InfoCasas out/2026; Mustang: Facebook Marketplace, autor, out/2026.</w:t>
+      </w:r>
+    </w:p>
+    <w:p>
+      <w:pPr>
+        <w:numPr>
+          <w:ilvl w:val="0"/>
+          <w:numId w:val="1083"/>
+        </w:numPr>
+        <w:pStyle w:val="Compact"/>
+      </w:pPr>
+      <w:r>
+        <w:rPr>
+          <w:bCs/>
+          <w:b/>
+        </w:rPr>
+        <w:t xml:space="preserve">p. 32</w:t>
+      </w:r>
+      <w:r>
+        <w:t xml:space="preserve">FipeZAP set/2026 via MySide (Leblon); autor e InfoCasas out/2026 (Cochabamba, faixa US$ 70–170 mil). US$ 1 = R$ 5,35 (Investidor10, 28/10/2026). Preço de anúncio é preço pedido.</w:t>
+      </w:r>
+    </w:p>
+    <w:p>
+      <w:pPr>
+        <w:numPr>
+          <w:ilvl w:val="0"/>
+          <w:numId w:val="1083"/>
+        </w:numPr>
+        <w:pStyle w:val="Compact"/>
+      </w:pPr>
+      <w:r>
+        <w:rPr>
+          <w:bCs/>
+          <w:b/>
+        </w:rPr>
+        <w:t xml:space="preserve">p. 33</w:t>
+      </w:r>
+      <w:r>
+        <w:t xml:space="preserve">FipeZAP set/2026 via MySide e Daniel Carvalho Imobiliário; Equipetrol: anúncios Century 21, out/2026 (US$ 1.310–1.950/m²); Cochabamba: InfoCasas out/2026 (média ~US$ 940/m²); Calacoto: anúncios Century 21 (~US$ 620–670/m²).</w:t>
+      </w:r>
+    </w:p>
+    <w:p>
+      <w:pPr>
+        <w:numPr>
+          <w:ilvl w:val="0"/>
+          <w:numId w:val="1083"/>
+        </w:numPr>
+        <w:pStyle w:val="Compact"/>
+      </w:pPr>
+      <w:r>
+        <w:rPr>
+          <w:bCs/>
+          <w:b/>
+        </w:rPr>
+        <w:t xml:space="preserve">p. 34</w:t>
+      </w:r>
+      <w:r>
+        <w:t xml:space="preserve">FipeZAP set/2026 (m² por bairro) × 110 m²; Cochabamba: autor e InfoCasas out/2026. Cálculo do curso.</w:t>
+      </w:r>
+    </w:p>
+    <w:p>
+      <w:pPr>
+        <w:numPr>
+          <w:ilvl w:val="0"/>
+          <w:numId w:val="1083"/>
+        </w:numPr>
+        <w:pStyle w:val="Compact"/>
+      </w:pPr>
+      <w:r>
+        <w:rPr>
+          <w:bCs/>
+          <w:b/>
+        </w:rPr>
+        <w:t xml:space="preserve">p. 35</w:t>
+      </w:r>
+      <w:r>
+        <w:t xml:space="preserve">Century 21 (anúncios em Equipetrol e Urubó, consultados em out/2026; preço pedido); eju.tv (lotes Urubó Golf, US$ 110–170/m²). Pinheiros: FipeZAP set/2026, R$ 18.260/m² × 140 m² ≈ R$ 2,56 mi ≈ US$ 480 mil.</w:t>
+      </w:r>
+    </w:p>
+    <w:p>
+      <w:r>
+        <w:pict>
+          <v:rect style="width:0;height:1.5pt" o:hralign="center" o:hrstd="t" o:hr="t"/>
+        </w:pict>
+      </w:r>
+    </w:p>
+    <w:p>
+      <w:pPr>
+        <w:numPr>
+          <w:ilvl w:val="0"/>
+          <w:numId w:val="1084"/>
+        </w:numPr>
+        <w:pStyle w:val="Compact"/>
+      </w:pPr>
+      <w:r>
+        <w:rPr>
+          <w:bCs/>
+          <w:b/>
+        </w:rPr>
+        <w:t xml:space="preserve">p. 36</w:t>
+      </w:r>
+      <w:r>
+        <w:t xml:space="preserve">Century 21 (anúncios Alto Calacoto e Urb. Cordes, preço pedido, out/2026). Guinness World Records (altitude de La Paz).</w:t>
+      </w:r>
+    </w:p>
+    <w:p>
+      <w:pPr>
+        <w:numPr>
+          <w:ilvl w:val="0"/>
+          <w:numId w:val="1084"/>
+        </w:numPr>
+        <w:pStyle w:val="Compact"/>
+      </w:pPr>
+      <w:r>
+        <w:rPr>
+          <w:bCs/>
+          <w:b/>
+        </w:rPr>
+        <w:t xml:space="preserve">p. 37</w:t>
+      </w:r>
+      <w:r>
+        <w:t xml:space="preserve">Century 21 (anúncio com 60% em dólar e 40% em Bs, out/2026); boliviaimpuestos.com (folio real e Derechos Reales).</w:t>
+      </w:r>
+    </w:p>
+    <w:p>
+      <w:pPr>
+        <w:numPr>
+          <w:ilvl w:val="0"/>
+          <w:numId w:val="1084"/>
+        </w:numPr>
+        <w:pStyle w:val="Compact"/>
+      </w:pPr>
+      <w:r>
+        <w:rPr>
+          <w:bCs/>
+          <w:b/>
+        </w:rPr>
+        <w:t xml:space="preserve">p. 38</w:t>
+      </w:r>
+      <w:r>
+        <w:t xml:space="preserve">FipeZAP Locação set/2026 (TNH1); InfoCasas out/2026; The Rio Times, set/2026 (Equipetrol e diferença de 1,5–2×). Câmbios: US$ 1 = R$ 5,35; R$ 1 = Bs 2,30.</w:t>
+      </w:r>
+    </w:p>
+    <w:p>
+      <w:pPr>
+        <w:numPr>
+          <w:ilvl w:val="0"/>
+          <w:numId w:val="1084"/>
+        </w:numPr>
+        <w:pStyle w:val="Compact"/>
+      </w:pPr>
+      <w:r>
+        <w:rPr>
+          <w:bCs/>
+          <w:b/>
+        </w:rPr>
+        <w:t xml:space="preserve">p. 39</w:t>
+      </w:r>
+      <w:r>
+        <w:t xml:space="preserve">InfoNegocios (como funciona); boliviaimpuestos.com (gravame ~0,5%, RC-IVA 10% a.a., Formulário 610; confirmar no SIN). Valores do exemplo: ilustrativos.</w:t>
+      </w:r>
+    </w:p>
+    <w:p>
+      <w:pPr>
+        <w:numPr>
+          <w:ilvl w:val="0"/>
+          <w:numId w:val="1084"/>
+        </w:numPr>
+        <w:pStyle w:val="Compact"/>
+      </w:pPr>
+      <w:r>
+        <w:rPr>
+          <w:bCs/>
+          <w:b/>
+        </w:rPr>
+        <w:t xml:space="preserve">p. 40</w:t>
+      </w:r>
+      <w:r>
+        <w:t xml:space="preserve">boliviaimpuestos.com; Red Uno via Bolivian Thoughts (19/11/2025, moeda da devolução); eju.tv (alta de anticréticos e aluguéis; data a confirmar).</w:t>
+      </w:r>
+    </w:p>
+    <w:p>
+      <w:pPr>
+        <w:numPr>
+          <w:ilvl w:val="0"/>
+          <w:numId w:val="1084"/>
+        </w:numPr>
+        <w:pStyle w:val="Compact"/>
+      </w:pPr>
+      <w:r>
+        <w:rPr>
+          <w:bCs/>
+          <w:b/>
+        </w:rPr>
+        <w:t xml:space="preserve">p. 42</w:t>
+      </w:r>
+      <w:r>
+        <w:t xml:space="preserve">Facebook Marketplace, levantado pelo autor, out/2026 (preço pedido; anúncios sem dados de terceiros). R$ 1 = Bs 2,30 (autor, 28/10/2026).</w:t>
+      </w:r>
+    </w:p>
+    <w:p>
+      <w:pPr>
+        <w:numPr>
+          <w:ilvl w:val="0"/>
+          <w:numId w:val="1084"/>
+        </w:numPr>
+        <w:pStyle w:val="Compact"/>
+      </w:pPr>
+      <w:r>
+        <w:rPr>
+          <w:bCs/>
+          <w:b/>
+        </w:rPr>
+        <w:t xml:space="preserve">p. 43</w:t>
+      </w:r>
+      <w:r>
+        <w:t xml:space="preserve">Câmbio de referência do autor (28/10/2026).</w:t>
+      </w:r>
+    </w:p>
+    <w:p>
+      <w:pPr>
+        <w:numPr>
+          <w:ilvl w:val="0"/>
+          <w:numId w:val="1084"/>
+        </w:numPr>
+        <w:pStyle w:val="Compact"/>
+      </w:pPr>
+      <w:r>
+        <w:rPr>
+          <w:bCs/>
+          <w:b/>
+        </w:rPr>
+        <w:t xml:space="preserve">p. 45</w:t>
+      </w:r>
+      <w:r>
+        <w:t xml:space="preserve">ANP set/2026; Correo del Sur ago/2026; France 24 via Acento (crise de combustíveis, 08/11/2025). R$ 1 = Bs 2,30.</w:t>
+      </w:r>
+    </w:p>
+    <w:p>
+      <w:pPr>
+        <w:numPr>
+          <w:ilvl w:val="0"/>
+          <w:numId w:val="1084"/>
+        </w:numPr>
+        <w:pStyle w:val="Compact"/>
+      </w:pPr>
+      <w:r>
+        <w:rPr>
+          <w:bCs/>
+          <w:b/>
+        </w:rPr>
+        <w:t xml:space="preserve">p. 46</w:t>
+      </w:r>
+      <w:r>
+        <w:t xml:space="preserve">FAC-SP, Índice Prato Feito, jun/2026 (via SBT News); Food Travel Explore (2026); Living Cost Index 2026; The Rio Times, set/2026 (casal em Santa Cruz). US$ 1 = R$ 5,35.</w:t>
+      </w:r>
+    </w:p>
+    <w:p>
+      <w:pPr>
+        <w:numPr>
+          <w:ilvl w:val="0"/>
+          <w:numId w:val="1084"/>
+        </w:numPr>
+        <w:pStyle w:val="Compact"/>
+      </w:pPr>
+      <w:r>
+        <w:rPr>
+          <w:bCs/>
+          <w:b/>
+        </w:rPr>
+        <w:t xml:space="preserve">p. 47</w:t>
+      </w:r>
+      <w:r>
+        <w:t xml:space="preserve">Referências das páginas anteriores.</w:t>
+      </w:r>
+    </w:p>
+    <w:p>
+      <w:pPr>
+        <w:numPr>
+          <w:ilvl w:val="0"/>
+          <w:numId w:val="1084"/>
+        </w:numPr>
+        <w:pStyle w:val="Compact"/>
+      </w:pPr>
+      <w:r>
+        <w:rPr>
+          <w:bCs/>
+          <w:b/>
+        </w:rPr>
+        <w:t xml:space="preserve">p. 48</w:t>
+      </w:r>
+      <w:r>
+        <w:t xml:space="preserve">Living Cost Index 2026 (solteiro); The Rio Times, set/2026 (casal); FipeZAP Locação set/2026 (SP). US$ 1 = R$ 5,35.</w:t>
+      </w:r>
+    </w:p>
+    <w:p>
+      <w:pPr>
+        <w:numPr>
+          <w:ilvl w:val="0"/>
+          <w:numId w:val="1084"/>
+        </w:numPr>
+        <w:pStyle w:val="Compact"/>
+      </w:pPr>
+      <w:r>
+        <w:rPr>
+          <w:bCs/>
+          <w:b/>
+        </w:rPr>
+        <w:t xml:space="preserve">p. 49</w:t>
+      </w:r>
+      <w:r>
+        <w:t xml:space="preserve">Autor, out/2026 (aluguel e despesas reais). R$ 1 = Bs 2,30 (autor, 28/10/2026). SP: FipeZAP Locação set/2026.</w:t>
+      </w:r>
+    </w:p>
+    <w:p>
+      <w:pPr>
+        <w:numPr>
+          <w:ilvl w:val="0"/>
+          <w:numId w:val="1084"/>
+        </w:numPr>
+        <w:pStyle w:val="Compact"/>
+      </w:pPr>
+      <w:r>
+        <w:rPr>
+          <w:bCs/>
+          <w:b/>
+        </w:rPr>
+        <w:t xml:space="preserve">p. 50</w:t>
+      </w:r>
+      <w:r>
+        <w:t xml:space="preserve">Autor, out/2026 (fotos e valores reais). Brasil: FAC-SP, Índice Prato Feito, jun/2026. R$ 1 = Bs 2,30 (autor). Resultado do autor, não é promessa.</w:t>
+      </w:r>
+    </w:p>
+    <w:p>
+      <w:pPr>
+        <w:numPr>
+          <w:ilvl w:val="0"/>
+          <w:numId w:val="1084"/>
+        </w:numPr>
+        <w:pStyle w:val="Compact"/>
+      </w:pPr>
+      <w:r>
+        <w:rPr>
+          <w:bCs/>
+          <w:b/>
+        </w:rPr>
+        <w:t xml:space="preserve">p. 51</w:t>
+      </w:r>
+      <w:r>
+        <w:t xml:space="preserve">Autor, out/2026 (fotos, cardápio e conta). Placas visíveis na foto do restaurante. SP: ABBT, 2024 (prato, bebida, sobremesa e café). R$ 1 = Bs 2,30.</w:t>
+      </w:r>
+    </w:p>
+    <w:p>
+      <w:r>
+        <w:pict>
+          <v:rect style="width:0;height:1.5pt" o:hralign="center" o:hrstd="t" o:hr="t"/>
+        </w:pict>
+      </w:r>
+    </w:p>
+    <w:p>
+      <w:pPr>
+        <w:numPr>
+          <w:ilvl w:val="0"/>
+          <w:numId w:val="1085"/>
+        </w:numPr>
+        <w:pStyle w:val="Compact"/>
+      </w:pPr>
+      <w:r>
+        <w:rPr>
+          <w:bCs/>
+          <w:b/>
+        </w:rPr>
+        <w:t xml:space="preserve">p. 52</w:t>
+      </w:r>
+      <w:r>
+        <w:t xml:space="preserve">The Rio Times, set/2026 (aluguel em dólar; câmbio); expat.com (filas em escolas internacionais); France 24 (combustível, 2025).</w:t>
+      </w:r>
+    </w:p>
+    <w:p>
+      <w:pPr>
+        <w:numPr>
+          <w:ilvl w:val="0"/>
+          <w:numId w:val="1085"/>
+        </w:numPr>
+        <w:pStyle w:val="Compact"/>
+      </w:pPr>
+      <w:r>
+        <w:rPr>
+          <w:bCs/>
+          <w:b/>
+        </w:rPr>
+        <w:t xml:space="preserve">p. 53</w:t>
+      </w:r>
+      <w:r>
+        <w:t xml:space="preserve">Orçamentos da página anterior (teto de cada faixa). Cálculo do curso; não considera inflação nem rendimento.</w:t>
+      </w:r>
+    </w:p>
+    <w:p>
+      <w:pPr>
+        <w:numPr>
+          <w:ilvl w:val="0"/>
+          <w:numId w:val="1085"/>
+        </w:numPr>
+        <w:pStyle w:val="Compact"/>
+      </w:pPr>
+      <w:r>
+        <w:rPr>
+          <w:bCs/>
+          <w:b/>
+        </w:rPr>
+        <w:t xml:space="preserve">p. 54</w:t>
+      </w:r>
+      <w:r>
+        <w:t xml:space="preserve">The Rio Times (Healthcare in Bolivia 2026); GOV.UK (lista de clínicas na Bolívia); Holafly (saúde pública para estrangeiros).</w:t>
+      </w:r>
+    </w:p>
+    <w:p>
+      <w:pPr>
+        <w:numPr>
+          <w:ilvl w:val="0"/>
+          <w:numId w:val="1085"/>
+        </w:numPr>
+        <w:pStyle w:val="Compact"/>
+      </w:pPr>
+      <w:r>
+        <w:rPr>
+          <w:bCs/>
+          <w:b/>
+        </w:rPr>
+        <w:t xml:space="preserve">p. 55</w:t>
+      </w:r>
+      <w:r>
+        <w:t xml:space="preserve">Mochileiros (CIVP febre amarela para entrada).</w:t>
+      </w:r>
+    </w:p>
+    <w:p>
+      <w:pPr>
+        <w:numPr>
+          <w:ilvl w:val="0"/>
+          <w:numId w:val="1085"/>
+        </w:numPr>
+        <w:pStyle w:val="Compact"/>
+      </w:pPr>
+      <w:r>
+        <w:rPr>
+          <w:bCs/>
+          <w:b/>
+        </w:rPr>
+        <w:t xml:space="preserve">p. 56</w:t>
+      </w:r>
+      <w:r>
+        <w:t xml:space="preserve">International Medical Relief (pacote Clínica Alemana). US$ 1 = R$ 5,35.</w:t>
+      </w:r>
+    </w:p>
+    <w:p>
+      <w:pPr>
+        <w:numPr>
+          <w:ilvl w:val="0"/>
+          <w:numId w:val="1085"/>
+        </w:numPr>
+        <w:pStyle w:val="Compact"/>
+      </w:pPr>
+      <w:r>
+        <w:rPr>
+          <w:bCs/>
+          <w:b/>
+        </w:rPr>
+        <w:t xml:space="preserve">p. 57</w:t>
+      </w:r>
+      <w:r>
+        <w:t xml:space="preserve">Gran Faculdade (média nacional ~R$ 9.500, 2026); Sanarmed (Bolívia R$ 700–1.200); Universidade do Intercâmbio (média ~R$ 750 em Cochabamba e Santa Cruz). Valores variam; confirmar com cada instituição.</w:t>
+      </w:r>
+    </w:p>
+    <w:p>
+      <w:pPr>
+        <w:numPr>
+          <w:ilvl w:val="0"/>
+          <w:numId w:val="1085"/>
+        </w:numPr>
+        <w:pStyle w:val="Compact"/>
+      </w:pPr>
+      <w:r>
+        <w:rPr>
+          <w:bCs/>
+          <w:b/>
+        </w:rPr>
+        <w:t xml:space="preserve">p. 58</w:t>
+      </w:r>
+      <w:r>
+        <w:t xml:space="preserve">Universidade do Intercâmbio; Estratégia Vestibulares; Correio do Estado; Querobolsa (lista de universidades). Exemplos, não indicação paga.</w:t>
+      </w:r>
+    </w:p>
+    <w:p>
+      <w:pPr>
+        <w:numPr>
+          <w:ilvl w:val="0"/>
+          <w:numId w:val="1085"/>
+        </w:numPr>
+        <w:pStyle w:val="Compact"/>
+      </w:pPr>
+      <w:r>
+        <w:rPr>
+          <w:bCs/>
+          <w:b/>
+        </w:rPr>
+        <w:t xml:space="preserve">p. 59</w:t>
+      </w:r>
+      <w:r>
+        <w:t xml:space="preserve">expat.com (guia de Santa Cruz); IBO (Colegio Alemán); CBDE, monitoramento de imprensa, jan/2026 (congelamento e denúncias).</w:t>
+      </w:r>
+    </w:p>
+    <w:p>
+      <w:pPr>
+        <w:numPr>
+          <w:ilvl w:val="0"/>
+          <w:numId w:val="1085"/>
+        </w:numPr>
+        <w:pStyle w:val="Compact"/>
+      </w:pPr>
+      <w:r>
+        <w:rPr>
+          <w:bCs/>
+          <w:b/>
+        </w:rPr>
+        <w:t xml:space="preserve">p. 60</w:t>
+      </w:r>
+      <w:r>
+        <w:t xml:space="preserve">expat.com (perfil das escolas internacionais e fila de espera).</w:t>
+      </w:r>
+    </w:p>
+    <w:p>
+      <w:pPr>
+        <w:numPr>
+          <w:ilvl w:val="0"/>
+          <w:numId w:val="1085"/>
+        </w:numPr>
+        <w:pStyle w:val="Compact"/>
+      </w:pPr>
+      <w:r>
+        <w:rPr>
+          <w:bCs/>
+          <w:b/>
+        </w:rPr>
+        <w:t xml:space="preserve">p. 61</w:t>
+      </w:r>
+      <w:r>
+        <w:t xml:space="preserve">Guias de viagem 2026 (US$ 140–200); Nomades (US$ 229 até 31/12/2026; semiprivado US$ 710/pessoa para 2). Extras: guia de viagem. Preços de agência, variam por temporada.</w:t>
+      </w:r>
+    </w:p>
+    <w:p>
+      <w:pPr>
+        <w:numPr>
+          <w:ilvl w:val="0"/>
+          <w:numId w:val="1085"/>
+        </w:numPr>
+        <w:pStyle w:val="Compact"/>
+      </w:pPr>
+      <w:r>
+        <w:rPr>
+          <w:bCs/>
+          <w:b/>
+        </w:rPr>
+        <w:t xml:space="preserve">p. 62</w:t>
+      </w:r>
+      <w:r>
+        <w:t xml:space="preserve">Autor, out/2026. R$ 1 = Bs 2,30.</w:t>
+      </w:r>
+    </w:p>
+    <w:p>
+      <w:pPr>
+        <w:numPr>
+          <w:ilvl w:val="0"/>
+          <w:numId w:val="1085"/>
+        </w:numPr>
+        <w:pStyle w:val="Compact"/>
+      </w:pPr>
+      <w:r>
+        <w:rPr>
+          <w:bCs/>
+          <w:b/>
+        </w:rPr>
+        <w:t xml:space="preserve">p. 64</w:t>
+      </w:r>
+      <w:r>
+        <w:t xml:space="preserve">Living Cost Index 2026; The Rio Times, set/2026. US$ 1 = R$ 5,35. Cálculo do curso; sem inflação nem rendimento.</w:t>
+      </w:r>
+    </w:p>
+    <w:p>
+      <w:pPr>
+        <w:numPr>
+          <w:ilvl w:val="0"/>
+          <w:numId w:val="1085"/>
+        </w:numPr>
+        <w:pStyle w:val="Compact"/>
+      </w:pPr>
+      <w:r>
+        <w:rPr>
+          <w:bCs/>
+          <w:b/>
+        </w:rPr>
+        <w:t xml:space="preserve">p. 65</w:t>
+      </w:r>
+      <w:r>
+        <w:t xml:space="preserve">Orçamento: The Rio Times, set/2026 (teto da faixa do casal). Aluguel SP: FipeZAP Locação set/2026.</w:t>
+      </w:r>
+    </w:p>
+    <w:p>
+      <w:pPr>
+        <w:numPr>
+          <w:ilvl w:val="0"/>
+          <w:numId w:val="1085"/>
+        </w:numPr>
+        <w:pStyle w:val="Compact"/>
+      </w:pPr>
+      <w:r>
+        <w:rPr>
+          <w:bCs/>
+          <w:b/>
+        </w:rPr>
+        <w:t xml:space="preserve">p. 69</w:t>
+      </w:r>
+      <w:r>
+        <w:t xml:space="preserve">Decretos 12.466 e 12.499/2025 (IOF 3,5%); eco.com, guias de 2026 (taxas de rede e tempo de envio; envio errado em geral não tem volta).</w:t>
+      </w:r>
+    </w:p>
+    <w:p>
+      <w:r>
+        <w:pict>
+          <v:rect style="width:0;height:1.5pt" o:hralign="center" o:hrstd="t" o:hr="t"/>
+        </w:pict>
+      </w:r>
+    </w:p>
+    <w:p>
+      <w:pPr>
+        <w:numPr>
+          <w:ilvl w:val="0"/>
+          <w:numId w:val="1086"/>
+        </w:numPr>
+        <w:pStyle w:val="Compact"/>
+      </w:pPr>
+      <w:r>
+        <w:rPr>
+          <w:bCs/>
+          <w:b/>
+        </w:rPr>
+        <w:t xml:space="preserve">p. 70</w:t>
+      </w:r>
+      <w:r>
+        <w:t xml:space="preserve">Chainalysis via Investalk/BB (jul/2024–jun/2025: US$ 319 bi; 90% em stablecoins); diretor do BC Renato Dias Gomes, mai/2025 (~90%); Receita Federal via COAD (R$ 1,13 tri declarados em stablecoins, ago/2019–dez/2025, ~80% do volume declarado); InfoMoney e Fizen (Res. BCB 519–521).</w:t>
+      </w:r>
+    </w:p>
+    <w:p>
+      <w:pPr>
+        <w:numPr>
+          <w:ilvl w:val="0"/>
+          <w:numId w:val="1086"/>
+        </w:numPr>
+        <w:pStyle w:val="Compact"/>
+      </w:pPr>
+      <w:r>
+        <w:rPr>
+          <w:bCs/>
+          <w:b/>
+        </w:rPr>
+        <w:t xml:space="preserve">p. 71</w:t>
+      </w:r>
+      <w:r>
+        <w:t xml:space="preserve">usdthoy.com (flutuação do boliviano desde 29/06/2026).</w:t>
+      </w:r>
+    </w:p>
+    <w:p>
+      <w:pPr>
+        <w:numPr>
+          <w:ilvl w:val="0"/>
+          <w:numId w:val="1086"/>
+        </w:numPr>
+        <w:pStyle w:val="Compact"/>
+      </w:pPr>
+      <w:r>
+        <w:rPr>
+          <w:bCs/>
+          <w:b/>
+        </w:rPr>
+        <w:t xml:space="preserve">p. 72</w:t>
+      </w:r>
+      <w:r>
+        <w:t xml:space="preserve">CoinMarketCap e DefiLlama via Admiral Markets (~12/10/2026: US$ 184 bi; ~60% de US$ 306 bi); atestação BDO do 2º tri/2026 (31/07/2026), via Stablecoin Insider; Crowdfund Insider via Admiral Markets (auditoria em andamento, ago/2026).</w:t>
+      </w:r>
+    </w:p>
+    <w:p>
+      <w:pPr>
+        <w:numPr>
+          <w:ilvl w:val="0"/>
+          <w:numId w:val="1086"/>
+        </w:numPr>
+        <w:pStyle w:val="Compact"/>
+      </w:pPr>
+      <w:r>
+        <w:rPr>
+          <w:bCs/>
+          <w:b/>
+        </w:rPr>
+        <w:t xml:space="preserve">p. 73</w:t>
+      </w:r>
+      <w:r>
+        <w:t xml:space="preserve">DefiLlama via Admiral Markets (~12/10/2026); dolarparalelobolivia.net, 28/10/2026 (P2P Bs 12,13); CriptoNoticias, Criptoinforme e usdthoy (bancos bolivianos).</w:t>
+      </w:r>
+    </w:p>
+    <w:p>
+      <w:pPr>
+        <w:numPr>
+          <w:ilvl w:val="0"/>
+          <w:numId w:val="1086"/>
+        </w:numPr>
+        <w:pStyle w:val="Compact"/>
+      </w:pPr>
+      <w:r>
+        <w:rPr>
+          <w:bCs/>
+          <w:b/>
+        </w:rPr>
+        <w:t xml:space="preserve">p. 74</w:t>
+      </w:r>
+      <w:r>
+        <w:t xml:space="preserve">Atestação BDO do 2º tri/2026; Res. BCB 519–521 (operações com stablecoin).</w:t>
+      </w:r>
+    </w:p>
+    <w:p>
+      <w:pPr>
+        <w:numPr>
+          <w:ilvl w:val="0"/>
+          <w:numId w:val="1086"/>
+        </w:numPr>
+        <w:pStyle w:val="Compact"/>
+      </w:pPr>
+      <w:r>
+        <w:rPr>
+          <w:bCs/>
+          <w:b/>
+        </w:rPr>
+        <w:t xml:space="preserve">p. 75</w:t>
+      </w:r>
+      <w:r>
+        <w:t xml:space="preserve">Capital Aberto, mar/2026 (topo de US$ 126 mil em out/2025; retração de 52,4%); AUVP (queda de 13% em 06/02/2026).</w:t>
+      </w:r>
+    </w:p>
+    <w:p>
+      <w:pPr>
+        <w:numPr>
+          <w:ilvl w:val="0"/>
+          <w:numId w:val="1086"/>
+        </w:numPr>
+        <w:pStyle w:val="Compact"/>
+      </w:pPr>
+      <w:r>
+        <w:rPr>
+          <w:bCs/>
+          <w:b/>
+        </w:rPr>
+        <w:t xml:space="preserve">p. 76</w:t>
+      </w:r>
+      <w:r>
+        <w:t xml:space="preserve">AUVP (queda de 13% em um dia, 06/02/2026).</w:t>
+      </w:r>
+    </w:p>
+    <w:p>
+      <w:pPr>
+        <w:numPr>
+          <w:ilvl w:val="0"/>
+          <w:numId w:val="1086"/>
+        </w:numPr>
+        <w:pStyle w:val="Compact"/>
+      </w:pPr>
+      <w:r>
+        <w:rPr>
+          <w:bCs/>
+          <w:b/>
+        </w:rPr>
+        <w:t xml:space="preserve">p. 78</w:t>
+      </w:r>
+      <w:r>
+        <w:t xml:space="preserve">InfoMoney e Fizen (Res. BCB 519–521: identificação de carteira autocustodiada, vigência 02/02/2026).</w:t>
+      </w:r>
+    </w:p>
+    <w:p>
+      <w:pPr>
+        <w:numPr>
+          <w:ilvl w:val="0"/>
+          <w:numId w:val="1086"/>
+        </w:numPr>
+        <w:pStyle w:val="Compact"/>
+      </w:pPr>
+      <w:r>
+        <w:rPr>
+          <w:bCs/>
+          <w:b/>
+        </w:rPr>
+        <w:t xml:space="preserve">p. 82</w:t>
+      </w:r>
+      <w:r>
+        <w:t xml:space="preserve">eco.com, guias de 2026 (redes do USDT; envio para rede errada em geral não é recuperável).</w:t>
+      </w:r>
+    </w:p>
+    <w:p>
+      <w:pPr>
+        <w:numPr>
+          <w:ilvl w:val="0"/>
+          <w:numId w:val="1086"/>
+        </w:numPr>
+        <w:pStyle w:val="Compact"/>
+      </w:pPr>
+      <w:r>
+        <w:rPr>
+          <w:bCs/>
+          <w:b/>
+        </w:rPr>
+        <w:t xml:space="preserve">p. 83</w:t>
+      </w:r>
+      <w:r>
+        <w:t xml:space="preserve">eco.com, comparativo de taxas de rede, mai/2026 (Binance: TRC20 1, BEP20 0,29, ERC20 1,6, SOL 1 USDT; velocidade TRC20/BEP20 ~1 min, ERC20 ~2 min); comparativo de 2026 (Polygon ~1 USDT). Escopo do curso, Seção 2.1 (taxa de 1 USDT no exemplo-padrão).</w:t>
+      </w:r>
+    </w:p>
+    <w:p>
+      <w:pPr>
+        <w:numPr>
+          <w:ilvl w:val="0"/>
+          <w:numId w:val="1086"/>
+        </w:numPr>
+        <w:pStyle w:val="Compact"/>
+      </w:pPr>
+      <w:r>
+        <w:rPr>
+          <w:bCs/>
+          <w:b/>
+        </w:rPr>
+        <w:t xml:space="preserve">p. 85</w:t>
+      </w:r>
+      <w:r>
+        <w:t xml:space="preserve">Endereços de exemplo, fictícios e encurtados.</w:t>
+      </w:r>
+    </w:p>
+    <w:p>
+      <w:pPr>
+        <w:numPr>
+          <w:ilvl w:val="0"/>
+          <w:numId w:val="1086"/>
+        </w:numPr>
+        <w:pStyle w:val="Compact"/>
+      </w:pPr>
+      <w:r>
+        <w:rPr>
+          <w:bCs/>
+          <w:b/>
+        </w:rPr>
+        <w:t xml:space="preserve">p. 86</w:t>
+      </w:r>
+      <w:r>
+        <w:t xml:space="preserve">eco.com, guias de 2026 (memo não necessário em TRC20, BEP20 e ERC20, salvo quando o lado que recebe informa um).</w:t>
+      </w:r>
+    </w:p>
+    <w:p>
+      <w:pPr>
+        <w:numPr>
+          <w:ilvl w:val="0"/>
+          <w:numId w:val="1086"/>
+        </w:numPr>
+        <w:pStyle w:val="Compact"/>
+      </w:pPr>
+      <w:r>
+        <w:rPr>
+          <w:bCs/>
+          <w:b/>
+        </w:rPr>
+        <w:t xml:space="preserve">p. 96</w:t>
+      </w:r>
+      <w:r>
+        <w:t xml:space="preserve">Escopo do curso, Seção 2.1 (exemplo-padrão: USDT a R$ 5,38, rede de 1 USDT, P2P a Bs 12,13; remessa e espécie com percentuais ilustrativos).</w:t>
+      </w:r>
+    </w:p>
+    <w:p>
+      <w:r>
+        <w:pict>
+          <v:rect style="width:0;height:1.5pt" o:hralign="center" o:hrstd="t" o:hr="t"/>
+        </w:pict>
+      </w:r>
+    </w:p>
+    <w:p>
+      <w:pPr>
+        <w:numPr>
+          <w:ilvl w:val="0"/>
+          <w:numId w:val="1087"/>
+        </w:numPr>
+        <w:pStyle w:val="Compact"/>
+      </w:pPr>
+      <w:r>
+        <w:rPr>
+          <w:bCs/>
+          <w:b/>
+        </w:rPr>
+        <w:t xml:space="preserve">p. 98</w:t>
+      </w:r>
+      <w:r>
+        <w:t xml:space="preserve">Escopo do curso, Seção 2.1 (câmbio efetivo; spreads de remessa e espécie são exemplos); Decretos 12.466 e 12.499/2025 (IOF 3,5%).</w:t>
+      </w:r>
+    </w:p>
+    <w:p>
+      <w:pPr>
+        <w:numPr>
+          <w:ilvl w:val="0"/>
+          <w:numId w:val="1087"/>
+        </w:numPr>
+        <w:pStyle w:val="Compact"/>
+      </w:pPr>
+      <w:r>
+        <w:rPr>
+          <w:bCs/>
+          <w:b/>
+        </w:rPr>
+        <w:t xml:space="preserve">p. 99</w:t>
+      </w:r>
+      <w:r>
+        <w:t xml:space="preserve">Escopo do curso, Seção 2.1; InfoMoney (nov/2025) e Blue Consult (25/07/2026): IOF não cobrado automaticamente na compra de stablecoin.</w:t>
+      </w:r>
+    </w:p>
+    <w:p>
+      <w:pPr>
+        <w:numPr>
+          <w:ilvl w:val="0"/>
+          <w:numId w:val="1087"/>
+        </w:numPr>
+        <w:pStyle w:val="Compact"/>
+      </w:pPr>
+      <w:r>
+        <w:rPr>
+          <w:bCs/>
+          <w:b/>
+        </w:rPr>
+        <w:t xml:space="preserve">p. 100</w:t>
+      </w:r>
+      <w:r>
+        <w:t xml:space="preserve">Escopo do curso, Seção 2.1; Investidor10 e CoinMarketCap, 28/10/2026 (R$ 5,35); dolarparalelobolivia.net, 28/10/2026 (P2P Bs 12,13).</w:t>
+      </w:r>
+    </w:p>
+    <w:p>
+      <w:pPr>
+        <w:numPr>
+          <w:ilvl w:val="0"/>
+          <w:numId w:val="1087"/>
+        </w:numPr>
+        <w:pStyle w:val="Compact"/>
+      </w:pPr>
+      <w:r>
+        <w:rPr>
+          <w:bCs/>
+          <w:b/>
+        </w:rPr>
+        <w:t xml:space="preserve">p. 101</w:t>
+      </w:r>
+      <w:r>
+        <w:t xml:space="preserve">Lei 14.478/2022; Poder360 (textos das Res. BCB 519, 520 e 521, 10/11/2025); InfoMoney (vigência 02/02/2026); BlockEden (Res. 561); Let's Money (prazo de autorização até 30/10/2026; reporte adiado para 03/11/2026 pela Res. 574); Blocktrends e Judit (Res. 584).</w:t>
+      </w:r>
+    </w:p>
+    <w:p>
+      <w:pPr>
+        <w:numPr>
+          <w:ilvl w:val="0"/>
+          <w:numId w:val="1087"/>
+        </w:numPr>
+        <w:pStyle w:val="Compact"/>
+      </w:pPr>
+      <w:r>
+        <w:rPr>
+          <w:bCs/>
+          <w:b/>
+        </w:rPr>
+        <w:t xml:space="preserve">p. 102</w:t>
+      </w:r>
+      <w:r>
+        <w:t xml:space="preserve">Poder360 (íntegra das Res. BCB 519, 520 e 521); InfoMoney (“BC define regras para o mercado de criptomoedas”). Conferir os textos oficiais em bcb.gov.br.</w:t>
+      </w:r>
+    </w:p>
+    <w:p>
+      <w:pPr>
+        <w:numPr>
+          <w:ilvl w:val="0"/>
+          <w:numId w:val="1087"/>
+        </w:numPr>
+        <w:pStyle w:val="Compact"/>
+      </w:pPr>
+      <w:r>
+        <w:rPr>
+          <w:bCs/>
+          <w:b/>
+        </w:rPr>
+        <w:t xml:space="preserve">p. 103</w:t>
+      </w:r>
+      <w:r>
+        <w:t xml:space="preserve">Blocktrends e SpaceMoney (Res. BCB 584, publicada em 07/08/2026, vigência 01/01/2027); Judit (liberação antecipada); Investalk/BB; Judit (PDL 926/2026, 10/08/2026).</w:t>
+      </w:r>
+    </w:p>
+    <w:p>
+      <w:pPr>
+        <w:numPr>
+          <w:ilvl w:val="0"/>
+          <w:numId w:val="1087"/>
+        </w:numPr>
+        <w:pStyle w:val="Compact"/>
+      </w:pPr>
+      <w:r>
+        <w:rPr>
+          <w:bCs/>
+          <w:b/>
+        </w:rPr>
+        <w:t xml:space="preserve">p. 104</w:t>
+      </w:r>
+      <w:r>
+        <w:t xml:space="preserve">Gazeta do Povo e Revista Oeste (minuta da Receita, fev/2026: 3,5% com isenção até R$ 10 mil/mês para PF); InfoMoney (“Secretário de Haddad confirma plano de taxar criptomoedas”); Blocknews, out/2026 (consulta adiada; incerteza após a reeleição).</w:t>
+      </w:r>
+    </w:p>
+    <w:p>
+      <w:pPr>
+        <w:numPr>
+          <w:ilvl w:val="0"/>
+          <w:numId w:val="1087"/>
+        </w:numPr>
+        <w:pStyle w:val="Compact"/>
+      </w:pPr>
+      <w:r>
+        <w:rPr>
+          <w:bCs/>
+          <w:b/>
+        </w:rPr>
+        <w:t xml:space="preserve">p. 105</w:t>
+      </w:r>
+      <w:r>
+        <w:t xml:space="preserve">Lei 7.492/1986; Lei 14.478/2022 (escopo do curso, Seção 3.2).</w:t>
+      </w:r>
+    </w:p>
+    <w:p>
+      <w:pPr>
+        <w:numPr>
+          <w:ilvl w:val="0"/>
+          <w:numId w:val="1087"/>
+        </w:numPr>
+        <w:pStyle w:val="Compact"/>
+      </w:pPr>
+      <w:r>
+        <w:rPr>
+          <w:bCs/>
+          <w:b/>
+        </w:rPr>
+        <w:t xml:space="preserve">p. 106</w:t>
+      </w:r>
+      <w:r>
+        <w:t xml:space="preserve">CriptoNoticias (bancos bolivianos com USDT; FIE Cuenta Cripto desde 09/04/2026; Unión/Yasta abr/2026; BISA); KuCoin News (fim da proibição em jun/2024); Cointelegraph e CriptoNoticias (declaração do ministro José Gabriel Espinoza).</w:t>
+      </w:r>
+    </w:p>
+    <w:p>
+      <w:pPr>
+        <w:numPr>
+          <w:ilvl w:val="0"/>
+          <w:numId w:val="1087"/>
+        </w:numPr>
+        <w:pStyle w:val="Compact"/>
+      </w:pPr>
+      <w:r>
+        <w:rPr>
+          <w:bCs/>
+          <w:b/>
+        </w:rPr>
+        <w:t xml:space="preserve">p. 107</w:t>
+      </w:r>
+      <w:r>
+        <w:t xml:space="preserve">CriptoNoticias (FIE: cidadãos bolivianos maiores de 18 residentes; Unión/Yasta; BISA).</w:t>
+      </w:r>
+    </w:p>
+    <w:p>
+      <w:pPr>
+        <w:numPr>
+          <w:ilvl w:val="0"/>
+          <w:numId w:val="1087"/>
+        </w:numPr>
+        <w:pStyle w:val="Compact"/>
+      </w:pPr>
+      <w:r>
+        <w:rPr>
+          <w:bCs/>
+          <w:b/>
+        </w:rPr>
+        <w:t xml:space="preserve">p. 109</w:t>
+      </w:r>
+      <w:r>
+        <w:t xml:space="preserve">InfoMoney (vigência das Res. 519–521); Let's Money (prazo de 270 dias, até 30/10/2026); IstoÉ Dinheiro (prazo de 2 e 3 anos para o BC decidir, 19/02/2026).</w:t>
+      </w:r>
+    </w:p>
+    <w:p>
+      <w:r>
+        <w:pict>
+          <v:rect style="width:0;height:1.5pt" o:hralign="center" o:hrstd="t" o:hr="t"/>
+        </w:pict>
+      </w:r>
+    </w:p>
     <w:p>
       <w:pPr>
         <w:numPr>
@@ -32746,6 +33792,279 @@
           <w:bCs/>
           <w:b/>
         </w:rPr>
+        <w:t xml:space="preserve">p. 112</w:t>
+      </w:r>
+      <w:r>
+        <w:t xml:space="preserve">Jovem Pan e Revista Oeste (regras do Pix: limite noturno de R$ 1.000 entre pessoas físicas, 20h–6h); Tecnoblog (aumento em 24 a 48 h); Diário do Comércio, jun/2026 (limite mantido em 2026).</w:t>
+      </w:r>
+    </w:p>
+    <w:p>
+      <w:pPr>
+        <w:numPr>
+          <w:ilvl w:val="0"/>
+          <w:numId w:val="1088"/>
+        </w:numPr>
+        <w:pStyle w:val="Compact"/>
+      </w:pPr>
+      <w:r>
+        <w:rPr>
+          <w:bCs/>
+          <w:b/>
+        </w:rPr>
+        <w:t xml:space="preserve">p. 116</w:t>
+      </w:r>
+      <w:r>
+        <w:t xml:space="preserve">Investidor10 e CoinMarketCap, 28/10/2026.</w:t>
+      </w:r>
+    </w:p>
+    <w:p>
+      <w:pPr>
+        <w:numPr>
+          <w:ilvl w:val="0"/>
+          <w:numId w:val="1088"/>
+        </w:numPr>
+        <w:pStyle w:val="Compact"/>
+      </w:pPr>
+      <w:r>
+        <w:rPr>
+          <w:bCs/>
+          <w:b/>
+        </w:rPr>
+        <w:t xml:space="preserve">p. 117</w:t>
+      </w:r>
+      <w:r>
+        <w:t xml:space="preserve">eco.com, comparativo de taxas de rede, mai/2026.</w:t>
+      </w:r>
+    </w:p>
+    <w:p>
+      <w:pPr>
+        <w:numPr>
+          <w:ilvl w:val="0"/>
+          <w:numId w:val="1088"/>
+        </w:numPr>
+        <w:pStyle w:val="Compact"/>
+      </w:pPr>
+      <w:r>
+        <w:rPr>
+          <w:bCs/>
+          <w:b/>
+        </w:rPr>
+        <w:t xml:space="preserve">p. 120</w:t>
+      </w:r>
+      <w:r>
+        <w:t xml:space="preserve">Poder360 (texto da Res. BCB 521: identificação de carteira autocustodiada); Blocktrends (Res. 584).</w:t>
+      </w:r>
+    </w:p>
+    <w:p>
+      <w:pPr>
+        <w:numPr>
+          <w:ilvl w:val="0"/>
+          <w:numId w:val="1088"/>
+        </w:numPr>
+        <w:pStyle w:val="Compact"/>
+      </w:pPr>
+      <w:r>
+        <w:rPr>
+          <w:bCs/>
+          <w:b/>
+        </w:rPr>
+        <w:t xml:space="preserve">p. 121</w:t>
+      </w:r>
+      <w:r>
+        <w:t xml:space="preserve">dolarparalelobolivia.net, 28/10/2026 (P2P Binance: compra Bs 12,17, venda Bs 12,13); BCB via usdtbol.com, 28/10/2026 (Bs 12,02).</w:t>
+      </w:r>
+    </w:p>
+    <w:p>
+      <w:pPr>
+        <w:numPr>
+          <w:ilvl w:val="0"/>
+          <w:numId w:val="1088"/>
+        </w:numPr>
+        <w:pStyle w:val="Compact"/>
+      </w:pPr>
+      <w:r>
+        <w:rPr>
+          <w:bCs/>
+          <w:b/>
+        </w:rPr>
+        <w:t xml:space="preserve">p. 126</w:t>
+      </w:r>
+      <w:r>
+        <w:t xml:space="preserve">CriptoNoticias; Criptoinforme; usdthoy (escopo do curso, Seção 2: limites de BISA, FIE e Unión/Yasta); CriptoNoticias (FIE para cidadãos bolivianos residentes; Unión/EFY com respaldo da ASFI).</w:t>
+      </w:r>
+    </w:p>
+    <w:p>
+      <w:pPr>
+        <w:numPr>
+          <w:ilvl w:val="0"/>
+          <w:numId w:val="1088"/>
+        </w:numPr>
+        <w:pStyle w:val="Compact"/>
+      </w:pPr>
+      <w:r>
+        <w:rPr>
+          <w:bCs/>
+          <w:b/>
+        </w:rPr>
+        <w:t xml:space="preserve">p. 127</w:t>
+      </w:r>
+      <w:r>
+        <w:t xml:space="preserve">CriptoNoticias, CoinMarketCap Academy e Bitcoin.com News (Toyosa: Toyota, BYD e Yamaha aceitam USDT; anúncio de Paolo Ardoino em 21/09/2025).</w:t>
+      </w:r>
+    </w:p>
+    <w:p>
+      <w:pPr>
+        <w:numPr>
+          <w:ilvl w:val="0"/>
+          <w:numId w:val="1088"/>
+        </w:numPr>
+        <w:pStyle w:val="Compact"/>
+      </w:pPr>
+      <w:r>
+        <w:rPr>
+          <w:bCs/>
+          <w:b/>
+        </w:rPr>
+        <w:t xml:space="preserve">p. 129</w:t>
+      </w:r>
+      <w:r>
+        <w:t xml:space="preserve">Escopo do curso, Seção 2.1 (exemplo-padrão).</w:t>
+      </w:r>
+    </w:p>
+    <w:p>
+      <w:pPr>
+        <w:numPr>
+          <w:ilvl w:val="0"/>
+          <w:numId w:val="1088"/>
+        </w:numPr>
+        <w:pStyle w:val="Compact"/>
+      </w:pPr>
+      <w:r>
+        <w:rPr>
+          <w:bCs/>
+          <w:b/>
+        </w:rPr>
+        <w:t xml:space="preserve">p. 131</w:t>
+      </w:r>
+      <w:r>
+        <w:t xml:space="preserve">Escopo do curso, Seção 3.2 (proibição de fracionar para escapar de limites); Blocktrends e Judit (Res. 584).</w:t>
+      </w:r>
+    </w:p>
+    <w:p>
+      <w:pPr>
+        <w:numPr>
+          <w:ilvl w:val="0"/>
+          <w:numId w:val="1088"/>
+        </w:numPr>
+        <w:pStyle w:val="Compact"/>
+      </w:pPr>
+      <w:r>
+        <w:rPr>
+          <w:bCs/>
+          <w:b/>
+        </w:rPr>
+        <w:t xml:space="preserve">p. 132</w:t>
+      </w:r>
+      <w:r>
+        <w:t xml:space="preserve">Poder360 (Res. BCB 521: limite de US$ 100 mil); Blocktrends (Res. 584).</w:t>
+      </w:r>
+    </w:p>
+    <w:p>
+      <w:pPr>
+        <w:numPr>
+          <w:ilvl w:val="0"/>
+          <w:numId w:val="1088"/>
+        </w:numPr>
+        <w:pStyle w:val="Compact"/>
+      </w:pPr>
+      <w:r>
+        <w:rPr>
+          <w:bCs/>
+          <w:b/>
+        </w:rPr>
+        <w:t xml:space="preserve">p. 133</w:t>
+      </w:r>
+      <w:r>
+        <w:t xml:space="preserve">Receita Federal (e-DBV); Aduana Nacional da Bolívia, RD 01-013-24 (Formulário 250, ASFI e retenção de 30%).</w:t>
+      </w:r>
+    </w:p>
+    <w:p>
+      <w:pPr>
+        <w:numPr>
+          <w:ilvl w:val="0"/>
+          <w:numId w:val="1088"/>
+        </w:numPr>
+        <w:pStyle w:val="Compact"/>
+      </w:pPr>
+      <w:r>
+        <w:rPr>
+          <w:bCs/>
+          <w:b/>
+        </w:rPr>
+        <w:t xml:space="preserve">p. 136</w:t>
+      </w:r>
+      <w:r>
+        <w:t xml:space="preserve">Escopo do curso, Seção 3.5; Lei 14.478/2022; Res. BCB 519 e 520.</w:t>
+      </w:r>
+    </w:p>
+    <w:p>
+      <w:pPr>
+        <w:numPr>
+          <w:ilvl w:val="0"/>
+          <w:numId w:val="1088"/>
+        </w:numPr>
+        <w:pStyle w:val="Compact"/>
+      </w:pPr>
+      <w:r>
+        <w:rPr>
+          <w:bCs/>
+          <w:b/>
+        </w:rPr>
+        <w:t xml:space="preserve">p. 138</w:t>
+      </w:r>
+      <w:r>
+        <w:t xml:space="preserve">Exame, via Global Anti-Scam Alliance (mar/2025–fev/2026: R$ 21,2 bi, 16,5 mi de vítimas); Poder360 e Exame, via Banco Central (2024: 4,7 mi de fraudes no Pix, R$ 6,5 bi, R$ 459 mi devolvidos); InfoMoney (golpes com cripto: ~R$ 40 bi e quase 4 mi de vítimas em 5 anos).</w:t>
+      </w:r>
+    </w:p>
+    <w:p>
+      <w:pPr>
+        <w:numPr>
+          <w:ilvl w:val="0"/>
+          <w:numId w:val="1088"/>
+        </w:numPr>
+        <w:pStyle w:val="Compact"/>
+      </w:pPr>
+      <w:r>
+        <w:rPr>
+          <w:bCs/>
+          <w:b/>
+        </w:rPr>
+        <w:t xml:space="preserve">p. 142</w:t>
+      </w:r>
+      <w:r>
+        <w:t xml:space="preserve">Revista Oeste e InfoMoney (Operação Criptoabate, Polícia Civil do RS: perda de R$ 37 mi e cobrança de “taxas” para liberar saque); InfoMoney (Operação Profeta, PF: promessa de até 9% ao mês, ~R$ 260 mi).</w:t>
+      </w:r>
+    </w:p>
+    <w:p>
+      <w:r>
+        <w:pict>
+          <v:rect style="width:0;height:1.5pt" o:hralign="center" o:hrstd="t" o:hr="t"/>
+        </w:pict>
+      </w:r>
+    </w:p>
+    <w:p>
+      <w:pPr>
+        <w:numPr>
+          <w:ilvl w:val="0"/>
+          <w:numId w:val="1089"/>
+        </w:numPr>
+        <w:pStyle w:val="Compact"/>
+      </w:pPr>
+      <w:r>
+        <w:rPr>
+          <w:bCs/>
+          <w:b/>
+        </w:rPr>
         <w:t xml:space="preserve">p. 143</w:t>
       </w:r>
       <w:r>
@@ -32756,7 +34075,7 @@
       <w:pPr>
         <w:numPr>
           <w:ilvl w:val="0"/>
-          <w:numId w:val="1088"/>
+          <w:numId w:val="1089"/>
         </w:numPr>
         <w:pStyle w:val="Compact"/>
       </w:pPr>
@@ -32775,7 +34094,7 @@
       <w:pPr>
         <w:numPr>
           <w:ilvl w:val="0"/>
-          <w:numId w:val="1088"/>
+          <w:numId w:val="1089"/>
         </w:numPr>
         <w:pStyle w:val="Compact"/>
       </w:pPr>
@@ -32794,7 +34113,7 @@
       <w:pPr>
         <w:numPr>
           <w:ilvl w:val="0"/>
-          <w:numId w:val="1088"/>
+          <w:numId w:val="1089"/>
         </w:numPr>
         <w:pStyle w:val="Compact"/>
       </w:pPr>
@@ -32807,6 +34126,25 @@
       </w:r>
       <w:r>
         <w:t xml:space="preserve">DPL News (ATT, plataforma “Bloquea la Estafa” e linha 800 10 6000); Correo del Sur (denúncia de golpe digital na FELCC, unidade de cibercrime).</w:t>
+      </w:r>
+    </w:p>
+    <w:p>
+      <w:pPr>
+        <w:numPr>
+          <w:ilvl w:val="0"/>
+          <w:numId w:val="1089"/>
+        </w:numPr>
+        <w:pStyle w:val="Compact"/>
+      </w:pPr>
+      <w:r>
+        <w:rPr>
+          <w:bCs/>
+          <w:b/>
+        </w:rPr>
+        <w:t xml:space="preserve">p. 165</w:t>
+      </w:r>
+      <w:r>
+        <w:t xml:space="preserve">Gazeta do Povo (arrecadação 2025; 1 imposto a cada 27 dias; dívida e juros, ago/2026; herança de 90% do PIB); Poder360 (IOF 3,5%; dívida 82,9% do PIB segundo o BC).</w:t>
       </w:r>
     </w:p>
     <w:sectPr/>
@@ -33860,7 +35198,34 @@
     <w:abstractNumId w:val="991"/>
   </w:num>
   <w:num w:numId="1081">
-    <w:abstractNumId w:val="991"/>
+    <w:abstractNumId w:val="99201"/>
+    <w:lvlOverride w:ilvl="0">
+      <w:startOverride w:val="1"/>
+    </w:lvlOverride>
+    <w:lvlOverride w:ilvl="1">
+      <w:startOverride w:val="1"/>
+    </w:lvlOverride>
+    <w:lvlOverride w:ilvl="2">
+      <w:startOverride w:val="1"/>
+    </w:lvlOverride>
+    <w:lvlOverride w:ilvl="3">
+      <w:startOverride w:val="1"/>
+    </w:lvlOverride>
+    <w:lvlOverride w:ilvl="4">
+      <w:startOverride w:val="1"/>
+    </w:lvlOverride>
+    <w:lvlOverride w:ilvl="5">
+      <w:startOverride w:val="1"/>
+    </w:lvlOverride>
+    <w:lvlOverride w:ilvl="6">
+      <w:startOverride w:val="1"/>
+    </w:lvlOverride>
+    <w:lvlOverride w:ilvl="7">
+      <w:startOverride w:val="1"/>
+    </w:lvlOverride>
+    <w:lvlOverride w:ilvl="8">
+      <w:startOverride w:val="1"/>
+    </w:lvlOverride>
   </w:num>
   <w:num w:numId="1082">
     <w:abstractNumId w:val="991"/>
@@ -33881,6 +35246,9 @@
     <w:abstractNumId w:val="991"/>
   </w:num>
   <w:num w:numId="1088">
+    <w:abstractNumId w:val="991"/>
+  </w:num>
+  <w:num w:numId="1089">
     <w:abstractNumId w:val="991"/>
   </w:num>
 </w:numbering>

</xml_diff>

<commit_message>
Dossiê avulso: B7 como e-book separado para a landing page
O build aceita BOOK_FILES/BOOK_HTML/BOOK_OUT/BOOK_TITLE para montar
outros livros com o mesmo sistema. npm run build:dossie gera o PDF e o
Word do dossiê com capa e contracapa próprias. As manchetes viram links
clicáveis, além do QR code.

Co-Authored-By: Claude Opus 5.5 <noreply@anthropic.com>
Claude-Session: https://claude.ai/code/session_01GJhkYfDrHd3AkmDKDTo71F
</commit_message>
<xml_diff>
--- a/curso/dist/LULA-GANHOU-Curso-Completo.docx
+++ b/curso/dist/LULA-GANHOU-Curso-Completo.docx
@@ -31187,7 +31187,7 @@
         <w:t xml:space="preserve">Fatos publicados</w:t>
       </w:r>
     </w:p>
-    <w:bookmarkStart w:id="241" w:name="já-aconteceu-1"/>
+    <w:bookmarkStart w:id="244" w:name="já-aconteceu-1"/>
     <w:p>
       <w:pPr>
         <w:pStyle w:val="Heading2"/>
@@ -31211,9 +31211,14 @@
       <w:pPr>
         <w:pStyle w:val="BodyText"/>
       </w:pPr>
-      <w:r>
-        <w:t xml:space="preserve">“Arrecadação de impostos bate recorde em 2025 e atinge R$ 2,89 trilhões”</w:t>
-      </w:r>
+      <w:hyperlink r:id="rId241">
+        <w:r>
+          <w:rPr>
+            <w:rStyle w:val="Hyperlink"/>
+          </w:rPr>
+          <w:t xml:space="preserve">“Arrecadação de impostos bate recorde em 2025 e atinge R$ 2,89 trilhões”</w:t>
+        </w:r>
+      </w:hyperlink>
     </w:p>
     <w:p>
       <w:pPr>
@@ -31256,9 +31261,14 @@
       <w:pPr>
         <w:pStyle w:val="BodyText"/>
       </w:pPr>
-      <w:r>
-        <w:t xml:space="preserve">“Governo Lula: novo imposto a cada 27 dias e carga recorde”</w:t>
-      </w:r>
+      <w:hyperlink r:id="rId242">
+        <w:r>
+          <w:rPr>
+            <w:rStyle w:val="Hyperlink"/>
+          </w:rPr>
+          <w:t xml:space="preserve">“Governo Lula: novo imposto a cada 27 dias e carga recorde”</w:t>
+        </w:r>
+      </w:hyperlink>
     </w:p>
     <w:p>
       <w:pPr>
@@ -31301,9 +31311,14 @@
       <w:pPr>
         <w:pStyle w:val="BodyText"/>
       </w:pPr>
-      <w:r>
-        <w:t xml:space="preserve">“Lula aumentou impostos 27 vezes em 3 anos no Planalto”</w:t>
-      </w:r>
+      <w:hyperlink r:id="rId243">
+        <w:r>
+          <w:rPr>
+            <w:rStyle w:val="Hyperlink"/>
+          </w:rPr>
+          <w:t xml:space="preserve">“Lula aumentou impostos 27 vezes em 3 anos no Planalto”</w:t>
+        </w:r>
+      </w:hyperlink>
     </w:p>
     <w:p>
       <w:pPr>
@@ -31331,7 +31346,7 @@
         <w:t xml:space="preserve">· link consultado em 28/10/2026</w:t>
       </w:r>
     </w:p>
-    <w:bookmarkEnd w:id="241"/>
+    <w:bookmarkEnd w:id="244"/>
     <w:p>
       <w:r>
         <w:pict>
@@ -31339,7 +31354,7 @@
         </w:pict>
       </w:r>
     </w:p>
-    <w:bookmarkStart w:id="242" w:name="já-aconteceu-cont."/>
+    <w:bookmarkStart w:id="248" w:name="já-aconteceu-cont."/>
     <w:p>
       <w:pPr>
         <w:pStyle w:val="Heading2"/>
@@ -31363,9 +31378,14 @@
       <w:pPr>
         <w:pStyle w:val="BodyText"/>
       </w:pPr>
-      <w:r>
-        <w:t xml:space="preserve">“Lista dos impostos que o governo Lula criou ou elevou”</w:t>
-      </w:r>
+      <w:hyperlink r:id="rId245">
+        <w:r>
+          <w:rPr>
+            <w:rStyle w:val="Hyperlink"/>
+          </w:rPr>
+          <w:t xml:space="preserve">“Lista dos impostos que o governo Lula criou ou elevou”</w:t>
+        </w:r>
+      </w:hyperlink>
     </w:p>
     <w:p>
       <w:pPr>
@@ -31408,9 +31428,14 @@
       <w:pPr>
         <w:pStyle w:val="BodyText"/>
       </w:pPr>
-      <w:r>
-        <w:t xml:space="preserve">“Haddad desiste de zerar IOF do cartão internacional e sobe para 3,5%”</w:t>
-      </w:r>
+      <w:hyperlink r:id="rId246">
+        <w:r>
+          <w:rPr>
+            <w:rStyle w:val="Hyperlink"/>
+          </w:rPr>
+          <w:t xml:space="preserve">“Haddad desiste de zerar IOF do cartão internacional e sobe para 3,5%”</w:t>
+        </w:r>
+      </w:hyperlink>
     </w:p>
     <w:p>
       <w:pPr>
@@ -31453,9 +31478,14 @@
       <w:pPr>
         <w:pStyle w:val="BodyText"/>
       </w:pPr>
-      <w:r>
-        <w:t xml:space="preserve">“Saiba como fica o IOF após decisão de Moraes”</w:t>
-      </w:r>
+      <w:hyperlink r:id="rId247">
+        <w:r>
+          <w:rPr>
+            <w:rStyle w:val="Hyperlink"/>
+          </w:rPr>
+          <w:t xml:space="preserve">“Saiba como fica o IOF após decisão de Moraes”</w:t>
+        </w:r>
+      </w:hyperlink>
     </w:p>
     <w:p>
       <w:pPr>
@@ -31483,7 +31513,7 @@
         <w:t xml:space="preserve">· link consultado em 28/10/2026</w:t>
       </w:r>
     </w:p>
-    <w:bookmarkEnd w:id="242"/>
+    <w:bookmarkEnd w:id="248"/>
     <w:p>
       <w:r>
         <w:pict>
@@ -31491,7 +31521,7 @@
         </w:pict>
       </w:r>
     </w:p>
-    <w:bookmarkStart w:id="243" w:name="já-aconteceu-cont.-1"/>
+    <w:bookmarkStart w:id="252" w:name="já-aconteceu-cont.-1"/>
     <w:p>
       <w:pPr>
         <w:pStyle w:val="Heading2"/>
@@ -31515,9 +31545,14 @@
       <w:pPr>
         <w:pStyle w:val="BodyText"/>
       </w:pPr>
-      <w:r>
-        <w:t xml:space="preserve">“Dívida pública avança a 82,9% do PIB e bate R$ 11 trilhões sob Lula”</w:t>
-      </w:r>
+      <w:hyperlink r:id="rId249">
+        <w:r>
+          <w:rPr>
+            <w:rStyle w:val="Hyperlink"/>
+          </w:rPr>
+          <w:t xml:space="preserve">“Dívida pública avança a 82,9% do PIB e bate R$ 11 trilhões sob Lula”</w:t>
+        </w:r>
+      </w:hyperlink>
     </w:p>
     <w:p>
       <w:pPr>
@@ -31560,9 +31595,14 @@
       <w:pPr>
         <w:pStyle w:val="BodyText"/>
       </w:pPr>
-      <w:r>
-        <w:t xml:space="preserve">“Dívida pública brasileira alcança R$ 11 trilhões e chega a 82,9% do PIB”</w:t>
-      </w:r>
+      <w:hyperlink r:id="rId250">
+        <w:r>
+          <w:rPr>
+            <w:rStyle w:val="Hyperlink"/>
+          </w:rPr>
+          <w:t xml:space="preserve">“Dívida pública brasileira alcança R$ 11 trilhões e chega a 82,9% do PIB”</w:t>
+        </w:r>
+      </w:hyperlink>
     </w:p>
     <w:p>
       <w:pPr>
@@ -31605,9 +31645,14 @@
       <w:pPr>
         <w:pStyle w:val="BodyText"/>
       </w:pPr>
-      <w:r>
-        <w:t xml:space="preserve">“Sob Lula, arrecadação bate recorde, mas déficit permanece acima de R$ 1 tri pelo 3º ano seguido”</w:t>
-      </w:r>
+      <w:hyperlink r:id="rId251">
+        <w:r>
+          <w:rPr>
+            <w:rStyle w:val="Hyperlink"/>
+          </w:rPr>
+          <w:t xml:space="preserve">“Sob Lula, arrecadação bate recorde, mas déficit permanece acima de R$ 1 tri pelo 3º ano seguido”</w:t>
+        </w:r>
+      </w:hyperlink>
     </w:p>
     <w:p>
       <w:pPr>
@@ -31635,7 +31680,7 @@
         <w:t xml:space="preserve">· link consultado em 28/10/2026</w:t>
       </w:r>
     </w:p>
-    <w:bookmarkEnd w:id="243"/>
+    <w:bookmarkEnd w:id="252"/>
     <w:p>
       <w:r>
         <w:pict>
@@ -31643,7 +31688,7 @@
         </w:pict>
       </w:r>
     </w:p>
-    <w:bookmarkStart w:id="244" w:name="já-aconteceu-cont.-2"/>
+    <w:bookmarkStart w:id="256" w:name="já-aconteceu-cont.-2"/>
     <w:p>
       <w:pPr>
         <w:pStyle w:val="Heading2"/>
@@ -31667,9 +31712,14 @@
       <w:pPr>
         <w:pStyle w:val="BodyText"/>
       </w:pPr>
-      <w:r>
-        <w:t xml:space="preserve">“Pix: Golpes crescem 80% e somam R$ 6,5 bi em 2024”</w:t>
-      </w:r>
+      <w:hyperlink r:id="rId253">
+        <w:r>
+          <w:rPr>
+            <w:rStyle w:val="Hyperlink"/>
+          </w:rPr>
+          <w:t xml:space="preserve">“Pix: Golpes crescem 80% e somam R$ 6,5 bi em 2024”</w:t>
+        </w:r>
+      </w:hyperlink>
     </w:p>
     <w:p>
       <w:pPr>
@@ -31712,9 +31762,14 @@
       <w:pPr>
         <w:pStyle w:val="BodyText"/>
       </w:pPr>
-      <w:r>
-        <w:t xml:space="preserve">“Governo Lula eleva Imposto de Importação e trava investimentos”</w:t>
-      </w:r>
+      <w:hyperlink r:id="rId254">
+        <w:r>
+          <w:rPr>
+            <w:rStyle w:val="Hyperlink"/>
+          </w:rPr>
+          <w:t xml:space="preserve">“Governo Lula eleva Imposto de Importação e trava investimentos”</w:t>
+        </w:r>
+      </w:hyperlink>
     </w:p>
     <w:p>
       <w:pPr>
@@ -31757,9 +31812,14 @@
       <w:pPr>
         <w:pStyle w:val="BodyText"/>
       </w:pPr>
-      <w:r>
-        <w:t xml:space="preserve">“Governo pretende cobrar IOF sobre operações com criptomoedas”</w:t>
-      </w:r>
+      <w:hyperlink r:id="rId255">
+        <w:r>
+          <w:rPr>
+            <w:rStyle w:val="Hyperlink"/>
+          </w:rPr>
+          <w:t xml:space="preserve">“Governo pretende cobrar IOF sobre operações com criptomoedas”</w:t>
+        </w:r>
+      </w:hyperlink>
     </w:p>
     <w:p>
       <w:pPr>
@@ -31787,7 +31847,7 @@
         <w:t xml:space="preserve">· link consultado em 28/10/2026</w:t>
       </w:r>
     </w:p>
-    <w:bookmarkEnd w:id="244"/>
+    <w:bookmarkEnd w:id="256"/>
     <w:p>
       <w:r>
         <w:pict>
@@ -31803,7 +31863,7 @@
         <w:t xml:space="preserve">Projeções e propostas</w:t>
       </w:r>
     </w:p>
-    <w:bookmarkStart w:id="245" w:name="o-que-vem-por-aí-1"/>
+    <w:bookmarkStart w:id="260" w:name="o-que-vem-por-aí-1"/>
     <w:p>
       <w:pPr>
         <w:pStyle w:val="Heading2"/>
@@ -31827,9 +31887,14 @@
       <w:pPr>
         <w:pStyle w:val="BodyText"/>
       </w:pPr>
-      <w:r>
-        <w:t xml:space="preserve">“Governo admite deixar “herança” de dívida pública em 90% do PIB”</w:t>
-      </w:r>
+      <w:hyperlink r:id="rId257">
+        <w:r>
+          <w:rPr>
+            <w:rStyle w:val="Hyperlink"/>
+          </w:rPr>
+          <w:t xml:space="preserve">“Governo admite deixar “herança” de dívida pública em 90% do PIB”</w:t>
+        </w:r>
+      </w:hyperlink>
     </w:p>
     <w:p>
       <w:pPr>
@@ -31872,9 +31937,14 @@
       <w:pPr>
         <w:pStyle w:val="BodyText"/>
       </w:pPr>
-      <w:r>
-        <w:t xml:space="preserve">“Brasil crescerá 2,4% em 2026 e dívida se aproxima de 100% do PIB”</w:t>
-      </w:r>
+      <w:hyperlink r:id="rId258">
+        <w:r>
+          <w:rPr>
+            <w:rStyle w:val="Hyperlink"/>
+          </w:rPr>
+          <w:t xml:space="preserve">“Brasil crescerá 2,4% em 2026 e dívida se aproxima de 100% do PIB”</w:t>
+        </w:r>
+      </w:hyperlink>
     </w:p>
     <w:p>
       <w:pPr>
@@ -31917,9 +31987,14 @@
       <w:pPr>
         <w:pStyle w:val="BodyText"/>
       </w:pPr>
-      <w:r>
-        <w:t xml:space="preserve">“Instituição do Senado diz que ajuste fiscal será inevitável”</w:t>
-      </w:r>
+      <w:hyperlink r:id="rId259">
+        <w:r>
+          <w:rPr>
+            <w:rStyle w:val="Hyperlink"/>
+          </w:rPr>
+          <w:t xml:space="preserve">“Instituição do Senado diz que ajuste fiscal será inevitável”</w:t>
+        </w:r>
+      </w:hyperlink>
     </w:p>
     <w:p>
       <w:pPr>
@@ -31947,7 +32022,7 @@
         <w:t xml:space="preserve">· link consultado em 28/10/2026</w:t>
       </w:r>
     </w:p>
-    <w:bookmarkEnd w:id="245"/>
+    <w:bookmarkEnd w:id="260"/>
     <w:p>
       <w:r>
         <w:pict>
@@ -31955,7 +32030,7 @@
         </w:pict>
       </w:r>
     </w:p>
-    <w:bookmarkStart w:id="246" w:name="o-que-vem-por-aí-cont."/>
+    <w:bookmarkStart w:id="264" w:name="o-que-vem-por-aí-cont."/>
     <w:p>
       <w:pPr>
         <w:pStyle w:val="Heading2"/>
@@ -31979,9 +32054,14 @@
       <w:pPr>
         <w:pStyle w:val="BodyText"/>
       </w:pPr>
-      <w:r>
-        <w:t xml:space="preserve">“Governo Lula prepara cobrança do IOF sobre investimentos isentos sem passar pelo Congresso”</w:t>
-      </w:r>
+      <w:hyperlink r:id="rId261">
+        <w:r>
+          <w:rPr>
+            <w:rStyle w:val="Hyperlink"/>
+          </w:rPr>
+          <w:t xml:space="preserve">“Governo Lula prepara cobrança do IOF sobre investimentos isentos sem passar pelo Congresso”</w:t>
+        </w:r>
+      </w:hyperlink>
     </w:p>
     <w:p>
       <w:pPr>
@@ -32024,9 +32104,14 @@
       <w:pPr>
         <w:pStyle w:val="BodyText"/>
       </w:pPr>
-      <w:r>
-        <w:t xml:space="preserve">“O Leão insaciável: arrecadação é recorde em 2025, mas governo quer mais impostos em 2026”</w:t>
-      </w:r>
+      <w:hyperlink r:id="rId262">
+        <w:r>
+          <w:rPr>
+            <w:rStyle w:val="Hyperlink"/>
+          </w:rPr>
+          <w:t xml:space="preserve">“O Leão insaciável: arrecadação é recorde em 2025, mas governo quer mais impostos em 2026”</w:t>
+        </w:r>
+      </w:hyperlink>
     </w:p>
     <w:p>
       <w:pPr>
@@ -32069,9 +32154,14 @@
       <w:pPr>
         <w:pStyle w:val="BodyText"/>
       </w:pPr>
-      <w:r>
-        <w:t xml:space="preserve">“Golpes via Pix podem custar R$ 11 bi a brasileiros até 2028”</w:t>
-      </w:r>
+      <w:hyperlink r:id="rId263">
+        <w:r>
+          <w:rPr>
+            <w:rStyle w:val="Hyperlink"/>
+          </w:rPr>
+          <w:t xml:space="preserve">“Golpes via Pix podem custar R$ 11 bi a brasileiros até 2028”</w:t>
+        </w:r>
+      </w:hyperlink>
     </w:p>
     <w:p>
       <w:pPr>
@@ -32099,7 +32189,7 @@
         <w:t xml:space="preserve">· link consultado em 28/10/2026</w:t>
       </w:r>
     </w:p>
-    <w:bookmarkEnd w:id="246"/>
+    <w:bookmarkEnd w:id="264"/>
     <w:p>
       <w:r>
         <w:pict>
@@ -32107,7 +32197,7 @@
         </w:pict>
       </w:r>
     </w:p>
-    <w:bookmarkStart w:id="247" w:name="o-que-vem-por-aí-cont.-1"/>
+    <w:bookmarkStart w:id="266" w:name="o-que-vem-por-aí-cont.-1"/>
     <w:p>
       <w:pPr>
         <w:pStyle w:val="Heading2"/>
@@ -32131,9 +32221,14 @@
       <w:pPr>
         <w:pStyle w:val="BodyText"/>
       </w:pPr>
-      <w:r>
-        <w:t xml:space="preserve">“BC exige retenção de até 24 horas em envios de cripto ao exterior a partir de 2027”</w:t>
-      </w:r>
+      <w:hyperlink r:id="rId265">
+        <w:r>
+          <w:rPr>
+            <w:rStyle w:val="Hyperlink"/>
+          </w:rPr>
+          <w:t xml:space="preserve">“BC exige retenção de até 24 horas em envios de cripto ao exterior a partir de 2027”</w:t>
+        </w:r>
+      </w:hyperlink>
     </w:p>
     <w:p>
       <w:pPr>
@@ -32161,7 +32256,7 @@
         <w:t xml:space="preserve">· link consultado em 28/10/2026</w:t>
       </w:r>
     </w:p>
-    <w:bookmarkEnd w:id="247"/>
+    <w:bookmarkEnd w:id="266"/>
     <w:p>
       <w:r>
         <w:pict>
@@ -32177,7 +32272,7 @@
         <w:t xml:space="preserve">Para o WhatsApp</w:t>
       </w:r>
     </w:p>
-    <w:bookmarkStart w:id="248" w:name="mais-4-anos-em-6-números"/>
+    <w:bookmarkStart w:id="267" w:name="mais-4-anos-em-6-números"/>
     <w:p>
       <w:pPr>
         <w:pStyle w:val="Heading1"/>
@@ -32278,7 +32373,7 @@
         <w:t xml:space="preserve">[LINK DO CURSO]</w:t>
       </w:r>
     </w:p>
-    <w:bookmarkEnd w:id="248"/>
+    <w:bookmarkEnd w:id="267"/>
     <w:p>
       <w:r>
         <w:pict>
@@ -32294,7 +32389,7 @@
         <w:t xml:space="preserve">Anexo</w:t>
       </w:r>
     </w:p>
-    <w:bookmarkStart w:id="249" w:name="fontes-de-todos-os-números"/>
+    <w:bookmarkStart w:id="268" w:name="fontes-de-todos-os-números"/>
     <w:p>
       <w:pPr>
         <w:pStyle w:val="Heading2"/>
@@ -32539,7 +32634,7 @@
         <w:t xml:space="preserve">Agência Brasil e Poder360 (19/10/2025); MercoPress (10/11/2025); France 24 via Acento (08/11/2025); usdthoy.com (flutuação desde 29/06/2026).</w:t>
       </w:r>
     </w:p>
-    <w:bookmarkEnd w:id="249"/>
+    <w:bookmarkEnd w:id="268"/>
     <w:p>
       <w:r>
         <w:pict>

</xml_diff>

<commit_message>
Parte 8: O mesmo método para outros países
10 páginas: comparativo dos 6 destinos e fichas de Paraguai, Argentina,
Uruguai, Portugal e EUA (moeda, residência, governo, prós e contras).

Co-Authored-By: Claude Opus 5.5 <noreply@anthropic.com>
Claude-Session: https://claude.ai/code/session_01GJhkYfDrHd3AkmDKDTo71F
</commit_message>
<xml_diff>
--- a/curso/dist/LULA-GANHOU-Curso-Completo.docx
+++ b/curso/dist/LULA-GANHOU-Curso-Completo.docx
@@ -2188,10 +2188,100 @@
         <w:pStyle w:val="Compact"/>
       </w:pPr>
       <w:r>
+        <w:t xml:space="preserve">Parte 8 · O mesmo método para outros países</w:t>
+      </w:r>
+      <w:r>
+        <w:t xml:space="preserve">194</w:t>
+      </w:r>
+    </w:p>
+    <w:p>
+      <w:pPr>
+        <w:numPr>
+          <w:ilvl w:val="0"/>
+          <w:numId w:val="1006"/>
+        </w:numPr>
+        <w:pStyle w:val="Compact"/>
+      </w:pPr>
+      <w:r>
+        <w:t xml:space="preserve">8.1 Paraguai</w:t>
+      </w:r>
+      <w:r>
+        <w:t xml:space="preserve">196</w:t>
+      </w:r>
+    </w:p>
+    <w:p>
+      <w:pPr>
+        <w:numPr>
+          <w:ilvl w:val="0"/>
+          <w:numId w:val="1006"/>
+        </w:numPr>
+        <w:pStyle w:val="Compact"/>
+      </w:pPr>
+      <w:r>
+        <w:t xml:space="preserve">8.2 Argentina</w:t>
+      </w:r>
+      <w:r>
+        <w:t xml:space="preserve">198</w:t>
+      </w:r>
+    </w:p>
+    <w:p>
+      <w:pPr>
+        <w:numPr>
+          <w:ilvl w:val="0"/>
+          <w:numId w:val="1006"/>
+        </w:numPr>
+        <w:pStyle w:val="Compact"/>
+      </w:pPr>
+      <w:r>
+        <w:t xml:space="preserve">8.3 Uruguai</w:t>
+      </w:r>
+      <w:r>
+        <w:t xml:space="preserve">200</w:t>
+      </w:r>
+    </w:p>
+    <w:p>
+      <w:pPr>
+        <w:numPr>
+          <w:ilvl w:val="0"/>
+          <w:numId w:val="1006"/>
+        </w:numPr>
+        <w:pStyle w:val="Compact"/>
+      </w:pPr>
+      <w:r>
+        <w:t xml:space="preserve">8.4 Portugal</w:t>
+      </w:r>
+      <w:r>
+        <w:t xml:space="preserve">201</w:t>
+      </w:r>
+    </w:p>
+    <w:p>
+      <w:pPr>
+        <w:numPr>
+          <w:ilvl w:val="0"/>
+          <w:numId w:val="1006"/>
+        </w:numPr>
+        <w:pStyle w:val="Compact"/>
+      </w:pPr>
+      <w:r>
+        <w:t xml:space="preserve">8.5 Estados Unidos</w:t>
+      </w:r>
+      <w:r>
+        <w:t xml:space="preserve">202</w:t>
+      </w:r>
+    </w:p>
+    <w:p>
+      <w:pPr>
+        <w:numPr>
+          <w:ilvl w:val="0"/>
+          <w:numId w:val="1006"/>
+        </w:numPr>
+        <w:pStyle w:val="Compact"/>
+      </w:pPr>
+      <w:r>
         <w:t xml:space="preserve">Bônus B7 · Dossiê: mais 4 anos em manchetes</w:t>
       </w:r>
       <w:r>
-        <w:t xml:space="preserve">194</w:t>
+        <w:t xml:space="preserve">204</w:t>
       </w:r>
     </w:p>
     <w:p>
@@ -2206,7 +2296,7 @@
         <w:t xml:space="preserve">B7 · Versão de 1 página para WhatsApp</w:t>
       </w:r>
       <w:r>
-        <w:t xml:space="preserve">203</w:t>
+        <w:t xml:space="preserve">213</w:t>
       </w:r>
     </w:p>
     <w:p>
@@ -2221,7 +2311,7 @@
         <w:t xml:space="preserve">Anexo · Fontes de todos os números</w:t>
       </w:r>
       <w:r>
-        <w:t xml:space="preserve">204</w:t>
+        <w:t xml:space="preserve">214</w:t>
       </w:r>
     </w:p>
     <w:p>
@@ -38395,7 +38485,7 @@
         <w:pStyle w:val="FirstParagraph"/>
       </w:pPr>
       <w:r>
-        <w:t xml:space="preserve">B7</w:t>
+        <w:t xml:space="preserve">08</w:t>
       </w:r>
     </w:p>
     <w:p>
@@ -38403,7 +38493,7 @@
         <w:pStyle w:val="BodyText"/>
       </w:pPr>
       <w:r>
-        <w:t xml:space="preserve">Dossiê: mais 4 anos em manchetes</w:t>
+        <w:t xml:space="preserve">Outros países</w:t>
       </w:r>
     </w:p>
     <w:p>
@@ -38411,7 +38501,7 @@
         <w:pStyle w:val="BodyText"/>
       </w:pPr>
       <w:r>
-        <w:t xml:space="preserve">Links para mandar ao seu conhecido de esquerda. Não é opinião: é manchete, com veículo e QR code para ele mesmo conferir.</w:t>
+        <w:t xml:space="preserve">Bolívia não é a única saída. Paraguai, Argentina, Uruguai, Portugal e EUA: quem é de direita, quem abre a porta e quanto custa.</w:t>
       </w:r>
     </w:p>
     <w:p>
@@ -38426,145 +38516,438 @@
         <w:pStyle w:val="FirstParagraph"/>
       </w:pPr>
       <w:r>
-        <w:t xml:space="preserve">Como usar o dossiê</w:t>
-      </w:r>
-    </w:p>
-    <w:bookmarkStart w:id="285" w:name="não-discuta.-mande-o-link."/>
+        <w:t xml:space="preserve">Comparativo</w:t>
+      </w:r>
+    </w:p>
+    <w:bookmarkStart w:id="283" w:name="os-6-destinos-lado-a-lado"/>
     <w:p>
       <w:pPr>
         <w:pStyle w:val="Heading1"/>
       </w:pPr>
       <w:r>
-        <w:t xml:space="preserve">Não discuta. Mande o link.</w:t>
-      </w:r>
-    </w:p>
-    <w:p>
-      <w:pPr>
-        <w:pStyle w:val="FirstParagraph"/>
-      </w:pPr>
-      <w:r>
-        <w:t xml:space="preserve">Discussão de grupo de família não convence ninguém.</w:t>
-      </w:r>
-      <w:r>
-        <w:t xml:space="preserve"> </w:t>
-      </w:r>
-      <w:r>
-        <w:rPr>
-          <w:bCs/>
-          <w:b/>
-        </w:rPr>
-        <w:t xml:space="preserve">Manchete com data e veículo</w:t>
-      </w:r>
-      <w:r>
-        <w:t xml:space="preserve"> </w:t>
-      </w:r>
-      <w:r>
-        <w:t xml:space="preserve">convence mais. Este dossiê é para isso.</w:t>
-      </w:r>
-    </w:p>
-    <w:p>
-      <w:pPr>
-        <w:numPr>
-          <w:ilvl w:val="0"/>
-          <w:numId w:val="1101"/>
-        </w:numPr>
-        <w:pStyle w:val="Compact"/>
-      </w:pPr>
-      <w:r>
-        <w:t xml:space="preserve">Escolha 1 ou 2 manchetes sobre o assunto da conversa</w:t>
-      </w:r>
-    </w:p>
-    <w:p>
-      <w:pPr>
-        <w:numPr>
-          <w:ilvl w:val="0"/>
-          <w:numId w:val="1101"/>
-        </w:numPr>
-        <w:pStyle w:val="Compact"/>
-      </w:pPr>
-      <w:r>
-        <w:t xml:space="preserve">Aponte a câmera do celular para o QR code e copie o link</w:t>
-      </w:r>
-    </w:p>
-    <w:p>
-      <w:pPr>
-        <w:numPr>
-          <w:ilvl w:val="0"/>
-          <w:numId w:val="1101"/>
-        </w:numPr>
-        <w:pStyle w:val="Compact"/>
-      </w:pPr>
-      <w:r>
-        <w:t xml:space="preserve">Mande o link, sem textão. Deixe a notícia falar</w:t>
-      </w:r>
-    </w:p>
-    <w:p>
-      <w:pPr>
-        <w:numPr>
-          <w:ilvl w:val="0"/>
-          <w:numId w:val="1101"/>
-        </w:numPr>
-        <w:pStyle w:val="Compact"/>
-      </w:pPr>
-      <w:r>
-        <w:t xml:space="preserve">Se ele disser “site de direita”, mande o dado oficial que está na mesma linha (Banco Central, Senado, Receita)</w:t>
-      </w:r>
-    </w:p>
-    <w:bookmarkStart w:id="283" w:name="já-aconteceu"/>
-    <w:p>
-      <w:pPr>
-        <w:pStyle w:val="Heading3"/>
-      </w:pPr>
-      <w:r>
-        <w:t xml:space="preserve">Já aconteceu</w:t>
-      </w:r>
-    </w:p>
-    <w:p>
-      <w:pPr>
-        <w:pStyle w:val="FirstParagraph"/>
-      </w:pPr>
-      <w:r>
-        <w:t xml:space="preserve">Fatos publicados: impostos, IOF, dívida, juros, déficit, golpes.</w:t>
+        <w:t xml:space="preserve">Os 6 destinos lado a lado</w:t>
+      </w:r>
+    </w:p>
+    <w:tbl>
+      <w:tblPr>
+        <w:tblStyle w:val="Table"/>
+        <w:tblW w:type="auto" w:w="0"/>
+        <w:tblLook w:firstRow="0" w:lastRow="0" w:firstColumn="0" w:lastColumn="0" w:noHBand="0" w:noVBand="0" w:val="0000"/>
+        <w:jc w:val="start"/>
+      </w:tblPr>
+      <w:tblGrid>
+        <w:gridCol w:w="1980"/>
+        <w:gridCol w:w="1980"/>
+        <w:gridCol w:w="1980"/>
+        <w:gridCol w:w="1980"/>
+      </w:tblGrid>
+      <w:tr>
+        <w:tc>
+          <w:tcPr/>
+          <w:p>
+            <w:pPr>
+              <w:pStyle w:val="Compact"/>
+              <w:jc w:val="left"/>
+            </w:pPr>
+            <w:r>
+              <w:t xml:space="preserve">País</w:t>
+            </w:r>
+          </w:p>
+        </w:tc>
+        <w:tc>
+          <w:tcPr/>
+          <w:p>
+            <w:pPr>
+              <w:pStyle w:val="Compact"/>
+              <w:jc w:val="left"/>
+            </w:pPr>
+            <w:r>
+              <w:t xml:space="preserve">Governo</w:t>
+            </w:r>
+          </w:p>
+        </w:tc>
+        <w:tc>
+          <w:tcPr/>
+          <w:p>
+            <w:pPr>
+              <w:pStyle w:val="Compact"/>
+              <w:jc w:val="left"/>
+            </w:pPr>
+            <w:r>
+              <w:t xml:space="preserve">Entrada/residência</w:t>
+            </w:r>
+          </w:p>
+        </w:tc>
+        <w:tc>
+          <w:tcPr/>
+          <w:p>
+            <w:pPr>
+              <w:pStyle w:val="Compact"/>
+              <w:jc w:val="left"/>
+            </w:pPr>
+            <w:r>
+              <w:t xml:space="preserve">Custo para quem leva real</w:t>
+            </w:r>
+          </w:p>
+        </w:tc>
+      </w:tr>
+      <w:tr>
+        <w:tc>
+          <w:tcPr/>
+          <w:p>
+            <w:pPr>
+              <w:pStyle w:val="Compact"/>
+              <w:jc w:val="left"/>
+            </w:pPr>
+            <w:r>
+              <w:rPr>
+                <w:bCs/>
+                <w:b/>
+              </w:rPr>
+              <w:t xml:space="preserve">Bolívia</w:t>
+            </w:r>
+          </w:p>
+        </w:tc>
+        <w:tc>
+          <w:tcPr/>
+          <w:p>
+            <w:pPr>
+              <w:pStyle w:val="Compact"/>
+              <w:jc w:val="left"/>
+            </w:pPr>
+            <w:r>
+              <w:t xml:space="preserve">Centro-direita (Paz)</w:t>
+            </w:r>
+          </w:p>
+        </w:tc>
+        <w:tc>
+          <w:tcPr/>
+          <w:p>
+            <w:pPr>
+              <w:pStyle w:val="Compact"/>
+              <w:jc w:val="left"/>
+            </w:pPr>
+            <w:r>
+              <w:t xml:space="preserve">Mercosul, sem visto</w:t>
+            </w:r>
+          </w:p>
+        </w:tc>
+        <w:tc>
+          <w:tcPr/>
+          <w:p>
+            <w:pPr>
+              <w:pStyle w:val="Compact"/>
+              <w:jc w:val="left"/>
+            </w:pPr>
+            <w:r>
+              <w:t xml:space="preserve">Baixo: real vale mais</w:t>
+            </w:r>
+          </w:p>
+        </w:tc>
+      </w:tr>
+      <w:tr>
+        <w:tc>
+          <w:tcPr/>
+          <w:p>
+            <w:pPr>
+              <w:pStyle w:val="Compact"/>
+              <w:jc w:val="left"/>
+            </w:pPr>
+            <w:r>
+              <w:rPr>
+                <w:bCs/>
+                <w:b/>
+              </w:rPr>
+              <w:t xml:space="preserve">Paraguai</w:t>
+            </w:r>
+          </w:p>
+        </w:tc>
+        <w:tc>
+          <w:tcPr/>
+          <w:p>
+            <w:pPr>
+              <w:pStyle w:val="Compact"/>
+              <w:jc w:val="left"/>
+            </w:pPr>
+            <w:r>
+              <w:t xml:space="preserve">Direita (Peña, Colorado)</w:t>
+            </w:r>
+          </w:p>
+        </w:tc>
+        <w:tc>
+          <w:tcPr/>
+          <w:p>
+            <w:pPr>
+              <w:pStyle w:val="Compact"/>
+              <w:jc w:val="left"/>
+            </w:pPr>
+            <w:r>
+              <w:t xml:space="preserve">Mercosul, sem visto</w:t>
+            </w:r>
+          </w:p>
+        </w:tc>
+        <w:tc>
+          <w:tcPr/>
+          <w:p>
+            <w:pPr>
+              <w:pStyle w:val="Compact"/>
+              <w:jc w:val="left"/>
+            </w:pPr>
+            <w:r>
+              <w:t xml:space="preserve">A conferir por cidade</w:t>
+            </w:r>
+          </w:p>
+        </w:tc>
+      </w:tr>
+      <w:tr>
+        <w:tc>
+          <w:tcPr/>
+          <w:p>
+            <w:pPr>
+              <w:pStyle w:val="Compact"/>
+              <w:jc w:val="left"/>
+            </w:pPr>
+            <w:r>
+              <w:rPr>
+                <w:bCs/>
+                <w:b/>
+              </w:rPr>
+              <w:t xml:space="preserve">Argentina</w:t>
+            </w:r>
+          </w:p>
+        </w:tc>
+        <w:tc>
+          <w:tcPr/>
+          <w:p>
+            <w:pPr>
+              <w:pStyle w:val="Compact"/>
+              <w:jc w:val="left"/>
+            </w:pPr>
+            <w:r>
+              <w:t xml:space="preserve">Direita liberal (Milei)</w:t>
+            </w:r>
+          </w:p>
+        </w:tc>
+        <w:tc>
+          <w:tcPr/>
+          <w:p>
+            <w:pPr>
+              <w:pStyle w:val="Compact"/>
+              <w:jc w:val="left"/>
+            </w:pPr>
+            <w:r>
+              <w:t xml:space="preserve">Mercosul, sem visto</w:t>
+            </w:r>
+          </w:p>
+        </w:tc>
+        <w:tc>
+          <w:tcPr/>
+          <w:p>
+            <w:pPr>
+              <w:pStyle w:val="Compact"/>
+              <w:jc w:val="left"/>
+            </w:pPr>
+            <w:r>
+              <w:t xml:space="preserve">Inflação ainda alta</w:t>
+            </w:r>
+          </w:p>
+        </w:tc>
+      </w:tr>
+      <w:tr>
+        <w:tc>
+          <w:tcPr/>
+          <w:p>
+            <w:pPr>
+              <w:pStyle w:val="Compact"/>
+              <w:jc w:val="left"/>
+            </w:pPr>
+            <w:r>
+              <w:rPr>
+                <w:bCs/>
+                <w:b/>
+              </w:rPr>
+              <w:t xml:space="preserve">Uruguai</w:t>
+            </w:r>
+          </w:p>
+        </w:tc>
+        <w:tc>
+          <w:tcPr/>
+          <w:p>
+            <w:pPr>
+              <w:pStyle w:val="Compact"/>
+              <w:jc w:val="left"/>
+            </w:pPr>
+            <w:r>
+              <w:t xml:space="preserve">Esquerda (Orsi, Frente Ampla)</w:t>
+            </w:r>
+          </w:p>
+        </w:tc>
+        <w:tc>
+          <w:tcPr/>
+          <w:p>
+            <w:pPr>
+              <w:pStyle w:val="Compact"/>
+              <w:jc w:val="left"/>
+            </w:pPr>
+            <w:r>
+              <w:t xml:space="preserve">Mercosul, sem visto</w:t>
+            </w:r>
+          </w:p>
+        </w:tc>
+        <w:tc>
+          <w:tcPr/>
+          <w:p>
+            <w:pPr>
+              <w:pStyle w:val="Compact"/>
+              <w:jc w:val="left"/>
+            </w:pPr>
+            <w:r>
+              <w:t xml:space="preserve">Alto: mais caro da região</w:t>
+            </w:r>
+          </w:p>
+        </w:tc>
+      </w:tr>
+      <w:tr>
+        <w:tc>
+          <w:tcPr/>
+          <w:p>
+            <w:pPr>
+              <w:pStyle w:val="Compact"/>
+              <w:jc w:val="left"/>
+            </w:pPr>
+            <w:r>
+              <w:rPr>
+                <w:bCs/>
+                <w:b/>
+              </w:rPr>
+              <w:t xml:space="preserve">Portugal</w:t>
+            </w:r>
+          </w:p>
+        </w:tc>
+        <w:tc>
+          <w:tcPr/>
+          <w:p>
+            <w:pPr>
+              <w:pStyle w:val="Compact"/>
+              <w:jc w:val="left"/>
+            </w:pPr>
+            <w:r>
+              <w:t xml:space="preserve">—</w:t>
+            </w:r>
+          </w:p>
+        </w:tc>
+        <w:tc>
+          <w:tcPr/>
+          <w:p>
+            <w:pPr>
+              <w:pStyle w:val="Compact"/>
+              <w:jc w:val="left"/>
+            </w:pPr>
+            <w:r>
+              <w:t xml:space="preserve">Visto D7 (renda)</w:t>
+            </w:r>
+          </w:p>
+        </w:tc>
+        <w:tc>
+          <w:tcPr/>
+          <w:p>
+            <w:pPr>
+              <w:pStyle w:val="Compact"/>
+              <w:jc w:val="left"/>
+            </w:pPr>
+            <w:r>
+              <w:t xml:space="preserve">Alto: euro</w:t>
+            </w:r>
+          </w:p>
+        </w:tc>
+      </w:tr>
+      <w:tr>
+        <w:tc>
+          <w:tcPr/>
+          <w:p>
+            <w:pPr>
+              <w:pStyle w:val="Compact"/>
+              <w:jc w:val="left"/>
+            </w:pPr>
+            <w:r>
+              <w:rPr>
+                <w:bCs/>
+                <w:b/>
+              </w:rPr>
+              <w:t xml:space="preserve">EUA</w:t>
+            </w:r>
+          </w:p>
+        </w:tc>
+        <w:tc>
+          <w:tcPr/>
+          <w:p>
+            <w:pPr>
+              <w:pStyle w:val="Compact"/>
+              <w:jc w:val="left"/>
+            </w:pPr>
+            <w:r>
+              <w:t xml:space="preserve">Direita (Trump)</w:t>
+            </w:r>
+          </w:p>
+        </w:tc>
+        <w:tc>
+          <w:tcPr/>
+          <w:p>
+            <w:pPr>
+              <w:pStyle w:val="Compact"/>
+              <w:jc w:val="left"/>
+            </w:pPr>
+            <w:r>
+              <w:t xml:space="preserve">Vistos de imigrante para brasileiros suspensos</w:t>
+            </w:r>
+          </w:p>
+        </w:tc>
+        <w:tc>
+          <w:tcPr/>
+          <w:p>
+            <w:pPr>
+              <w:pStyle w:val="Compact"/>
+              <w:jc w:val="left"/>
+            </w:pPr>
+            <w:r>
+              <w:t xml:space="preserve">Muito alto: dólar</w:t>
+            </w:r>
+          </w:p>
+        </w:tc>
+      </w:tr>
+    </w:tbl>
+    <w:p>
+      <w:pPr>
+        <w:pStyle w:val="BodyText"/>
+      </w:pPr>
+      <w:r>
+        <w:rPr>
+          <w:bCs/>
+          <w:b/>
+        </w:rPr>
+        <w:t xml:space="preserve">Veredito:</w:t>
+      </w:r>
+      <w:r>
+        <w:t xml:space="preserve"> </w:t>
+      </w:r>
+      <w:r>
+        <w:t xml:space="preserve">para quem quer</w:t>
+      </w:r>
+      <w:r>
+        <w:t xml:space="preserve"> </w:t>
+      </w:r>
+      <w:r>
+        <w:rPr>
+          <w:bCs/>
+          <w:b/>
+        </w:rPr>
+        <w:t xml:space="preserve">governo de direita + dinheiro rendendo mais + entrada fácil</w:t>
+      </w:r>
+      <w:r>
+        <w:t xml:space="preserve">, Bolívia e Paraguai lideram.</w:t>
       </w:r>
     </w:p>
     <w:bookmarkEnd w:id="283"/>
-    <w:bookmarkStart w:id="284" w:name="o-que-vem-por-aí"/>
-    <w:p>
-      <w:pPr>
-        <w:pStyle w:val="Heading3"/>
-      </w:pPr>
-      <w:r>
-        <w:t xml:space="preserve">O que vem por aí</w:t>
-      </w:r>
-    </w:p>
-    <w:p>
-      <w:pPr>
-        <w:pStyle w:val="FirstParagraph"/>
-      </w:pPr>
-      <w:r>
-        <w:t xml:space="preserve">Projeções de instituições e propostas do governo, marcadas como projeção.</w:t>
-      </w:r>
-    </w:p>
-    <w:bookmarkEnd w:id="284"/>
-    <w:p>
-      <w:pPr>
-        <w:pStyle w:val="BodyText"/>
-      </w:pPr>
-      <w:r>
-        <w:rPr>
-          <w:bCs/>
-          <w:b/>
-        </w:rPr>
-        <w:t xml:space="preserve">Links mudam.</w:t>
-      </w:r>
-      <w:r>
-        <w:t xml:space="preserve"> </w:t>
-      </w:r>
-      <w:r>
-        <w:t xml:space="preserve">Todos foram consultados em 28/10/2026. Se algum sair do ar, busque o título entre aspas.</w:t>
-      </w:r>
-    </w:p>
-    <w:bookmarkEnd w:id="285"/>
     <w:p>
       <w:r>
         <w:pict>
@@ -38577,10 +38960,1588 @@
         <w:pStyle w:val="FirstParagraph"/>
       </w:pPr>
       <w:r>
+        <w:t xml:space="preserve">Paraguai</w:t>
+      </w:r>
+    </w:p>
+    <w:bookmarkStart w:id="284" w:name="os-brasileiros-estão-correndo-para-lá"/>
+    <w:p>
+      <w:pPr>
+        <w:pStyle w:val="Heading1"/>
+      </w:pPr>
+      <w:r>
+        <w:t xml:space="preserve">Os brasileiros estão correndo para lá</w:t>
+      </w:r>
+    </w:p>
+    <w:p>
+      <w:pPr>
+        <w:pStyle w:val="FirstParagraph"/>
+      </w:pPr>
+      <w:r>
+        <w:t xml:space="preserve">22.628</w:t>
+      </w:r>
+      <w:r>
+        <w:t xml:space="preserve">brasileiros com residência no 1º semestre de 2026</w:t>
+      </w:r>
+    </w:p>
+    <w:p>
+      <w:pPr>
+        <w:pStyle w:val="BodyText"/>
+      </w:pPr>
+      <w:r>
+        <w:t xml:space="preserve">2×</w:t>
+      </w:r>
+      <w:r>
+        <w:t xml:space="preserve">o mesmo período de 2025 (11.723)</w:t>
+      </w:r>
+    </w:p>
+    <w:p>
+      <w:pPr>
+        <w:pStyle w:val="BodyText"/>
+      </w:pPr>
+      <w:r>
+        <w:t xml:space="preserve">Peña</w:t>
+      </w:r>
+      <w:r>
+        <w:t xml:space="preserve">Partido Colorado, desde 15/08/2023</w:t>
+      </w:r>
+    </w:p>
+    <w:tbl>
+      <w:tblPr>
+        <w:tblStyle w:val="Table"/>
+        <w:tblW w:type="auto" w:w="0"/>
+        <w:tblLook w:firstRow="0" w:lastRow="0" w:firstColumn="0" w:lastColumn="0" w:noHBand="0" w:noVBand="0" w:val="0000"/>
+        <w:jc w:val="start"/>
+      </w:tblPr>
+      <w:tblGrid>
+        <w:gridCol w:w="3960"/>
+        <w:gridCol w:w="3960"/>
+      </w:tblGrid>
+      <w:tr>
+        <w:tc>
+          <w:tcPr/>
+          <w:p>
+            <w:pPr>
+              <w:pStyle w:val="Compact"/>
+              <w:jc w:val="left"/>
+            </w:pPr>
+            <w:r>
+              <w:t xml:space="preserve">Ficha</w:t>
+            </w:r>
+          </w:p>
+        </w:tc>
+        <w:tc>
+          <w:tcPr/>
+          <w:p>
+            <w:pPr>
+              <w:pStyle w:val="Compact"/>
+              <w:jc w:val="left"/>
+            </w:pPr>
+            <w:r>
+              <w:t xml:space="preserve">Paraguai</w:t>
+            </w:r>
+          </w:p>
+        </w:tc>
+      </w:tr>
+      <w:tr>
+        <w:tc>
+          <w:tcPr/>
+          <w:p>
+            <w:pPr>
+              <w:pStyle w:val="Compact"/>
+              <w:jc w:val="left"/>
+            </w:pPr>
+            <w:r>
+              <w:t xml:space="preserve">Moeda</w:t>
+            </w:r>
+          </w:p>
+        </w:tc>
+        <w:tc>
+          <w:tcPr/>
+          <w:p>
+            <w:pPr>
+              <w:pStyle w:val="Compact"/>
+              <w:jc w:val="left"/>
+            </w:pPr>
+            <w:r>
+              <w:t xml:space="preserve">Guarani (PYG)</w:t>
+            </w:r>
+          </w:p>
+        </w:tc>
+      </w:tr>
+      <w:tr>
+        <w:tc>
+          <w:tcPr/>
+          <w:p>
+            <w:pPr>
+              <w:pStyle w:val="Compact"/>
+              <w:jc w:val="left"/>
+            </w:pPr>
+            <w:r>
+              <w:t xml:space="preserve">Residência</w:t>
+            </w:r>
+          </w:p>
+        </w:tc>
+        <w:tc>
+          <w:tcPr/>
+          <w:p>
+            <w:pPr>
+              <w:pStyle w:val="Compact"/>
+              <w:jc w:val="left"/>
+            </w:pPr>
+            <w:r>
+              <w:t xml:space="preserve">Mercosul: temporária de 2 anos e depois permanente. A cédula paraguaia vem com a permanente</w:t>
+            </w:r>
+          </w:p>
+        </w:tc>
+      </w:tr>
+      <w:tr>
+        <w:tc>
+          <w:tcPr/>
+          <w:p>
+            <w:pPr>
+              <w:pStyle w:val="Compact"/>
+              <w:jc w:val="left"/>
+            </w:pPr>
+            <w:r>
+              <w:t xml:space="preserve">Renda citada</w:t>
+            </w:r>
+          </w:p>
+        </w:tc>
+        <w:tc>
+          <w:tcPr/>
+          <w:p>
+            <w:pPr>
+              <w:pStyle w:val="Compact"/>
+              <w:jc w:val="left"/>
+            </w:pPr>
+            <w:r>
+              <w:t xml:space="preserve">Cerca de US$ 500/mês (guia de consultoria)</w:t>
+            </w:r>
+          </w:p>
+        </w:tc>
+      </w:tr>
+      <w:tr>
+        <w:tc>
+          <w:tcPr/>
+          <w:p>
+            <w:pPr>
+              <w:pStyle w:val="Compact"/>
+              <w:jc w:val="left"/>
+            </w:pPr>
+            <w:r>
+              <w:t xml:space="preserve">Imóveis</w:t>
+            </w:r>
+          </w:p>
+        </w:tc>
+        <w:tc>
+          <w:tcPr/>
+          <w:p>
+            <w:pPr>
+              <w:pStyle w:val="Compact"/>
+              <w:jc w:val="left"/>
+            </w:pPr>
+            <w:r>
+              <w:t xml:space="preserve">Brasileiros entrando no mercado de Assunção, inclusive em condomínios</w:t>
+            </w:r>
+          </w:p>
+        </w:tc>
+      </w:tr>
+    </w:tbl>
+    <w:bookmarkEnd w:id="284"/>
+    <w:p>
+      <w:r>
+        <w:pict>
+          <v:rect style="width:0;height:1.5pt" o:hralign="center" o:hrstd="t" o:hr="t"/>
+        </w:pict>
+      </w:r>
+    </w:p>
+    <w:bookmarkStart w:id="285" w:name="e-o-usdt-no-paraguai"/>
+    <w:p>
+      <w:pPr>
+        <w:pStyle w:val="Heading2"/>
+      </w:pPr>
+      <w:r>
+        <w:t xml:space="preserve">E o USDT no Paraguai?</w:t>
+      </w:r>
+    </w:p>
+    <w:p>
+      <w:pPr>
+        <w:numPr>
+          <w:ilvl w:val="0"/>
+          <w:numId w:val="1101"/>
+        </w:numPr>
+        <w:pStyle w:val="Compact"/>
+      </w:pPr>
+      <w:r>
+        <w:t xml:space="preserve">Plataformas P2P negociam USDT com guaranis por transferência em bancos locais</w:t>
+      </w:r>
+    </w:p>
+    <w:p>
+      <w:pPr>
+        <w:numPr>
+          <w:ilvl w:val="0"/>
+          <w:numId w:val="1101"/>
+        </w:numPr>
+        <w:pStyle w:val="Compact"/>
+      </w:pPr>
+      <w:r>
+        <w:t xml:space="preserve">O Banco Central do Paraguai diz que</w:t>
+      </w:r>
+      <w:r>
+        <w:t xml:space="preserve"> </w:t>
+      </w:r>
+      <w:r>
+        <w:rPr>
+          <w:bCs/>
+          <w:b/>
+        </w:rPr>
+        <w:t xml:space="preserve">não há regulação específica</w:t>
+      </w:r>
+      <w:r>
+        <w:t xml:space="preserve"> </w:t>
+      </w:r>
+      <w:r>
+        <w:t xml:space="preserve">e que cripto</w:t>
+      </w:r>
+      <w:r>
+        <w:t xml:space="preserve"> </w:t>
+      </w:r>
+      <w:r>
+        <w:rPr>
+          <w:bCs/>
+          <w:b/>
+        </w:rPr>
+        <w:t xml:space="preserve">não é moeda legal</w:t>
+      </w:r>
+    </w:p>
+    <w:p>
+      <w:pPr>
+        <w:numPr>
+          <w:ilvl w:val="0"/>
+          <w:numId w:val="1101"/>
+        </w:numPr>
+        <w:pStyle w:val="Compact"/>
+      </w:pPr>
+      <w:r>
+        <w:t xml:space="preserve">Há relato de norma da Receita paraguaia (DNIT) de mar/2026 exigindo que plataformas informem operações. Confirme antes de operar</w:t>
+      </w:r>
+    </w:p>
+    <w:p>
+      <w:pPr>
+        <w:pStyle w:val="FirstParagraph"/>
+      </w:pPr>
+      <w:r>
+        <w:rPr>
+          <w:bCs/>
+          <w:b/>
+        </w:rPr>
+        <w:t xml:space="preserve">O método é o mesmo:</w:t>
+      </w:r>
+      <w:r>
+        <w:t xml:space="preserve"> </w:t>
+      </w:r>
+      <w:r>
+        <w:t xml:space="preserve">compra no Brasil, envio na rede certa, venda no P2P em moeda local. Só muda a moeda de chegada.</w:t>
+      </w:r>
+    </w:p>
+    <w:p>
+      <w:pPr>
+        <w:pStyle w:val="BodyText"/>
+      </w:pPr>
+      <w:r>
+        <w:rPr>
+          <w:bCs/>
+          <w:b/>
+        </w:rPr>
+        <w:t xml:space="preserve">Falta no curso:</w:t>
+      </w:r>
+      <w:r>
+        <w:t xml:space="preserve"> </w:t>
+      </w:r>
+      <w:r>
+        <w:t xml:space="preserve">custo de vida e aluguel do Paraguai com fonte confiável. Pesquise antes de decidir.</w:t>
+      </w:r>
+    </w:p>
+    <w:p>
+      <w:pPr>
+        <w:pStyle w:val="BodyText"/>
+      </w:pPr>
+      <w:r>
+        <w:t xml:space="preserve">Vizinho, Mercosul e governo de direita: o Paraguai é o plano B do plano B.</w:t>
+      </w:r>
+    </w:p>
+    <w:bookmarkEnd w:id="285"/>
+    <w:p>
+      <w:r>
+        <w:pict>
+          <v:rect style="width:0;height:1.5pt" o:hralign="center" o:hrstd="t" o:hr="t"/>
+        </w:pict>
+      </w:r>
+    </w:p>
+    <w:p>
+      <w:pPr>
+        <w:pStyle w:val="FirstParagraph"/>
+      </w:pPr>
+      <w:r>
+        <w:t xml:space="preserve">Argentina</w:t>
+      </w:r>
+    </w:p>
+    <w:bookmarkStart w:id="286" w:name="o-laboratório-do-milei"/>
+    <w:p>
+      <w:pPr>
+        <w:pStyle w:val="Heading1"/>
+      </w:pPr>
+      <w:r>
+        <w:t xml:space="preserve">O laboratório do Milei</w:t>
+      </w:r>
+    </w:p>
+    <w:p>
+      <w:pPr>
+        <w:pStyle w:val="FirstParagraph"/>
+      </w:pPr>
+      <w:r>
+        <w:t xml:space="preserve">211,4%</w:t>
+      </w:r>
+      <w:r>
+        <w:t xml:space="preserve">inflação de 2023, último ano kirchnerista</w:t>
+      </w:r>
+    </w:p>
+    <w:p>
+      <w:pPr>
+        <w:pStyle w:val="BodyText"/>
+      </w:pPr>
+      <w:r>
+        <w:t xml:space="preserve">31,5%</w:t>
+      </w:r>
+      <w:r>
+        <w:t xml:space="preserve">inflação de 2025</w:t>
+      </w:r>
+    </w:p>
+    <w:p>
+      <w:pPr>
+        <w:pStyle w:val="BodyText"/>
+      </w:pPr>
+      <w:r>
+        <w:t xml:space="preserve">~1,7–1,9%</w:t>
+      </w:r>
+      <w:r>
+        <w:t xml:space="preserve">inflação mensal esperada em set–out/2026</w:t>
+      </w:r>
+    </w:p>
+    <w:tbl>
+      <w:tblPr>
+        <w:tblStyle w:val="Table"/>
+        <w:tblW w:type="auto" w:w="0"/>
+        <w:tblLook w:firstRow="0" w:lastRow="0" w:firstColumn="0" w:lastColumn="0" w:noHBand="0" w:noVBand="0" w:val="0000"/>
+        <w:jc w:val="start"/>
+      </w:tblPr>
+      <w:tblGrid>
+        <w:gridCol w:w="3960"/>
+        <w:gridCol w:w="3960"/>
+      </w:tblGrid>
+      <w:tr>
+        <w:tc>
+          <w:tcPr/>
+          <w:p>
+            <w:pPr>
+              <w:pStyle w:val="Compact"/>
+              <w:jc w:val="left"/>
+            </w:pPr>
+            <w:r>
+              <w:t xml:space="preserve">Ficha</w:t>
+            </w:r>
+          </w:p>
+        </w:tc>
+        <w:tc>
+          <w:tcPr/>
+          <w:p>
+            <w:pPr>
+              <w:pStyle w:val="Compact"/>
+              <w:jc w:val="left"/>
+            </w:pPr>
+            <w:r>
+              <w:t xml:space="preserve">Argentina</w:t>
+            </w:r>
+          </w:p>
+        </w:tc>
+      </w:tr>
+      <w:tr>
+        <w:tc>
+          <w:tcPr/>
+          <w:p>
+            <w:pPr>
+              <w:pStyle w:val="Compact"/>
+              <w:jc w:val="left"/>
+            </w:pPr>
+            <w:r>
+              <w:t xml:space="preserve">Moeda</w:t>
+            </w:r>
+          </w:p>
+        </w:tc>
+        <w:tc>
+          <w:tcPr/>
+          <w:p>
+            <w:pPr>
+              <w:pStyle w:val="Compact"/>
+              <w:jc w:val="left"/>
+            </w:pPr>
+            <w:r>
+              <w:t xml:space="preserve">Peso argentino. Dólar oficial ~ARS 1.545 (01/10/2026)</w:t>
+            </w:r>
+          </w:p>
+        </w:tc>
+      </w:tr>
+      <w:tr>
+        <w:tc>
+          <w:tcPr/>
+          <w:p>
+            <w:pPr>
+              <w:pStyle w:val="Compact"/>
+              <w:jc w:val="left"/>
+            </w:pPr>
+            <w:r>
+              <w:t xml:space="preserve">Residência</w:t>
+            </w:r>
+          </w:p>
+        </w:tc>
+        <w:tc>
+          <w:tcPr/>
+          <w:p>
+            <w:pPr>
+              <w:pStyle w:val="Compact"/>
+              <w:jc w:val="left"/>
+            </w:pPr>
+            <w:r>
+              <w:t xml:space="preserve">Mercosul: temporária de 2 anos, pedido online pelo sistema RADEX da Migração</w:t>
+            </w:r>
+          </w:p>
+        </w:tc>
+      </w:tr>
+      <w:tr>
+        <w:tc>
+          <w:tcPr/>
+          <w:p>
+            <w:pPr>
+              <w:pStyle w:val="Compact"/>
+              <w:jc w:val="left"/>
+            </w:pPr>
+            <w:r>
+              <w:t xml:space="preserve">Governo</w:t>
+            </w:r>
+          </w:p>
+        </w:tc>
+        <w:tc>
+          <w:tcPr/>
+          <w:p>
+            <w:pPr>
+              <w:pStyle w:val="Compact"/>
+              <w:jc w:val="left"/>
+            </w:pPr>
+            <w:r>
+              <w:t xml:space="preserve">Javier Milei, direita liberal, desde 10/12/2023</w:t>
+            </w:r>
+          </w:p>
+        </w:tc>
+      </w:tr>
+    </w:tbl>
+    <w:bookmarkEnd w:id="286"/>
+    <w:p>
+      <w:r>
+        <w:pict>
+          <v:rect style="width:0;height:1.5pt" o:hralign="center" o:hrstd="t" o:hr="t"/>
+        </w:pict>
+      </w:r>
+    </w:p>
+    <w:bookmarkStart w:id="289" w:name="vale-a-pena-ir-para-a-argentina"/>
+    <w:p>
+      <w:pPr>
+        <w:pStyle w:val="Heading2"/>
+      </w:pPr>
+      <w:r>
+        <w:t xml:space="preserve">Vale a pena ir para a Argentina?</w:t>
+      </w:r>
+    </w:p>
+    <w:bookmarkStart w:id="287" w:name="a-favor-1"/>
+    <w:p>
+      <w:pPr>
+        <w:pStyle w:val="Heading3"/>
+      </w:pPr>
+      <w:r>
+        <w:t xml:space="preserve">A favor</w:t>
+      </w:r>
+    </w:p>
+    <w:p>
+      <w:pPr>
+        <w:numPr>
+          <w:ilvl w:val="0"/>
+          <w:numId w:val="1102"/>
+        </w:numPr>
+        <w:pStyle w:val="Compact"/>
+      </w:pPr>
+      <w:r>
+        <w:t xml:space="preserve">Governo de direita liberal</w:t>
+      </w:r>
+    </w:p>
+    <w:p>
+      <w:pPr>
+        <w:numPr>
+          <w:ilvl w:val="0"/>
+          <w:numId w:val="1102"/>
+        </w:numPr>
+        <w:pStyle w:val="Compact"/>
+      </w:pPr>
+      <w:r>
+        <w:t xml:space="preserve">Inflação despencou desde 2023</w:t>
+      </w:r>
+    </w:p>
+    <w:p>
+      <w:pPr>
+        <w:numPr>
+          <w:ilvl w:val="0"/>
+          <w:numId w:val="1102"/>
+        </w:numPr>
+        <w:pStyle w:val="Compact"/>
+      </w:pPr>
+      <w:r>
+        <w:t xml:space="preserve">Entrada e residência fáceis pelo Mercosul</w:t>
+      </w:r>
+    </w:p>
+    <w:bookmarkEnd w:id="287"/>
+    <w:bookmarkStart w:id="288" w:name="atenção-1"/>
+    <w:p>
+      <w:pPr>
+        <w:pStyle w:val="Heading3"/>
+      </w:pPr>
+      <w:r>
+        <w:t xml:space="preserve">Atenção</w:t>
+      </w:r>
+    </w:p>
+    <w:p>
+      <w:pPr>
+        <w:numPr>
+          <w:ilvl w:val="0"/>
+          <w:numId w:val="1103"/>
+        </w:numPr>
+        <w:pStyle w:val="Compact"/>
+      </w:pPr>
+      <w:r>
+        <w:t xml:space="preserve">Inflação ainda perto de 30% ao ano em 2026</w:t>
+      </w:r>
+    </w:p>
+    <w:p>
+      <w:pPr>
+        <w:numPr>
+          <w:ilvl w:val="0"/>
+          <w:numId w:val="1103"/>
+        </w:numPr>
+        <w:pStyle w:val="Compact"/>
+      </w:pPr>
+      <w:r>
+        <w:t xml:space="preserve">Preços mudam rápido</w:t>
+      </w:r>
+    </w:p>
+    <w:p>
+      <w:pPr>
+        <w:numPr>
+          <w:ilvl w:val="0"/>
+          <w:numId w:val="1103"/>
+        </w:numPr>
+        <w:pStyle w:val="Compact"/>
+      </w:pPr>
+      <w:r>
+        <w:t xml:space="preserve">Regra de prorrogação da residência com fontes divergentes</w:t>
+      </w:r>
+    </w:p>
+    <w:bookmarkEnd w:id="288"/>
+    <w:p>
+      <w:pPr>
+        <w:pStyle w:val="FirstParagraph"/>
+      </w:pPr>
+      <w:r>
+        <w:rPr>
+          <w:bCs/>
+          <w:b/>
+        </w:rPr>
+        <w:t xml:space="preserve">Projeção do mercado:</w:t>
+      </w:r>
+      <w:r>
+        <w:t xml:space="preserve"> </w:t>
+      </w:r>
+      <w:r>
+        <w:t xml:space="preserve">inflação de cerca de 30% em 2026 e dólar oficial entre ARS 1.614 e 1.652 no fim do ano.</w:t>
+      </w:r>
+    </w:p>
+    <w:p>
+      <w:pPr>
+        <w:pStyle w:val="BodyText"/>
+      </w:pPr>
+      <w:r>
+        <w:t xml:space="preserve">A Argentina mostra que dá para sair do buraco. Mas a obra ainda não acabou.</w:t>
+      </w:r>
+    </w:p>
+    <w:bookmarkEnd w:id="289"/>
+    <w:p>
+      <w:r>
+        <w:pict>
+          <v:rect style="width:0;height:1.5pt" o:hralign="center" o:hrstd="t" o:hr="t"/>
+        </w:pict>
+      </w:r>
+    </w:p>
+    <w:p>
+      <w:pPr>
+        <w:pStyle w:val="FirstParagraph"/>
+      </w:pPr>
+      <w:r>
+        <w:t xml:space="preserve">Uruguai</w:t>
+      </w:r>
+    </w:p>
+    <w:bookmarkStart w:id="290" w:name="Xdc4e338a7123d05e9c2106c251b39fe5b2d930c"/>
+    <w:p>
+      <w:pPr>
+        <w:pStyle w:val="Heading1"/>
+      </w:pPr>
+      <w:r>
+        <w:t xml:space="preserve">O Uruguai virou à esquerda. E é o mais caro.</w:t>
+      </w:r>
+    </w:p>
+    <w:p>
+      <w:pPr>
+        <w:pStyle w:val="FirstParagraph"/>
+      </w:pPr>
+      <w:r>
+        <w:t xml:space="preserve">Orsi</w:t>
+      </w:r>
+      <w:r>
+        <w:t xml:space="preserve">Frente Ampla, esquerda, desde 01/03/2025</w:t>
+      </w:r>
+    </w:p>
+    <w:p>
+      <w:pPr>
+        <w:pStyle w:val="BodyText"/>
+      </w:pPr>
+      <w:r>
+        <w:t xml:space="preserve">nº 1</w:t>
+      </w:r>
+      <w:r>
+        <w:t xml:space="preserve">Montevidéu: cidade mais cara da América Latina</w:t>
+      </w:r>
+    </w:p>
+    <w:p>
+      <w:pPr>
+        <w:pStyle w:val="BodyText"/>
+      </w:pPr>
+      <w:r>
+        <w:t xml:space="preserve">R$ 15–20 mil</w:t>
+      </w:r>
+      <w:r>
+        <w:t xml:space="preserve">por mês: família com escola e saúde privadas</w:t>
+      </w:r>
+    </w:p>
+    <w:tbl>
+      <w:tblPr>
+        <w:tblStyle w:val="Table"/>
+        <w:tblW w:type="auto" w:w="0"/>
+        <w:tblLook w:firstRow="0" w:lastRow="0" w:firstColumn="0" w:lastColumn="0" w:noHBand="0" w:noVBand="0" w:val="0000"/>
+        <w:jc w:val="start"/>
+      </w:tblPr>
+      <w:tblGrid>
+        <w:gridCol w:w="3960"/>
+        <w:gridCol w:w="3960"/>
+      </w:tblGrid>
+      <w:tr>
+        <w:tc>
+          <w:tcPr/>
+          <w:p>
+            <w:pPr>
+              <w:pStyle w:val="Compact"/>
+              <w:jc w:val="left"/>
+            </w:pPr>
+            <w:r>
+              <w:t xml:space="preserve">Ficha</w:t>
+            </w:r>
+          </w:p>
+        </w:tc>
+        <w:tc>
+          <w:tcPr/>
+          <w:p>
+            <w:pPr>
+              <w:pStyle w:val="Compact"/>
+              <w:jc w:val="left"/>
+            </w:pPr>
+            <w:r>
+              <w:t xml:space="preserve">Uruguai</w:t>
+            </w:r>
+          </w:p>
+        </w:tc>
+      </w:tr>
+      <w:tr>
+        <w:tc>
+          <w:tcPr/>
+          <w:p>
+            <w:pPr>
+              <w:pStyle w:val="Compact"/>
+              <w:jc w:val="left"/>
+            </w:pPr>
+            <w:r>
+              <w:t xml:space="preserve">Moeda</w:t>
+            </w:r>
+          </w:p>
+        </w:tc>
+        <w:tc>
+          <w:tcPr/>
+          <w:p>
+            <w:pPr>
+              <w:pStyle w:val="Compact"/>
+              <w:jc w:val="left"/>
+            </w:pPr>
+            <w:r>
+              <w:t xml:space="preserve">Peso uruguaio</w:t>
+            </w:r>
+          </w:p>
+        </w:tc>
+      </w:tr>
+      <w:tr>
+        <w:tc>
+          <w:tcPr/>
+          <w:p>
+            <w:pPr>
+              <w:pStyle w:val="Compact"/>
+              <w:jc w:val="left"/>
+            </w:pPr>
+            <w:r>
+              <w:t xml:space="preserve">Residência</w:t>
+            </w:r>
+          </w:p>
+        </w:tc>
+        <w:tc>
+          <w:tcPr/>
+          <w:p>
+            <w:pPr>
+              <w:pStyle w:val="Compact"/>
+              <w:jc w:val="left"/>
+            </w:pPr>
+            <w:r>
+              <w:t xml:space="preserve">Mercosul, pela Direção Nacional de Migração. Exigência de renda com fontes divergentes (até ~US$ 650/mês)</w:t>
+            </w:r>
+          </w:p>
+        </w:tc>
+      </w:tr>
+      <w:tr>
+        <w:tc>
+          <w:tcPr/>
+          <w:p>
+            <w:pPr>
+              <w:pStyle w:val="Compact"/>
+              <w:jc w:val="left"/>
+            </w:pPr>
+            <w:r>
+              <w:t xml:space="preserve">Governo</w:t>
+            </w:r>
+          </w:p>
+        </w:tc>
+        <w:tc>
+          <w:tcPr/>
+          <w:p>
+            <w:pPr>
+              <w:pStyle w:val="Compact"/>
+              <w:jc w:val="left"/>
+            </w:pPr>
+            <w:r>
+              <w:t xml:space="preserve">Yamandú Orsi, pupilo de José “Pepe” Mujica</w:t>
+            </w:r>
+          </w:p>
+        </w:tc>
+      </w:tr>
+    </w:tbl>
+    <w:p>
+      <w:pPr>
+        <w:pStyle w:val="BodyText"/>
+      </w:pPr>
+      <w:r>
+        <w:rPr>
+          <w:bCs/>
+          <w:b/>
+        </w:rPr>
+        <w:t xml:space="preserve">Saiu da direita de Lacalle Pou para a esquerda de Mujica.</w:t>
+      </w:r>
+      <w:r>
+        <w:t xml:space="preserve"> </w:t>
+      </w:r>
+      <w:r>
+        <w:t xml:space="preserve">Caro e governado pela esquerda: não é o perfil deste curso.</w:t>
+      </w:r>
+    </w:p>
+    <w:bookmarkEnd w:id="290"/>
+    <w:p>
+      <w:r>
+        <w:pict>
+          <v:rect style="width:0;height:1.5pt" o:hralign="center" o:hrstd="t" o:hr="t"/>
+        </w:pict>
+      </w:r>
+    </w:p>
+    <w:p>
+      <w:pPr>
+        <w:pStyle w:val="FirstParagraph"/>
+      </w:pPr>
+      <w:r>
+        <w:t xml:space="preserve">Portugal</w:t>
+      </w:r>
+    </w:p>
+    <w:bookmarkStart w:id="293" w:name="portugal-o-sonho-com-fila-de-400-mil"/>
+    <w:p>
+      <w:pPr>
+        <w:pStyle w:val="Heading1"/>
+      </w:pPr>
+      <w:r>
+        <w:t xml:space="preserve">Portugal: o sonho com fila de 400 mil</w:t>
+      </w:r>
+    </w:p>
+    <w:tbl>
+      <w:tblPr>
+        <w:tblStyle w:val="Table"/>
+        <w:tblW w:type="auto" w:w="0"/>
+        <w:tblLook w:firstRow="0" w:lastRow="0" w:firstColumn="0" w:lastColumn="0" w:noHBand="0" w:noVBand="0" w:val="0000"/>
+        <w:jc w:val="start"/>
+      </w:tblPr>
+      <w:tblGrid>
+        <w:gridCol w:w="3960"/>
+        <w:gridCol w:w="3960"/>
+      </w:tblGrid>
+      <w:tr>
+        <w:tc>
+          <w:tcPr/>
+          <w:p>
+            <w:pPr>
+              <w:pStyle w:val="Compact"/>
+              <w:jc w:val="left"/>
+            </w:pPr>
+            <w:r>
+              <w:t xml:space="preserve">Ficha</w:t>
+            </w:r>
+          </w:p>
+        </w:tc>
+        <w:tc>
+          <w:tcPr/>
+          <w:p>
+            <w:pPr>
+              <w:pStyle w:val="Compact"/>
+              <w:jc w:val="left"/>
+            </w:pPr>
+            <w:r>
+              <w:t xml:space="preserve">Portugal</w:t>
+            </w:r>
+          </w:p>
+        </w:tc>
+      </w:tr>
+      <w:tr>
+        <w:tc>
+          <w:tcPr/>
+          <w:p>
+            <w:pPr>
+              <w:pStyle w:val="Compact"/>
+              <w:jc w:val="left"/>
+            </w:pPr>
+            <w:r>
+              <w:t xml:space="preserve">Moeda</w:t>
+            </w:r>
+          </w:p>
+        </w:tc>
+        <w:tc>
+          <w:tcPr/>
+          <w:p>
+            <w:pPr>
+              <w:pStyle w:val="Compact"/>
+              <w:jc w:val="left"/>
+            </w:pPr>
+            <w:r>
+              <w:t xml:space="preserve">Euro (€1 ≈ R$ 5,62)</w:t>
+            </w:r>
+          </w:p>
+        </w:tc>
+      </w:tr>
+      <w:tr>
+        <w:tc>
+          <w:tcPr/>
+          <w:p>
+            <w:pPr>
+              <w:pStyle w:val="Compact"/>
+              <w:jc w:val="left"/>
+            </w:pPr>
+            <w:r>
+              <w:t xml:space="preserve">Visto de renda (D7)</w:t>
+            </w:r>
+          </w:p>
+        </w:tc>
+        <w:tc>
+          <w:tcPr/>
+          <w:p>
+            <w:pPr>
+              <w:pStyle w:val="Compact"/>
+              <w:jc w:val="left"/>
+            </w:pPr>
+            <w:r>
+              <w:t xml:space="preserve">Renda passiva de cerca de</w:t>
+            </w:r>
+            <w:r>
+              <w:t xml:space="preserve"> </w:t>
+            </w:r>
+            <w:r>
+              <w:rPr>
+                <w:bCs/>
+                <w:b/>
+              </w:rPr>
+              <w:t xml:space="preserve">€ 920/mês</w:t>
+            </w:r>
+            <w:r>
+              <w:t xml:space="preserve"> </w:t>
+            </w:r>
+            <w:r>
+              <w:t xml:space="preserve">para o titular (2026)</w:t>
+            </w:r>
+          </w:p>
+        </w:tc>
+      </w:tr>
+      <w:tr>
+        <w:tc>
+          <w:tcPr/>
+          <w:p>
+            <w:pPr>
+              <w:pStyle w:val="Compact"/>
+              <w:jc w:val="left"/>
+            </w:pPr>
+            <w:r>
+              <w:t xml:space="preserve">Processo</w:t>
+            </w:r>
+          </w:p>
+        </w:tc>
+        <w:tc>
+          <w:tcPr/>
+          <w:p>
+            <w:pPr>
+              <w:pStyle w:val="Compact"/>
+              <w:jc w:val="left"/>
+            </w:pPr>
+            <w:r>
+              <w:t xml:space="preserve">Visto no consulado + autorização de residência na AIMA, já em Portugal</w:t>
+            </w:r>
+          </w:p>
+        </w:tc>
+      </w:tr>
+      <w:tr>
+        <w:tc>
+          <w:tcPr/>
+          <w:p>
+            <w:pPr>
+              <w:pStyle w:val="Compact"/>
+              <w:jc w:val="left"/>
+            </w:pPr>
+            <w:r>
+              <w:t xml:space="preserve">Fila</w:t>
+            </w:r>
+          </w:p>
+        </w:tc>
+        <w:tc>
+          <w:tcPr/>
+          <w:p>
+            <w:pPr>
+              <w:pStyle w:val="Compact"/>
+              <w:jc w:val="left"/>
+            </w:pPr>
+            <w:r>
+              <w:t xml:space="preserve">AIMA com acúmulo que já passou de</w:t>
+            </w:r>
+            <w:r>
+              <w:t xml:space="preserve"> </w:t>
+            </w:r>
+            <w:r>
+              <w:rPr>
+                <w:bCs/>
+                <w:b/>
+              </w:rPr>
+              <w:t xml:space="preserve">400 mil processos</w:t>
+            </w:r>
+          </w:p>
+        </w:tc>
+      </w:tr>
+      <w:tr>
+        <w:tc>
+          <w:tcPr/>
+          <w:p>
+            <w:pPr>
+              <w:pStyle w:val="Compact"/>
+              <w:jc w:val="left"/>
+            </w:pPr>
+            <w:r>
+              <w:t xml:space="preserve">Aluguel</w:t>
+            </w:r>
+          </w:p>
+        </w:tc>
+        <w:tc>
+          <w:tcPr/>
+          <w:p>
+            <w:pPr>
+              <w:pStyle w:val="Compact"/>
+              <w:jc w:val="left"/>
+            </w:pPr>
+            <w:r>
+              <w:t xml:space="preserve">T1 no centro de Lisboa: €1.280 (~R$ 7.194)</w:t>
+            </w:r>
+          </w:p>
+        </w:tc>
+      </w:tr>
+    </w:tbl>
+    <w:bookmarkStart w:id="291" w:name="a-favor-2"/>
+    <w:p>
+      <w:pPr>
+        <w:pStyle w:val="Heading3"/>
+      </w:pPr>
+      <w:r>
+        <w:t xml:space="preserve">A favor</w:t>
+      </w:r>
+    </w:p>
+    <w:p>
+      <w:pPr>
+        <w:numPr>
+          <w:ilvl w:val="0"/>
+          <w:numId w:val="1104"/>
+        </w:numPr>
+        <w:pStyle w:val="Compact"/>
+      </w:pPr>
+      <w:r>
+        <w:t xml:space="preserve">Língua portuguesa</w:t>
+      </w:r>
+    </w:p>
+    <w:p>
+      <w:pPr>
+        <w:numPr>
+          <w:ilvl w:val="0"/>
+          <w:numId w:val="1104"/>
+        </w:numPr>
+        <w:pStyle w:val="Compact"/>
+      </w:pPr>
+      <w:r>
+        <w:t xml:space="preserve">Europa</w:t>
+      </w:r>
+    </w:p>
+    <w:bookmarkEnd w:id="291"/>
+    <w:bookmarkStart w:id="292" w:name="contra"/>
+    <w:p>
+      <w:pPr>
+        <w:pStyle w:val="Heading3"/>
+      </w:pPr>
+      <w:r>
+        <w:t xml:space="preserve">Contra</w:t>
+      </w:r>
+    </w:p>
+    <w:p>
+      <w:pPr>
+        <w:numPr>
+          <w:ilvl w:val="0"/>
+          <w:numId w:val="1105"/>
+        </w:numPr>
+        <w:pStyle w:val="Compact"/>
+      </w:pPr>
+      <w:r>
+        <w:t xml:space="preserve">Euro: seu real encolhe</w:t>
+      </w:r>
+    </w:p>
+    <w:p>
+      <w:pPr>
+        <w:numPr>
+          <w:ilvl w:val="0"/>
+          <w:numId w:val="1105"/>
+        </w:numPr>
+        <w:pStyle w:val="Compact"/>
+      </w:pPr>
+      <w:r>
+        <w:t xml:space="preserve">Fila e espera de meses</w:t>
+      </w:r>
+    </w:p>
+    <w:p>
+      <w:pPr>
+        <w:numPr>
+          <w:ilvl w:val="0"/>
+          <w:numId w:val="1105"/>
+        </w:numPr>
+        <w:pStyle w:val="Compact"/>
+      </w:pPr>
+      <w:r>
+        <w:t xml:space="preserve">Aluguel caro</w:t>
+      </w:r>
+    </w:p>
+    <w:bookmarkEnd w:id="292"/>
+    <w:bookmarkEnd w:id="293"/>
+    <w:p>
+      <w:r>
+        <w:pict>
+          <v:rect style="width:0;height:1.5pt" o:hralign="center" o:hrstd="t" o:hr="t"/>
+        </w:pict>
+      </w:r>
+    </w:p>
+    <w:p>
+      <w:pPr>
+        <w:pStyle w:val="FirstParagraph"/>
+      </w:pPr>
+      <w:r>
+        <w:t xml:space="preserve">Estados Unidos</w:t>
+      </w:r>
+    </w:p>
+    <w:bookmarkStart w:id="294" w:name="eua-governo-de-direita-porta-fechada"/>
+    <w:p>
+      <w:pPr>
+        <w:pStyle w:val="Heading1"/>
+      </w:pPr>
+      <w:r>
+        <w:t xml:space="preserve">EUA: governo de direita, porta fechada</w:t>
+      </w:r>
+    </w:p>
+    <w:p>
+      <w:pPr>
+        <w:pStyle w:val="FirstParagraph"/>
+      </w:pPr>
+      <w:r>
+        <w:t xml:space="preserve">21/01/2026</w:t>
+      </w:r>
+      <w:r>
+        <w:t xml:space="preserve">EUA suspendem vistos de imigrante para brasileiros</w:t>
+      </w:r>
+    </w:p>
+    <w:p>
+      <w:pPr>
+        <w:pStyle w:val="BodyText"/>
+      </w:pPr>
+      <w:r>
+        <w:t xml:space="preserve">US$ 250</w:t>
+      </w:r>
+      <w:r>
+        <w:t xml:space="preserve">“taxa de integridade” sobre vistos de não imigrante</w:t>
+      </w:r>
+    </w:p>
+    <w:p>
+      <w:pPr>
+        <w:pStyle w:val="BodyText"/>
+      </w:pPr>
+      <w:r>
+        <w:t xml:space="preserve">R$ 13.375</w:t>
+      </w:r>
+      <w:r>
+        <w:t xml:space="preserve">1 quarto em Miami por mês</w:t>
+      </w:r>
+    </w:p>
+    <w:p>
+      <w:pPr>
+        <w:pStyle w:val="BodyText"/>
+      </w:pPr>
+      <w:r>
+        <w:t xml:space="preserve">O governo Trump é de direita, mas a política é de</w:t>
+      </w:r>
+      <w:r>
+        <w:t xml:space="preserve"> </w:t>
+      </w:r>
+      <w:r>
+        <w:rPr>
+          <w:bCs/>
+          <w:b/>
+        </w:rPr>
+        <w:t xml:space="preserve">porta fechada</w:t>
+      </w:r>
+      <w:r>
+        <w:t xml:space="preserve"> </w:t>
+      </w:r>
+      <w:r>
+        <w:t xml:space="preserve">para imigração. A suspensão de vistos de imigrante para brasileiros não tem prazo para acabar. O Brasil ficou fora da caução de até US$ 15 mil para vistos de turismo.</w:t>
+      </w:r>
+    </w:p>
+    <w:p>
+      <w:pPr>
+        <w:pStyle w:val="BodyText"/>
+      </w:pPr>
+      <w:r>
+        <w:rPr>
+          <w:bCs/>
+          <w:b/>
+        </w:rPr>
+        <w:t xml:space="preserve">Para morar, não é o caminho.</w:t>
+      </w:r>
+      <w:r>
+        <w:t xml:space="preserve"> </w:t>
+      </w:r>
+      <w:r>
+        <w:t xml:space="preserve">Para turismo e negócios, o visto comum continua, mais caro.</w:t>
+      </w:r>
+    </w:p>
+    <w:bookmarkEnd w:id="294"/>
+    <w:p>
+      <w:r>
+        <w:pict>
+          <v:rect style="width:0;height:1.5pt" o:hralign="center" o:hrstd="t" o:hr="t"/>
+        </w:pict>
+      </w:r>
+    </w:p>
+    <w:p>
+      <w:pPr>
+        <w:pStyle w:val="FirstParagraph"/>
+      </w:pPr>
+      <w:r>
+        <w:t xml:space="preserve">Fim da Parte 8</w:t>
+      </w:r>
+    </w:p>
+    <w:bookmarkStart w:id="295" w:name="Xe22f3731301bcaf48d078288930a6010db7de4f"/>
+    <w:p>
+      <w:pPr>
+        <w:pStyle w:val="Heading1"/>
+      </w:pPr>
+      <w:r>
+        <w:t xml:space="preserve">Por que a Bolívia continua sendo a número 1</w:t>
+      </w:r>
+    </w:p>
+    <w:p>
+      <w:pPr>
+        <w:numPr>
+          <w:ilvl w:val="0"/>
+          <w:numId w:val="1106"/>
+        </w:numPr>
+        <w:pStyle w:val="Compact"/>
+      </w:pPr>
+      <w:r>
+        <w:rPr>
+          <w:bCs/>
+          <w:b/>
+        </w:rPr>
+        <w:t xml:space="preserve">Governo:</w:t>
+      </w:r>
+      <w:r>
+        <w:t xml:space="preserve"> </w:t>
+      </w:r>
+      <w:r>
+        <w:t xml:space="preserve">centro-direita desde 2025, depois de 20 anos de socialismo</w:t>
+      </w:r>
+    </w:p>
+    <w:p>
+      <w:pPr>
+        <w:numPr>
+          <w:ilvl w:val="0"/>
+          <w:numId w:val="1106"/>
+        </w:numPr>
+        <w:pStyle w:val="Compact"/>
+      </w:pPr>
+      <w:r>
+        <w:rPr>
+          <w:bCs/>
+          <w:b/>
+        </w:rPr>
+        <w:t xml:space="preserve">Entrada:</w:t>
+      </w:r>
+      <w:r>
+        <w:t xml:space="preserve"> </w:t>
+      </w:r>
+      <w:r>
+        <w:t xml:space="preserve">RG, sem visto, residência Mercosul</w:t>
+      </w:r>
+    </w:p>
+    <w:p>
+      <w:pPr>
+        <w:numPr>
+          <w:ilvl w:val="0"/>
+          <w:numId w:val="1106"/>
+        </w:numPr>
+        <w:pStyle w:val="Compact"/>
+      </w:pPr>
+      <w:r>
+        <w:rPr>
+          <w:bCs/>
+          <w:b/>
+        </w:rPr>
+        <w:t xml:space="preserve">Câmbio:</w:t>
+      </w:r>
+      <w:r>
+        <w:t xml:space="preserve"> </w:t>
+      </w:r>
+      <w:r>
+        <w:t xml:space="preserve">o dólar dobrou e os preços em Bs ficaram para trás</w:t>
+      </w:r>
+    </w:p>
+    <w:p>
+      <w:pPr>
+        <w:numPr>
+          <w:ilvl w:val="0"/>
+          <w:numId w:val="1106"/>
+        </w:numPr>
+        <w:pStyle w:val="Compact"/>
+      </w:pPr>
+      <w:r>
+        <w:rPr>
+          <w:bCs/>
+          <w:b/>
+        </w:rPr>
+        <w:t xml:space="preserve">USDT:</w:t>
+      </w:r>
+      <w:r>
+        <w:t xml:space="preserve"> </w:t>
+      </w:r>
+      <w:r>
+        <w:t xml:space="preserve">legal, com bancos operando e P2P acima do dólar oficial</w:t>
+      </w:r>
+    </w:p>
+    <w:p>
+      <w:pPr>
+        <w:numPr>
+          <w:ilvl w:val="0"/>
+          <w:numId w:val="1106"/>
+        </w:numPr>
+        <w:pStyle w:val="Compact"/>
+      </w:pPr>
+      <w:r>
+        <w:rPr>
+          <w:bCs/>
+          <w:b/>
+        </w:rPr>
+        <w:t xml:space="preserve">Distância:</w:t>
+      </w:r>
+      <w:r>
+        <w:t xml:space="preserve"> </w:t>
+      </w:r>
+      <w:r>
+        <w:t xml:space="preserve">~3 horas de voo</w:t>
+      </w:r>
+    </w:p>
+    <w:p>
+      <w:pPr>
+        <w:pStyle w:val="FirstParagraph"/>
+      </w:pPr>
+      <w:r>
+        <w:rPr>
+          <w:bCs/>
+          <w:b/>
+        </w:rPr>
+        <w:t xml:space="preserve">O método serve para qualquer país.</w:t>
+      </w:r>
+      <w:r>
+        <w:t xml:space="preserve"> </w:t>
+      </w:r>
+      <w:r>
+        <w:t xml:space="preserve">A matemática é que escolhe o destino.</w:t>
+      </w:r>
+    </w:p>
+    <w:p>
+      <w:pPr>
+        <w:pStyle w:val="BodyText"/>
+      </w:pPr>
+      <w:r>
+        <w:t xml:space="preserve">PRÓXIMO</w:t>
+      </w:r>
+      <w:r>
+        <w:t xml:space="preserve">Bônus:</w:t>
+      </w:r>
+      <w:r>
+        <w:t xml:space="preserve"> </w:t>
+      </w:r>
+      <w:r>
+        <w:rPr>
+          <w:highlight w:val="yellow"/>
+        </w:rPr>
+        <w:t xml:space="preserve">dossiê, checklists e planilhas</w:t>
+      </w:r>
+    </w:p>
+    <w:bookmarkEnd w:id="295"/>
+    <w:p>
+      <w:r>
+        <w:pict>
+          <v:rect style="width:0;height:1.5pt" o:hralign="center" o:hrstd="t" o:hr="t"/>
+        </w:pict>
+      </w:r>
+    </w:p>
+    <w:p>
+      <w:pPr>
+        <w:pStyle w:val="FirstParagraph"/>
+      </w:pPr>
+      <w:r>
+        <w:t xml:space="preserve">B7</w:t>
+      </w:r>
+    </w:p>
+    <w:p>
+      <w:pPr>
+        <w:pStyle w:val="BodyText"/>
+      </w:pPr>
+      <w:r>
+        <w:t xml:space="preserve">Dossiê: mais 4 anos em manchetes</w:t>
+      </w:r>
+    </w:p>
+    <w:p>
+      <w:pPr>
+        <w:pStyle w:val="BodyText"/>
+      </w:pPr>
+      <w:r>
+        <w:t xml:space="preserve">Links para mandar ao seu conhecido de esquerda. Não é opinião: é manchete, com veículo e QR code para ele mesmo conferir.</w:t>
+      </w:r>
+    </w:p>
+    <w:p>
+      <w:r>
+        <w:pict>
+          <v:rect style="width:0;height:1.5pt" o:hralign="center" o:hrstd="t" o:hr="t"/>
+        </w:pict>
+      </w:r>
+    </w:p>
+    <w:p>
+      <w:pPr>
+        <w:pStyle w:val="FirstParagraph"/>
+      </w:pPr>
+      <w:r>
+        <w:t xml:space="preserve">Como usar o dossiê</w:t>
+      </w:r>
+    </w:p>
+    <w:bookmarkStart w:id="298" w:name="não-discuta.-mande-o-link."/>
+    <w:p>
+      <w:pPr>
+        <w:pStyle w:val="Heading1"/>
+      </w:pPr>
+      <w:r>
+        <w:t xml:space="preserve">Não discuta. Mande o link.</w:t>
+      </w:r>
+    </w:p>
+    <w:p>
+      <w:pPr>
+        <w:pStyle w:val="FirstParagraph"/>
+      </w:pPr>
+      <w:r>
+        <w:t xml:space="preserve">Discussão de grupo de família não convence ninguém.</w:t>
+      </w:r>
+      <w:r>
+        <w:t xml:space="preserve"> </w:t>
+      </w:r>
+      <w:r>
+        <w:rPr>
+          <w:bCs/>
+          <w:b/>
+        </w:rPr>
+        <w:t xml:space="preserve">Manchete com data e veículo</w:t>
+      </w:r>
+      <w:r>
+        <w:t xml:space="preserve"> </w:t>
+      </w:r>
+      <w:r>
+        <w:t xml:space="preserve">convence mais. Este dossiê é para isso.</w:t>
+      </w:r>
+    </w:p>
+    <w:p>
+      <w:pPr>
+        <w:numPr>
+          <w:ilvl w:val="0"/>
+          <w:numId w:val="1107"/>
+        </w:numPr>
+        <w:pStyle w:val="Compact"/>
+      </w:pPr>
+      <w:r>
+        <w:t xml:space="preserve">Escolha 1 ou 2 manchetes sobre o assunto da conversa</w:t>
+      </w:r>
+    </w:p>
+    <w:p>
+      <w:pPr>
+        <w:numPr>
+          <w:ilvl w:val="0"/>
+          <w:numId w:val="1107"/>
+        </w:numPr>
+        <w:pStyle w:val="Compact"/>
+      </w:pPr>
+      <w:r>
+        <w:t xml:space="preserve">Aponte a câmera do celular para o QR code e copie o link</w:t>
+      </w:r>
+    </w:p>
+    <w:p>
+      <w:pPr>
+        <w:numPr>
+          <w:ilvl w:val="0"/>
+          <w:numId w:val="1107"/>
+        </w:numPr>
+        <w:pStyle w:val="Compact"/>
+      </w:pPr>
+      <w:r>
+        <w:t xml:space="preserve">Mande o link, sem textão. Deixe a notícia falar</w:t>
+      </w:r>
+    </w:p>
+    <w:p>
+      <w:pPr>
+        <w:numPr>
+          <w:ilvl w:val="0"/>
+          <w:numId w:val="1107"/>
+        </w:numPr>
+        <w:pStyle w:val="Compact"/>
+      </w:pPr>
+      <w:r>
+        <w:t xml:space="preserve">Se ele disser “site de direita”, mande o dado oficial que está na mesma linha (Banco Central, Senado, Receita)</w:t>
+      </w:r>
+    </w:p>
+    <w:bookmarkStart w:id="296" w:name="já-aconteceu"/>
+    <w:p>
+      <w:pPr>
+        <w:pStyle w:val="Heading3"/>
+      </w:pPr>
+      <w:r>
+        <w:t xml:space="preserve">Já aconteceu</w:t>
+      </w:r>
+    </w:p>
+    <w:p>
+      <w:pPr>
+        <w:pStyle w:val="FirstParagraph"/>
+      </w:pPr>
+      <w:r>
+        <w:t xml:space="preserve">Fatos publicados: impostos, IOF, dívida, juros, déficit, golpes.</w:t>
+      </w:r>
+    </w:p>
+    <w:bookmarkEnd w:id="296"/>
+    <w:bookmarkStart w:id="297" w:name="o-que-vem-por-aí"/>
+    <w:p>
+      <w:pPr>
+        <w:pStyle w:val="Heading3"/>
+      </w:pPr>
+      <w:r>
+        <w:t xml:space="preserve">O que vem por aí</w:t>
+      </w:r>
+    </w:p>
+    <w:p>
+      <w:pPr>
+        <w:pStyle w:val="FirstParagraph"/>
+      </w:pPr>
+      <w:r>
+        <w:t xml:space="preserve">Projeções de instituições e propostas do governo, marcadas como projeção.</w:t>
+      </w:r>
+    </w:p>
+    <w:bookmarkEnd w:id="297"/>
+    <w:p>
+      <w:pPr>
+        <w:pStyle w:val="BodyText"/>
+      </w:pPr>
+      <w:r>
+        <w:rPr>
+          <w:bCs/>
+          <w:b/>
+        </w:rPr>
+        <w:t xml:space="preserve">Links mudam.</w:t>
+      </w:r>
+      <w:r>
+        <w:t xml:space="preserve"> </w:t>
+      </w:r>
+      <w:r>
+        <w:t xml:space="preserve">Todos foram consultados em 28/10/2026. Se algum sair do ar, busque o título entre aspas.</w:t>
+      </w:r>
+    </w:p>
+    <w:bookmarkEnd w:id="298"/>
+    <w:p>
+      <w:r>
+        <w:pict>
+          <v:rect style="width:0;height:1.5pt" o:hralign="center" o:hrstd="t" o:hr="t"/>
+        </w:pict>
+      </w:r>
+    </w:p>
+    <w:p>
+      <w:pPr>
+        <w:pStyle w:val="FirstParagraph"/>
+      </w:pPr>
+      <w:r>
         <w:t xml:space="preserve">Fatos publicados</w:t>
       </w:r>
     </w:p>
-    <w:bookmarkStart w:id="289" w:name="já-aconteceu-1"/>
+    <w:bookmarkStart w:id="302" w:name="já-aconteceu-1"/>
     <w:p>
       <w:pPr>
         <w:pStyle w:val="Heading2"/>
@@ -38604,7 +40565,7 @@
       <w:pPr>
         <w:pStyle w:val="BodyText"/>
       </w:pPr>
-      <w:hyperlink r:id="rId286">
+      <w:hyperlink r:id="rId299">
         <w:r>
           <w:rPr>
             <w:rStyle w:val="Hyperlink"/>
@@ -38654,7 +40615,7 @@
       <w:pPr>
         <w:pStyle w:val="BodyText"/>
       </w:pPr>
-      <w:hyperlink r:id="rId287">
+      <w:hyperlink r:id="rId300">
         <w:r>
           <w:rPr>
             <w:rStyle w:val="Hyperlink"/>
@@ -38704,7 +40665,7 @@
       <w:pPr>
         <w:pStyle w:val="BodyText"/>
       </w:pPr>
-      <w:hyperlink r:id="rId288">
+      <w:hyperlink r:id="rId301">
         <w:r>
           <w:rPr>
             <w:rStyle w:val="Hyperlink"/>
@@ -38739,7 +40700,7 @@
         <w:t xml:space="preserve">· link consultado em 28/10/2026</w:t>
       </w:r>
     </w:p>
-    <w:bookmarkEnd w:id="289"/>
+    <w:bookmarkEnd w:id="302"/>
     <w:p>
       <w:r>
         <w:pict>
@@ -38747,7 +40708,7 @@
         </w:pict>
       </w:r>
     </w:p>
-    <w:bookmarkStart w:id="293" w:name="já-aconteceu-cont."/>
+    <w:bookmarkStart w:id="306" w:name="já-aconteceu-cont."/>
     <w:p>
       <w:pPr>
         <w:pStyle w:val="Heading2"/>
@@ -38771,7 +40732,7 @@
       <w:pPr>
         <w:pStyle w:val="BodyText"/>
       </w:pPr>
-      <w:hyperlink r:id="rId290">
+      <w:hyperlink r:id="rId303">
         <w:r>
           <w:rPr>
             <w:rStyle w:val="Hyperlink"/>
@@ -38821,7 +40782,7 @@
       <w:pPr>
         <w:pStyle w:val="BodyText"/>
       </w:pPr>
-      <w:hyperlink r:id="rId291">
+      <w:hyperlink r:id="rId304">
         <w:r>
           <w:rPr>
             <w:rStyle w:val="Hyperlink"/>
@@ -38871,7 +40832,7 @@
       <w:pPr>
         <w:pStyle w:val="BodyText"/>
       </w:pPr>
-      <w:hyperlink r:id="rId292">
+      <w:hyperlink r:id="rId305">
         <w:r>
           <w:rPr>
             <w:rStyle w:val="Hyperlink"/>
@@ -38906,7 +40867,7 @@
         <w:t xml:space="preserve">· link consultado em 28/10/2026</w:t>
       </w:r>
     </w:p>
-    <w:bookmarkEnd w:id="293"/>
+    <w:bookmarkEnd w:id="306"/>
     <w:p>
       <w:r>
         <w:pict>
@@ -38914,7 +40875,7 @@
         </w:pict>
       </w:r>
     </w:p>
-    <w:bookmarkStart w:id="297" w:name="já-aconteceu-cont.-1"/>
+    <w:bookmarkStart w:id="310" w:name="já-aconteceu-cont.-1"/>
     <w:p>
       <w:pPr>
         <w:pStyle w:val="Heading2"/>
@@ -38938,7 +40899,7 @@
       <w:pPr>
         <w:pStyle w:val="BodyText"/>
       </w:pPr>
-      <w:hyperlink r:id="rId294">
+      <w:hyperlink r:id="rId307">
         <w:r>
           <w:rPr>
             <w:rStyle w:val="Hyperlink"/>
@@ -38988,7 +40949,7 @@
       <w:pPr>
         <w:pStyle w:val="BodyText"/>
       </w:pPr>
-      <w:hyperlink r:id="rId295">
+      <w:hyperlink r:id="rId308">
         <w:r>
           <w:rPr>
             <w:rStyle w:val="Hyperlink"/>
@@ -39038,7 +40999,7 @@
       <w:pPr>
         <w:pStyle w:val="BodyText"/>
       </w:pPr>
-      <w:hyperlink r:id="rId296">
+      <w:hyperlink r:id="rId309">
         <w:r>
           <w:rPr>
             <w:rStyle w:val="Hyperlink"/>
@@ -39073,7 +41034,7 @@
         <w:t xml:space="preserve">· link consultado em 28/10/2026</w:t>
       </w:r>
     </w:p>
-    <w:bookmarkEnd w:id="297"/>
+    <w:bookmarkEnd w:id="310"/>
     <w:p>
       <w:r>
         <w:pict>
@@ -39081,7 +41042,7 @@
         </w:pict>
       </w:r>
     </w:p>
-    <w:bookmarkStart w:id="301" w:name="já-aconteceu-cont.-2"/>
+    <w:bookmarkStart w:id="314" w:name="já-aconteceu-cont.-2"/>
     <w:p>
       <w:pPr>
         <w:pStyle w:val="Heading2"/>
@@ -39105,7 +41066,7 @@
       <w:pPr>
         <w:pStyle w:val="BodyText"/>
       </w:pPr>
-      <w:hyperlink r:id="rId298">
+      <w:hyperlink r:id="rId311">
         <w:r>
           <w:rPr>
             <w:rStyle w:val="Hyperlink"/>
@@ -39155,7 +41116,7 @@
       <w:pPr>
         <w:pStyle w:val="BodyText"/>
       </w:pPr>
-      <w:hyperlink r:id="rId299">
+      <w:hyperlink r:id="rId312">
         <w:r>
           <w:rPr>
             <w:rStyle w:val="Hyperlink"/>
@@ -39205,7 +41166,7 @@
       <w:pPr>
         <w:pStyle w:val="BodyText"/>
       </w:pPr>
-      <w:hyperlink r:id="rId300">
+      <w:hyperlink r:id="rId313">
         <w:r>
           <w:rPr>
             <w:rStyle w:val="Hyperlink"/>
@@ -39240,7 +41201,7 @@
         <w:t xml:space="preserve">· link consultado em 28/10/2026</w:t>
       </w:r>
     </w:p>
-    <w:bookmarkEnd w:id="301"/>
+    <w:bookmarkEnd w:id="314"/>
     <w:p>
       <w:r>
         <w:pict>
@@ -39256,7 +41217,7 @@
         <w:t xml:space="preserve">Projeções e propostas</w:t>
       </w:r>
     </w:p>
-    <w:bookmarkStart w:id="305" w:name="o-que-vem-por-aí-1"/>
+    <w:bookmarkStart w:id="318" w:name="o-que-vem-por-aí-1"/>
     <w:p>
       <w:pPr>
         <w:pStyle w:val="Heading2"/>
@@ -39280,7 +41241,7 @@
       <w:pPr>
         <w:pStyle w:val="BodyText"/>
       </w:pPr>
-      <w:hyperlink r:id="rId302">
+      <w:hyperlink r:id="rId315">
         <w:r>
           <w:rPr>
             <w:rStyle w:val="Hyperlink"/>
@@ -39330,7 +41291,7 @@
       <w:pPr>
         <w:pStyle w:val="BodyText"/>
       </w:pPr>
-      <w:hyperlink r:id="rId303">
+      <w:hyperlink r:id="rId316">
         <w:r>
           <w:rPr>
             <w:rStyle w:val="Hyperlink"/>
@@ -39380,7 +41341,7 @@
       <w:pPr>
         <w:pStyle w:val="BodyText"/>
       </w:pPr>
-      <w:hyperlink r:id="rId304">
+      <w:hyperlink r:id="rId317">
         <w:r>
           <w:rPr>
             <w:rStyle w:val="Hyperlink"/>
@@ -39415,7 +41376,7 @@
         <w:t xml:space="preserve">· link consultado em 28/10/2026</w:t>
       </w:r>
     </w:p>
-    <w:bookmarkEnd w:id="305"/>
+    <w:bookmarkEnd w:id="318"/>
     <w:p>
       <w:r>
         <w:pict>
@@ -39423,7 +41384,7 @@
         </w:pict>
       </w:r>
     </w:p>
-    <w:bookmarkStart w:id="309" w:name="o-que-vem-por-aí-cont."/>
+    <w:bookmarkStart w:id="322" w:name="o-que-vem-por-aí-cont."/>
     <w:p>
       <w:pPr>
         <w:pStyle w:val="Heading2"/>
@@ -39447,7 +41408,7 @@
       <w:pPr>
         <w:pStyle w:val="BodyText"/>
       </w:pPr>
-      <w:hyperlink r:id="rId306">
+      <w:hyperlink r:id="rId319">
         <w:r>
           <w:rPr>
             <w:rStyle w:val="Hyperlink"/>
@@ -39497,7 +41458,7 @@
       <w:pPr>
         <w:pStyle w:val="BodyText"/>
       </w:pPr>
-      <w:hyperlink r:id="rId307">
+      <w:hyperlink r:id="rId320">
         <w:r>
           <w:rPr>
             <w:rStyle w:val="Hyperlink"/>
@@ -39547,7 +41508,7 @@
       <w:pPr>
         <w:pStyle w:val="BodyText"/>
       </w:pPr>
-      <w:hyperlink r:id="rId308">
+      <w:hyperlink r:id="rId321">
         <w:r>
           <w:rPr>
             <w:rStyle w:val="Hyperlink"/>
@@ -39582,7 +41543,7 @@
         <w:t xml:space="preserve">· link consultado em 28/10/2026</w:t>
       </w:r>
     </w:p>
-    <w:bookmarkEnd w:id="309"/>
+    <w:bookmarkEnd w:id="322"/>
     <w:p>
       <w:r>
         <w:pict>
@@ -39590,7 +41551,7 @@
         </w:pict>
       </w:r>
     </w:p>
-    <w:bookmarkStart w:id="311" w:name="o-que-vem-por-aí-cont.-1"/>
+    <w:bookmarkStart w:id="324" w:name="o-que-vem-por-aí-cont.-1"/>
     <w:p>
       <w:pPr>
         <w:pStyle w:val="Heading2"/>
@@ -39614,7 +41575,7 @@
       <w:pPr>
         <w:pStyle w:val="BodyText"/>
       </w:pPr>
-      <w:hyperlink r:id="rId310">
+      <w:hyperlink r:id="rId323">
         <w:r>
           <w:rPr>
             <w:rStyle w:val="Hyperlink"/>
@@ -39649,7 +41610,7 @@
         <w:t xml:space="preserve">· link consultado em 28/10/2026</w:t>
       </w:r>
     </w:p>
-    <w:bookmarkEnd w:id="311"/>
+    <w:bookmarkEnd w:id="324"/>
     <w:p>
       <w:r>
         <w:pict>
@@ -39665,7 +41626,7 @@
         <w:t xml:space="preserve">Para o WhatsApp</w:t>
       </w:r>
     </w:p>
-    <w:bookmarkStart w:id="312" w:name="mais-4-anos-em-6-números"/>
+    <w:bookmarkStart w:id="325" w:name="mais-4-anos-em-6-números"/>
     <w:p>
       <w:pPr>
         <w:pStyle w:val="Heading1"/>
@@ -39766,7 +41727,7 @@
         <w:t xml:space="preserve">[LINK DO CURSO]</w:t>
       </w:r>
     </w:p>
-    <w:bookmarkEnd w:id="312"/>
+    <w:bookmarkEnd w:id="325"/>
     <w:p>
       <w:r>
         <w:pict>
@@ -39782,7 +41743,7 @@
         <w:t xml:space="preserve">Anexo</w:t>
       </w:r>
     </w:p>
-    <w:bookmarkStart w:id="313" w:name="fontes-de-todos-os-números"/>
+    <w:bookmarkStart w:id="326" w:name="fontes-de-todos-os-números"/>
     <w:p>
       <w:pPr>
         <w:pStyle w:val="Heading2"/>
@@ -39803,7 +41764,7 @@
       <w:pPr>
         <w:numPr>
           <w:ilvl w:val="0"/>
-          <w:numId w:val="1102"/>
+          <w:numId w:val="1108"/>
         </w:numPr>
         <w:pStyle w:val="Compact"/>
       </w:pPr>
@@ -39822,7 +41783,7 @@
       <w:pPr>
         <w:numPr>
           <w:ilvl w:val="0"/>
-          <w:numId w:val="1102"/>
+          <w:numId w:val="1108"/>
         </w:numPr>
         <w:pStyle w:val="Compact"/>
       </w:pPr>
@@ -39841,7 +41802,7 @@
       <w:pPr>
         <w:numPr>
           <w:ilvl w:val="0"/>
-          <w:numId w:val="1102"/>
+          <w:numId w:val="1108"/>
         </w:numPr>
         <w:pStyle w:val="Compact"/>
       </w:pPr>
@@ -39860,7 +41821,7 @@
       <w:pPr>
         <w:numPr>
           <w:ilvl w:val="0"/>
-          <w:numId w:val="1102"/>
+          <w:numId w:val="1108"/>
         </w:numPr>
         <w:pStyle w:val="Compact"/>
       </w:pPr>
@@ -39879,7 +41840,7 @@
       <w:pPr>
         <w:numPr>
           <w:ilvl w:val="0"/>
-          <w:numId w:val="1102"/>
+          <w:numId w:val="1108"/>
         </w:numPr>
         <w:pStyle w:val="Compact"/>
       </w:pPr>
@@ -39898,7 +41859,7 @@
       <w:pPr>
         <w:numPr>
           <w:ilvl w:val="0"/>
-          <w:numId w:val="1102"/>
+          <w:numId w:val="1108"/>
         </w:numPr>
         <w:pStyle w:val="Compact"/>
       </w:pPr>
@@ -39917,7 +41878,7 @@
       <w:pPr>
         <w:numPr>
           <w:ilvl w:val="0"/>
-          <w:numId w:val="1102"/>
+          <w:numId w:val="1108"/>
         </w:numPr>
         <w:pStyle w:val="Compact"/>
       </w:pPr>
@@ -39936,7 +41897,7 @@
       <w:pPr>
         <w:numPr>
           <w:ilvl w:val="0"/>
-          <w:numId w:val="1102"/>
+          <w:numId w:val="1108"/>
         </w:numPr>
         <w:pStyle w:val="Compact"/>
       </w:pPr>
@@ -39955,7 +41916,7 @@
       <w:pPr>
         <w:numPr>
           <w:ilvl w:val="0"/>
-          <w:numId w:val="1102"/>
+          <w:numId w:val="1108"/>
         </w:numPr>
         <w:pStyle w:val="Compact"/>
       </w:pPr>
@@ -39974,7 +41935,7 @@
       <w:pPr>
         <w:numPr>
           <w:ilvl w:val="0"/>
-          <w:numId w:val="1102"/>
+          <w:numId w:val="1108"/>
         </w:numPr>
         <w:pStyle w:val="Compact"/>
       </w:pPr>
@@ -39993,7 +41954,7 @@
       <w:pPr>
         <w:numPr>
           <w:ilvl w:val="0"/>
-          <w:numId w:val="1102"/>
+          <w:numId w:val="1108"/>
         </w:numPr>
         <w:pStyle w:val="Compact"/>
       </w:pPr>
@@ -40012,7 +41973,7 @@
       <w:pPr>
         <w:numPr>
           <w:ilvl w:val="0"/>
-          <w:numId w:val="1102"/>
+          <w:numId w:val="1108"/>
         </w:numPr>
         <w:pStyle w:val="Compact"/>
       </w:pPr>
@@ -40027,7 +41988,7 @@
         <w:t xml:space="preserve">Agência Brasil e Poder360 (19/10/2025); MercoPress (10/11/2025); France 24 via Acento (08/11/2025); usdthoy.com (flutuação desde 29/06/2026).</w:t>
       </w:r>
     </w:p>
-    <w:bookmarkEnd w:id="313"/>
+    <w:bookmarkEnd w:id="326"/>
     <w:p>
       <w:r>
         <w:pict>
@@ -40039,7 +42000,7 @@
       <w:pPr>
         <w:numPr>
           <w:ilvl w:val="0"/>
-          <w:numId w:val="1103"/>
+          <w:numId w:val="1109"/>
         </w:numPr>
         <w:pStyle w:val="Compact"/>
       </w:pPr>
@@ -40058,7 +42019,7 @@
       <w:pPr>
         <w:numPr>
           <w:ilvl w:val="0"/>
-          <w:numId w:val="1103"/>
+          <w:numId w:val="1109"/>
         </w:numPr>
         <w:pStyle w:val="Compact"/>
       </w:pPr>
@@ -40077,7 +42038,7 @@
       <w:pPr>
         <w:numPr>
           <w:ilvl w:val="0"/>
-          <w:numId w:val="1103"/>
+          <w:numId w:val="1109"/>
         </w:numPr>
         <w:pStyle w:val="Compact"/>
       </w:pPr>
@@ -40096,7 +42057,7 @@
       <w:pPr>
         <w:numPr>
           <w:ilvl w:val="0"/>
-          <w:numId w:val="1103"/>
+          <w:numId w:val="1109"/>
         </w:numPr>
         <w:pStyle w:val="Compact"/>
       </w:pPr>
@@ -40115,7 +42076,7 @@
       <w:pPr>
         <w:numPr>
           <w:ilvl w:val="0"/>
-          <w:numId w:val="1103"/>
+          <w:numId w:val="1109"/>
         </w:numPr>
         <w:pStyle w:val="Compact"/>
       </w:pPr>
@@ -40134,7 +42095,7 @@
       <w:pPr>
         <w:numPr>
           <w:ilvl w:val="0"/>
-          <w:numId w:val="1103"/>
+          <w:numId w:val="1109"/>
         </w:numPr>
         <w:pStyle w:val="Compact"/>
       </w:pPr>
@@ -40153,7 +42114,7 @@
       <w:pPr>
         <w:numPr>
           <w:ilvl w:val="0"/>
-          <w:numId w:val="1103"/>
+          <w:numId w:val="1109"/>
         </w:numPr>
         <w:pStyle w:val="Compact"/>
       </w:pPr>
@@ -40172,7 +42133,7 @@
       <w:pPr>
         <w:numPr>
           <w:ilvl w:val="0"/>
-          <w:numId w:val="1103"/>
+          <w:numId w:val="1109"/>
         </w:numPr>
         <w:pStyle w:val="Compact"/>
       </w:pPr>
@@ -40191,7 +42152,7 @@
       <w:pPr>
         <w:numPr>
           <w:ilvl w:val="0"/>
-          <w:numId w:val="1103"/>
+          <w:numId w:val="1109"/>
         </w:numPr>
         <w:pStyle w:val="Compact"/>
       </w:pPr>
@@ -40210,7 +42171,7 @@
       <w:pPr>
         <w:numPr>
           <w:ilvl w:val="0"/>
-          <w:numId w:val="1103"/>
+          <w:numId w:val="1109"/>
         </w:numPr>
         <w:pStyle w:val="Compact"/>
       </w:pPr>
@@ -40229,7 +42190,7 @@
       <w:pPr>
         <w:numPr>
           <w:ilvl w:val="0"/>
-          <w:numId w:val="1103"/>
+          <w:numId w:val="1109"/>
         </w:numPr>
         <w:pStyle w:val="Compact"/>
       </w:pPr>
@@ -40255,7 +42216,7 @@
       <w:pPr>
         <w:numPr>
           <w:ilvl w:val="0"/>
-          <w:numId w:val="1104"/>
+          <w:numId w:val="1110"/>
         </w:numPr>
         <w:pStyle w:val="Compact"/>
       </w:pPr>
@@ -40274,7 +42235,7 @@
       <w:pPr>
         <w:numPr>
           <w:ilvl w:val="0"/>
-          <w:numId w:val="1104"/>
+          <w:numId w:val="1110"/>
         </w:numPr>
         <w:pStyle w:val="Compact"/>
       </w:pPr>
@@ -40293,7 +42254,7 @@
       <w:pPr>
         <w:numPr>
           <w:ilvl w:val="0"/>
-          <w:numId w:val="1104"/>
+          <w:numId w:val="1110"/>
         </w:numPr>
         <w:pStyle w:val="Compact"/>
       </w:pPr>
@@ -40312,7 +42273,7 @@
       <w:pPr>
         <w:numPr>
           <w:ilvl w:val="0"/>
-          <w:numId w:val="1104"/>
+          <w:numId w:val="1110"/>
         </w:numPr>
         <w:pStyle w:val="Compact"/>
       </w:pPr>
@@ -40331,7 +42292,7 @@
       <w:pPr>
         <w:numPr>
           <w:ilvl w:val="0"/>
-          <w:numId w:val="1104"/>
+          <w:numId w:val="1110"/>
         </w:numPr>
         <w:pStyle w:val="Compact"/>
       </w:pPr>
@@ -40350,7 +42311,7 @@
       <w:pPr>
         <w:numPr>
           <w:ilvl w:val="0"/>
-          <w:numId w:val="1104"/>
+          <w:numId w:val="1110"/>
         </w:numPr>
         <w:pStyle w:val="Compact"/>
       </w:pPr>
@@ -40369,7 +42330,7 @@
       <w:pPr>
         <w:numPr>
           <w:ilvl w:val="0"/>
-          <w:numId w:val="1104"/>
+          <w:numId w:val="1110"/>
         </w:numPr>
         <w:pStyle w:val="Compact"/>
       </w:pPr>
@@ -40388,7 +42349,7 @@
       <w:pPr>
         <w:numPr>
           <w:ilvl w:val="0"/>
-          <w:numId w:val="1104"/>
+          <w:numId w:val="1110"/>
         </w:numPr>
         <w:pStyle w:val="Compact"/>
       </w:pPr>
@@ -40407,7 +42368,7 @@
       <w:pPr>
         <w:numPr>
           <w:ilvl w:val="0"/>
-          <w:numId w:val="1104"/>
+          <w:numId w:val="1110"/>
         </w:numPr>
         <w:pStyle w:val="Compact"/>
       </w:pPr>
@@ -40426,7 +42387,7 @@
       <w:pPr>
         <w:numPr>
           <w:ilvl w:val="0"/>
-          <w:numId w:val="1104"/>
+          <w:numId w:val="1110"/>
         </w:numPr>
         <w:pStyle w:val="Compact"/>
       </w:pPr>
@@ -40445,7 +42406,7 @@
       <w:pPr>
         <w:numPr>
           <w:ilvl w:val="0"/>
-          <w:numId w:val="1104"/>
+          <w:numId w:val="1110"/>
         </w:numPr>
         <w:pStyle w:val="Compact"/>
       </w:pPr>
@@ -40464,7 +42425,7 @@
       <w:pPr>
         <w:numPr>
           <w:ilvl w:val="0"/>
-          <w:numId w:val="1104"/>
+          <w:numId w:val="1110"/>
         </w:numPr>
         <w:pStyle w:val="Compact"/>
       </w:pPr>
@@ -40483,7 +42444,7 @@
       <w:pPr>
         <w:numPr>
           <w:ilvl w:val="0"/>
-          <w:numId w:val="1104"/>
+          <w:numId w:val="1110"/>
         </w:numPr>
         <w:pStyle w:val="Compact"/>
       </w:pPr>
@@ -40502,7 +42463,7 @@
       <w:pPr>
         <w:numPr>
           <w:ilvl w:val="0"/>
-          <w:numId w:val="1104"/>
+          <w:numId w:val="1110"/>
         </w:numPr>
         <w:pStyle w:val="Compact"/>
       </w:pPr>
@@ -40528,7 +42489,7 @@
       <w:pPr>
         <w:numPr>
           <w:ilvl w:val="0"/>
-          <w:numId w:val="1105"/>
+          <w:numId w:val="1111"/>
         </w:numPr>
         <w:pStyle w:val="Compact"/>
       </w:pPr>
@@ -40547,7 +42508,7 @@
       <w:pPr>
         <w:numPr>
           <w:ilvl w:val="0"/>
-          <w:numId w:val="1105"/>
+          <w:numId w:val="1111"/>
         </w:numPr>
         <w:pStyle w:val="Compact"/>
       </w:pPr>
@@ -40566,7 +42527,7 @@
       <w:pPr>
         <w:numPr>
           <w:ilvl w:val="0"/>
-          <w:numId w:val="1105"/>
+          <w:numId w:val="1111"/>
         </w:numPr>
         <w:pStyle w:val="Compact"/>
       </w:pPr>
@@ -40585,7 +42546,7 @@
       <w:pPr>
         <w:numPr>
           <w:ilvl w:val="0"/>
-          <w:numId w:val="1105"/>
+          <w:numId w:val="1111"/>
         </w:numPr>
         <w:pStyle w:val="Compact"/>
       </w:pPr>
@@ -40604,7 +42565,7 @@
       <w:pPr>
         <w:numPr>
           <w:ilvl w:val="0"/>
-          <w:numId w:val="1105"/>
+          <w:numId w:val="1111"/>
         </w:numPr>
         <w:pStyle w:val="Compact"/>
       </w:pPr>
@@ -40623,7 +42584,7 @@
       <w:pPr>
         <w:numPr>
           <w:ilvl w:val="0"/>
-          <w:numId w:val="1105"/>
+          <w:numId w:val="1111"/>
         </w:numPr>
         <w:pStyle w:val="Compact"/>
       </w:pPr>
@@ -40642,7 +42603,7 @@
       <w:pPr>
         <w:numPr>
           <w:ilvl w:val="0"/>
-          <w:numId w:val="1105"/>
+          <w:numId w:val="1111"/>
         </w:numPr>
         <w:pStyle w:val="Compact"/>
       </w:pPr>
@@ -40661,7 +42622,7 @@
       <w:pPr>
         <w:numPr>
           <w:ilvl w:val="0"/>
-          <w:numId w:val="1105"/>
+          <w:numId w:val="1111"/>
         </w:numPr>
         <w:pStyle w:val="Compact"/>
       </w:pPr>
@@ -40680,7 +42641,7 @@
       <w:pPr>
         <w:numPr>
           <w:ilvl w:val="0"/>
-          <w:numId w:val="1105"/>
+          <w:numId w:val="1111"/>
         </w:numPr>
         <w:pStyle w:val="Compact"/>
       </w:pPr>
@@ -40699,7 +42660,7 @@
       <w:pPr>
         <w:numPr>
           <w:ilvl w:val="0"/>
-          <w:numId w:val="1105"/>
+          <w:numId w:val="1111"/>
         </w:numPr>
         <w:pStyle w:val="Compact"/>
       </w:pPr>
@@ -40718,7 +42679,7 @@
       <w:pPr>
         <w:numPr>
           <w:ilvl w:val="0"/>
-          <w:numId w:val="1105"/>
+          <w:numId w:val="1111"/>
         </w:numPr>
         <w:pStyle w:val="Compact"/>
       </w:pPr>
@@ -40737,7 +42698,7 @@
       <w:pPr>
         <w:numPr>
           <w:ilvl w:val="0"/>
-          <w:numId w:val="1105"/>
+          <w:numId w:val="1111"/>
         </w:numPr>
         <w:pStyle w:val="Compact"/>
       </w:pPr>
@@ -40756,7 +42717,7 @@
       <w:pPr>
         <w:numPr>
           <w:ilvl w:val="0"/>
-          <w:numId w:val="1105"/>
+          <w:numId w:val="1111"/>
         </w:numPr>
         <w:pStyle w:val="Compact"/>
       </w:pPr>
@@ -40775,7 +42736,7 @@
       <w:pPr>
         <w:numPr>
           <w:ilvl w:val="0"/>
-          <w:numId w:val="1105"/>
+          <w:numId w:val="1111"/>
         </w:numPr>
         <w:pStyle w:val="Compact"/>
       </w:pPr>
@@ -40801,7 +42762,7 @@
       <w:pPr>
         <w:numPr>
           <w:ilvl w:val="0"/>
-          <w:numId w:val="1106"/>
+          <w:numId w:val="1112"/>
         </w:numPr>
         <w:pStyle w:val="Compact"/>
       </w:pPr>
@@ -40820,7 +42781,7 @@
       <w:pPr>
         <w:numPr>
           <w:ilvl w:val="0"/>
-          <w:numId w:val="1106"/>
+          <w:numId w:val="1112"/>
         </w:numPr>
         <w:pStyle w:val="Compact"/>
       </w:pPr>
@@ -40839,7 +42800,7 @@
       <w:pPr>
         <w:numPr>
           <w:ilvl w:val="0"/>
-          <w:numId w:val="1106"/>
+          <w:numId w:val="1112"/>
         </w:numPr>
         <w:pStyle w:val="Compact"/>
       </w:pPr>
@@ -40858,7 +42819,7 @@
       <w:pPr>
         <w:numPr>
           <w:ilvl w:val="0"/>
-          <w:numId w:val="1106"/>
+          <w:numId w:val="1112"/>
         </w:numPr>
         <w:pStyle w:val="Compact"/>
       </w:pPr>
@@ -40877,7 +42838,7 @@
       <w:pPr>
         <w:numPr>
           <w:ilvl w:val="0"/>
-          <w:numId w:val="1106"/>
+          <w:numId w:val="1112"/>
         </w:numPr>
         <w:pStyle w:val="Compact"/>
       </w:pPr>
@@ -40896,7 +42857,7 @@
       <w:pPr>
         <w:numPr>
           <w:ilvl w:val="0"/>
-          <w:numId w:val="1106"/>
+          <w:numId w:val="1112"/>
         </w:numPr>
         <w:pStyle w:val="Compact"/>
       </w:pPr>
@@ -40915,7 +42876,7 @@
       <w:pPr>
         <w:numPr>
           <w:ilvl w:val="0"/>
-          <w:numId w:val="1106"/>
+          <w:numId w:val="1112"/>
         </w:numPr>
         <w:pStyle w:val="Compact"/>
       </w:pPr>
@@ -40934,7 +42895,7 @@
       <w:pPr>
         <w:numPr>
           <w:ilvl w:val="0"/>
-          <w:numId w:val="1106"/>
+          <w:numId w:val="1112"/>
         </w:numPr>
         <w:pStyle w:val="Compact"/>
       </w:pPr>
@@ -40953,7 +42914,7 @@
       <w:pPr>
         <w:numPr>
           <w:ilvl w:val="0"/>
-          <w:numId w:val="1106"/>
+          <w:numId w:val="1112"/>
         </w:numPr>
         <w:pStyle w:val="Compact"/>
       </w:pPr>
@@ -40972,7 +42933,7 @@
       <w:pPr>
         <w:numPr>
           <w:ilvl w:val="0"/>
-          <w:numId w:val="1106"/>
+          <w:numId w:val="1112"/>
         </w:numPr>
         <w:pStyle w:val="Compact"/>
       </w:pPr>
@@ -40991,7 +42952,7 @@
       <w:pPr>
         <w:numPr>
           <w:ilvl w:val="0"/>
-          <w:numId w:val="1106"/>
+          <w:numId w:val="1112"/>
         </w:numPr>
         <w:pStyle w:val="Compact"/>
       </w:pPr>
@@ -41010,7 +42971,7 @@
       <w:pPr>
         <w:numPr>
           <w:ilvl w:val="0"/>
-          <w:numId w:val="1106"/>
+          <w:numId w:val="1112"/>
         </w:numPr>
         <w:pStyle w:val="Compact"/>
       </w:pPr>
@@ -41029,7 +42990,7 @@
       <w:pPr>
         <w:numPr>
           <w:ilvl w:val="0"/>
-          <w:numId w:val="1106"/>
+          <w:numId w:val="1112"/>
         </w:numPr>
         <w:pStyle w:val="Compact"/>
       </w:pPr>
@@ -41055,7 +43016,7 @@
       <w:pPr>
         <w:numPr>
           <w:ilvl w:val="0"/>
-          <w:numId w:val="1107"/>
+          <w:numId w:val="1113"/>
         </w:numPr>
         <w:pStyle w:val="Compact"/>
       </w:pPr>
@@ -41074,7 +43035,7 @@
       <w:pPr>
         <w:numPr>
           <w:ilvl w:val="0"/>
-          <w:numId w:val="1107"/>
+          <w:numId w:val="1113"/>
         </w:numPr>
         <w:pStyle w:val="Compact"/>
       </w:pPr>
@@ -41093,7 +43054,7 @@
       <w:pPr>
         <w:numPr>
           <w:ilvl w:val="0"/>
-          <w:numId w:val="1107"/>
+          <w:numId w:val="1113"/>
         </w:numPr>
         <w:pStyle w:val="Compact"/>
       </w:pPr>
@@ -41112,7 +43073,7 @@
       <w:pPr>
         <w:numPr>
           <w:ilvl w:val="0"/>
-          <w:numId w:val="1107"/>
+          <w:numId w:val="1113"/>
         </w:numPr>
         <w:pStyle w:val="Compact"/>
       </w:pPr>
@@ -41131,7 +43092,7 @@
       <w:pPr>
         <w:numPr>
           <w:ilvl w:val="0"/>
-          <w:numId w:val="1107"/>
+          <w:numId w:val="1113"/>
         </w:numPr>
         <w:pStyle w:val="Compact"/>
       </w:pPr>
@@ -41150,7 +43111,7 @@
       <w:pPr>
         <w:numPr>
           <w:ilvl w:val="0"/>
-          <w:numId w:val="1107"/>
+          <w:numId w:val="1113"/>
         </w:numPr>
         <w:pStyle w:val="Compact"/>
       </w:pPr>
@@ -41169,7 +43130,7 @@
       <w:pPr>
         <w:numPr>
           <w:ilvl w:val="0"/>
-          <w:numId w:val="1107"/>
+          <w:numId w:val="1113"/>
         </w:numPr>
         <w:pStyle w:val="Compact"/>
       </w:pPr>
@@ -41188,7 +43149,7 @@
       <w:pPr>
         <w:numPr>
           <w:ilvl w:val="0"/>
-          <w:numId w:val="1107"/>
+          <w:numId w:val="1113"/>
         </w:numPr>
         <w:pStyle w:val="Compact"/>
       </w:pPr>
@@ -41207,7 +43168,7 @@
       <w:pPr>
         <w:numPr>
           <w:ilvl w:val="0"/>
-          <w:numId w:val="1107"/>
+          <w:numId w:val="1113"/>
         </w:numPr>
         <w:pStyle w:val="Compact"/>
       </w:pPr>
@@ -41226,7 +43187,7 @@
       <w:pPr>
         <w:numPr>
           <w:ilvl w:val="0"/>
-          <w:numId w:val="1107"/>
+          <w:numId w:val="1113"/>
         </w:numPr>
         <w:pStyle w:val="Compact"/>
       </w:pPr>
@@ -41245,7 +43206,7 @@
       <w:pPr>
         <w:numPr>
           <w:ilvl w:val="0"/>
-          <w:numId w:val="1107"/>
+          <w:numId w:val="1113"/>
         </w:numPr>
         <w:pStyle w:val="Compact"/>
       </w:pPr>
@@ -41271,7 +43232,7 @@
       <w:pPr>
         <w:numPr>
           <w:ilvl w:val="0"/>
-          <w:numId w:val="1108"/>
+          <w:numId w:val="1114"/>
         </w:numPr>
         <w:pStyle w:val="Compact"/>
       </w:pPr>
@@ -41290,7 +43251,7 @@
       <w:pPr>
         <w:numPr>
           <w:ilvl w:val="0"/>
-          <w:numId w:val="1108"/>
+          <w:numId w:val="1114"/>
         </w:numPr>
         <w:pStyle w:val="Compact"/>
       </w:pPr>
@@ -41309,7 +43270,7 @@
       <w:pPr>
         <w:numPr>
           <w:ilvl w:val="0"/>
-          <w:numId w:val="1108"/>
+          <w:numId w:val="1114"/>
         </w:numPr>
         <w:pStyle w:val="Compact"/>
       </w:pPr>
@@ -41328,7 +43289,7 @@
       <w:pPr>
         <w:numPr>
           <w:ilvl w:val="0"/>
-          <w:numId w:val="1108"/>
+          <w:numId w:val="1114"/>
         </w:numPr>
         <w:pStyle w:val="Compact"/>
       </w:pPr>
@@ -41347,7 +43308,7 @@
       <w:pPr>
         <w:numPr>
           <w:ilvl w:val="0"/>
-          <w:numId w:val="1108"/>
+          <w:numId w:val="1114"/>
         </w:numPr>
         <w:pStyle w:val="Compact"/>
       </w:pPr>
@@ -41366,7 +43327,7 @@
       <w:pPr>
         <w:numPr>
           <w:ilvl w:val="0"/>
-          <w:numId w:val="1108"/>
+          <w:numId w:val="1114"/>
         </w:numPr>
         <w:pStyle w:val="Compact"/>
       </w:pPr>
@@ -41385,7 +43346,7 @@
       <w:pPr>
         <w:numPr>
           <w:ilvl w:val="0"/>
-          <w:numId w:val="1108"/>
+          <w:numId w:val="1114"/>
         </w:numPr>
         <w:pStyle w:val="Compact"/>
       </w:pPr>
@@ -41404,7 +43365,7 @@
       <w:pPr>
         <w:numPr>
           <w:ilvl w:val="0"/>
-          <w:numId w:val="1108"/>
+          <w:numId w:val="1114"/>
         </w:numPr>
         <w:pStyle w:val="Compact"/>
       </w:pPr>
@@ -41423,7 +43384,7 @@
       <w:pPr>
         <w:numPr>
           <w:ilvl w:val="0"/>
-          <w:numId w:val="1108"/>
+          <w:numId w:val="1114"/>
         </w:numPr>
         <w:pStyle w:val="Compact"/>
       </w:pPr>
@@ -41442,7 +43403,7 @@
       <w:pPr>
         <w:numPr>
           <w:ilvl w:val="0"/>
-          <w:numId w:val="1108"/>
+          <w:numId w:val="1114"/>
         </w:numPr>
         <w:pStyle w:val="Compact"/>
       </w:pPr>
@@ -41461,7 +43422,7 @@
       <w:pPr>
         <w:numPr>
           <w:ilvl w:val="0"/>
-          <w:numId w:val="1108"/>
+          <w:numId w:val="1114"/>
         </w:numPr>
         <w:pStyle w:val="Compact"/>
       </w:pPr>
@@ -41480,7 +43441,7 @@
       <w:pPr>
         <w:numPr>
           <w:ilvl w:val="0"/>
-          <w:numId w:val="1108"/>
+          <w:numId w:val="1114"/>
         </w:numPr>
         <w:pStyle w:val="Compact"/>
       </w:pPr>
@@ -41499,7 +43460,7 @@
       <w:pPr>
         <w:numPr>
           <w:ilvl w:val="0"/>
-          <w:numId w:val="1108"/>
+          <w:numId w:val="1114"/>
         </w:numPr>
         <w:pStyle w:val="Compact"/>
       </w:pPr>
@@ -41518,7 +43479,7 @@
       <w:pPr>
         <w:numPr>
           <w:ilvl w:val="0"/>
-          <w:numId w:val="1108"/>
+          <w:numId w:val="1114"/>
         </w:numPr>
         <w:pStyle w:val="Compact"/>
       </w:pPr>
@@ -41544,7 +43505,7 @@
       <w:pPr>
         <w:numPr>
           <w:ilvl w:val="0"/>
-          <w:numId w:val="1109"/>
+          <w:numId w:val="1115"/>
         </w:numPr>
         <w:pStyle w:val="Compact"/>
       </w:pPr>
@@ -41563,7 +43524,7 @@
       <w:pPr>
         <w:numPr>
           <w:ilvl w:val="0"/>
-          <w:numId w:val="1109"/>
+          <w:numId w:val="1115"/>
         </w:numPr>
         <w:pStyle w:val="Compact"/>
       </w:pPr>
@@ -41582,7 +43543,7 @@
       <w:pPr>
         <w:numPr>
           <w:ilvl w:val="0"/>
-          <w:numId w:val="1109"/>
+          <w:numId w:val="1115"/>
         </w:numPr>
         <w:pStyle w:val="Compact"/>
       </w:pPr>
@@ -41601,7 +43562,7 @@
       <w:pPr>
         <w:numPr>
           <w:ilvl w:val="0"/>
-          <w:numId w:val="1109"/>
+          <w:numId w:val="1115"/>
         </w:numPr>
         <w:pStyle w:val="Compact"/>
       </w:pPr>
@@ -41620,7 +43581,7 @@
       <w:pPr>
         <w:numPr>
           <w:ilvl w:val="0"/>
-          <w:numId w:val="1109"/>
+          <w:numId w:val="1115"/>
         </w:numPr>
         <w:pStyle w:val="Compact"/>
       </w:pPr>
@@ -41639,7 +43600,7 @@
       <w:pPr>
         <w:numPr>
           <w:ilvl w:val="0"/>
-          <w:numId w:val="1109"/>
+          <w:numId w:val="1115"/>
         </w:numPr>
         <w:pStyle w:val="Compact"/>
       </w:pPr>
@@ -41658,7 +43619,7 @@
       <w:pPr>
         <w:numPr>
           <w:ilvl w:val="0"/>
-          <w:numId w:val="1109"/>
+          <w:numId w:val="1115"/>
         </w:numPr>
         <w:pStyle w:val="Compact"/>
       </w:pPr>
@@ -41677,7 +43638,7 @@
       <w:pPr>
         <w:numPr>
           <w:ilvl w:val="0"/>
-          <w:numId w:val="1109"/>
+          <w:numId w:val="1115"/>
         </w:numPr>
         <w:pStyle w:val="Compact"/>
       </w:pPr>
@@ -41696,7 +43657,7 @@
       <w:pPr>
         <w:numPr>
           <w:ilvl w:val="0"/>
-          <w:numId w:val="1109"/>
+          <w:numId w:val="1115"/>
         </w:numPr>
         <w:pStyle w:val="Compact"/>
       </w:pPr>
@@ -41715,7 +43676,7 @@
       <w:pPr>
         <w:numPr>
           <w:ilvl w:val="0"/>
-          <w:numId w:val="1109"/>
+          <w:numId w:val="1115"/>
         </w:numPr>
         <w:pStyle w:val="Compact"/>
       </w:pPr>
@@ -41734,7 +43695,7 @@
       <w:pPr>
         <w:numPr>
           <w:ilvl w:val="0"/>
-          <w:numId w:val="1109"/>
+          <w:numId w:val="1115"/>
         </w:numPr>
         <w:pStyle w:val="Compact"/>
       </w:pPr>
@@ -41760,7 +43721,7 @@
       <w:pPr>
         <w:numPr>
           <w:ilvl w:val="0"/>
-          <w:numId w:val="1110"/>
+          <w:numId w:val="1116"/>
         </w:numPr>
         <w:pStyle w:val="Compact"/>
       </w:pPr>
@@ -41779,7 +43740,7 @@
       <w:pPr>
         <w:numPr>
           <w:ilvl w:val="0"/>
-          <w:numId w:val="1110"/>
+          <w:numId w:val="1116"/>
         </w:numPr>
         <w:pStyle w:val="Compact"/>
       </w:pPr>
@@ -41798,7 +43759,7 @@
       <w:pPr>
         <w:numPr>
           <w:ilvl w:val="0"/>
-          <w:numId w:val="1110"/>
+          <w:numId w:val="1116"/>
         </w:numPr>
         <w:pStyle w:val="Compact"/>
       </w:pPr>
@@ -41817,7 +43778,7 @@
       <w:pPr>
         <w:numPr>
           <w:ilvl w:val="0"/>
-          <w:numId w:val="1110"/>
+          <w:numId w:val="1116"/>
         </w:numPr>
         <w:pStyle w:val="Compact"/>
       </w:pPr>
@@ -41836,7 +43797,7 @@
       <w:pPr>
         <w:numPr>
           <w:ilvl w:val="0"/>
-          <w:numId w:val="1110"/>
+          <w:numId w:val="1116"/>
         </w:numPr>
         <w:pStyle w:val="Compact"/>
       </w:pPr>
@@ -41855,7 +43816,7 @@
       <w:pPr>
         <w:numPr>
           <w:ilvl w:val="0"/>
-          <w:numId w:val="1110"/>
+          <w:numId w:val="1116"/>
         </w:numPr>
         <w:pStyle w:val="Compact"/>
       </w:pPr>
@@ -41874,7 +43835,7 @@
       <w:pPr>
         <w:numPr>
           <w:ilvl w:val="0"/>
-          <w:numId w:val="1110"/>
+          <w:numId w:val="1116"/>
         </w:numPr>
         <w:pStyle w:val="Compact"/>
       </w:pPr>
@@ -41893,7 +43854,7 @@
       <w:pPr>
         <w:numPr>
           <w:ilvl w:val="0"/>
-          <w:numId w:val="1110"/>
+          <w:numId w:val="1116"/>
         </w:numPr>
         <w:pStyle w:val="Compact"/>
       </w:pPr>
@@ -41912,7 +43873,7 @@
       <w:pPr>
         <w:numPr>
           <w:ilvl w:val="0"/>
-          <w:numId w:val="1110"/>
+          <w:numId w:val="1116"/>
         </w:numPr>
         <w:pStyle w:val="Compact"/>
       </w:pPr>
@@ -41931,7 +43892,7 @@
       <w:pPr>
         <w:numPr>
           <w:ilvl w:val="0"/>
-          <w:numId w:val="1110"/>
+          <w:numId w:val="1116"/>
         </w:numPr>
         <w:pStyle w:val="Compact"/>
       </w:pPr>
@@ -41950,7 +43911,7 @@
       <w:pPr>
         <w:numPr>
           <w:ilvl w:val="0"/>
-          <w:numId w:val="1110"/>
+          <w:numId w:val="1116"/>
         </w:numPr>
         <w:pStyle w:val="Compact"/>
       </w:pPr>
@@ -41976,7 +43937,7 @@
       <w:pPr>
         <w:numPr>
           <w:ilvl w:val="0"/>
-          <w:numId w:val="1111"/>
+          <w:numId w:val="1117"/>
         </w:numPr>
         <w:pStyle w:val="Compact"/>
       </w:pPr>
@@ -41995,7 +43956,7 @@
       <w:pPr>
         <w:numPr>
           <w:ilvl w:val="0"/>
-          <w:numId w:val="1111"/>
+          <w:numId w:val="1117"/>
         </w:numPr>
         <w:pStyle w:val="Compact"/>
       </w:pPr>
@@ -42014,7 +43975,7 @@
       <w:pPr>
         <w:numPr>
           <w:ilvl w:val="0"/>
-          <w:numId w:val="1111"/>
+          <w:numId w:val="1117"/>
         </w:numPr>
         <w:pStyle w:val="Compact"/>
       </w:pPr>
@@ -42033,7 +43994,7 @@
       <w:pPr>
         <w:numPr>
           <w:ilvl w:val="0"/>
-          <w:numId w:val="1111"/>
+          <w:numId w:val="1117"/>
         </w:numPr>
         <w:pStyle w:val="Compact"/>
       </w:pPr>
@@ -42052,7 +44013,7 @@
       <w:pPr>
         <w:numPr>
           <w:ilvl w:val="0"/>
-          <w:numId w:val="1111"/>
+          <w:numId w:val="1117"/>
         </w:numPr>
         <w:pStyle w:val="Compact"/>
       </w:pPr>
@@ -42071,7 +44032,7 @@
       <w:pPr>
         <w:numPr>
           <w:ilvl w:val="0"/>
-          <w:numId w:val="1111"/>
+          <w:numId w:val="1117"/>
         </w:numPr>
         <w:pStyle w:val="Compact"/>
       </w:pPr>
@@ -42090,7 +44051,7 @@
       <w:pPr>
         <w:numPr>
           <w:ilvl w:val="0"/>
-          <w:numId w:val="1111"/>
+          <w:numId w:val="1117"/>
         </w:numPr>
         <w:pStyle w:val="Compact"/>
       </w:pPr>
@@ -42109,7 +44070,7 @@
       <w:pPr>
         <w:numPr>
           <w:ilvl w:val="0"/>
-          <w:numId w:val="1111"/>
+          <w:numId w:val="1117"/>
         </w:numPr>
         <w:pStyle w:val="Compact"/>
       </w:pPr>
@@ -42128,7 +44089,7 @@
       <w:pPr>
         <w:numPr>
           <w:ilvl w:val="0"/>
-          <w:numId w:val="1111"/>
+          <w:numId w:val="1117"/>
         </w:numPr>
         <w:pStyle w:val="Compact"/>
       </w:pPr>
@@ -42147,7 +44108,7 @@
       <w:pPr>
         <w:numPr>
           <w:ilvl w:val="0"/>
-          <w:numId w:val="1111"/>
+          <w:numId w:val="1117"/>
         </w:numPr>
         <w:pStyle w:val="Compact"/>
       </w:pPr>
@@ -42166,7 +44127,7 @@
       <w:pPr>
         <w:numPr>
           <w:ilvl w:val="0"/>
-          <w:numId w:val="1111"/>
+          <w:numId w:val="1117"/>
         </w:numPr>
         <w:pStyle w:val="Compact"/>
       </w:pPr>
@@ -42182,19 +44143,178 @@
       </w:r>
     </w:p>
     <w:p>
-      <w:pPr>
-        <w:numPr>
-          <w:ilvl w:val="0"/>
-          <w:numId w:val="1111"/>
-        </w:numPr>
-        <w:pStyle w:val="Compact"/>
-      </w:pPr>
-      <w:r>
-        <w:rPr>
-          <w:bCs/>
-          <w:b/>
-        </w:rPr>
-        <w:t xml:space="preserve">p. 203</w:t>
+      <w:r>
+        <w:pict>
+          <v:rect style="width:0;height:1.5pt" o:hralign="center" o:hrstd="t" o:hr="t"/>
+        </w:pict>
+      </w:r>
+    </w:p>
+    <w:p>
+      <w:pPr>
+        <w:numPr>
+          <w:ilvl w:val="0"/>
+          <w:numId w:val="1118"/>
+        </w:numPr>
+        <w:pStyle w:val="Compact"/>
+      </w:pPr>
+      <w:r>
+        <w:rPr>
+          <w:bCs/>
+          <w:b/>
+        </w:rPr>
+        <w:t xml:space="preserve">p. 195</w:t>
+      </w:r>
+      <w:r>
+        <w:t xml:space="preserve">MercoPress (posse de Paz, 2025; posse de Orsi, 01/03/2025); posses oficiais (Peña, 15/08/2023; Milei, 10/12/2023); Band (suspensão de vistos de imigrante para brasileiros desde 21/01/2026); Mercer via Band (Montevidéu, cidade mais cara da América Latina).</w:t>
+      </w:r>
+    </w:p>
+    <w:p>
+      <w:pPr>
+        <w:numPr>
+          <w:ilvl w:val="0"/>
+          <w:numId w:val="1118"/>
+        </w:numPr>
+        <w:pStyle w:val="Compact"/>
+      </w:pPr>
+      <w:r>
+        <w:rPr>
+          <w:bCs/>
+          <w:b/>
+        </w:rPr>
+        <w:t xml:space="preserve">p. 196</w:t>
+      </w:r>
+      <w:r>
+        <w:t xml:space="preserve">The Rio Times (22.628 residências para brasileiros no 1º sem./2026 vs. 11.723 em 2025); Expats Argentina, 06/10/2026 (temporária Mercosul de 2 anos, cédula após a permanente); Bleap (renda de ~US$ 500); Portas e Paraíba Business (brasileiros no mercado imobiliário, 2026).</w:t>
+      </w:r>
+    </w:p>
+    <w:p>
+      <w:pPr>
+        <w:numPr>
+          <w:ilvl w:val="0"/>
+          <w:numId w:val="1118"/>
+        </w:numPr>
+        <w:pStyle w:val="Compact"/>
+      </w:pPr>
+      <w:r>
+        <w:rPr>
+          <w:bCs/>
+          <w:b/>
+        </w:rPr>
+        <w:t xml:space="preserve">p. 197</w:t>
+      </w:r>
+      <w:r>
+        <w:t xml:space="preserve">El Dorado e guias P2P (USDT com guarani via bancos locais); CriptoNoticias (BCP: sem regulação específica, cripto sem curso legal); fonte secundária (Resolução Geral DNIT 47/2026).</w:t>
+      </w:r>
+    </w:p>
+    <w:p>
+      <w:pPr>
+        <w:numPr>
+          <w:ilvl w:val="0"/>
+          <w:numId w:val="1118"/>
+        </w:numPr>
+        <w:pStyle w:val="Compact"/>
+      </w:pPr>
+      <w:r>
+        <w:rPr>
+          <w:bCs/>
+          <w:b/>
+        </w:rPr>
+        <w:t xml:space="preserve">p. 198</w:t>
+      </w:r>
+      <w:r>
+        <w:t xml:space="preserve">INDEC (IPC 2023 e 2025); REM/BCRA via GBM e Bloomberg Línea (inflação mensal e dólar, out/2026); Hace Cuentas (dólar oficial em 01/10/2026); Papelea e Expats Argentina (residência Mercosul via RADEX; Disposição DNM 1637/2022).</w:t>
+      </w:r>
+    </w:p>
+    <w:p>
+      <w:pPr>
+        <w:numPr>
+          <w:ilvl w:val="0"/>
+          <w:numId w:val="1118"/>
+        </w:numPr>
+        <w:pStyle w:val="Compact"/>
+      </w:pPr>
+      <w:r>
+        <w:rPr>
+          <w:bCs/>
+          <w:b/>
+        </w:rPr>
+        <w:t xml:space="preserve">p. 199</w:t>
+      </w:r>
+      <w:r>
+        <w:t xml:space="preserve">REM/BCRA via Bloomberg Línea e Notícias NQN (inflação ~29,8–30% em 2026; dólar de ARS 1.614–1.652 em dez/2026); Papelea × Expats Argentina (divergência sobre prorrogação).</w:t>
+      </w:r>
+    </w:p>
+    <w:p>
+      <w:pPr>
+        <w:numPr>
+          <w:ilvl w:val="0"/>
+          <w:numId w:val="1118"/>
+        </w:numPr>
+        <w:pStyle w:val="Compact"/>
+      </w:pPr>
+      <w:r>
+        <w:rPr>
+          <w:bCs/>
+          <w:b/>
+        </w:rPr>
+        <w:t xml:space="preserve">p. 200</w:t>
+      </w:r>
+      <w:r>
+        <w:t xml:space="preserve">MercoPress e La República (posse de Orsi em 01/03/2025, sucedendo Lacalle Pou); CNN Brasil (perfil); Mercer via Band (Montevidéu, cidade mais cara da América Latina); Nomad (família de R$ 15–20 mil/mês); Bleap e Henley (residência Mercosul, renda divergente).</w:t>
+      </w:r>
+    </w:p>
+    <w:p>
+      <w:pPr>
+        <w:numPr>
+          <w:ilvl w:val="0"/>
+          <w:numId w:val="1118"/>
+        </w:numPr>
+        <w:pStyle w:val="Compact"/>
+      </w:pPr>
+      <w:r>
+        <w:rPr>
+          <w:bCs/>
+          <w:b/>
+        </w:rPr>
+        <w:t xml:space="preserve">p. 201</w:t>
+      </w:r>
+      <w:r>
+        <w:t xml:space="preserve">Guias D7 2026 (renda de referência de €920; duas etapas, consulado e AIMA; acúmulo de mais de 400 mil processos); Numbeo mai/2026 via Cidadania e Visto (Lisboa €1.280); Meelion, 09/10/2026 (€1 = R$ 5,62).</w:t>
+      </w:r>
+    </w:p>
+    <w:p>
+      <w:pPr>
+        <w:numPr>
+          <w:ilvl w:val="0"/>
+          <w:numId w:val="1118"/>
+        </w:numPr>
+        <w:pStyle w:val="Compact"/>
+      </w:pPr>
+      <w:r>
+        <w:rPr>
+          <w:bCs/>
+          <w:b/>
+        </w:rPr>
+        <w:t xml:space="preserve">p. 202</w:t>
+      </w:r>
+      <w:r>
+        <w:t xml:space="preserve">Band (suspensão de vistos de imigrante para brasileiros a partir de 21/01/2026); Jovem Pan e Investidor10 (taxa de US$ 250; Brasil fora da caução); Zumper via WLRN, set/2026 (Miami US$ 2.500 × R$ 5,35).</w:t>
+      </w:r>
+    </w:p>
+    <w:p>
+      <w:pPr>
+        <w:numPr>
+          <w:ilvl w:val="0"/>
+          <w:numId w:val="1118"/>
+        </w:numPr>
+        <w:pStyle w:val="Compact"/>
+      </w:pPr>
+      <w:r>
+        <w:rPr>
+          <w:bCs/>
+          <w:b/>
+        </w:rPr>
+        <w:t xml:space="preserve">p. 213</w:t>
       </w:r>
       <w:r>
         <w:t xml:space="preserve">Gazeta do Povo (arrecadação 2025; 1 imposto a cada 27 dias; dívida e juros, ago/2026; herança de 90% do PIB); Poder360 (IOF 3,5%; dívida 82,9% do PIB segundo o BC).</w:t>
@@ -43473,6 +45593,24 @@
     <w:abstractNumId w:val="991"/>
   </w:num>
   <w:num w:numId="1101">
+    <w:abstractNumId w:val="991"/>
+  </w:num>
+  <w:num w:numId="1102">
+    <w:abstractNumId w:val="991"/>
+  </w:num>
+  <w:num w:numId="1103">
+    <w:abstractNumId w:val="991"/>
+  </w:num>
+  <w:num w:numId="1104">
+    <w:abstractNumId w:val="991"/>
+  </w:num>
+  <w:num w:numId="1105">
+    <w:abstractNumId w:val="991"/>
+  </w:num>
+  <w:num w:numId="1106">
+    <w:abstractNumId w:val="991"/>
+  </w:num>
+  <w:num w:numId="1107">
     <w:abstractNumId w:val="99201"/>
     <w:lvlOverride w:ilvl="0">
       <w:startOverride w:val="1"/>
@@ -43502,24 +45640,6 @@
       <w:startOverride w:val="1"/>
     </w:lvlOverride>
   </w:num>
-  <w:num w:numId="1102">
-    <w:abstractNumId w:val="991"/>
-  </w:num>
-  <w:num w:numId="1103">
-    <w:abstractNumId w:val="991"/>
-  </w:num>
-  <w:num w:numId="1104">
-    <w:abstractNumId w:val="991"/>
-  </w:num>
-  <w:num w:numId="1105">
-    <w:abstractNumId w:val="991"/>
-  </w:num>
-  <w:num w:numId="1106">
-    <w:abstractNumId w:val="991"/>
-  </w:num>
-  <w:num w:numId="1107">
-    <w:abstractNumId w:val="991"/>
-  </w:num>
   <w:num w:numId="1108">
     <w:abstractNumId w:val="991"/>
   </w:num>
@@ -43530,6 +45650,27 @@
     <w:abstractNumId w:val="991"/>
   </w:num>
   <w:num w:numId="1111">
+    <w:abstractNumId w:val="991"/>
+  </w:num>
+  <w:num w:numId="1112">
+    <w:abstractNumId w:val="991"/>
+  </w:num>
+  <w:num w:numId="1113">
+    <w:abstractNumId w:val="991"/>
+  </w:num>
+  <w:num w:numId="1114">
+    <w:abstractNumId w:val="991"/>
+  </w:num>
+  <w:num w:numId="1115">
+    <w:abstractNumId w:val="991"/>
+  </w:num>
+  <w:num w:numId="1116">
+    <w:abstractNumId w:val="991"/>
+  </w:num>
+  <w:num w:numId="1117">
+    <w:abstractNumId w:val="991"/>
+  </w:num>
+  <w:num w:numId="1118">
     <w:abstractNumId w:val="991"/>
   </w:num>
 </w:numbering>

</xml_diff>

<commit_message>
História do autor na Carta e no depoimento 7.13
Co-Authored-By: Claude Opus 5.5 <noreply@anthropic.com>
Claude-Session: https://claude.ai/code/session_01GJhkYfDrHd3AkmDKDTo71F
</commit_message>
<xml_diff>
--- a/curso/dist/LULA-GANHOU-Curso-Completo.docx
+++ b/curso/dist/LULA-GANHOU-Curso-Completo.docx
@@ -586,7 +586,23 @@
         <w:pStyle w:val="BodyText"/>
       </w:pPr>
       <w:r>
-        <w:t xml:space="preserve">[PEDIR AO AUTOR: história pessoal — por que saiu, há quanto tempo mora, em qual cidade]</w:t>
+        <w:t xml:space="preserve">Eu tinha uma empresa no Brasil.</w:t>
+      </w:r>
+      <w:r>
+        <w:t xml:space="preserve"> </w:t>
+      </w:r>
+      <w:r>
+        <w:rPr>
+          <w:bCs/>
+          <w:b/>
+        </w:rPr>
+        <w:t xml:space="preserve">Fechei.</w:t>
+      </w:r>
+      <w:r>
+        <w:t xml:space="preserve"> </w:t>
+      </w:r>
+      <w:r>
+        <w:t xml:space="preserve">Vi o país ir de mal a pior com a esquerda no poder e as dificuldades que esse governo deixou para quem produz. Em vez de assistir parado, fui pesquisar onde o meu dinheiro renderia mais. Encontrei a Bolívia, fechei a empresa e vim. Hoje estudo medicina aqui e vivo bem.</w:t>
       </w:r>
     </w:p>
     <w:p>
@@ -38559,7 +38575,7 @@
         <w:t xml:space="preserve">Depoimento do autor</w:t>
       </w:r>
     </w:p>
-    <w:bookmarkStart w:id="282" w:name="como-é-viver-aqui-de-verdade"/>
+    <w:bookmarkStart w:id="285" w:name="como-é-viver-aqui-de-verdade"/>
     <w:p>
       <w:pPr>
         <w:pStyle w:val="Heading1"/>
@@ -38586,12 +38602,78 @@
         <w:t xml:space="preserve">moro no Queru Queru, num apê de 3 quartos de Bs 2.800 com condomínio. Almoço por Bs 27. Jantar com vinho em restaurante premiado por Bs 120. Gasto cerca de R$ 1.106 por mês dividindo o apê.</w:t>
       </w:r>
     </w:p>
+    <w:bookmarkStart w:id="282" w:name="por-que-eu-saí"/>
+    <w:p>
+      <w:pPr>
+        <w:pStyle w:val="Heading3"/>
+      </w:pPr>
+      <w:r>
+        <w:t xml:space="preserve">Por que eu saí</w:t>
+      </w:r>
+    </w:p>
+    <w:p>
+      <w:pPr>
+        <w:pStyle w:val="FirstParagraph"/>
+      </w:pPr>
+      <w:r>
+        <w:t xml:space="preserve">Eu tinha uma empresa no Brasil e fechei pela dificuldade que o governo de esquerda deixou no país. Vi o Brasil ir de mal a pior e entendi que não ia esperar a próxima conta chegar.</w:t>
+      </w:r>
+    </w:p>
+    <w:bookmarkEnd w:id="282"/>
+    <w:bookmarkStart w:id="283" w:name="o-que-eu-fiz"/>
+    <w:p>
+      <w:pPr>
+        <w:pStyle w:val="Heading3"/>
+      </w:pPr>
+      <w:r>
+        <w:t xml:space="preserve">O que eu fiz</w:t>
+      </w:r>
+    </w:p>
+    <w:p>
+      <w:pPr>
+        <w:pStyle w:val="FirstParagraph"/>
+      </w:pPr>
+      <w:r>
+        <w:t xml:space="preserve">Comecei a pesquisar países onde o meu dinheiro renderia mais. Cheguei na Bolívia. Fechei a empresa e vim para cá.</w:t>
+      </w:r>
+    </w:p>
+    <w:bookmarkEnd w:id="283"/>
+    <w:bookmarkStart w:id="284" w:name="como-estou-hoje"/>
+    <w:p>
+      <w:pPr>
+        <w:pStyle w:val="Heading3"/>
+      </w:pPr>
+      <w:r>
+        <w:t xml:space="preserve">Como estou hoje</w:t>
+      </w:r>
+    </w:p>
+    <w:p>
+      <w:pPr>
+        <w:pStyle w:val="FirstParagraph"/>
+      </w:pPr>
+      <w:r>
+        <w:t xml:space="preserve">Para não ficar parado, entrei na faculdade de</w:t>
+      </w:r>
+      <w:r>
+        <w:t xml:space="preserve"> </w:t>
+      </w:r>
+      <w:r>
+        <w:rPr>
+          <w:bCs/>
+          <w:b/>
+        </w:rPr>
+        <w:t xml:space="preserve">medicina</w:t>
+      </w:r>
+      <w:r>
+        <w:t xml:space="preserve">. Hoje estudo medicina e consigo viver bem, com as contas que você viu acima.</w:t>
+      </w:r>
+    </w:p>
     <w:p>
       <w:pPr>
         <w:pStyle w:val="BodyText"/>
       </w:pPr>
       <w:r>
-        <w:t xml:space="preserve">[PEDIR AO AUTOR: depoimento de 1 página — o que mais surpreendeu, o que foi difícil, o que você faria diferente]</w:t>
+        <w:t xml:space="preserve">Eu não fugi. Eu escolhi onde o meu trabalho vale mais.</w:t>
       </w:r>
     </w:p>
     <w:p>
@@ -38614,7 +38696,8 @@
         <w:t xml:space="preserve">o mesmo método em outros países</w:t>
       </w:r>
     </w:p>
-    <w:bookmarkEnd w:id="282"/>
+    <w:bookmarkEnd w:id="284"/>
+    <w:bookmarkEnd w:id="285"/>
     <w:p>
       <w:r>
         <w:pict>
@@ -38661,7 +38744,7 @@
         <w:t xml:space="preserve">Comparativo</w:t>
       </w:r>
     </w:p>
-    <w:bookmarkStart w:id="283" w:name="os-6-destinos-lado-a-lado"/>
+    <w:bookmarkStart w:id="286" w:name="os-6-destinos-lado-a-lado"/>
     <w:p>
       <w:pPr>
         <w:pStyle w:val="Heading1"/>
@@ -39089,7 +39172,7 @@
         <w:t xml:space="preserve">, Bolívia e Paraguai lideram.</w:t>
       </w:r>
     </w:p>
-    <w:bookmarkEnd w:id="283"/>
+    <w:bookmarkEnd w:id="286"/>
     <w:p>
       <w:r>
         <w:pict>
@@ -39105,7 +39188,7 @@
         <w:t xml:space="preserve">Paraguai</w:t>
       </w:r>
     </w:p>
-    <w:bookmarkStart w:id="284" w:name="os-brasileiros-estão-correndo-para-lá"/>
+    <w:bookmarkStart w:id="287" w:name="os-brasileiros-estão-correndo-para-lá"/>
     <w:p>
       <w:pPr>
         <w:pStyle w:val="Heading1"/>
@@ -39289,7 +39372,7 @@
         </w:tc>
       </w:tr>
     </w:tbl>
-    <w:bookmarkEnd w:id="284"/>
+    <w:bookmarkEnd w:id="287"/>
     <w:p>
       <w:r>
         <w:pict>
@@ -39297,7 +39380,7 @@
         </w:pict>
       </w:r>
     </w:p>
-    <w:bookmarkStart w:id="285" w:name="e-o-usdt-no-paraguai"/>
+    <w:bookmarkStart w:id="288" w:name="e-o-usdt-no-paraguai"/>
     <w:p>
       <w:pPr>
         <w:pStyle w:val="Heading2"/>
@@ -39412,7 +39495,7 @@
         <w:t xml:space="preserve">Vizinho, Mercosul e governo de direita: o Paraguai é o plano B do plano B.</w:t>
       </w:r>
     </w:p>
-    <w:bookmarkEnd w:id="285"/>
+    <w:bookmarkEnd w:id="288"/>
     <w:p>
       <w:r>
         <w:pict>
@@ -39428,7 +39511,7 @@
         <w:t xml:space="preserve">Argentina</w:t>
       </w:r>
     </w:p>
-    <w:bookmarkStart w:id="286" w:name="o-laboratório-do-milei"/>
+    <w:bookmarkStart w:id="289" w:name="o-laboratório-do-milei"/>
     <w:p>
       <w:pPr>
         <w:pStyle w:val="Heading1"/>
@@ -39586,7 +39669,7 @@
         </w:tc>
       </w:tr>
     </w:tbl>
-    <w:bookmarkEnd w:id="286"/>
+    <w:bookmarkEnd w:id="289"/>
     <w:p>
       <w:r>
         <w:pict>
@@ -39594,7 +39677,7 @@
         </w:pict>
       </w:r>
     </w:p>
-    <w:bookmarkStart w:id="289" w:name="vale-a-pena-ir-para-a-argentina"/>
+    <w:bookmarkStart w:id="292" w:name="vale-a-pena-ir-para-a-argentina"/>
     <w:p>
       <w:pPr>
         <w:pStyle w:val="Heading2"/>
@@ -39603,7 +39686,7 @@
         <w:t xml:space="preserve">Vale a pena ir para a Argentina?</w:t>
       </w:r>
     </w:p>
-    <w:bookmarkStart w:id="287" w:name="a-favor-1"/>
+    <w:bookmarkStart w:id="290" w:name="a-favor-1"/>
     <w:p>
       <w:pPr>
         <w:pStyle w:val="Heading3"/>
@@ -39648,8 +39731,8 @@
         <w:t xml:space="preserve">Entrada e residência fáceis pelo Mercosul</w:t>
       </w:r>
     </w:p>
-    <w:bookmarkEnd w:id="287"/>
-    <w:bookmarkStart w:id="288" w:name="atenção-1"/>
+    <w:bookmarkEnd w:id="290"/>
+    <w:bookmarkStart w:id="291" w:name="atenção-1"/>
     <w:p>
       <w:pPr>
         <w:pStyle w:val="Heading3"/>
@@ -39694,7 +39777,7 @@
         <w:t xml:space="preserve">Regra de prorrogação da residência com fontes divergentes</w:t>
       </w:r>
     </w:p>
-    <w:bookmarkEnd w:id="288"/>
+    <w:bookmarkEnd w:id="291"/>
     <w:p>
       <w:pPr>
         <w:pStyle w:val="FirstParagraph"/>
@@ -39721,7 +39804,7 @@
         <w:t xml:space="preserve">A Argentina mostra que dá para sair do buraco. Mas a obra ainda não acabou.</w:t>
       </w:r>
     </w:p>
-    <w:bookmarkEnd w:id="289"/>
+    <w:bookmarkEnd w:id="292"/>
     <w:p>
       <w:r>
         <w:pict>
@@ -39737,7 +39820,7 @@
         <w:t xml:space="preserve">Uruguai</w:t>
       </w:r>
     </w:p>
-    <w:bookmarkStart w:id="290" w:name="Xdc4e338a7123d05e9c2106c251b39fe5b2d930c"/>
+    <w:bookmarkStart w:id="293" w:name="Xdc4e338a7123d05e9c2106c251b39fe5b2d930c"/>
     <w:p>
       <w:pPr>
         <w:pStyle w:val="Heading1"/>
@@ -39913,7 +39996,7 @@
         <w:t xml:space="preserve">Caro e governado pela esquerda: não é o perfil deste curso.</w:t>
       </w:r>
     </w:p>
-    <w:bookmarkEnd w:id="290"/>
+    <w:bookmarkEnd w:id="293"/>
     <w:p>
       <w:r>
         <w:pict>
@@ -39929,7 +40012,7 @@
         <w:t xml:space="preserve">Portugal</w:t>
       </w:r>
     </w:p>
-    <w:bookmarkStart w:id="293" w:name="portugal-o-sonho-com-fila-de-400-mil"/>
+    <w:bookmarkStart w:id="296" w:name="portugal-o-sonho-com-fila-de-400-mil"/>
     <w:p>
       <w:pPr>
         <w:pStyle w:val="Heading1"/>
@@ -40132,7 +40215,7 @@
         </w:tc>
       </w:tr>
     </w:tbl>
-    <w:bookmarkStart w:id="291" w:name="a-favor-2"/>
+    <w:bookmarkStart w:id="294" w:name="a-favor-2"/>
     <w:p>
       <w:pPr>
         <w:pStyle w:val="Heading3"/>
@@ -40165,8 +40248,8 @@
         <w:t xml:space="preserve">Europa</w:t>
       </w:r>
     </w:p>
-    <w:bookmarkEnd w:id="291"/>
-    <w:bookmarkStart w:id="292" w:name="contra"/>
+    <w:bookmarkEnd w:id="294"/>
+    <w:bookmarkStart w:id="295" w:name="contra"/>
     <w:p>
       <w:pPr>
         <w:pStyle w:val="Heading3"/>
@@ -40211,8 +40294,8 @@
         <w:t xml:space="preserve">Aluguel caro</w:t>
       </w:r>
     </w:p>
-    <w:bookmarkEnd w:id="292"/>
-    <w:bookmarkEnd w:id="293"/>
+    <w:bookmarkEnd w:id="295"/>
+    <w:bookmarkEnd w:id="296"/>
     <w:p>
       <w:r>
         <w:pict>
@@ -40228,7 +40311,7 @@
         <w:t xml:space="preserve">Estados Unidos</w:t>
       </w:r>
     </w:p>
-    <w:bookmarkStart w:id="294" w:name="eua-governo-de-direita-porta-fechada"/>
+    <w:bookmarkStart w:id="297" w:name="eua-governo-de-direita-porta-fechada"/>
     <w:p>
       <w:pPr>
         <w:pStyle w:val="Heading1"/>
@@ -40312,7 +40395,7 @@
         <w:t xml:space="preserve">Para turismo e negócios, o visto comum continua, mais caro.</w:t>
       </w:r>
     </w:p>
-    <w:bookmarkEnd w:id="294"/>
+    <w:bookmarkEnd w:id="297"/>
     <w:p>
       <w:r>
         <w:pict>
@@ -40328,7 +40411,7 @@
         <w:t xml:space="preserve">Fim da Parte 8</w:t>
       </w:r>
     </w:p>
-    <w:bookmarkStart w:id="295" w:name="Xe22f3731301bcaf48d078288930a6010db7de4f"/>
+    <w:bookmarkStart w:id="298" w:name="Xe22f3731301bcaf48d078288930a6010db7de4f"/>
     <w:p>
       <w:pPr>
         <w:pStyle w:val="Heading1"/>
@@ -40485,7 +40568,7 @@
         <w:t xml:space="preserve">dossiê, checklists e planilhas</w:t>
       </w:r>
     </w:p>
-    <w:bookmarkEnd w:id="295"/>
+    <w:bookmarkEnd w:id="298"/>
     <w:p>
       <w:r>
         <w:pict>
@@ -40532,7 +40615,7 @@
         <w:t xml:space="preserve">B1 · Espanhol de sobrevivência</w:t>
       </w:r>
     </w:p>
-    <w:bookmarkStart w:id="297" w:name="as-frases-que-resolvem-o-dia-a-dia"/>
+    <w:bookmarkStart w:id="300" w:name="as-frases-que-resolvem-o-dia-a-dia"/>
     <w:p>
       <w:pPr>
         <w:pStyle w:val="Heading1"/>
@@ -40541,7 +40624,7 @@
         <w:t xml:space="preserve">As frases que resolvem o dia a dia</w:t>
       </w:r>
     </w:p>
-    <w:bookmarkStart w:id="296" w:name="no-p2p-e-no-banco"/>
+    <w:bookmarkStart w:id="299" w:name="no-p2p-e-no-banco"/>
     <w:p>
       <w:pPr>
         <w:pStyle w:val="Heading3"/>
@@ -40837,8 +40920,8 @@
         <w:t xml:space="preserve">“Solo libero el USDT cuando veo el dinero en mi cuenta.” (Só libero o USDT quando vejo o dinheiro na minha conta.)</w:t>
       </w:r>
     </w:p>
-    <w:bookmarkEnd w:id="296"/>
-    <w:bookmarkEnd w:id="297"/>
+    <w:bookmarkEnd w:id="299"/>
+    <w:bookmarkEnd w:id="300"/>
     <w:p>
       <w:r>
         <w:pict>
@@ -40846,7 +40929,7 @@
         </w:pict>
       </w:r>
     </w:p>
-    <w:bookmarkStart w:id="298" w:name="imobiliária-e-aluguel"/>
+    <w:bookmarkStart w:id="301" w:name="imobiliária-e-aluguel"/>
     <w:p>
       <w:pPr>
         <w:pStyle w:val="Heading3"/>
@@ -41023,8 +41106,8 @@
         </w:tc>
       </w:tr>
     </w:tbl>
-    <w:bookmarkEnd w:id="298"/>
-    <w:bookmarkStart w:id="299" w:name="migração-e-documentos"/>
+    <w:bookmarkEnd w:id="301"/>
+    <w:bookmarkStart w:id="302" w:name="migração-e-documentos"/>
     <w:p>
       <w:pPr>
         <w:pStyle w:val="Heading3"/>
@@ -41175,7 +41258,7 @@
         </w:tc>
       </w:tr>
     </w:tbl>
-    <w:bookmarkEnd w:id="299"/>
+    <w:bookmarkEnd w:id="302"/>
     <w:p>
       <w:r>
         <w:pict>
@@ -41183,7 +41266,7 @@
         </w:pict>
       </w:r>
     </w:p>
-    <w:bookmarkStart w:id="300" w:name="médico-e-farmácia"/>
+    <w:bookmarkStart w:id="303" w:name="médico-e-farmácia"/>
     <w:p>
       <w:pPr>
         <w:pStyle w:val="Heading3"/>
@@ -41360,8 +41443,8 @@
         </w:tc>
       </w:tr>
     </w:tbl>
-    <w:bookmarkEnd w:id="300"/>
-    <w:bookmarkStart w:id="301" w:name="táxi-mercado-e-restaurante"/>
+    <w:bookmarkEnd w:id="303"/>
+    <w:bookmarkStart w:id="304" w:name="táxi-mercado-e-restaurante"/>
     <w:p>
       <w:pPr>
         <w:pStyle w:val="Heading3"/>
@@ -41588,7 +41671,7 @@
         <w:t xml:space="preserve">= escritório.</w:t>
       </w:r>
     </w:p>
-    <w:bookmarkEnd w:id="301"/>
+    <w:bookmarkEnd w:id="304"/>
     <w:p>
       <w:r>
         <w:pict>
@@ -41604,7 +41687,7 @@
         <w:t xml:space="preserve">B2 · Roteiros de mensagem</w:t>
       </w:r>
     </w:p>
-    <w:bookmarkStart w:id="305" w:name="copie-cole-e-mande"/>
+    <w:bookmarkStart w:id="308" w:name="copie-cole-e-mande"/>
     <w:p>
       <w:pPr>
         <w:pStyle w:val="Heading1"/>
@@ -41613,7 +41696,7 @@
         <w:t xml:space="preserve">Copie, cole e mande</w:t>
       </w:r>
     </w:p>
-    <w:bookmarkStart w:id="302" w:name="para-o-comprador-no-p2p"/>
+    <w:bookmarkStart w:id="305" w:name="para-o-comprador-no-p2p"/>
     <w:p>
       <w:pPr>
         <w:pStyle w:val="Heading3"/>
@@ -41638,8 +41721,8 @@
         <w:t xml:space="preserve">El pago vino de una cuenta con otro nombre. Voy a devolver el monto a la misma cuenta y cancelar la orden.</w:t>
       </w:r>
     </w:p>
-    <w:bookmarkEnd w:id="302"/>
-    <w:bookmarkStart w:id="303" w:name="para-o-dono-do-imóvel"/>
+    <w:bookmarkEnd w:id="305"/>
+    <w:bookmarkStart w:id="306" w:name="para-o-dono-do-imóvel"/>
     <w:p>
       <w:pPr>
         <w:pStyle w:val="Heading3"/>
@@ -41656,8 +41739,8 @@
         <w:t xml:space="preserve">Hola, vi su anuncio del departamento en [barrio]. ¿Sigue disponible? ¿El precio en bolivianos incluye expensas? ¿Podemos agendar una visita esta semana?</w:t>
       </w:r>
     </w:p>
-    <w:bookmarkEnd w:id="303"/>
-    <w:bookmarkStart w:id="304" w:name="para-o-vendedor-do-carro"/>
+    <w:bookmarkEnd w:id="306"/>
+    <w:bookmarkStart w:id="307" w:name="para-o-vendedor-do-carro"/>
     <w:p>
       <w:pPr>
         <w:pStyle w:val="Heading3"/>
@@ -41674,8 +41757,8 @@
         <w:t xml:space="preserve">Hola, me interesa su [modelo y año]. ¿El precio es en bolivianos? ¿Tiene RUAT, SOAT e inspección técnica al día? ¿Podemos verlo con un mecánico?</w:t>
       </w:r>
     </w:p>
-    <w:bookmarkEnd w:id="304"/>
-    <w:bookmarkEnd w:id="305"/>
+    <w:bookmarkEnd w:id="307"/>
+    <w:bookmarkEnd w:id="308"/>
     <w:p>
       <w:r>
         <w:pict>
@@ -41683,7 +41766,7 @@
         </w:pict>
       </w:r>
     </w:p>
-    <w:bookmarkStart w:id="306" w:name="para-a-escola"/>
+    <w:bookmarkStart w:id="309" w:name="para-a-escola"/>
     <w:p>
       <w:pPr>
         <w:pStyle w:val="Heading3"/>
@@ -41700,8 +41783,8 @@
         <w:t xml:space="preserve">Buenos días, somos una familia brasileña y queremos matricular a nuestro hijo en [curso]. ¿Cuáles son los requisitos, las fechas y la pensión mensual? ¿Me lo puede enviar por escrito?</w:t>
       </w:r>
     </w:p>
-    <w:bookmarkEnd w:id="306"/>
-    <w:bookmarkStart w:id="307" w:name="para-o-banco"/>
+    <w:bookmarkEnd w:id="309"/>
+    <w:bookmarkStart w:id="310" w:name="para-o-banco"/>
     <w:p>
       <w:pPr>
         <w:pStyle w:val="Heading3"/>
@@ -41718,8 +41801,8 @@
         <w:t xml:space="preserve">Buenos días, soy brasileño y vivo en [ciudad]. Quiero abrir una cuenta en bolivianos. ¿Qué documentos necesito?</w:t>
       </w:r>
     </w:p>
-    <w:bookmarkEnd w:id="307"/>
-    <w:bookmarkStart w:id="308" w:name="para-negociar-preço"/>
+    <w:bookmarkEnd w:id="310"/>
+    <w:bookmarkStart w:id="311" w:name="para-negociar-preço"/>
     <w:p>
       <w:pPr>
         <w:pStyle w:val="Heading3"/>
@@ -41754,7 +41837,7 @@
         <w:t xml:space="preserve">tudo por escrito. Mensagem guardada é prova.</w:t>
       </w:r>
     </w:p>
-    <w:bookmarkEnd w:id="308"/>
+    <w:bookmarkEnd w:id="311"/>
     <w:p>
       <w:r>
         <w:pict>
@@ -41770,7 +41853,7 @@
         <w:t xml:space="preserve">B3 · Planilha 1</w:t>
       </w:r>
     </w:p>
-    <w:bookmarkStart w:id="309" w:name="câmbio-efetivo"/>
+    <w:bookmarkStart w:id="312" w:name="câmbio-efetivo"/>
     <w:p>
       <w:pPr>
         <w:pStyle w:val="Heading2"/>
@@ -42463,7 +42546,7 @@
         <w:t xml:space="preserve">câmbio efetivo = Bs recebidos ÷ R$ gastos · exemplo do curso: 2,25</w:t>
       </w:r>
     </w:p>
-    <w:bookmarkEnd w:id="309"/>
+    <w:bookmarkEnd w:id="312"/>
     <w:p>
       <w:r>
         <w:pict>
@@ -42479,7 +42562,7 @@
         <w:t xml:space="preserve">B3 · Planilha 2</w:t>
       </w:r>
     </w:p>
-    <w:bookmarkStart w:id="310" w:name="orçamento-mensal-na-bolívia"/>
+    <w:bookmarkStart w:id="313" w:name="orçamento-mensal-na-bolívia"/>
     <w:p>
       <w:pPr>
         <w:pStyle w:val="Heading2"/>
@@ -42861,7 +42944,7 @@
         <w:t xml:space="preserve">aluguel de Bs 933 por pessoa (apê dividido) + R$ 700 de comida e contas = ~R$ 1.106/mês.</w:t>
       </w:r>
     </w:p>
-    <w:bookmarkEnd w:id="310"/>
+    <w:bookmarkEnd w:id="313"/>
     <w:p>
       <w:r>
         <w:pict>
@@ -42877,7 +42960,7 @@
         <w:t xml:space="preserve">B3 · Planilha 3</w:t>
       </w:r>
     </w:p>
-    <w:bookmarkStart w:id="311" w:name="controle-de-envios"/>
+    <w:bookmarkStart w:id="314" w:name="controle-de-envios"/>
     <w:p>
       <w:pPr>
         <w:pStyle w:val="Heading2"/>
@@ -43332,7 +43415,7 @@
         <w:t xml:space="preserve">A partir de 01/01/2027, envios acima de US$ 10 mil para fora podem ficar retidos por até 24 h (Res. BCB 584). Anote a data com folga.</w:t>
       </w:r>
     </w:p>
-    <w:bookmarkEnd w:id="311"/>
+    <w:bookmarkEnd w:id="314"/>
     <w:p>
       <w:r>
         <w:pict>
@@ -43348,7 +43431,7 @@
         <w:t xml:space="preserve">B4 · Checklists mestres</w:t>
       </w:r>
     </w:p>
-    <w:bookmarkStart w:id="312" w:name="antes-de-sair-do-brasil"/>
+    <w:bookmarkStart w:id="315" w:name="antes-de-sair-do-brasil"/>
     <w:p>
       <w:pPr>
         <w:pStyle w:val="Heading2"/>
@@ -43453,8 +43536,8 @@
         <w:t xml:space="preserve">CVI do pet (se tiver)</w:t>
       </w:r>
     </w:p>
-    <w:bookmarkEnd w:id="312"/>
-    <w:bookmarkStart w:id="313" w:name="primeira-operação-usdt"/>
+    <w:bookmarkEnd w:id="315"/>
+    <w:bookmarkStart w:id="316" w:name="primeira-operação-usdt"/>
     <w:p>
       <w:pPr>
         <w:pStyle w:val="Heading2"/>
@@ -43535,7 +43618,7 @@
         <w:t xml:space="preserve">Hash e preço anotados na pasta fiscal</w:t>
       </w:r>
     </w:p>
-    <w:bookmarkEnd w:id="313"/>
+    <w:bookmarkEnd w:id="316"/>
     <w:p>
       <w:r>
         <w:pict>
@@ -43543,7 +43626,7 @@
         </w:pict>
       </w:r>
     </w:p>
-    <w:bookmarkStart w:id="314" w:name="na-chegada"/>
+    <w:bookmarkStart w:id="317" w:name="na-chegada"/>
     <w:p>
       <w:pPr>
         <w:pStyle w:val="Heading2"/>
@@ -43600,8 +43683,8 @@
         <w:t xml:space="preserve">Primeira venda P2P pequena</w:t>
       </w:r>
     </w:p>
-    <w:bookmarkEnd w:id="314"/>
-    <w:bookmarkStart w:id="315" w:name="residência"/>
+    <w:bookmarkEnd w:id="317"/>
+    <w:bookmarkStart w:id="318" w:name="residência"/>
     <w:p>
       <w:pPr>
         <w:pStyle w:val="Heading2"/>
@@ -43670,8 +43753,8 @@
         <w:t xml:space="preserve">Cédula de estrangeiro no SEGIP</w:t>
       </w:r>
     </w:p>
-    <w:bookmarkEnd w:id="315"/>
-    <w:bookmarkStart w:id="316" w:name="blindagem"/>
+    <w:bookmarkEnd w:id="318"/>
+    <w:bookmarkStart w:id="319" w:name="blindagem"/>
     <w:p>
       <w:pPr>
         <w:pStyle w:val="Heading2"/>
@@ -43740,7 +43823,7 @@
         <w:t xml:space="preserve">Nada de encontro presencial com dinheiro</w:t>
       </w:r>
     </w:p>
-    <w:bookmarkEnd w:id="316"/>
+    <w:bookmarkEnd w:id="319"/>
     <w:p>
       <w:r>
         <w:pict>
@@ -43756,7 +43839,7 @@
         <w:t xml:space="preserve">B5 · Glossário geral</w:t>
       </w:r>
     </w:p>
-    <w:bookmarkStart w:id="317" w:name="bolívia-e-espanhol"/>
+    <w:bookmarkStart w:id="320" w:name="bolívia-e-espanhol"/>
     <w:p>
       <w:pPr>
         <w:pStyle w:val="Heading2"/>
@@ -44304,7 +44387,7 @@
         <w:t xml:space="preserve">.</w:t>
       </w:r>
     </w:p>
-    <w:bookmarkEnd w:id="317"/>
+    <w:bookmarkEnd w:id="320"/>
     <w:p>
       <w:r>
         <w:pict>
@@ -44320,7 +44403,7 @@
         <w:t xml:space="preserve">B6 · Grupo VIP</w:t>
       </w:r>
     </w:p>
-    <w:bookmarkStart w:id="320" w:name="regras-do-grupo-e-atualizações"/>
+    <w:bookmarkStart w:id="323" w:name="regras-do-grupo-e-atualizações"/>
     <w:p>
       <w:pPr>
         <w:pStyle w:val="Heading1"/>
@@ -44329,7 +44412,7 @@
         <w:t xml:space="preserve">Regras do grupo e atualizações</w:t>
       </w:r>
     </w:p>
-    <w:bookmarkStart w:id="318" w:name="regras-fixadas"/>
+    <w:bookmarkStart w:id="321" w:name="regras-fixadas"/>
     <w:p>
       <w:pPr>
         <w:pStyle w:val="Heading3"/>
@@ -44386,8 +44469,8 @@
         <w:t xml:space="preserve">Nenhum admin manda mensagem privada pedindo dinheiro</w:t>
       </w:r>
     </w:p>
-    <w:bookmarkEnd w:id="318"/>
-    <w:bookmarkStart w:id="319" w:name="calendário"/>
+    <w:bookmarkEnd w:id="321"/>
+    <w:bookmarkStart w:id="322" w:name="calendário"/>
     <w:p>
       <w:pPr>
         <w:pStyle w:val="Heading3"/>
@@ -44562,8 +44645,8 @@
         <w:t xml:space="preserve">[LINK DO GRUPO]</w:t>
       </w:r>
     </w:p>
-    <w:bookmarkEnd w:id="319"/>
-    <w:bookmarkEnd w:id="320"/>
+    <w:bookmarkEnd w:id="322"/>
+    <w:bookmarkEnd w:id="323"/>
     <w:p>
       <w:r>
         <w:pict>
@@ -44610,7 +44693,7 @@
         <w:t xml:space="preserve">Como usar o dossiê</w:t>
       </w:r>
     </w:p>
-    <w:bookmarkStart w:id="323" w:name="não-discuta.-mande-o-link."/>
+    <w:bookmarkStart w:id="326" w:name="não-discuta.-mande-o-link."/>
     <w:p>
       <w:pPr>
         <w:pStyle w:val="Heading1"/>
@@ -44691,7 +44774,7 @@
         <w:t xml:space="preserve">Se ele disser “site de direita”, mande o dado oficial que está na mesma linha (Banco Central, Senado, Receita)</w:t>
       </w:r>
     </w:p>
-    <w:bookmarkStart w:id="321" w:name="já-aconteceu"/>
+    <w:bookmarkStart w:id="324" w:name="já-aconteceu"/>
     <w:p>
       <w:pPr>
         <w:pStyle w:val="Heading3"/>
@@ -44708,8 +44791,8 @@
         <w:t xml:space="preserve">Fatos publicados: impostos, IOF, dívida, juros, déficit, golpes.</w:t>
       </w:r>
     </w:p>
-    <w:bookmarkEnd w:id="321"/>
-    <w:bookmarkStart w:id="322" w:name="o-que-vem-por-aí"/>
+    <w:bookmarkEnd w:id="324"/>
+    <w:bookmarkStart w:id="325" w:name="o-que-vem-por-aí"/>
     <w:p>
       <w:pPr>
         <w:pStyle w:val="Heading3"/>
@@ -44726,7 +44809,7 @@
         <w:t xml:space="preserve">Projeções de instituições e propostas do governo, marcadas como projeção.</w:t>
       </w:r>
     </w:p>
-    <w:bookmarkEnd w:id="322"/>
+    <w:bookmarkEnd w:id="325"/>
     <w:p>
       <w:pPr>
         <w:pStyle w:val="BodyText"/>
@@ -44745,7 +44828,7 @@
         <w:t xml:space="preserve">Todos foram consultados em 28/10/2026. Se algum sair do ar, busque o título entre aspas.</w:t>
       </w:r>
     </w:p>
-    <w:bookmarkEnd w:id="323"/>
+    <w:bookmarkEnd w:id="326"/>
     <w:p>
       <w:r>
         <w:pict>
@@ -44761,7 +44844,7 @@
         <w:t xml:space="preserve">Fatos publicados</w:t>
       </w:r>
     </w:p>
-    <w:bookmarkStart w:id="327" w:name="já-aconteceu-1"/>
+    <w:bookmarkStart w:id="330" w:name="já-aconteceu-1"/>
     <w:p>
       <w:pPr>
         <w:pStyle w:val="Heading2"/>
@@ -44785,7 +44868,7 @@
       <w:pPr>
         <w:pStyle w:val="BodyText"/>
       </w:pPr>
-      <w:hyperlink r:id="rId324">
+      <w:hyperlink r:id="rId327">
         <w:r>
           <w:rPr>
             <w:rStyle w:val="Hyperlink"/>
@@ -44835,7 +44918,7 @@
       <w:pPr>
         <w:pStyle w:val="BodyText"/>
       </w:pPr>
-      <w:hyperlink r:id="rId325">
+      <w:hyperlink r:id="rId328">
         <w:r>
           <w:rPr>
             <w:rStyle w:val="Hyperlink"/>
@@ -44885,7 +44968,7 @@
       <w:pPr>
         <w:pStyle w:val="BodyText"/>
       </w:pPr>
-      <w:hyperlink r:id="rId326">
+      <w:hyperlink r:id="rId329">
         <w:r>
           <w:rPr>
             <w:rStyle w:val="Hyperlink"/>
@@ -44920,7 +45003,7 @@
         <w:t xml:space="preserve">· link consultado em 28/10/2026</w:t>
       </w:r>
     </w:p>
-    <w:bookmarkEnd w:id="327"/>
+    <w:bookmarkEnd w:id="330"/>
     <w:p>
       <w:r>
         <w:pict>
@@ -44928,7 +45011,7 @@
         </w:pict>
       </w:r>
     </w:p>
-    <w:bookmarkStart w:id="331" w:name="já-aconteceu-cont."/>
+    <w:bookmarkStart w:id="334" w:name="já-aconteceu-cont."/>
     <w:p>
       <w:pPr>
         <w:pStyle w:val="Heading2"/>
@@ -44952,7 +45035,7 @@
       <w:pPr>
         <w:pStyle w:val="BodyText"/>
       </w:pPr>
-      <w:hyperlink r:id="rId328">
+      <w:hyperlink r:id="rId331">
         <w:r>
           <w:rPr>
             <w:rStyle w:val="Hyperlink"/>
@@ -45002,7 +45085,7 @@
       <w:pPr>
         <w:pStyle w:val="BodyText"/>
       </w:pPr>
-      <w:hyperlink r:id="rId329">
+      <w:hyperlink r:id="rId332">
         <w:r>
           <w:rPr>
             <w:rStyle w:val="Hyperlink"/>
@@ -45052,7 +45135,7 @@
       <w:pPr>
         <w:pStyle w:val="BodyText"/>
       </w:pPr>
-      <w:hyperlink r:id="rId330">
+      <w:hyperlink r:id="rId333">
         <w:r>
           <w:rPr>
             <w:rStyle w:val="Hyperlink"/>
@@ -45087,7 +45170,7 @@
         <w:t xml:space="preserve">· link consultado em 28/10/2026</w:t>
       </w:r>
     </w:p>
-    <w:bookmarkEnd w:id="331"/>
+    <w:bookmarkEnd w:id="334"/>
     <w:p>
       <w:r>
         <w:pict>
@@ -45095,7 +45178,7 @@
         </w:pict>
       </w:r>
     </w:p>
-    <w:bookmarkStart w:id="335" w:name="já-aconteceu-cont.-1"/>
+    <w:bookmarkStart w:id="338" w:name="já-aconteceu-cont.-1"/>
     <w:p>
       <w:pPr>
         <w:pStyle w:val="Heading2"/>
@@ -45119,7 +45202,7 @@
       <w:pPr>
         <w:pStyle w:val="BodyText"/>
       </w:pPr>
-      <w:hyperlink r:id="rId332">
+      <w:hyperlink r:id="rId335">
         <w:r>
           <w:rPr>
             <w:rStyle w:val="Hyperlink"/>
@@ -45169,7 +45252,7 @@
       <w:pPr>
         <w:pStyle w:val="BodyText"/>
       </w:pPr>
-      <w:hyperlink r:id="rId333">
+      <w:hyperlink r:id="rId336">
         <w:r>
           <w:rPr>
             <w:rStyle w:val="Hyperlink"/>
@@ -45219,7 +45302,7 @@
       <w:pPr>
         <w:pStyle w:val="BodyText"/>
       </w:pPr>
-      <w:hyperlink r:id="rId334">
+      <w:hyperlink r:id="rId337">
         <w:r>
           <w:rPr>
             <w:rStyle w:val="Hyperlink"/>
@@ -45254,7 +45337,7 @@
         <w:t xml:space="preserve">· link consultado em 28/10/2026</w:t>
       </w:r>
     </w:p>
-    <w:bookmarkEnd w:id="335"/>
+    <w:bookmarkEnd w:id="338"/>
     <w:p>
       <w:r>
         <w:pict>
@@ -45262,7 +45345,7 @@
         </w:pict>
       </w:r>
     </w:p>
-    <w:bookmarkStart w:id="339" w:name="já-aconteceu-cont.-2"/>
+    <w:bookmarkStart w:id="342" w:name="já-aconteceu-cont.-2"/>
     <w:p>
       <w:pPr>
         <w:pStyle w:val="Heading2"/>
@@ -45286,7 +45369,7 @@
       <w:pPr>
         <w:pStyle w:val="BodyText"/>
       </w:pPr>
-      <w:hyperlink r:id="rId336">
+      <w:hyperlink r:id="rId339">
         <w:r>
           <w:rPr>
             <w:rStyle w:val="Hyperlink"/>
@@ -45336,7 +45419,7 @@
       <w:pPr>
         <w:pStyle w:val="BodyText"/>
       </w:pPr>
-      <w:hyperlink r:id="rId337">
+      <w:hyperlink r:id="rId340">
         <w:r>
           <w:rPr>
             <w:rStyle w:val="Hyperlink"/>
@@ -45386,7 +45469,7 @@
       <w:pPr>
         <w:pStyle w:val="BodyText"/>
       </w:pPr>
-      <w:hyperlink r:id="rId338">
+      <w:hyperlink r:id="rId341">
         <w:r>
           <w:rPr>
             <w:rStyle w:val="Hyperlink"/>
@@ -45421,7 +45504,7 @@
         <w:t xml:space="preserve">· link consultado em 28/10/2026</w:t>
       </w:r>
     </w:p>
-    <w:bookmarkEnd w:id="339"/>
+    <w:bookmarkEnd w:id="342"/>
     <w:p>
       <w:r>
         <w:pict>
@@ -45437,7 +45520,7 @@
         <w:t xml:space="preserve">Projeções e propostas</w:t>
       </w:r>
     </w:p>
-    <w:bookmarkStart w:id="343" w:name="o-que-vem-por-aí-1"/>
+    <w:bookmarkStart w:id="346" w:name="o-que-vem-por-aí-1"/>
     <w:p>
       <w:pPr>
         <w:pStyle w:val="Heading2"/>
@@ -45461,7 +45544,7 @@
       <w:pPr>
         <w:pStyle w:val="BodyText"/>
       </w:pPr>
-      <w:hyperlink r:id="rId340">
+      <w:hyperlink r:id="rId343">
         <w:r>
           <w:rPr>
             <w:rStyle w:val="Hyperlink"/>
@@ -45511,7 +45594,7 @@
       <w:pPr>
         <w:pStyle w:val="BodyText"/>
       </w:pPr>
-      <w:hyperlink r:id="rId341">
+      <w:hyperlink r:id="rId344">
         <w:r>
           <w:rPr>
             <w:rStyle w:val="Hyperlink"/>
@@ -45561,7 +45644,7 @@
       <w:pPr>
         <w:pStyle w:val="BodyText"/>
       </w:pPr>
-      <w:hyperlink r:id="rId342">
+      <w:hyperlink r:id="rId345">
         <w:r>
           <w:rPr>
             <w:rStyle w:val="Hyperlink"/>
@@ -45596,7 +45679,7 @@
         <w:t xml:space="preserve">· link consultado em 28/10/2026</w:t>
       </w:r>
     </w:p>
-    <w:bookmarkEnd w:id="343"/>
+    <w:bookmarkEnd w:id="346"/>
     <w:p>
       <w:r>
         <w:pict>
@@ -45604,7 +45687,7 @@
         </w:pict>
       </w:r>
     </w:p>
-    <w:bookmarkStart w:id="347" w:name="o-que-vem-por-aí-cont."/>
+    <w:bookmarkStart w:id="350" w:name="o-que-vem-por-aí-cont."/>
     <w:p>
       <w:pPr>
         <w:pStyle w:val="Heading2"/>
@@ -45628,7 +45711,7 @@
       <w:pPr>
         <w:pStyle w:val="BodyText"/>
       </w:pPr>
-      <w:hyperlink r:id="rId344">
+      <w:hyperlink r:id="rId347">
         <w:r>
           <w:rPr>
             <w:rStyle w:val="Hyperlink"/>
@@ -45678,7 +45761,7 @@
       <w:pPr>
         <w:pStyle w:val="BodyText"/>
       </w:pPr>
-      <w:hyperlink r:id="rId345">
+      <w:hyperlink r:id="rId348">
         <w:r>
           <w:rPr>
             <w:rStyle w:val="Hyperlink"/>
@@ -45728,7 +45811,7 @@
       <w:pPr>
         <w:pStyle w:val="BodyText"/>
       </w:pPr>
-      <w:hyperlink r:id="rId346">
+      <w:hyperlink r:id="rId349">
         <w:r>
           <w:rPr>
             <w:rStyle w:val="Hyperlink"/>
@@ -45763,7 +45846,7 @@
         <w:t xml:space="preserve">· link consultado em 28/10/2026</w:t>
       </w:r>
     </w:p>
-    <w:bookmarkEnd w:id="347"/>
+    <w:bookmarkEnd w:id="350"/>
     <w:p>
       <w:r>
         <w:pict>
@@ -45771,7 +45854,7 @@
         </w:pict>
       </w:r>
     </w:p>
-    <w:bookmarkStart w:id="349" w:name="o-que-vem-por-aí-cont.-1"/>
+    <w:bookmarkStart w:id="352" w:name="o-que-vem-por-aí-cont.-1"/>
     <w:p>
       <w:pPr>
         <w:pStyle w:val="Heading2"/>
@@ -45795,7 +45878,7 @@
       <w:pPr>
         <w:pStyle w:val="BodyText"/>
       </w:pPr>
-      <w:hyperlink r:id="rId348">
+      <w:hyperlink r:id="rId351">
         <w:r>
           <w:rPr>
             <w:rStyle w:val="Hyperlink"/>
@@ -45830,7 +45913,7 @@
         <w:t xml:space="preserve">· link consultado em 28/10/2026</w:t>
       </w:r>
     </w:p>
-    <w:bookmarkEnd w:id="349"/>
+    <w:bookmarkEnd w:id="352"/>
     <w:p>
       <w:r>
         <w:pict>
@@ -45846,7 +45929,7 @@
         <w:t xml:space="preserve">Para o WhatsApp</w:t>
       </w:r>
     </w:p>
-    <w:bookmarkStart w:id="350" w:name="mais-4-anos-em-6-números"/>
+    <w:bookmarkStart w:id="353" w:name="mais-4-anos-em-6-números"/>
     <w:p>
       <w:pPr>
         <w:pStyle w:val="Heading1"/>
@@ -45947,7 +46030,7 @@
         <w:t xml:space="preserve">[LINK DO CURSO]</w:t>
       </w:r>
     </w:p>
-    <w:bookmarkEnd w:id="350"/>
+    <w:bookmarkEnd w:id="353"/>
     <w:p>
       <w:r>
         <w:pict>
@@ -45963,7 +46046,7 @@
         <w:t xml:space="preserve">Aviso legal</w:t>
       </w:r>
     </w:p>
-    <w:bookmarkStart w:id="351" w:name="leia-antes-de-agir"/>
+    <w:bookmarkStart w:id="354" w:name="leia-antes-de-agir"/>
     <w:p>
       <w:pPr>
         <w:pStyle w:val="Heading1"/>
@@ -46215,7 +46298,7 @@
         <w:t xml:space="preserve">7 dias, conforme o Código de Defesa do Consumidor (art. 49).</w:t>
       </w:r>
     </w:p>
-    <w:bookmarkEnd w:id="351"/>
+    <w:bookmarkEnd w:id="354"/>
     <w:p>
       <w:r>
         <w:pict>
@@ -46231,7 +46314,7 @@
         <w:t xml:space="preserve">Créditos</w:t>
       </w:r>
     </w:p>
-    <w:bookmarkStart w:id="352" w:name="créditos"/>
+    <w:bookmarkStart w:id="355" w:name="créditos"/>
     <w:p>
       <w:pPr>
         <w:pStyle w:val="Heading2"/>
@@ -46328,8 +46411,8 @@
         <w:t xml:space="preserve">Anton, Archivo e JetBrains Mono (licença livre)</w:t>
       </w:r>
     </w:p>
-    <w:bookmarkEnd w:id="352"/>
-    <w:bookmarkStart w:id="353" w:name="últimas-atualizações"/>
+    <w:bookmarkEnd w:id="355"/>
+    <w:bookmarkStart w:id="356" w:name="últimas-atualizações"/>
     <w:p>
       <w:pPr>
         <w:pStyle w:val="Heading2"/>
@@ -46473,7 +46556,7 @@
         <w:t xml:space="preserve">Novas versões chegam por e-mail e no grupo VIP, gratuitamente, por 12 meses após a compra.</w:t>
       </w:r>
     </w:p>
-    <w:bookmarkEnd w:id="353"/>
+    <w:bookmarkEnd w:id="356"/>
     <w:p>
       <w:r>
         <w:pict>
@@ -46489,7 +46572,7 @@
         <w:t xml:space="preserve">Anexo</w:t>
       </w:r>
     </w:p>
-    <w:bookmarkStart w:id="354" w:name="fontes-de-todos-os-números"/>
+    <w:bookmarkStart w:id="357" w:name="fontes-de-todos-os-números"/>
     <w:p>
       <w:pPr>
         <w:pStyle w:val="Heading2"/>
@@ -46734,7 +46817,7 @@
         <w:t xml:space="preserve">Agência Brasil e Poder360 (19/10/2025); MercoPress (10/11/2025); France 24 via Acento (08/11/2025); usdthoy.com (flutuação desde 29/06/2026).</w:t>
       </w:r>
     </w:p>
-    <w:bookmarkEnd w:id="354"/>
+    <w:bookmarkEnd w:id="357"/>
     <w:p>
       <w:r>
         <w:pict>

</xml_diff>

<commit_message>
Depoimento do autor mais narrativo (2 páginas)
Co-Authored-By: Claude Opus 5.5 <noreply@anthropic.com>
Claude-Session: https://claude.ai/code/session_01GJhkYfDrHd3AkmDKDTo71F
</commit_message>
<xml_diff>
--- a/curso/dist/LULA-GANHOU-Curso-Completo.docx
+++ b/curso/dist/LULA-GANHOU-Curso-Completo.docx
@@ -586,23 +586,23 @@
         <w:pStyle w:val="BodyText"/>
       </w:pPr>
       <w:r>
-        <w:t xml:space="preserve">Eu tinha uma empresa no Brasil.</w:t>
-      </w:r>
-      <w:r>
-        <w:t xml:space="preserve"> </w:t>
-      </w:r>
-      <w:r>
-        <w:rPr>
-          <w:bCs/>
-          <w:b/>
-        </w:rPr>
-        <w:t xml:space="preserve">Fechei.</w:t>
-      </w:r>
-      <w:r>
-        <w:t xml:space="preserve"> </w:t>
-      </w:r>
-      <w:r>
-        <w:t xml:space="preserve">Vi o país ir de mal a pior com a esquerda no poder e as dificuldades que esse governo deixou para quem produz. Em vez de assistir parado, fui pesquisar onde o meu dinheiro renderia mais. Encontrei a Bolívia, fechei a empresa e vim. Hoje estudo medicina aqui e vivo bem.</w:t>
+        <w:t xml:space="preserve">Eu tinha uma empresa no Brasil. Acordava cedo, pagava imposto, gerava emprego. E todo mês a conta ficava mais pesada. Um dia fiz a pergunta que muita gente evita:</w:t>
+      </w:r>
+      <w:r>
+        <w:t xml:space="preserve"> </w:t>
+      </w:r>
+      <w:r>
+        <w:rPr>
+          <w:bCs/>
+          <w:b/>
+        </w:rPr>
+        <w:t xml:space="preserve">até quando?</w:t>
+      </w:r>
+      <w:r>
+        <w:t xml:space="preserve"> </w:t>
+      </w:r>
+      <w:r>
+        <w:t xml:space="preserve">Baixei a porta pela última vez, peguei o que tinha construído e vim para a Bolívia. Hoje estudo medicina e vivo bem. Este livro é o caminho que eu fiz.</w:t>
       </w:r>
     </w:p>
     <w:p>
@@ -2207,7 +2207,7 @@
         <w:t xml:space="preserve">Parte 8 · O mesmo método para outros países</w:t>
       </w:r>
       <w:r>
-        <w:t xml:space="preserve">195</w:t>
+        <w:t xml:space="preserve">196</w:t>
       </w:r>
     </w:p>
     <w:p>
@@ -2222,7 +2222,7 @@
         <w:t xml:space="preserve">8.1 Paraguai</w:t>
       </w:r>
       <w:r>
-        <w:t xml:space="preserve">197</w:t>
+        <w:t xml:space="preserve">198</w:t>
       </w:r>
     </w:p>
     <w:p>
@@ -2237,7 +2237,7 @@
         <w:t xml:space="preserve">8.2 Argentina</w:t>
       </w:r>
       <w:r>
-        <w:t xml:space="preserve">199</w:t>
+        <w:t xml:space="preserve">200</w:t>
       </w:r>
     </w:p>
     <w:p>
@@ -2252,7 +2252,7 @@
         <w:t xml:space="preserve">8.3 Uruguai</w:t>
       </w:r>
       <w:r>
-        <w:t xml:space="preserve">201</w:t>
+        <w:t xml:space="preserve">202</w:t>
       </w:r>
     </w:p>
     <w:p>
@@ -2267,7 +2267,7 @@
         <w:t xml:space="preserve">8.4 Portugal</w:t>
       </w:r>
       <w:r>
-        <w:t xml:space="preserve">202</w:t>
+        <w:t xml:space="preserve">203</w:t>
       </w:r>
     </w:p>
     <w:p>
@@ -2282,7 +2282,7 @@
         <w:t xml:space="preserve">8.5 Estados Unidos</w:t>
       </w:r>
       <w:r>
-        <w:t xml:space="preserve">203</w:t>
+        <w:t xml:space="preserve">204</w:t>
       </w:r>
     </w:p>
     <w:p>
@@ -2297,7 +2297,7 @@
         <w:t xml:space="preserve">Bônus</w:t>
       </w:r>
       <w:r>
-        <w:t xml:space="preserve">205</w:t>
+        <w:t xml:space="preserve">206</w:t>
       </w:r>
     </w:p>
     <w:p>
@@ -2312,7 +2312,7 @@
         <w:t xml:space="preserve">B1 Espanhol de sobrevivência</w:t>
       </w:r>
       <w:r>
-        <w:t xml:space="preserve">206</w:t>
+        <w:t xml:space="preserve">207</w:t>
       </w:r>
     </w:p>
     <w:p>
@@ -2327,7 +2327,7 @@
         <w:t xml:space="preserve">B2 Roteiros de mensagem</w:t>
       </w:r>
       <w:r>
-        <w:t xml:space="preserve">209</w:t>
+        <w:t xml:space="preserve">210</w:t>
       </w:r>
     </w:p>
     <w:p>
@@ -2342,7 +2342,7 @@
         <w:t xml:space="preserve">B3 Planilhas para imprimir</w:t>
       </w:r>
       <w:r>
-        <w:t xml:space="preserve">211</w:t>
+        <w:t xml:space="preserve">212</w:t>
       </w:r>
     </w:p>
     <w:p>
@@ -2364,7 +2364,7 @@
         <w:t xml:space="preserve">B4 Checklists mestres</w:t>
       </w:r>
       <w:r>
-        <w:t xml:space="preserve">214</w:t>
+        <w:t xml:space="preserve">215</w:t>
       </w:r>
     </w:p>
     <w:p>
@@ -2379,7 +2379,7 @@
         <w:t xml:space="preserve">B5 Glossário geral</w:t>
       </w:r>
       <w:r>
-        <w:t xml:space="preserve">216</w:t>
+        <w:t xml:space="preserve">217</w:t>
       </w:r>
     </w:p>
     <w:p>
@@ -2394,7 +2394,7 @@
         <w:t xml:space="preserve">B6 Grupo VIP e atualizações</w:t>
       </w:r>
       <w:r>
-        <w:t xml:space="preserve">217</w:t>
+        <w:t xml:space="preserve">218</w:t>
       </w:r>
     </w:p>
     <w:p>
@@ -2409,7 +2409,7 @@
         <w:t xml:space="preserve">Bônus B7 · Dossiê: mais 4 anos em manchetes</w:t>
       </w:r>
       <w:r>
-        <w:t xml:space="preserve">218</w:t>
+        <w:t xml:space="preserve">219</w:t>
       </w:r>
     </w:p>
     <w:p>
@@ -2424,7 +2424,7 @@
         <w:t xml:space="preserve">B7 · Versão de 1 página para WhatsApp</w:t>
       </w:r>
       <w:r>
-        <w:t xml:space="preserve">227</w:t>
+        <w:t xml:space="preserve">228</w:t>
       </w:r>
     </w:p>
     <w:p>
@@ -2439,7 +2439,7 @@
         <w:t xml:space="preserve">Anexo · Aviso legal</w:t>
       </w:r>
       <w:r>
-        <w:t xml:space="preserve">228</w:t>
+        <w:t xml:space="preserve">229</w:t>
       </w:r>
     </w:p>
     <w:p>
@@ -2454,7 +2454,7 @@
         <w:t xml:space="preserve">Anexo · Créditos e atualizações</w:t>
       </w:r>
       <w:r>
-        <w:t xml:space="preserve">229</w:t>
+        <w:t xml:space="preserve">230</w:t>
       </w:r>
     </w:p>
     <w:p>
@@ -2469,7 +2469,7 @@
         <w:t xml:space="preserve">Anexo · Fontes de todos os números</w:t>
       </w:r>
       <w:r>
-        <w:t xml:space="preserve">230</w:t>
+        <w:t xml:space="preserve">231</w:t>
       </w:r>
     </w:p>
     <w:p>
@@ -38575,7 +38575,7 @@
         <w:t xml:space="preserve">Depoimento do autor</w:t>
       </w:r>
     </w:p>
-    <w:bookmarkStart w:id="285" w:name="como-é-viver-aqui-de-verdade"/>
+    <w:bookmarkStart w:id="283" w:name="como-é-viver-aqui-de-verdade"/>
     <w:p>
       <w:pPr>
         <w:pStyle w:val="Heading1"/>
@@ -38616,88 +38616,43 @@
         <w:pStyle w:val="FirstParagraph"/>
       </w:pPr>
       <w:r>
-        <w:t xml:space="preserve">Eu tinha uma empresa no Brasil e fechei pela dificuldade que o governo de esquerda deixou no país. Vi o Brasil ir de mal a pior e entendi que não ia esperar a próxima conta chegar.</w:t>
+        <w:t xml:space="preserve">Eu tinha uma empresa. Não era grande, mas era minha: construída com trabalho, noite em claro e muita conta feita na ponta do lápis. Com a esquerda no governo, cada mês trazia uma regra nova, um custo novo, uma guia nova. Eu trabalhava mais e sobrava menos.</w:t>
+      </w:r>
+    </w:p>
+    <w:p>
+      <w:pPr>
+        <w:pStyle w:val="BodyText"/>
+      </w:pPr>
+      <w:r>
+        <w:t xml:space="preserve">Chegou o dia em que eu olhei a planilha e entendi:</w:t>
+      </w:r>
+      <w:r>
+        <w:t xml:space="preserve"> </w:t>
+      </w:r>
+      <w:r>
+        <w:rPr>
+          <w:bCs/>
+          <w:b/>
+        </w:rPr>
+        <w:t xml:space="preserve">eu estava trabalhando para pagar o governo.</w:t>
+      </w:r>
+      <w:r>
+        <w:t xml:space="preserve"> </w:t>
+      </w:r>
+      <w:r>
+        <w:t xml:space="preserve">E o país só ia de mal a pior.</w:t>
+      </w:r>
+    </w:p>
+    <w:p>
+      <w:pPr>
+        <w:pStyle w:val="BodyText"/>
+      </w:pPr>
+      <w:r>
+        <w:t xml:space="preserve">Eu não fechei a empresa porque falhei. Fechei porque o governo deixou impossível continuar.</w:t>
       </w:r>
     </w:p>
     <w:bookmarkEnd w:id="282"/>
-    <w:bookmarkStart w:id="283" w:name="o-que-eu-fiz"/>
-    <w:p>
-      <w:pPr>
-        <w:pStyle w:val="Heading3"/>
-      </w:pPr>
-      <w:r>
-        <w:t xml:space="preserve">O que eu fiz</w:t>
-      </w:r>
-    </w:p>
-    <w:p>
-      <w:pPr>
-        <w:pStyle w:val="FirstParagraph"/>
-      </w:pPr>
-      <w:r>
-        <w:t xml:space="preserve">Comecei a pesquisar países onde o meu dinheiro renderia mais. Cheguei na Bolívia. Fechei a empresa e vim para cá.</w:t>
-      </w:r>
-    </w:p>
     <w:bookmarkEnd w:id="283"/>
-    <w:bookmarkStart w:id="284" w:name="como-estou-hoje"/>
-    <w:p>
-      <w:pPr>
-        <w:pStyle w:val="Heading3"/>
-      </w:pPr>
-      <w:r>
-        <w:t xml:space="preserve">Como estou hoje</w:t>
-      </w:r>
-    </w:p>
-    <w:p>
-      <w:pPr>
-        <w:pStyle w:val="FirstParagraph"/>
-      </w:pPr>
-      <w:r>
-        <w:t xml:space="preserve">Para não ficar parado, entrei na faculdade de</w:t>
-      </w:r>
-      <w:r>
-        <w:t xml:space="preserve"> </w:t>
-      </w:r>
-      <w:r>
-        <w:rPr>
-          <w:bCs/>
-          <w:b/>
-        </w:rPr>
-        <w:t xml:space="preserve">medicina</w:t>
-      </w:r>
-      <w:r>
-        <w:t xml:space="preserve">. Hoje estudo medicina e consigo viver bem, com as contas que você viu acima.</w:t>
-      </w:r>
-    </w:p>
-    <w:p>
-      <w:pPr>
-        <w:pStyle w:val="BodyText"/>
-      </w:pPr>
-      <w:r>
-        <w:t xml:space="preserve">Eu não fugi. Eu escolhi onde o meu trabalho vale mais.</w:t>
-      </w:r>
-    </w:p>
-    <w:p>
-      <w:pPr>
-        <w:pStyle w:val="BodyText"/>
-      </w:pPr>
-      <w:r>
-        <w:t xml:space="preserve">PRÓXIMO</w:t>
-      </w:r>
-      <w:r>
-        <w:t xml:space="preserve">Parte 8:</w:t>
-      </w:r>
-      <w:r>
-        <w:t xml:space="preserve"> </w:t>
-      </w:r>
-      <w:r>
-        <w:rPr>
-          <w:highlight w:val="yellow"/>
-        </w:rPr>
-        <w:t xml:space="preserve">o mesmo método em outros países</w:t>
-      </w:r>
-    </w:p>
-    <w:bookmarkEnd w:id="284"/>
-    <w:bookmarkEnd w:id="285"/>
     <w:p>
       <w:r>
         <w:pict>
@@ -38710,7 +38665,37 @@
         <w:pStyle w:val="FirstParagraph"/>
       </w:pPr>
       <w:r>
-        <w:t xml:space="preserve">08</w:t>
+        <w:t xml:space="preserve">Depoimento do autor · continuação</w:t>
+      </w:r>
+    </w:p>
+    <w:bookmarkStart w:id="284" w:name="a-virada"/>
+    <w:p>
+      <w:pPr>
+        <w:pStyle w:val="Heading3"/>
+      </w:pPr>
+      <w:r>
+        <w:t xml:space="preserve">A virada</w:t>
+      </w:r>
+    </w:p>
+    <w:p>
+      <w:pPr>
+        <w:pStyle w:val="FirstParagraph"/>
+      </w:pPr>
+      <w:r>
+        <w:t xml:space="preserve">Em vez de reclamar, eu fui pesquisar. Comparei países, moedas, custo de vida, governo. Fiz a mesma conta que está na Parte 2 deste livro. E toda vez a resposta era a mesma:</w:t>
+      </w:r>
+      <w:r>
+        <w:t xml:space="preserve"> </w:t>
+      </w:r>
+      <w:r>
+        <w:rPr>
+          <w:bCs/>
+          <w:b/>
+        </w:rPr>
+        <w:t xml:space="preserve">Bolívia</w:t>
+      </w:r>
+      <w:r>
+        <w:t xml:space="preserve">. Aqui do lado, a poucas horas de voo, com o meu dinheiro valendo muito mais.</w:t>
       </w:r>
     </w:p>
     <w:p>
@@ -38718,7 +38703,56 @@
         <w:pStyle w:val="BodyText"/>
       </w:pPr>
       <w:r>
-        <w:t xml:space="preserve">Outros países</w:t>
+        <w:t xml:space="preserve">Fechei a empresa. Baixei a porta pela última vez. Deixei o Brasil com um aperto no peito, mas com a cabeça no lugar.</w:t>
+      </w:r>
+    </w:p>
+    <w:bookmarkEnd w:id="284"/>
+    <w:bookmarkStart w:id="285" w:name="a-vida-nova"/>
+    <w:p>
+      <w:pPr>
+        <w:pStyle w:val="Heading3"/>
+      </w:pPr>
+      <w:r>
+        <w:t xml:space="preserve">A vida nova</w:t>
+      </w:r>
+    </w:p>
+    <w:p>
+      <w:pPr>
+        <w:pStyle w:val="FirstParagraph"/>
+      </w:pPr>
+      <w:r>
+        <w:t xml:space="preserve">Eu não vim para ficar parado. Entrei na faculdade de</w:t>
+      </w:r>
+      <w:r>
+        <w:t xml:space="preserve"> </w:t>
+      </w:r>
+      <w:r>
+        <w:rPr>
+          <w:bCs/>
+          <w:b/>
+        </w:rPr>
+        <w:t xml:space="preserve">medicina</w:t>
+      </w:r>
+      <w:r>
+        <w:t xml:space="preserve">, um sonho que no Brasil eu não conseguiria bancar. Hoje estudo, moro bem num bairro nobre de Cochabamba e fecho o mês com as contas que você viu na página anterior.</w:t>
+      </w:r>
+    </w:p>
+    <w:bookmarkEnd w:id="285"/>
+    <w:bookmarkStart w:id="286" w:name="o-que-eu-digo-para-você"/>
+    <w:p>
+      <w:pPr>
+        <w:pStyle w:val="Heading3"/>
+      </w:pPr>
+      <w:r>
+        <w:t xml:space="preserve">O que eu digo para você</w:t>
+      </w:r>
+    </w:p>
+    <w:p>
+      <w:pPr>
+        <w:pStyle w:val="FirstParagraph"/>
+      </w:pPr>
+      <w:r>
+        <w:t xml:space="preserve">Você não precisa esperar mais 4 anos para ver onde isso vai dar. Eu já vi. E escolhi outro caminho, dentro da lei, no meu nome, com o meu dinheiro.</w:t>
       </w:r>
     </w:p>
     <w:p>
@@ -38726,9 +38760,30 @@
         <w:pStyle w:val="BodyText"/>
       </w:pPr>
       <w:r>
-        <w:t xml:space="preserve">Bolívia não é a única saída. Paraguai, Argentina, Uruguai, Portugal e EUA: quem é de direita, quem abre a porta e quanto custa.</w:t>
-      </w:r>
-    </w:p>
+        <w:t xml:space="preserve">Eu não fugi. Eu escolhi onde o meu trabalho vale mais.</w:t>
+      </w:r>
+    </w:p>
+    <w:p>
+      <w:pPr>
+        <w:pStyle w:val="BodyText"/>
+      </w:pPr>
+      <w:r>
+        <w:t xml:space="preserve">PRÓXIMO</w:t>
+      </w:r>
+      <w:r>
+        <w:t xml:space="preserve">Parte 8:</w:t>
+      </w:r>
+      <w:r>
+        <w:t xml:space="preserve"> </w:t>
+      </w:r>
+      <w:r>
+        <w:rPr>
+          <w:highlight w:val="yellow"/>
+        </w:rPr>
+        <w:t xml:space="preserve">o mesmo método em outros países</w:t>
+      </w:r>
+    </w:p>
+    <w:bookmarkEnd w:id="286"/>
     <w:p>
       <w:r>
         <w:pict>
@@ -38741,10 +38796,41 @@
         <w:pStyle w:val="FirstParagraph"/>
       </w:pPr>
       <w:r>
+        <w:t xml:space="preserve">08</w:t>
+      </w:r>
+    </w:p>
+    <w:p>
+      <w:pPr>
+        <w:pStyle w:val="BodyText"/>
+      </w:pPr>
+      <w:r>
+        <w:t xml:space="preserve">Outros países</w:t>
+      </w:r>
+    </w:p>
+    <w:p>
+      <w:pPr>
+        <w:pStyle w:val="BodyText"/>
+      </w:pPr>
+      <w:r>
+        <w:t xml:space="preserve">Bolívia não é a única saída. Paraguai, Argentina, Uruguai, Portugal e EUA: quem é de direita, quem abre a porta e quanto custa.</w:t>
+      </w:r>
+    </w:p>
+    <w:p>
+      <w:r>
+        <w:pict>
+          <v:rect style="width:0;height:1.5pt" o:hralign="center" o:hrstd="t" o:hr="t"/>
+        </w:pict>
+      </w:r>
+    </w:p>
+    <w:p>
+      <w:pPr>
+        <w:pStyle w:val="FirstParagraph"/>
+      </w:pPr>
+      <w:r>
         <w:t xml:space="preserve">Comparativo</w:t>
       </w:r>
     </w:p>
-    <w:bookmarkStart w:id="286" w:name="os-6-destinos-lado-a-lado"/>
+    <w:bookmarkStart w:id="287" w:name="os-6-destinos-lado-a-lado"/>
     <w:p>
       <w:pPr>
         <w:pStyle w:val="Heading1"/>
@@ -39172,7 +39258,7 @@
         <w:t xml:space="preserve">, Bolívia e Paraguai lideram.</w:t>
       </w:r>
     </w:p>
-    <w:bookmarkEnd w:id="286"/>
+    <w:bookmarkEnd w:id="287"/>
     <w:p>
       <w:r>
         <w:pict>
@@ -39188,7 +39274,7 @@
         <w:t xml:space="preserve">Paraguai</w:t>
       </w:r>
     </w:p>
-    <w:bookmarkStart w:id="287" w:name="os-brasileiros-estão-correndo-para-lá"/>
+    <w:bookmarkStart w:id="288" w:name="os-brasileiros-estão-correndo-para-lá"/>
     <w:p>
       <w:pPr>
         <w:pStyle w:val="Heading1"/>
@@ -39372,7 +39458,7 @@
         </w:tc>
       </w:tr>
     </w:tbl>
-    <w:bookmarkEnd w:id="287"/>
+    <w:bookmarkEnd w:id="288"/>
     <w:p>
       <w:r>
         <w:pict>
@@ -39380,7 +39466,7 @@
         </w:pict>
       </w:r>
     </w:p>
-    <w:bookmarkStart w:id="288" w:name="e-o-usdt-no-paraguai"/>
+    <w:bookmarkStart w:id="289" w:name="e-o-usdt-no-paraguai"/>
     <w:p>
       <w:pPr>
         <w:pStyle w:val="Heading2"/>
@@ -39495,7 +39581,7 @@
         <w:t xml:space="preserve">Vizinho, Mercosul e governo de direita: o Paraguai é o plano B do plano B.</w:t>
       </w:r>
     </w:p>
-    <w:bookmarkEnd w:id="288"/>
+    <w:bookmarkEnd w:id="289"/>
     <w:p>
       <w:r>
         <w:pict>
@@ -39511,7 +39597,7 @@
         <w:t xml:space="preserve">Argentina</w:t>
       </w:r>
     </w:p>
-    <w:bookmarkStart w:id="289" w:name="o-laboratório-do-milei"/>
+    <w:bookmarkStart w:id="290" w:name="o-laboratório-do-milei"/>
     <w:p>
       <w:pPr>
         <w:pStyle w:val="Heading1"/>
@@ -39669,7 +39755,7 @@
         </w:tc>
       </w:tr>
     </w:tbl>
-    <w:bookmarkEnd w:id="289"/>
+    <w:bookmarkEnd w:id="290"/>
     <w:p>
       <w:r>
         <w:pict>
@@ -39677,7 +39763,7 @@
         </w:pict>
       </w:r>
     </w:p>
-    <w:bookmarkStart w:id="292" w:name="vale-a-pena-ir-para-a-argentina"/>
+    <w:bookmarkStart w:id="293" w:name="vale-a-pena-ir-para-a-argentina"/>
     <w:p>
       <w:pPr>
         <w:pStyle w:val="Heading2"/>
@@ -39686,7 +39772,7 @@
         <w:t xml:space="preserve">Vale a pena ir para a Argentina?</w:t>
       </w:r>
     </w:p>
-    <w:bookmarkStart w:id="290" w:name="a-favor-1"/>
+    <w:bookmarkStart w:id="291" w:name="a-favor-1"/>
     <w:p>
       <w:pPr>
         <w:pStyle w:val="Heading3"/>
@@ -39731,8 +39817,8 @@
         <w:t xml:space="preserve">Entrada e residência fáceis pelo Mercosul</w:t>
       </w:r>
     </w:p>
-    <w:bookmarkEnd w:id="290"/>
-    <w:bookmarkStart w:id="291" w:name="atenção-1"/>
+    <w:bookmarkEnd w:id="291"/>
+    <w:bookmarkStart w:id="292" w:name="atenção-1"/>
     <w:p>
       <w:pPr>
         <w:pStyle w:val="Heading3"/>
@@ -39777,7 +39863,7 @@
         <w:t xml:space="preserve">Regra de prorrogação da residência com fontes divergentes</w:t>
       </w:r>
     </w:p>
-    <w:bookmarkEnd w:id="291"/>
+    <w:bookmarkEnd w:id="292"/>
     <w:p>
       <w:pPr>
         <w:pStyle w:val="FirstParagraph"/>
@@ -39804,7 +39890,7 @@
         <w:t xml:space="preserve">A Argentina mostra que dá para sair do buraco. Mas a obra ainda não acabou.</w:t>
       </w:r>
     </w:p>
-    <w:bookmarkEnd w:id="292"/>
+    <w:bookmarkEnd w:id="293"/>
     <w:p>
       <w:r>
         <w:pict>
@@ -39820,7 +39906,7 @@
         <w:t xml:space="preserve">Uruguai</w:t>
       </w:r>
     </w:p>
-    <w:bookmarkStart w:id="293" w:name="Xdc4e338a7123d05e9c2106c251b39fe5b2d930c"/>
+    <w:bookmarkStart w:id="294" w:name="Xdc4e338a7123d05e9c2106c251b39fe5b2d930c"/>
     <w:p>
       <w:pPr>
         <w:pStyle w:val="Heading1"/>
@@ -39996,7 +40082,7 @@
         <w:t xml:space="preserve">Caro e governado pela esquerda: não é o perfil deste curso.</w:t>
       </w:r>
     </w:p>
-    <w:bookmarkEnd w:id="293"/>
+    <w:bookmarkEnd w:id="294"/>
     <w:p>
       <w:r>
         <w:pict>
@@ -40012,7 +40098,7 @@
         <w:t xml:space="preserve">Portugal</w:t>
       </w:r>
     </w:p>
-    <w:bookmarkStart w:id="296" w:name="portugal-o-sonho-com-fila-de-400-mil"/>
+    <w:bookmarkStart w:id="297" w:name="portugal-o-sonho-com-fila-de-400-mil"/>
     <w:p>
       <w:pPr>
         <w:pStyle w:val="Heading1"/>
@@ -40215,7 +40301,7 @@
         </w:tc>
       </w:tr>
     </w:tbl>
-    <w:bookmarkStart w:id="294" w:name="a-favor-2"/>
+    <w:bookmarkStart w:id="295" w:name="a-favor-2"/>
     <w:p>
       <w:pPr>
         <w:pStyle w:val="Heading3"/>
@@ -40248,8 +40334,8 @@
         <w:t xml:space="preserve">Europa</w:t>
       </w:r>
     </w:p>
-    <w:bookmarkEnd w:id="294"/>
-    <w:bookmarkStart w:id="295" w:name="contra"/>
+    <w:bookmarkEnd w:id="295"/>
+    <w:bookmarkStart w:id="296" w:name="contra"/>
     <w:p>
       <w:pPr>
         <w:pStyle w:val="Heading3"/>
@@ -40294,8 +40380,8 @@
         <w:t xml:space="preserve">Aluguel caro</w:t>
       </w:r>
     </w:p>
-    <w:bookmarkEnd w:id="295"/>
     <w:bookmarkEnd w:id="296"/>
+    <w:bookmarkEnd w:id="297"/>
     <w:p>
       <w:r>
         <w:pict>
@@ -40311,7 +40397,7 @@
         <w:t xml:space="preserve">Estados Unidos</w:t>
       </w:r>
     </w:p>
-    <w:bookmarkStart w:id="297" w:name="eua-governo-de-direita-porta-fechada"/>
+    <w:bookmarkStart w:id="298" w:name="eua-governo-de-direita-porta-fechada"/>
     <w:p>
       <w:pPr>
         <w:pStyle w:val="Heading1"/>
@@ -40395,7 +40481,7 @@
         <w:t xml:space="preserve">Para turismo e negócios, o visto comum continua, mais caro.</w:t>
       </w:r>
     </w:p>
-    <w:bookmarkEnd w:id="297"/>
+    <w:bookmarkEnd w:id="298"/>
     <w:p>
       <w:r>
         <w:pict>
@@ -40411,7 +40497,7 @@
         <w:t xml:space="preserve">Fim da Parte 8</w:t>
       </w:r>
     </w:p>
-    <w:bookmarkStart w:id="298" w:name="Xe22f3731301bcaf48d078288930a6010db7de4f"/>
+    <w:bookmarkStart w:id="299" w:name="Xe22f3731301bcaf48d078288930a6010db7de4f"/>
     <w:p>
       <w:pPr>
         <w:pStyle w:val="Heading1"/>
@@ -40568,7 +40654,7 @@
         <w:t xml:space="preserve">dossiê, checklists e planilhas</w:t>
       </w:r>
     </w:p>
-    <w:bookmarkEnd w:id="298"/>
+    <w:bookmarkEnd w:id="299"/>
     <w:p>
       <w:r>
         <w:pict>
@@ -40615,7 +40701,7 @@
         <w:t xml:space="preserve">B1 · Espanhol de sobrevivência</w:t>
       </w:r>
     </w:p>
-    <w:bookmarkStart w:id="300" w:name="as-frases-que-resolvem-o-dia-a-dia"/>
+    <w:bookmarkStart w:id="301" w:name="as-frases-que-resolvem-o-dia-a-dia"/>
     <w:p>
       <w:pPr>
         <w:pStyle w:val="Heading1"/>
@@ -40624,7 +40710,7 @@
         <w:t xml:space="preserve">As frases que resolvem o dia a dia</w:t>
       </w:r>
     </w:p>
-    <w:bookmarkStart w:id="299" w:name="no-p2p-e-no-banco"/>
+    <w:bookmarkStart w:id="300" w:name="no-p2p-e-no-banco"/>
     <w:p>
       <w:pPr>
         <w:pStyle w:val="Heading3"/>
@@ -40920,8 +41006,8 @@
         <w:t xml:space="preserve">“Solo libero el USDT cuando veo el dinero en mi cuenta.” (Só libero o USDT quando vejo o dinheiro na minha conta.)</w:t>
       </w:r>
     </w:p>
-    <w:bookmarkEnd w:id="299"/>
     <w:bookmarkEnd w:id="300"/>
+    <w:bookmarkEnd w:id="301"/>
     <w:p>
       <w:r>
         <w:pict>
@@ -40929,7 +41015,7 @@
         </w:pict>
       </w:r>
     </w:p>
-    <w:bookmarkStart w:id="301" w:name="imobiliária-e-aluguel"/>
+    <w:bookmarkStart w:id="302" w:name="imobiliária-e-aluguel"/>
     <w:p>
       <w:pPr>
         <w:pStyle w:val="Heading3"/>
@@ -41106,8 +41192,8 @@
         </w:tc>
       </w:tr>
     </w:tbl>
-    <w:bookmarkEnd w:id="301"/>
-    <w:bookmarkStart w:id="302" w:name="migração-e-documentos"/>
+    <w:bookmarkEnd w:id="302"/>
+    <w:bookmarkStart w:id="303" w:name="migração-e-documentos"/>
     <w:p>
       <w:pPr>
         <w:pStyle w:val="Heading3"/>
@@ -41258,7 +41344,7 @@
         </w:tc>
       </w:tr>
     </w:tbl>
-    <w:bookmarkEnd w:id="302"/>
+    <w:bookmarkEnd w:id="303"/>
     <w:p>
       <w:r>
         <w:pict>
@@ -41266,7 +41352,7 @@
         </w:pict>
       </w:r>
     </w:p>
-    <w:bookmarkStart w:id="303" w:name="médico-e-farmácia"/>
+    <w:bookmarkStart w:id="304" w:name="médico-e-farmácia"/>
     <w:p>
       <w:pPr>
         <w:pStyle w:val="Heading3"/>
@@ -41443,8 +41529,8 @@
         </w:tc>
       </w:tr>
     </w:tbl>
-    <w:bookmarkEnd w:id="303"/>
-    <w:bookmarkStart w:id="304" w:name="táxi-mercado-e-restaurante"/>
+    <w:bookmarkEnd w:id="304"/>
+    <w:bookmarkStart w:id="305" w:name="táxi-mercado-e-restaurante"/>
     <w:p>
       <w:pPr>
         <w:pStyle w:val="Heading3"/>
@@ -41671,7 +41757,7 @@
         <w:t xml:space="preserve">= escritório.</w:t>
       </w:r>
     </w:p>
-    <w:bookmarkEnd w:id="304"/>
+    <w:bookmarkEnd w:id="305"/>
     <w:p>
       <w:r>
         <w:pict>
@@ -41687,7 +41773,7 @@
         <w:t xml:space="preserve">B2 · Roteiros de mensagem</w:t>
       </w:r>
     </w:p>
-    <w:bookmarkStart w:id="308" w:name="copie-cole-e-mande"/>
+    <w:bookmarkStart w:id="309" w:name="copie-cole-e-mande"/>
     <w:p>
       <w:pPr>
         <w:pStyle w:val="Heading1"/>
@@ -41696,7 +41782,7 @@
         <w:t xml:space="preserve">Copie, cole e mande</w:t>
       </w:r>
     </w:p>
-    <w:bookmarkStart w:id="305" w:name="para-o-comprador-no-p2p"/>
+    <w:bookmarkStart w:id="306" w:name="para-o-comprador-no-p2p"/>
     <w:p>
       <w:pPr>
         <w:pStyle w:val="Heading3"/>
@@ -41721,8 +41807,8 @@
         <w:t xml:space="preserve">El pago vino de una cuenta con otro nombre. Voy a devolver el monto a la misma cuenta y cancelar la orden.</w:t>
       </w:r>
     </w:p>
-    <w:bookmarkEnd w:id="305"/>
-    <w:bookmarkStart w:id="306" w:name="para-o-dono-do-imóvel"/>
+    <w:bookmarkEnd w:id="306"/>
+    <w:bookmarkStart w:id="307" w:name="para-o-dono-do-imóvel"/>
     <w:p>
       <w:pPr>
         <w:pStyle w:val="Heading3"/>
@@ -41739,8 +41825,8 @@
         <w:t xml:space="preserve">Hola, vi su anuncio del departamento en [barrio]. ¿Sigue disponible? ¿El precio en bolivianos incluye expensas? ¿Podemos agendar una visita esta semana?</w:t>
       </w:r>
     </w:p>
-    <w:bookmarkEnd w:id="306"/>
-    <w:bookmarkStart w:id="307" w:name="para-o-vendedor-do-carro"/>
+    <w:bookmarkEnd w:id="307"/>
+    <w:bookmarkStart w:id="308" w:name="para-o-vendedor-do-carro"/>
     <w:p>
       <w:pPr>
         <w:pStyle w:val="Heading3"/>
@@ -41757,8 +41843,8 @@
         <w:t xml:space="preserve">Hola, me interesa su [modelo y año]. ¿El precio es en bolivianos? ¿Tiene RUAT, SOAT e inspección técnica al día? ¿Podemos verlo con un mecánico?</w:t>
       </w:r>
     </w:p>
-    <w:bookmarkEnd w:id="307"/>
     <w:bookmarkEnd w:id="308"/>
+    <w:bookmarkEnd w:id="309"/>
     <w:p>
       <w:r>
         <w:pict>
@@ -41766,7 +41852,7 @@
         </w:pict>
       </w:r>
     </w:p>
-    <w:bookmarkStart w:id="309" w:name="para-a-escola"/>
+    <w:bookmarkStart w:id="310" w:name="para-a-escola"/>
     <w:p>
       <w:pPr>
         <w:pStyle w:val="Heading3"/>
@@ -41783,8 +41869,8 @@
         <w:t xml:space="preserve">Buenos días, somos una familia brasileña y queremos matricular a nuestro hijo en [curso]. ¿Cuáles son los requisitos, las fechas y la pensión mensual? ¿Me lo puede enviar por escrito?</w:t>
       </w:r>
     </w:p>
-    <w:bookmarkEnd w:id="309"/>
-    <w:bookmarkStart w:id="310" w:name="para-o-banco"/>
+    <w:bookmarkEnd w:id="310"/>
+    <w:bookmarkStart w:id="311" w:name="para-o-banco"/>
     <w:p>
       <w:pPr>
         <w:pStyle w:val="Heading3"/>
@@ -41801,8 +41887,8 @@
         <w:t xml:space="preserve">Buenos días, soy brasileño y vivo en [ciudad]. Quiero abrir una cuenta en bolivianos. ¿Qué documentos necesito?</w:t>
       </w:r>
     </w:p>
-    <w:bookmarkEnd w:id="310"/>
-    <w:bookmarkStart w:id="311" w:name="para-negociar-preço"/>
+    <w:bookmarkEnd w:id="311"/>
+    <w:bookmarkStart w:id="312" w:name="para-negociar-preço"/>
     <w:p>
       <w:pPr>
         <w:pStyle w:val="Heading3"/>
@@ -41837,7 +41923,7 @@
         <w:t xml:space="preserve">tudo por escrito. Mensagem guardada é prova.</w:t>
       </w:r>
     </w:p>
-    <w:bookmarkEnd w:id="311"/>
+    <w:bookmarkEnd w:id="312"/>
     <w:p>
       <w:r>
         <w:pict>
@@ -41853,7 +41939,7 @@
         <w:t xml:space="preserve">B3 · Planilha 1</w:t>
       </w:r>
     </w:p>
-    <w:bookmarkStart w:id="312" w:name="câmbio-efetivo"/>
+    <w:bookmarkStart w:id="313" w:name="câmbio-efetivo"/>
     <w:p>
       <w:pPr>
         <w:pStyle w:val="Heading2"/>
@@ -42546,7 +42632,7 @@
         <w:t xml:space="preserve">câmbio efetivo = Bs recebidos ÷ R$ gastos · exemplo do curso: 2,25</w:t>
       </w:r>
     </w:p>
-    <w:bookmarkEnd w:id="312"/>
+    <w:bookmarkEnd w:id="313"/>
     <w:p>
       <w:r>
         <w:pict>
@@ -42562,7 +42648,7 @@
         <w:t xml:space="preserve">B3 · Planilha 2</w:t>
       </w:r>
     </w:p>
-    <w:bookmarkStart w:id="313" w:name="orçamento-mensal-na-bolívia"/>
+    <w:bookmarkStart w:id="314" w:name="orçamento-mensal-na-bolívia"/>
     <w:p>
       <w:pPr>
         <w:pStyle w:val="Heading2"/>
@@ -42944,7 +43030,7 @@
         <w:t xml:space="preserve">aluguel de Bs 933 por pessoa (apê dividido) + R$ 700 de comida e contas = ~R$ 1.106/mês.</w:t>
       </w:r>
     </w:p>
-    <w:bookmarkEnd w:id="313"/>
+    <w:bookmarkEnd w:id="314"/>
     <w:p>
       <w:r>
         <w:pict>
@@ -42960,7 +43046,7 @@
         <w:t xml:space="preserve">B3 · Planilha 3</w:t>
       </w:r>
     </w:p>
-    <w:bookmarkStart w:id="314" w:name="controle-de-envios"/>
+    <w:bookmarkStart w:id="315" w:name="controle-de-envios"/>
     <w:p>
       <w:pPr>
         <w:pStyle w:val="Heading2"/>
@@ -43415,7 +43501,7 @@
         <w:t xml:space="preserve">A partir de 01/01/2027, envios acima de US$ 10 mil para fora podem ficar retidos por até 24 h (Res. BCB 584). Anote a data com folga.</w:t>
       </w:r>
     </w:p>
-    <w:bookmarkEnd w:id="314"/>
+    <w:bookmarkEnd w:id="315"/>
     <w:p>
       <w:r>
         <w:pict>
@@ -43431,7 +43517,7 @@
         <w:t xml:space="preserve">B4 · Checklists mestres</w:t>
       </w:r>
     </w:p>
-    <w:bookmarkStart w:id="315" w:name="antes-de-sair-do-brasil"/>
+    <w:bookmarkStart w:id="316" w:name="antes-de-sair-do-brasil"/>
     <w:p>
       <w:pPr>
         <w:pStyle w:val="Heading2"/>
@@ -43536,8 +43622,8 @@
         <w:t xml:space="preserve">CVI do pet (se tiver)</w:t>
       </w:r>
     </w:p>
-    <w:bookmarkEnd w:id="315"/>
-    <w:bookmarkStart w:id="316" w:name="primeira-operação-usdt"/>
+    <w:bookmarkEnd w:id="316"/>
+    <w:bookmarkStart w:id="317" w:name="primeira-operação-usdt"/>
     <w:p>
       <w:pPr>
         <w:pStyle w:val="Heading2"/>
@@ -43618,7 +43704,7 @@
         <w:t xml:space="preserve">Hash e preço anotados na pasta fiscal</w:t>
       </w:r>
     </w:p>
-    <w:bookmarkEnd w:id="316"/>
+    <w:bookmarkEnd w:id="317"/>
     <w:p>
       <w:r>
         <w:pict>
@@ -43626,7 +43712,7 @@
         </w:pict>
       </w:r>
     </w:p>
-    <w:bookmarkStart w:id="317" w:name="na-chegada"/>
+    <w:bookmarkStart w:id="318" w:name="na-chegada"/>
     <w:p>
       <w:pPr>
         <w:pStyle w:val="Heading2"/>
@@ -43683,8 +43769,8 @@
         <w:t xml:space="preserve">Primeira venda P2P pequena</w:t>
       </w:r>
     </w:p>
-    <w:bookmarkEnd w:id="317"/>
-    <w:bookmarkStart w:id="318" w:name="residência"/>
+    <w:bookmarkEnd w:id="318"/>
+    <w:bookmarkStart w:id="319" w:name="residência"/>
     <w:p>
       <w:pPr>
         <w:pStyle w:val="Heading2"/>
@@ -43753,8 +43839,8 @@
         <w:t xml:space="preserve">Cédula de estrangeiro no SEGIP</w:t>
       </w:r>
     </w:p>
-    <w:bookmarkEnd w:id="318"/>
-    <w:bookmarkStart w:id="319" w:name="blindagem"/>
+    <w:bookmarkEnd w:id="319"/>
+    <w:bookmarkStart w:id="320" w:name="blindagem"/>
     <w:p>
       <w:pPr>
         <w:pStyle w:val="Heading2"/>
@@ -43823,7 +43909,7 @@
         <w:t xml:space="preserve">Nada de encontro presencial com dinheiro</w:t>
       </w:r>
     </w:p>
-    <w:bookmarkEnd w:id="319"/>
+    <w:bookmarkEnd w:id="320"/>
     <w:p>
       <w:r>
         <w:pict>
@@ -43839,7 +43925,7 @@
         <w:t xml:space="preserve">B5 · Glossário geral</w:t>
       </w:r>
     </w:p>
-    <w:bookmarkStart w:id="320" w:name="bolívia-e-espanhol"/>
+    <w:bookmarkStart w:id="321" w:name="bolívia-e-espanhol"/>
     <w:p>
       <w:pPr>
         <w:pStyle w:val="Heading2"/>
@@ -44387,7 +44473,7 @@
         <w:t xml:space="preserve">.</w:t>
       </w:r>
     </w:p>
-    <w:bookmarkEnd w:id="320"/>
+    <w:bookmarkEnd w:id="321"/>
     <w:p>
       <w:r>
         <w:pict>
@@ -44403,7 +44489,7 @@
         <w:t xml:space="preserve">B6 · Grupo VIP</w:t>
       </w:r>
     </w:p>
-    <w:bookmarkStart w:id="323" w:name="regras-do-grupo-e-atualizações"/>
+    <w:bookmarkStart w:id="324" w:name="regras-do-grupo-e-atualizações"/>
     <w:p>
       <w:pPr>
         <w:pStyle w:val="Heading1"/>
@@ -44412,7 +44498,7 @@
         <w:t xml:space="preserve">Regras do grupo e atualizações</w:t>
       </w:r>
     </w:p>
-    <w:bookmarkStart w:id="321" w:name="regras-fixadas"/>
+    <w:bookmarkStart w:id="322" w:name="regras-fixadas"/>
     <w:p>
       <w:pPr>
         <w:pStyle w:val="Heading3"/>
@@ -44469,8 +44555,8 @@
         <w:t xml:space="preserve">Nenhum admin manda mensagem privada pedindo dinheiro</w:t>
       </w:r>
     </w:p>
-    <w:bookmarkEnd w:id="321"/>
-    <w:bookmarkStart w:id="322" w:name="calendário"/>
+    <w:bookmarkEnd w:id="322"/>
+    <w:bookmarkStart w:id="323" w:name="calendário"/>
     <w:p>
       <w:pPr>
         <w:pStyle w:val="Heading3"/>
@@ -44645,8 +44731,8 @@
         <w:t xml:space="preserve">[LINK DO GRUPO]</w:t>
       </w:r>
     </w:p>
-    <w:bookmarkEnd w:id="322"/>
     <w:bookmarkEnd w:id="323"/>
+    <w:bookmarkEnd w:id="324"/>
     <w:p>
       <w:r>
         <w:pict>
@@ -44693,7 +44779,7 @@
         <w:t xml:space="preserve">Como usar o dossiê</w:t>
       </w:r>
     </w:p>
-    <w:bookmarkStart w:id="326" w:name="não-discuta.-mande-o-link."/>
+    <w:bookmarkStart w:id="327" w:name="não-discuta.-mande-o-link."/>
     <w:p>
       <w:pPr>
         <w:pStyle w:val="Heading1"/>
@@ -44774,7 +44860,7 @@
         <w:t xml:space="preserve">Se ele disser “site de direita”, mande o dado oficial que está na mesma linha (Banco Central, Senado, Receita)</w:t>
       </w:r>
     </w:p>
-    <w:bookmarkStart w:id="324" w:name="já-aconteceu"/>
+    <w:bookmarkStart w:id="325" w:name="já-aconteceu"/>
     <w:p>
       <w:pPr>
         <w:pStyle w:val="Heading3"/>
@@ -44791,8 +44877,8 @@
         <w:t xml:space="preserve">Fatos publicados: impostos, IOF, dívida, juros, déficit, golpes.</w:t>
       </w:r>
     </w:p>
-    <w:bookmarkEnd w:id="324"/>
-    <w:bookmarkStart w:id="325" w:name="o-que-vem-por-aí"/>
+    <w:bookmarkEnd w:id="325"/>
+    <w:bookmarkStart w:id="326" w:name="o-que-vem-por-aí"/>
     <w:p>
       <w:pPr>
         <w:pStyle w:val="Heading3"/>
@@ -44809,7 +44895,7 @@
         <w:t xml:space="preserve">Projeções de instituições e propostas do governo, marcadas como projeção.</w:t>
       </w:r>
     </w:p>
-    <w:bookmarkEnd w:id="325"/>
+    <w:bookmarkEnd w:id="326"/>
     <w:p>
       <w:pPr>
         <w:pStyle w:val="BodyText"/>
@@ -44828,7 +44914,7 @@
         <w:t xml:space="preserve">Todos foram consultados em 28/10/2026. Se algum sair do ar, busque o título entre aspas.</w:t>
       </w:r>
     </w:p>
-    <w:bookmarkEnd w:id="326"/>
+    <w:bookmarkEnd w:id="327"/>
     <w:p>
       <w:r>
         <w:pict>
@@ -44844,7 +44930,7 @@
         <w:t xml:space="preserve">Fatos publicados</w:t>
       </w:r>
     </w:p>
-    <w:bookmarkStart w:id="330" w:name="já-aconteceu-1"/>
+    <w:bookmarkStart w:id="331" w:name="já-aconteceu-1"/>
     <w:p>
       <w:pPr>
         <w:pStyle w:val="Heading2"/>
@@ -44868,7 +44954,7 @@
       <w:pPr>
         <w:pStyle w:val="BodyText"/>
       </w:pPr>
-      <w:hyperlink r:id="rId327">
+      <w:hyperlink r:id="rId328">
         <w:r>
           <w:rPr>
             <w:rStyle w:val="Hyperlink"/>
@@ -44918,7 +45004,7 @@
       <w:pPr>
         <w:pStyle w:val="BodyText"/>
       </w:pPr>
-      <w:hyperlink r:id="rId328">
+      <w:hyperlink r:id="rId329">
         <w:r>
           <w:rPr>
             <w:rStyle w:val="Hyperlink"/>
@@ -44968,7 +45054,7 @@
       <w:pPr>
         <w:pStyle w:val="BodyText"/>
       </w:pPr>
-      <w:hyperlink r:id="rId329">
+      <w:hyperlink r:id="rId330">
         <w:r>
           <w:rPr>
             <w:rStyle w:val="Hyperlink"/>
@@ -45003,7 +45089,7 @@
         <w:t xml:space="preserve">· link consultado em 28/10/2026</w:t>
       </w:r>
     </w:p>
-    <w:bookmarkEnd w:id="330"/>
+    <w:bookmarkEnd w:id="331"/>
     <w:p>
       <w:r>
         <w:pict>
@@ -45011,7 +45097,7 @@
         </w:pict>
       </w:r>
     </w:p>
-    <w:bookmarkStart w:id="334" w:name="já-aconteceu-cont."/>
+    <w:bookmarkStart w:id="335" w:name="já-aconteceu-cont."/>
     <w:p>
       <w:pPr>
         <w:pStyle w:val="Heading2"/>
@@ -45035,7 +45121,7 @@
       <w:pPr>
         <w:pStyle w:val="BodyText"/>
       </w:pPr>
-      <w:hyperlink r:id="rId331">
+      <w:hyperlink r:id="rId332">
         <w:r>
           <w:rPr>
             <w:rStyle w:val="Hyperlink"/>
@@ -45085,7 +45171,7 @@
       <w:pPr>
         <w:pStyle w:val="BodyText"/>
       </w:pPr>
-      <w:hyperlink r:id="rId332">
+      <w:hyperlink r:id="rId333">
         <w:r>
           <w:rPr>
             <w:rStyle w:val="Hyperlink"/>
@@ -45135,7 +45221,7 @@
       <w:pPr>
         <w:pStyle w:val="BodyText"/>
       </w:pPr>
-      <w:hyperlink r:id="rId333">
+      <w:hyperlink r:id="rId334">
         <w:r>
           <w:rPr>
             <w:rStyle w:val="Hyperlink"/>
@@ -45170,7 +45256,7 @@
         <w:t xml:space="preserve">· link consultado em 28/10/2026</w:t>
       </w:r>
     </w:p>
-    <w:bookmarkEnd w:id="334"/>
+    <w:bookmarkEnd w:id="335"/>
     <w:p>
       <w:r>
         <w:pict>
@@ -45178,7 +45264,7 @@
         </w:pict>
       </w:r>
     </w:p>
-    <w:bookmarkStart w:id="338" w:name="já-aconteceu-cont.-1"/>
+    <w:bookmarkStart w:id="339" w:name="já-aconteceu-cont.-1"/>
     <w:p>
       <w:pPr>
         <w:pStyle w:val="Heading2"/>
@@ -45202,7 +45288,7 @@
       <w:pPr>
         <w:pStyle w:val="BodyText"/>
       </w:pPr>
-      <w:hyperlink r:id="rId335">
+      <w:hyperlink r:id="rId336">
         <w:r>
           <w:rPr>
             <w:rStyle w:val="Hyperlink"/>
@@ -45252,7 +45338,7 @@
       <w:pPr>
         <w:pStyle w:val="BodyText"/>
       </w:pPr>
-      <w:hyperlink r:id="rId336">
+      <w:hyperlink r:id="rId337">
         <w:r>
           <w:rPr>
             <w:rStyle w:val="Hyperlink"/>
@@ -45302,7 +45388,7 @@
       <w:pPr>
         <w:pStyle w:val="BodyText"/>
       </w:pPr>
-      <w:hyperlink r:id="rId337">
+      <w:hyperlink r:id="rId338">
         <w:r>
           <w:rPr>
             <w:rStyle w:val="Hyperlink"/>
@@ -45337,7 +45423,7 @@
         <w:t xml:space="preserve">· link consultado em 28/10/2026</w:t>
       </w:r>
     </w:p>
-    <w:bookmarkEnd w:id="338"/>
+    <w:bookmarkEnd w:id="339"/>
     <w:p>
       <w:r>
         <w:pict>
@@ -45345,7 +45431,7 @@
         </w:pict>
       </w:r>
     </w:p>
-    <w:bookmarkStart w:id="342" w:name="já-aconteceu-cont.-2"/>
+    <w:bookmarkStart w:id="343" w:name="já-aconteceu-cont.-2"/>
     <w:p>
       <w:pPr>
         <w:pStyle w:val="Heading2"/>
@@ -45369,7 +45455,7 @@
       <w:pPr>
         <w:pStyle w:val="BodyText"/>
       </w:pPr>
-      <w:hyperlink r:id="rId339">
+      <w:hyperlink r:id="rId340">
         <w:r>
           <w:rPr>
             <w:rStyle w:val="Hyperlink"/>
@@ -45419,7 +45505,7 @@
       <w:pPr>
         <w:pStyle w:val="BodyText"/>
       </w:pPr>
-      <w:hyperlink r:id="rId340">
+      <w:hyperlink r:id="rId341">
         <w:r>
           <w:rPr>
             <w:rStyle w:val="Hyperlink"/>
@@ -45469,7 +45555,7 @@
       <w:pPr>
         <w:pStyle w:val="BodyText"/>
       </w:pPr>
-      <w:hyperlink r:id="rId341">
+      <w:hyperlink r:id="rId342">
         <w:r>
           <w:rPr>
             <w:rStyle w:val="Hyperlink"/>
@@ -45504,7 +45590,7 @@
         <w:t xml:space="preserve">· link consultado em 28/10/2026</w:t>
       </w:r>
     </w:p>
-    <w:bookmarkEnd w:id="342"/>
+    <w:bookmarkEnd w:id="343"/>
     <w:p>
       <w:r>
         <w:pict>
@@ -45520,7 +45606,7 @@
         <w:t xml:space="preserve">Projeções e propostas</w:t>
       </w:r>
     </w:p>
-    <w:bookmarkStart w:id="346" w:name="o-que-vem-por-aí-1"/>
+    <w:bookmarkStart w:id="347" w:name="o-que-vem-por-aí-1"/>
     <w:p>
       <w:pPr>
         <w:pStyle w:val="Heading2"/>
@@ -45544,7 +45630,7 @@
       <w:pPr>
         <w:pStyle w:val="BodyText"/>
       </w:pPr>
-      <w:hyperlink r:id="rId343">
+      <w:hyperlink r:id="rId344">
         <w:r>
           <w:rPr>
             <w:rStyle w:val="Hyperlink"/>
@@ -45594,7 +45680,7 @@
       <w:pPr>
         <w:pStyle w:val="BodyText"/>
       </w:pPr>
-      <w:hyperlink r:id="rId344">
+      <w:hyperlink r:id="rId345">
         <w:r>
           <w:rPr>
             <w:rStyle w:val="Hyperlink"/>
@@ -45644,7 +45730,7 @@
       <w:pPr>
         <w:pStyle w:val="BodyText"/>
       </w:pPr>
-      <w:hyperlink r:id="rId345">
+      <w:hyperlink r:id="rId346">
         <w:r>
           <w:rPr>
             <w:rStyle w:val="Hyperlink"/>
@@ -45679,7 +45765,7 @@
         <w:t xml:space="preserve">· link consultado em 28/10/2026</w:t>
       </w:r>
     </w:p>
-    <w:bookmarkEnd w:id="346"/>
+    <w:bookmarkEnd w:id="347"/>
     <w:p>
       <w:r>
         <w:pict>
@@ -45687,7 +45773,7 @@
         </w:pict>
       </w:r>
     </w:p>
-    <w:bookmarkStart w:id="350" w:name="o-que-vem-por-aí-cont."/>
+    <w:bookmarkStart w:id="351" w:name="o-que-vem-por-aí-cont."/>
     <w:p>
       <w:pPr>
         <w:pStyle w:val="Heading2"/>
@@ -45711,7 +45797,7 @@
       <w:pPr>
         <w:pStyle w:val="BodyText"/>
       </w:pPr>
-      <w:hyperlink r:id="rId347">
+      <w:hyperlink r:id="rId348">
         <w:r>
           <w:rPr>
             <w:rStyle w:val="Hyperlink"/>
@@ -45761,7 +45847,7 @@
       <w:pPr>
         <w:pStyle w:val="BodyText"/>
       </w:pPr>
-      <w:hyperlink r:id="rId348">
+      <w:hyperlink r:id="rId349">
         <w:r>
           <w:rPr>
             <w:rStyle w:val="Hyperlink"/>
@@ -45811,7 +45897,7 @@
       <w:pPr>
         <w:pStyle w:val="BodyText"/>
       </w:pPr>
-      <w:hyperlink r:id="rId349">
+      <w:hyperlink r:id="rId350">
         <w:r>
           <w:rPr>
             <w:rStyle w:val="Hyperlink"/>
@@ -45846,7 +45932,7 @@
         <w:t xml:space="preserve">· link consultado em 28/10/2026</w:t>
       </w:r>
     </w:p>
-    <w:bookmarkEnd w:id="350"/>
+    <w:bookmarkEnd w:id="351"/>
     <w:p>
       <w:r>
         <w:pict>
@@ -45854,7 +45940,7 @@
         </w:pict>
       </w:r>
     </w:p>
-    <w:bookmarkStart w:id="352" w:name="o-que-vem-por-aí-cont.-1"/>
+    <w:bookmarkStart w:id="353" w:name="o-que-vem-por-aí-cont.-1"/>
     <w:p>
       <w:pPr>
         <w:pStyle w:val="Heading2"/>
@@ -45878,7 +45964,7 @@
       <w:pPr>
         <w:pStyle w:val="BodyText"/>
       </w:pPr>
-      <w:hyperlink r:id="rId351">
+      <w:hyperlink r:id="rId352">
         <w:r>
           <w:rPr>
             <w:rStyle w:val="Hyperlink"/>
@@ -45913,7 +45999,7 @@
         <w:t xml:space="preserve">· link consultado em 28/10/2026</w:t>
       </w:r>
     </w:p>
-    <w:bookmarkEnd w:id="352"/>
+    <w:bookmarkEnd w:id="353"/>
     <w:p>
       <w:r>
         <w:pict>
@@ -45929,7 +46015,7 @@
         <w:t xml:space="preserve">Para o WhatsApp</w:t>
       </w:r>
     </w:p>
-    <w:bookmarkStart w:id="353" w:name="mais-4-anos-em-6-números"/>
+    <w:bookmarkStart w:id="354" w:name="mais-4-anos-em-6-números"/>
     <w:p>
       <w:pPr>
         <w:pStyle w:val="Heading1"/>
@@ -46030,7 +46116,7 @@
         <w:t xml:space="preserve">[LINK DO CURSO]</w:t>
       </w:r>
     </w:p>
-    <w:bookmarkEnd w:id="353"/>
+    <w:bookmarkEnd w:id="354"/>
     <w:p>
       <w:r>
         <w:pict>
@@ -46046,7 +46132,7 @@
         <w:t xml:space="preserve">Aviso legal</w:t>
       </w:r>
     </w:p>
-    <w:bookmarkStart w:id="354" w:name="leia-antes-de-agir"/>
+    <w:bookmarkStart w:id="355" w:name="leia-antes-de-agir"/>
     <w:p>
       <w:pPr>
         <w:pStyle w:val="Heading1"/>
@@ -46298,7 +46384,7 @@
         <w:t xml:space="preserve">7 dias, conforme o Código de Defesa do Consumidor (art. 49).</w:t>
       </w:r>
     </w:p>
-    <w:bookmarkEnd w:id="354"/>
+    <w:bookmarkEnd w:id="355"/>
     <w:p>
       <w:r>
         <w:pict>
@@ -46314,7 +46400,7 @@
         <w:t xml:space="preserve">Créditos</w:t>
       </w:r>
     </w:p>
-    <w:bookmarkStart w:id="355" w:name="créditos"/>
+    <w:bookmarkStart w:id="356" w:name="créditos"/>
     <w:p>
       <w:pPr>
         <w:pStyle w:val="Heading2"/>
@@ -46411,8 +46497,8 @@
         <w:t xml:space="preserve">Anton, Archivo e JetBrains Mono (licença livre)</w:t>
       </w:r>
     </w:p>
-    <w:bookmarkEnd w:id="355"/>
-    <w:bookmarkStart w:id="356" w:name="últimas-atualizações"/>
+    <w:bookmarkEnd w:id="356"/>
+    <w:bookmarkStart w:id="357" w:name="últimas-atualizações"/>
     <w:p>
       <w:pPr>
         <w:pStyle w:val="Heading2"/>
@@ -46556,7 +46642,7 @@
         <w:t xml:space="preserve">Novas versões chegam por e-mail e no grupo VIP, gratuitamente, por 12 meses após a compra.</w:t>
       </w:r>
     </w:p>
-    <w:bookmarkEnd w:id="356"/>
+    <w:bookmarkEnd w:id="357"/>
     <w:p>
       <w:r>
         <w:pict>
@@ -46572,7 +46658,7 @@
         <w:t xml:space="preserve">Anexo</w:t>
       </w:r>
     </w:p>
-    <w:bookmarkStart w:id="357" w:name="fontes-de-todos-os-números"/>
+    <w:bookmarkStart w:id="358" w:name="fontes-de-todos-os-números"/>
     <w:p>
       <w:pPr>
         <w:pStyle w:val="Heading2"/>
@@ -46817,7 +46903,7 @@
         <w:t xml:space="preserve">Agência Brasil e Poder360 (19/10/2025); MercoPress (10/11/2025); France 24 via Acento (08/11/2025); usdthoy.com (flutuação desde 29/06/2026).</w:t>
       </w:r>
     </w:p>
-    <w:bookmarkEnd w:id="357"/>
+    <w:bookmarkEnd w:id="358"/>
     <w:p>
       <w:r>
         <w:pict>
@@ -48965,7 +49051,7 @@
           <w:bCs/>
           <w:b/>
         </w:rPr>
-        <w:t xml:space="preserve">p. 194</w:t>
+        <w:t xml:space="preserve">p. 195</w:t>
       </w:r>
       <w:r>
         <w:t xml:space="preserve">Autor, out/2026 (aluguel, refeições e custo mensal).</w:t>
@@ -48991,7 +49077,7 @@
           <w:bCs/>
           <w:b/>
         </w:rPr>
-        <w:t xml:space="preserve">p. 196</w:t>
+        <w:t xml:space="preserve">p. 197</w:t>
       </w:r>
       <w:r>
         <w:t xml:space="preserve">MercoPress (posse de Paz, 2025; posse de Orsi, 01/03/2025); posses oficiais (Peña, 15/08/2023; Milei, 10/12/2023); Band (suspensão de vistos de imigrante para brasileiros desde 21/01/2026); Mercer via Band (Montevidéu, cidade mais cara da América Latina).</w:t>
@@ -49010,7 +49096,7 @@
           <w:bCs/>
           <w:b/>
         </w:rPr>
-        <w:t xml:space="preserve">p. 197</w:t>
+        <w:t xml:space="preserve">p. 198</w:t>
       </w:r>
       <w:r>
         <w:t xml:space="preserve">The Rio Times (22.628 residências para brasileiros no 1º sem./2026 vs. 11.723 em 2025); Expats Argentina, 06/10/2026 (temporária Mercosul de 2 anos, cédula após a permanente); Bleap (renda de ~US$ 500); Portas e Paraíba Business (brasileiros no mercado imobiliário, 2026).</w:t>
@@ -49029,7 +49115,7 @@
           <w:bCs/>
           <w:b/>
         </w:rPr>
-        <w:t xml:space="preserve">p. 198</w:t>
+        <w:t xml:space="preserve">p. 199</w:t>
       </w:r>
       <w:r>
         <w:t xml:space="preserve">El Dorado e guias P2P (USDT com guarani via bancos locais); CriptoNoticias (BCP: sem regulação específica, cripto sem curso legal); fonte secundária (Resolução Geral DNIT 47/2026).</w:t>
@@ -49048,7 +49134,7 @@
           <w:bCs/>
           <w:b/>
         </w:rPr>
-        <w:t xml:space="preserve">p. 199</w:t>
+        <w:t xml:space="preserve">p. 200</w:t>
       </w:r>
       <w:r>
         <w:t xml:space="preserve">INDEC (IPC 2023 e 2025); REM/BCRA via GBM e Bloomberg Línea (inflação mensal e dólar, out/2026); Hace Cuentas (dólar oficial em 01/10/2026); Papelea e Expats Argentina (residência Mercosul via RADEX; Disposição DNM 1637/2022).</w:t>
@@ -49067,7 +49153,7 @@
           <w:bCs/>
           <w:b/>
         </w:rPr>
-        <w:t xml:space="preserve">p. 200</w:t>
+        <w:t xml:space="preserve">p. 201</w:t>
       </w:r>
       <w:r>
         <w:t xml:space="preserve">REM/BCRA via Bloomberg Línea e Notícias NQN (inflação ~29,8–30% em 2026; dólar de ARS 1.614–1.652 em dez/2026); Papelea × Expats Argentina (divergência sobre prorrogação).</w:t>
@@ -49086,7 +49172,7 @@
           <w:bCs/>
           <w:b/>
         </w:rPr>
-        <w:t xml:space="preserve">p. 201</w:t>
+        <w:t xml:space="preserve">p. 202</w:t>
       </w:r>
       <w:r>
         <w:t xml:space="preserve">MercoPress e La República (posse de Orsi em 01/03/2025, sucedendo Lacalle Pou); CNN Brasil (perfil); Mercer via Band (Montevidéu, cidade mais cara da América Latina); Nomad (família de R$ 15–20 mil/mês); Bleap e Henley (residência Mercosul, renda divergente).</w:t>
@@ -49105,7 +49191,7 @@
           <w:bCs/>
           <w:b/>
         </w:rPr>
-        <w:t xml:space="preserve">p. 202</w:t>
+        <w:t xml:space="preserve">p. 203</w:t>
       </w:r>
       <w:r>
         <w:t xml:space="preserve">Guias D7 2026 (renda de referência de €920; duas etapas, consulado e AIMA; acúmulo de mais de 400 mil processos); Numbeo mai/2026 via Cidadania e Visto (Lisboa €1.280); Meelion, 09/10/2026 (€1 = R$ 5,62).</w:t>
@@ -49124,7 +49210,7 @@
           <w:bCs/>
           <w:b/>
         </w:rPr>
-        <w:t xml:space="preserve">p. 203</w:t>
+        <w:t xml:space="preserve">p. 204</w:t>
       </w:r>
       <w:r>
         <w:t xml:space="preserve">Band (suspensão de vistos de imigrante para brasileiros a partir de 21/01/2026); Jovem Pan e Investidor10 (taxa de US$ 250; Brasil fora da caução); Zumper via WLRN, set/2026 (Miami US$ 2.500 × R$ 5,35).</w:t>
@@ -49143,7 +49229,7 @@
           <w:bCs/>
           <w:b/>
         </w:rPr>
-        <w:t xml:space="preserve">p. 213</w:t>
+        <w:t xml:space="preserve">p. 214</w:t>
       </w:r>
       <w:r>
         <w:t xml:space="preserve">Blocktrends (Res. BCB 584).</w:t>
@@ -49162,7 +49248,7 @@
           <w:bCs/>
           <w:b/>
         </w:rPr>
-        <w:t xml:space="preserve">p. 215</w:t>
+        <w:t xml:space="preserve">p. 216</w:t>
       </w:r>
       <w:r>
         <w:t xml:space="preserve">Itamaraty (plantão consular).</w:t>
@@ -49188,7 +49274,7 @@
           <w:bCs/>
           <w:b/>
         </w:rPr>
-        <w:t xml:space="preserve">p. 227</w:t>
+        <w:t xml:space="preserve">p. 228</w:t>
       </w:r>
       <w:r>
         <w:t xml:space="preserve">Gazeta do Povo (arrecadação 2025; 1 imposto a cada 27 dias; dívida e juros, ago/2026; herança de 90% do PIB); Poder360 (IOF 3,5%; dívida 82,9% do PIB segundo o BC).</w:t>

</xml_diff>